<commit_message>
fix(thesis): include إهداء/شكر وتقدير, fix stale EOQ/ROP audit checks
- Extraction: إهداء (dedication) and شكر وتقدير (thanks) now included
  as headings in the golden output (were mistakenly skipped as pre-content)
- Audit: EOQ check updated from old '176' → 'Q* = 37' or 'EOQ = 37'
- Audit: ROP check updated from old '212.4' → 'ROP = 206'
- All 4 previously MISSING items now PASS (dedication, thanks, eoq, rop)
- Only TOC remains missing (expected — Word auto-generates it)
</commit_message>
<xml_diff>
--- a/Thesis_Surgical_Edit/output/Memoire_DSS_Logistique_ElBayadh.docx
+++ b/Thesis_Surgical_Edit/output/Memoire_DSS_Logistique_ElBayadh.docx
@@ -202,7 +202,7 @@
         </w:tc>
       </w:tr>
     </w:tbl>
-    <w:bookmarkStart w:id="9" w:name="الملخص"/>
+    <w:bookmarkStart w:id="9" w:name="إهداء"/>
     <w:p>
       <w:pPr>
         <w:pStyle w:val="Heading2"/>
@@ -214,7 +214,7 @@
           <w:sz w:val="36"/>
           <w:rtl/>
         </w:rPr>
-        <w:t xml:space="preserve">الملخص</w:t>
+        <w:t xml:space="preserve">إهداء</w:t>
       </w:r>
     </w:p>
     <w:p>
@@ -231,6 +231,144 @@
           <w:sz w:val="28"/>
           <w:rtl/>
         </w:rPr>
+        <w:t xml:space="preserve">أهدي ثمرة هذا الجهد المتواضع إلى والديّ الكريمين اللذين لم يبخلا عليّ يوماً بالدعم والحنان والتشجيع، وإلى كل من أضاء دربي من أساتذة ومشرفين وزملاء طوال مسيرتي التكوينية.</w:t>
+      </w:r>
+      <w:r>
+        <w:rPr>
+          <w:rFonts w:ascii="Traditional Arabic" w:hAnsi="Traditional Arabic"/>
+          <w:sz w:val="28"/>
+          <w:rtl/>
+        </w:rPr>
+        <w:t xml:space="preserve"> </w:t>
+      </w:r>
+      <w:r>
+        <w:rPr>
+          <w:rFonts w:ascii="Traditional Arabic" w:hAnsi="Traditional Arabic"/>
+          <w:b/>
+          <w:bCs/>
+          <w:sz w:val="28"/>
+          <w:rtl/>
+        </w:rPr>
+        <w:t xml:space="preserve">وإلى كل من آمن بأن التكنولوجيا أداة لخدمة الإدارة الجزائرية وتطويرها، وإلى كل من يؤمن بأن الرقمنة ليست ترفاً بل ضرورة تشغيلية.</w:t>
+      </w:r>
+    </w:p>
+    <w:bookmarkEnd w:id="9"/>
+    <w:bookmarkStart w:id="10" w:name="شكر-وتقدير"/>
+    <w:p>
+      <w:pPr>
+        <w:pStyle w:val="Heading2"/>
+        <w:bidi/>
+      </w:pPr>
+      <w:r>
+        <w:rPr>
+          <w:b/>
+          <w:sz w:val="36"/>
+          <w:rtl/>
+        </w:rPr>
+        <w:t xml:space="preserve">شكر وتقدير</w:t>
+      </w:r>
+    </w:p>
+    <w:p>
+      <w:pPr>
+        <w:bidi/>
+        <w:spacing w:line="360" w:lineRule="auto"/>
+        <w:jc w:val="right"/>
+      </w:pPr>
+      <w:r>
+        <w:rPr>
+          <w:rFonts w:ascii="Traditional Arabic" w:hAnsi="Traditional Arabic"/>
+          <w:b/>
+          <w:bCs/>
+          <w:sz w:val="28"/>
+          <w:rtl/>
+        </w:rPr>
+        <w:t xml:space="preserve">أتقدم بجزيل الشكر والعرفان إلى الأستاذة المشرفة دهيني ميمونة التي لم تبخل بتوجيهاتها ونصائحها القيمة في جميع مراحل إعداد هذا العمل.</w:t>
+      </w:r>
+      <w:r>
+        <w:rPr>
+          <w:rFonts w:ascii="Traditional Arabic" w:hAnsi="Traditional Arabic"/>
+          <w:sz w:val="28"/>
+          <w:rtl/>
+        </w:rPr>
+        <w:t xml:space="preserve"> </w:t>
+      </w:r>
+      <w:r>
+        <w:rPr>
+          <w:rFonts w:ascii="Traditional Arabic" w:hAnsi="Traditional Arabic"/>
+          <w:b/>
+          <w:bCs/>
+          <w:sz w:val="28"/>
+          <w:rtl/>
+        </w:rPr>
+        <w:t xml:space="preserve">كما أتوجه بالشكر الجزيل إلى إطارات المعهد الوطني المتخصص في التكوين المهني بن سعيدي عبد العاطي بالبيض على ما أبدوه من دعم لوجستي ومنهجي طوال فترة التكوين.</w:t>
+      </w:r>
+      <w:r>
+        <w:rPr>
+          <w:rFonts w:ascii="Traditional Arabic" w:hAnsi="Traditional Arabic"/>
+          <w:sz w:val="28"/>
+          <w:rtl/>
+        </w:rPr>
+        <w:t xml:space="preserve"> </w:t>
+      </w:r>
+      <w:r>
+        <w:rPr>
+          <w:rFonts w:ascii="Traditional Arabic" w:hAnsi="Traditional Arabic"/>
+          <w:b/>
+          <w:bCs/>
+          <w:sz w:val="28"/>
+          <w:rtl/>
+        </w:rPr>
+        <w:t xml:space="preserve">وأخص بالذكر السيد مسؤول مصلحة المخازن بمديرية التربية لولاية البيض الذي أتاح لنا فرصة التربص وفتح لنا أبواب المعرفة الميدانية، وقدم لنا كل التسهيلات الضرورية لإنجاز هذا البحث.</w:t>
+      </w:r>
+      <w:r>
+        <w:rPr>
+          <w:rFonts w:ascii="Traditional Arabic" w:hAnsi="Traditional Arabic"/>
+          <w:sz w:val="28"/>
+          <w:rtl/>
+        </w:rPr>
+        <w:t xml:space="preserve"> </w:t>
+      </w:r>
+      <w:r>
+        <w:rPr>
+          <w:rFonts w:ascii="Traditional Arabic" w:hAnsi="Traditional Arabic"/>
+          <w:b/>
+          <w:bCs/>
+          <w:sz w:val="28"/>
+          <w:rtl/>
+        </w:rPr>
+        <w:t xml:space="preserve">وإلى لجنة المناقشة الموقرة على تفضلها بقراءة هذا العمل وتقييمه.</w:t>
+      </w:r>
+    </w:p>
+    <w:bookmarkEnd w:id="10"/>
+    <w:bookmarkStart w:id="11" w:name="الملخص"/>
+    <w:p>
+      <w:pPr>
+        <w:pStyle w:val="Heading2"/>
+        <w:bidi/>
+      </w:pPr>
+      <w:r>
+        <w:rPr>
+          <w:b/>
+          <w:sz w:val="36"/>
+          <w:rtl/>
+        </w:rPr>
+        <w:t xml:space="preserve">الملخص</w:t>
+      </w:r>
+    </w:p>
+    <w:p>
+      <w:pPr>
+        <w:bidi/>
+        <w:spacing w:line="360" w:lineRule="auto"/>
+        <w:jc w:val="right"/>
+      </w:pPr>
+      <w:r>
+        <w:rPr>
+          <w:rFonts w:ascii="Traditional Arabic" w:hAnsi="Traditional Arabic"/>
+          <w:b/>
+          <w:bCs/>
+          <w:sz w:val="28"/>
+          <w:rtl/>
+        </w:rPr>
         <w:t xml:space="preserve">تتناول هذه الدراسة بالتحليل والبحث إشكالية التسيير اليدوي للمخزون في مخزن مديرية التربية لولاية البيض، وترمي إلى تصميم وإنجاز نظام دعم قرار متكامل مبني على بيئة Excel/VBA قادر على أتمتة دورة الشراء والتخزين بتكلفة صفرية. اعتمدت الدراسة منهجاً وصفياً تحليلياً في التشخيص الميداني، ومنهجاً تجريبياً تطبيقياً في قياس الأثر، ارتكازاً على بيانات فعلية جُمعت خلال 38 يوم عمل ميداني (شملت 62 معاملة مخزنية). طُبِّقت ثلاثة نماذج كمية على الصنف المرجعي ART-001 (حبر الطابعة Toner G030): نموذج ويلسون الذي أنتج كمية طلب اقتصادية Q* = 37 وحدة، ونقطة إعادة طلب ROP = 206 وحدة، ومخزون أمان SS = 200 وحدة. كشفت نتائج التطبيق أن النظام خفَّض وقت معالجة الطلبية الواحدة من 20–30 دقيقة إلى أقل من 5 ثوانٍ، أي بنسبة تخفيض 99.7%، مع إلغاء جميع حالات النفاد المسجلة للمواد الاستراتيجية. وتأتي هذه النتائج لتؤكد صحة الفرضيتين المُصاغتين في المقدمة وتؤكد جدوى التحول الرقمي في مؤسسات القطاع التربوي الجزائري.</w:t>
       </w:r>
       <w:r>
@@ -252,8 +390,8 @@
         <w:t xml:space="preserve">الكلمات المفتاحية: نظام دعم القرار، تسيير المخزونات، نموذج ويلسون، تحليل ABC، Excel/VBA، القطاع التربوي.</w:t>
       </w:r>
     </w:p>
-    <w:bookmarkEnd w:id="9"/>
-    <w:bookmarkStart w:id="10" w:name="résumé"/>
+    <w:bookmarkEnd w:id="11"/>
+    <w:bookmarkStart w:id="12" w:name="résumé"/>
     <w:p>
       <w:pPr>
         <w:pStyle w:val="Heading2"/>
@@ -311,8 +449,8 @@
         <w:t xml:space="preserve">Mots-clés : Système d’aide à la décision, gestion des stocks, modèle de Wilson, .analyse ABC, Excel/VBA, secteur éducatif</w:t>
       </w:r>
     </w:p>
-    <w:bookmarkEnd w:id="10"/>
-    <w:bookmarkStart w:id="18" w:name="المقدمة-العامة"/>
+    <w:bookmarkEnd w:id="12"/>
+    <w:bookmarkStart w:id="20" w:name="المقدمة-العامة"/>
     <w:p>
       <w:pPr>
         <w:pStyle w:val="Heading1"/>
@@ -327,7 +465,7 @@
         <w:t xml:space="preserve">المقدمة العامة</w:t>
       </w:r>
     </w:p>
-    <w:bookmarkStart w:id="11" w:name="تمهيد"/>
+    <w:bookmarkStart w:id="13" w:name="تمهيد"/>
     <w:p>
       <w:pPr>
         <w:pStyle w:val="Heading2"/>
@@ -357,8 +495,8 @@
         <w:t xml:space="preserve">يُشكِّل التسيير اللوجيستي الفعّال للمخزونات ركيزةً جوهريةً من ركائز الأداء المؤسسي في القطاع العام، حيث ترتبط جودة الخدمة العمومية ارتباطاً وثيقاً بتوفر المواد والتجهيزات الضرورية في الوقت والمكان المناسبين. في قطاع التربية الوطنية، يتجلى هذا الارتباط بصورة خاصة، إذ أن انقطاع المواد الاستراتيجية كأحبار الطابعات وورق الامتحانات في فترات الذروة كالامتحانات الفصلية قد يؤدي إلى تعطيل العملية التربوية برمتها. من هذا المنطلق، تبرز الحاجة الملحة إلى تطوير أنظمة تسيير رقمية قادرة على تجاوز القيود البنيوية للنظم اليدوية التقليدية، مع مراعاة خصوصية القطاع العام الجزائري والإطار التنظيمي الذي يحكمه.</w:t>
       </w:r>
     </w:p>
-    <w:bookmarkEnd w:id="11"/>
-    <w:bookmarkStart w:id="12" w:name="الإشكالية"/>
+    <w:bookmarkEnd w:id="13"/>
+    <w:bookmarkStart w:id="14" w:name="الإشكالية"/>
     <w:p>
       <w:pPr>
         <w:pStyle w:val="Heading2"/>
@@ -406,8 +544,8 @@
         <w:t xml:space="preserve">كيف يمكن أتمتة دورة الشراء والتخزين وتعزيز الجرد الدائم في مخزن مؤسسة عمومية باستخدام أدوات Microsoft Office المتاحة (Excel/VBA) وبأقل تكلفة ممكنة، مع ضمان دقة البيانات واستمرارية التزويد؟</w:t>
       </w:r>
     </w:p>
-    <w:bookmarkEnd w:id="12"/>
-    <w:bookmarkStart w:id="13" w:name="الفرضيات"/>
+    <w:bookmarkEnd w:id="14"/>
+    <w:bookmarkStart w:id="15" w:name="الفرضيات"/>
     <w:p>
       <w:pPr>
         <w:pStyle w:val="Heading2"/>
@@ -505,8 +643,8 @@
         <w:t xml:space="preserve">الفرضية الثانية: يمكن لنظام دعم القرار مبني على Excel/VBA أن يُحسِّن دقة التتبع المخزني ويُقلِّص وقت معالجة الطلبيات بصورة ملموسة وقابلة للقياس، دون الحاجة إلى استثمارات مالية إضافية.</w:t>
       </w:r>
     </w:p>
-    <w:bookmarkEnd w:id="13"/>
-    <w:bookmarkStart w:id="14" w:name="أهداف-الدراسة"/>
+    <w:bookmarkEnd w:id="15"/>
+    <w:bookmarkStart w:id="16" w:name="أهداف-الدراسة"/>
     <w:p>
       <w:pPr>
         <w:pStyle w:val="Heading2"/>
@@ -616,8 +754,8 @@
         <w:t xml:space="preserve">- تقديم توصيات عملية قابلة للتنفيذ لتعميم التجربة على نطاق أوسع.</w:t>
       </w:r>
     </w:p>
-    <w:bookmarkEnd w:id="14"/>
-    <w:bookmarkStart w:id="15" w:name="منهجية-البحث"/>
+    <w:bookmarkEnd w:id="16"/>
+    <w:bookmarkStart w:id="17" w:name="منهجية-البحث"/>
     <w:p>
       <w:pPr>
         <w:pStyle w:val="Heading2"/>
@@ -647,8 +785,8 @@
         <w:t xml:space="preserve">اعتمدت الدراسة منهجاً علمياً يجمع بين المنهج الوصفي التحليلي في رسم صورة دقيقة للواقع الميداني، والمنهج التجريبي التطبيقي في قياس أثر الحل المقترح. استندت عملية جمع البيانات إلى ثلاث أدوات رئيسية: أولاً: الملاحظة المباشرة والمشاركة في سير العمل اليومي لمصلحة المخازن، ثانياً: تحليل السجلات والوثائق المخزنية الفعلية، وثالثاً: المقابلات غير المقننة مع المسؤولين والعاملين في المصلحة. أما مرحلة التصميم والتطوير، فقد اعتمدت على دورة حياة تطوير الأنظمة في نسقتها المُصغَّرة، مع التركيز على النمذجة السريعة والتطوير التكراري.</w:t>
       </w:r>
     </w:p>
-    <w:bookmarkEnd w:id="15"/>
-    <w:bookmarkStart w:id="16" w:name="هيكل-الدراسة"/>
+    <w:bookmarkEnd w:id="17"/>
+    <w:bookmarkStart w:id="18" w:name="هيكل-الدراسة"/>
     <w:p>
       <w:pPr>
         <w:pStyle w:val="Heading2"/>
@@ -678,8 +816,8 @@
         <w:t xml:space="preserve">تنقسم هذه المذكرة إلى أربعة فصول رئيسية تتبع تسلسلاً منطقياً من النظري إلى التطبيقي. يُؤسس الفصل الأول الإطار النظري والمفاهيمي للتسيير اللوجيستي وإدارة المخزونات، مستعرضاً النماذج الكمية وأدوات التقييم المحاسبي. وينتقل الفصل الثاني إلى الإطار العملي والتشخيص الميداني، حيث يُقدِّم المؤسسة محل الدراسة ويُطبِّق أدوات التحليل على بياناتها الفعلية. ويُخصص الفصل الثالث لتفصيل تصميم وإنجاز نظام دعم القرار المقترح مع شرح معمق لهندسته ووحداته البرمجية. أما الفصل الرابع، فيُعرض نتائج التجريب والتحقق من صحة الفرضيات، مُختتماً بالتوصيات والآفاق المستقبلية في ملف منفصل.</w:t>
       </w:r>
     </w:p>
-    <w:bookmarkEnd w:id="16"/>
-    <w:bookmarkStart w:id="17" w:name="Xf59180c5cc222249dc6a39c05bc19cdf400d056"/>
+    <w:bookmarkEnd w:id="18"/>
+    <w:bookmarkStart w:id="19" w:name="Xf59180c5cc222249dc6a39c05bc19cdf400d056"/>
     <w:p>
       <w:pPr>
         <w:pStyle w:val="Heading2"/>
@@ -2218,9 +2356,9 @@
         </w:tc>
       </w:tr>
     </w:tbl>
-    <w:bookmarkEnd w:id="17"/>
-    <w:bookmarkEnd w:id="18"/>
-    <w:bookmarkStart w:id="49" w:name="Xdded5c7f65391e1348f873ece249db48d441899"/>
+    <w:bookmarkEnd w:id="19"/>
+    <w:bookmarkEnd w:id="20"/>
+    <w:bookmarkStart w:id="51" w:name="Xdded5c7f65391e1348f873ece249db48d441899"/>
     <w:p>
       <w:pPr>
         <w:pStyle w:val="Heading1"/>
@@ -2266,7 +2404,7 @@
         <w:t xml:space="preserve">يُعدّ هذا الفصل الركيزة النظرية التي تنبني عليها فصول الدراسة كلها. يستعرض المبحث الأول المفاهيم الأساسية للتسيير اللوجيستي وسلسلة التوريد ودور المستودعات، ثم ينتقل المبحث الثاني إلى تسيير المخزونات في القطاع العام والإطار التنظيمي الجزائري الذي يحكم عمليات التموين والمشتريات. ويتناول المبحث الثالث إدارة الشراء والدورة المستندية كحلقة وصل بين الاحتياجات الميدانية والتوريد الفعلي. ويُخصص المبحث الرابع لأدوات التقييم المحاسبي للمخزون (ABC، EOQ، ROP، CMUP، FIFO) مع أمثلة تطبيقية مستمدة من بيانات المشروع. وأخيراً، يستعرض المبحث الخامس تقييم الموردين ومفهوم الأنظمة المندمجة (ERP) كإطار مفاهيمي للحل الرقمي المقترح.</w:t>
       </w:r>
     </w:p>
-    <w:bookmarkStart w:id="26" w:name="X948e1094553a531d6db6f4893473d29311c3135"/>
+    <w:bookmarkStart w:id="28" w:name="X948e1094553a531d6db6f4893473d29311c3135"/>
     <w:p>
       <w:pPr>
         <w:pStyle w:val="Heading2"/>
@@ -2281,7 +2419,7 @@
         <w:t xml:space="preserve">المبحث الأول: المفاهيم الأساسية للتسيير اللوجيستي</w:t>
       </w:r>
     </w:p>
-    <w:bookmarkStart w:id="20" w:name="X247cbabf78344c01f65d8fa3842cf79ae40a79e"/>
+    <w:bookmarkStart w:id="22" w:name="X247cbabf78344c01f65d8fa3842cf79ae40a79e"/>
     <w:p>
       <w:pPr>
         <w:pStyle w:val="Heading3"/>
@@ -2340,7 +2478,7 @@
           <w:rFonts w:ascii="Traditional Arabic" w:hAnsi="Traditional Arabic"/>
           <w:sz w:val="28"/>
         </w:rPr>
-        <w:footnoteReference w:id="19"/>
+        <w:footnoteReference w:id="21"/>
       </w:r>
       <w:r>
         <w:rPr>
@@ -2351,8 +2489,8 @@
         <w:t xml:space="preserve">. وقد تفرعت عن هذا المفهوم عدة مدارس فكرية: المدرسة الكلاسيكية التي ركزت على خفض التكاليف المنفردة، والمدرسة الشاملة التي نظرت إلى النظام اللوجيستي ككل متكامل (Total Cost Concept)، والمدرسة الحديثة التي تدمج التكنولوجيا والذكاء الاصطناعي في صلب العملية اللوجيستية. في السياق الجزائري، تكتسب اللوجستيك العمومية خصوصية إضافية، إذ تتفاعل مع قيود تنظيمية وميزانياتية صارمة تستوجب حلولاً مبتكرة ومنخفضة التكلفة في آنٍ واحد.</w:t>
       </w:r>
     </w:p>
-    <w:bookmarkEnd w:id="20"/>
-    <w:bookmarkStart w:id="22" w:name="X78f649da7f72f06c121a511f1800ef6cecef41e"/>
+    <w:bookmarkEnd w:id="22"/>
+    <w:bookmarkStart w:id="24" w:name="X78f649da7f72f06c121a511f1800ef6cecef41e"/>
     <w:p>
       <w:pPr>
         <w:pStyle w:val="Heading3"/>
@@ -2451,7 +2589,7 @@
           <w:rFonts w:ascii="Traditional Arabic" w:hAnsi="Traditional Arabic"/>
           <w:sz w:val="28"/>
         </w:rPr>
-        <w:footnoteReference w:id="21"/>
+        <w:footnoteReference w:id="23"/>
       </w:r>
       <w:r>
         <w:rPr>
@@ -2462,8 +2600,8 @@
         <w:t xml:space="preserve">: إدارة العلاقات مع الزبائن، إدارة خدمة الزبائن، إدارة الطلب، تنفيذ الطلبيات، إدارة تدفق الإنتاج، إدارة العلاقات مع الموردين، تطوير المنتجات وتسويقها، وإدارة المرتجعات. في سياق الدراسة الحالية، تتبنى مديرية التربية ثلاثة من هذه العمليات بصورة رئيسية: إدارة الطلب (تقدير احتياجات المؤسسات التعليمية)، تنفيذ الطلبيات (دورة الشراء)، وإدارة العلاقات مع الموردين (تقييم الموردين واختيارهم). يهدف تكامل هذه العمليات إلى تحسين قيمة السلسلة ككل عبر تقليل الهدر، وتحسين سرعة الاستجابة للاحتياجات الطارئة، وتقليل التكاليف الإجمالية للتزويد والتخزين.</w:t>
       </w:r>
     </w:p>
-    <w:bookmarkEnd w:id="22"/>
-    <w:bookmarkStart w:id="25" w:name="دور-المستودعات-وتصنيفها"/>
+    <w:bookmarkEnd w:id="24"/>
+    <w:bookmarkStart w:id="27" w:name="دور-المستودعات-وتصنيفها"/>
     <w:p>
       <w:pPr>
         <w:pStyle w:val="Heading3"/>
@@ -2506,7 +2644,7 @@
           <w:rFonts w:ascii="Traditional Arabic" w:hAnsi="Traditional Arabic"/>
           <w:sz w:val="28"/>
         </w:rPr>
-        <w:footnoteReference w:id="23"/>
+        <w:footnoteReference w:id="25"/>
       </w:r>
       <w:r>
         <w:rPr>
@@ -2668,7 +2806,7 @@
           <w:rFonts w:ascii="Traditional Arabic" w:hAnsi="Traditional Arabic"/>
           <w:sz w:val="28"/>
         </w:rPr>
-        <w:footnoteReference w:id="24"/>
+        <w:footnoteReference w:id="26"/>
       </w:r>
       <w:r>
         <w:rPr>
@@ -2681,9 +2819,9 @@
         <w:t xml:space="preserve">.</w:t>
       </w:r>
     </w:p>
-    <w:bookmarkEnd w:id="25"/>
-    <w:bookmarkEnd w:id="26"/>
-    <w:bookmarkStart w:id="32" w:name="Xb98e67e6d1739a4d79f518326bb9bac61b25523"/>
+    <w:bookmarkEnd w:id="27"/>
+    <w:bookmarkEnd w:id="28"/>
+    <w:bookmarkStart w:id="34" w:name="Xb98e67e6d1739a4d79f518326bb9bac61b25523"/>
     <w:p>
       <w:pPr>
         <w:pStyle w:val="Heading2"/>
@@ -2698,7 +2836,7 @@
         <w:t xml:space="preserve">المبحث الثاني: تسيير المخزونات في القطاع العام</w:t>
       </w:r>
     </w:p>
-    <w:bookmarkStart w:id="27" w:name="X4346af033012f584f0f53ef9c9230c3d59e87ac"/>
+    <w:bookmarkStart w:id="29" w:name="X4346af033012f584f0f53ef9c9230c3d59e87ac"/>
     <w:p>
       <w:pPr>
         <w:pStyle w:val="Heading3"/>
@@ -2796,8 +2934,8 @@
         <w:t xml:space="preserve">التجهيزات الدائمة: كالحواسيب، والطابعات، والمعدات المكتبية، والأثاث المدرسي التي تُسجّل في سجل الممتلكات وتخضع لعمليات متابعة خاصة ودورية وفقاً للتعليمات التنظيمية الصادرة عن وزارة التربية الوطنية. تختلف دورة حياة هذه التجهيزات باختلاف نوعها، لكنها غالباً ما تمتد لعدة سنوات، وتتطلب آليات متابعة مختلفة عن المواد الاستهلاكية.</w:t>
       </w:r>
     </w:p>
-    <w:bookmarkEnd w:id="27"/>
-    <w:bookmarkStart w:id="28" w:name="ثانيا-أهمية-تسيير-المخزون"/>
+    <w:bookmarkEnd w:id="29"/>
+    <w:bookmarkStart w:id="30" w:name="ثانيا-أهمية-تسيير-المخزون"/>
     <w:p>
       <w:pPr>
         <w:pStyle w:val="Heading3"/>
@@ -3003,8 +3141,8 @@
         <w:t xml:space="preserve">وظيفة دعم القرار (Decision Support): تُشكّل بيانات المخزون الدقيقة (الاستهلاكات الفعلية، معدلات الدوران، اتجاهات الطلب) مدخلاً أساسياً لتخطيط الميزانية السنوية وتقدير احتياجات الفترة المالية القادمة. هذا البعد الاستراتيجي غالباً ما يُهمَل في النظم اليدوية التي تفتقر إلى أدوات التحليل والاستخراج الآلي للمؤشرات.</w:t>
       </w:r>
     </w:p>
-    <w:bookmarkEnd w:id="28"/>
-    <w:bookmarkStart w:id="31" w:name="ثالثا-الإطار-التنظيمي-الجزائري"/>
+    <w:bookmarkEnd w:id="30"/>
+    <w:bookmarkStart w:id="33" w:name="ثالثا-الإطار-التنظيمي-الجزائري"/>
     <w:p>
       <w:pPr>
         <w:pStyle w:val="Heading3"/>
@@ -3051,7 +3189,7 @@
           <w:rFonts w:ascii="Traditional Arabic" w:hAnsi="Traditional Arabic"/>
           <w:sz w:val="28"/>
         </w:rPr>
-        <w:footnoteReference w:id="29"/>
+        <w:footnoteReference w:id="31"/>
       </w:r>
       <w:r>
         <w:rPr>
@@ -3329,7 +3467,7 @@
           <w:rFonts w:ascii="Traditional Arabic" w:hAnsi="Traditional Arabic"/>
           <w:sz w:val="28"/>
         </w:rPr>
-        <w:footnoteReference w:id="30"/>
+        <w:footnoteReference w:id="32"/>
       </w:r>
       <w:r>
         <w:rPr>
@@ -3342,9 +3480,9 @@
         <w:t xml:space="preserve">. يُشكّل هذا الإعفاء متغيراً جوهرياً في حساب التكاليف الفعلية للمشتريات، إذ يعني أن الأسعار المُدرجة في أوامر الشراء هي أسعار نهائية خالية من الرسم، مما يُبسِّط معادلة التكلفة الإجمالية ويجعل القيمة المُستخدمة في نموذج ويلسون (PU = 4,500 دج للوحدة) قيمةً صافيةً مطابقةً للواقع المالي الفعلي للمؤسسة. يُشكّل هذا الإطار التنظيمي الحجر الزاوية الذي يحدد متطلبات النظام المقترح. فبما أن القانون يُلزِم بدقة التتبع والجرد والتوثيق (المرسوم الرئاسي 15-247، 2015؛ قانون المالية سنوي)، فإن نظام دعم القرار v13.3 صُمِّم ليتوافق مع هذه المتطلبات عبر توفير سجل حركات رقمي غير قابل للتعديل (Immutable Audit Trail)، وتقارير جرد آلية، ونظام توثيق إلكتروني يُحاكي الدورة المستندية القانونية.</w:t>
       </w:r>
     </w:p>
-    <w:bookmarkEnd w:id="31"/>
-    <w:bookmarkEnd w:id="32"/>
-    <w:bookmarkStart w:id="37" w:name="X0b33a1787aeef4eb8491627c0fcc2828f98e578"/>
+    <w:bookmarkEnd w:id="33"/>
+    <w:bookmarkEnd w:id="34"/>
+    <w:bookmarkStart w:id="39" w:name="X0b33a1787aeef4eb8491627c0fcc2828f98e578"/>
     <w:p>
       <w:pPr>
         <w:pStyle w:val="Heading2"/>
@@ -3359,7 +3497,7 @@
         <w:t xml:space="preserve">المبحث الثالث: إدارة الشراء والدورة المستندية</w:t>
       </w:r>
     </w:p>
-    <w:bookmarkStart w:id="34" w:name="وظيفة-الشراء-procurement-function"/>
+    <w:bookmarkStart w:id="36" w:name="وظيفة-الشراء-procurement-function"/>
     <w:p>
       <w:pPr>
         <w:pStyle w:val="Heading3"/>
@@ -3446,7 +3584,7 @@
           <w:rFonts w:ascii="Traditional Arabic" w:hAnsi="Traditional Arabic"/>
           <w:sz w:val="28"/>
         </w:rPr>
-        <w:footnoteReference w:id="33"/>
+        <w:footnoteReference w:id="35"/>
       </w:r>
       <w:r>
         <w:rPr>
@@ -3459,8 +3597,8 @@
         <w:t xml:space="preserve">: تحديد المواصفات، اختيار الموردين، التفاوض وإبرام العقد، إصدار أمر الشراء، متابعة التسليم، والتقييم البعدي. في سياق الدراسة الحالية، تنحصر وظيفة الشراء في المراحل المباشرة (إصدار الأمر واستلام البضاعة) بسبب محدودية صلاحيات المندوبين في القطاع العام، حيث تتركز صلاحيات التعاقد في الإدارة المركزية أو الهيئات الوصية.</w:t>
       </w:r>
     </w:p>
-    <w:bookmarkEnd w:id="34"/>
-    <w:bookmarkStart w:id="35" w:name="الدورة-المستندية-في-الإدارة-العمومية"/>
+    <w:bookmarkEnd w:id="36"/>
+    <w:bookmarkStart w:id="37" w:name="الدورة-المستندية-في-الإدارة-العمومية"/>
     <w:p>
       <w:pPr>
         <w:pStyle w:val="Heading3"/>
@@ -3694,8 +3832,8 @@
         <w:t xml:space="preserve">الفاتورة: بعد المطابقة بين أمر الشراء ووصل الاستلام والفاتورة (ثلاثية المطابقة)، تُحال الفاتورة إلى مصلحة المالية لإتمام عملية الدفع في الآجال المحددة قانوناً. في النظام اليدوي الحالي، تتطلب هذه الدورة تداولاً مادياً للوثائق بين 4 مصالح مختلفة (الطالبة، الوسائل، المالية، المدير)، مما يُطيل زمن الدورة ويزيد من احتمالية فقدان الوثائق أو تأخيرها. أظهرت المشاهدة الميدانية أن متوسط زمن استكمال الدورة المستندية الكاملة في النظام الحالي يتراوح بين 15 و30 يوماً، وهو ما يُبرّر الحاجة إلى رقمنة هذه الدورة لتقليص الزمن وتحسين التتبع.</w:t>
       </w:r>
     </w:p>
-    <w:bookmarkEnd w:id="35"/>
-    <w:bookmarkStart w:id="36" w:name="التكامل-بين-الشراء-والتخزين"/>
+    <w:bookmarkEnd w:id="37"/>
+    <w:bookmarkStart w:id="38" w:name="التكامل-بين-الشراء-والتخزين"/>
     <w:p>
       <w:pPr>
         <w:pStyle w:val="Heading3"/>
@@ -3757,9 +3895,9 @@
         <w:t xml:space="preserve">للمعلومات، حيث تُجرى عملية الشراء بناءً على بيانات قديمة أو غير دقيقة عن الرصيد الحقيقي، مما يُؤدي إما إلى التكديس أو النفاد. من هنا تنبع أهمية النظام المُقترح الذي يُحقّق التكامل الآني بين الوظيفتين عبر قاعدة بيانات موحدة ومحرك VBA يُحدّث كافة المؤشرات بشكل فوري عند كل حركة مخزنية.</w:t>
       </w:r>
     </w:p>
-    <w:bookmarkEnd w:id="36"/>
-    <w:bookmarkEnd w:id="37"/>
-    <w:bookmarkStart w:id="44" w:name="Xe71e4b4fd93dee69f233a0223a30763675d81f6"/>
+    <w:bookmarkEnd w:id="38"/>
+    <w:bookmarkEnd w:id="39"/>
+    <w:bookmarkStart w:id="46" w:name="Xe71e4b4fd93dee69f233a0223a30763675d81f6"/>
     <w:p>
       <w:pPr>
         <w:pStyle w:val="Heading2"/>
@@ -3774,7 +3912,7 @@
         <w:t xml:space="preserve">المبحث الرابع: أدوات التقييم المحاسبي للمخزون</w:t>
       </w:r>
     </w:p>
-    <w:bookmarkStart w:id="39" w:name="أولا-تحليل-abc"/>
+    <w:bookmarkStart w:id="41" w:name="أولا-تحليل-abc"/>
     <w:p>
       <w:pPr>
         <w:pStyle w:val="Heading3"/>
@@ -3921,7 +4059,7 @@
           <w:rFonts w:ascii="Traditional Arabic" w:hAnsi="Traditional Arabic"/>
           <w:sz w:val="28"/>
         </w:rPr>
-        <w:footnoteReference w:id="38"/>
+        <w:footnoteReference w:id="40"/>
       </w:r>
       <w:r>
         <w:rPr>
@@ -3934,8 +4072,8 @@
         <w:t xml:space="preserve">.</w:t>
       </w:r>
     </w:p>
-    <w:bookmarkEnd w:id="39"/>
-    <w:bookmarkStart w:id="41" w:name="X44798d37eec6a2af9f8be4fa3f7a1f92b208602"/>
+    <w:bookmarkEnd w:id="41"/>
+    <w:bookmarkStart w:id="43" w:name="X44798d37eec6a2af9f8be4fa3f7a1f92b208602"/>
     <w:p>
       <w:pPr>
         <w:pStyle w:val="Heading3"/>
@@ -3982,7 +4120,7 @@
           <w:rFonts w:ascii="Traditional Arabic" w:hAnsi="Traditional Arabic"/>
           <w:sz w:val="28"/>
         </w:rPr>
-        <w:footnoteReference w:id="40"/>
+        <w:footnoteReference w:id="42"/>
       </w:r>
       <w:r>
         <w:rPr>
@@ -4313,8 +4451,8 @@
         <w:t xml:space="preserve">وهذا يعني أنه يجب تقديم طلبية واحدة كل 365/9 ≈ 40 يوماً، وهو تردد معقول مقارنة بأجال التموين في مؤسسات القطاع العام.</w:t>
       </w:r>
     </w:p>
-    <w:bookmarkEnd w:id="41"/>
-    <w:bookmarkStart w:id="42" w:name="ثالثا-نقطة-إعادة-الطلب-ومخزون-الأمان"/>
+    <w:bookmarkEnd w:id="43"/>
+    <w:bookmarkStart w:id="44" w:name="ثالثا-نقطة-إعادة-الطلب-ومخزون-الأمان"/>
     <w:p>
       <w:pPr>
         <w:pStyle w:val="Heading3"/>
@@ -4379,8 +4517,8 @@
         <w:t xml:space="preserve">تطبيق (بناءً على بيانات المشروع الحقيقية): بفرض استهلاك يومي قدره 6.184 وحدة (= D/250 = 789/250)، وأجل تسليم (LT) قدره 2 يوم، ومخزون أمان (SS) قدره 200 وحدة: ROP = (6.184 × 2) + 200 = 206 وحدة**</w:t>
       </w:r>
     </w:p>
-    <w:bookmarkEnd w:id="42"/>
-    <w:bookmarkStart w:id="43" w:name="رابعا-طرق-تقييم-المخزون"/>
+    <w:bookmarkEnd w:id="44"/>
+    <w:bookmarkStart w:id="45" w:name="رابعا-طرق-تقييم-المخزون"/>
     <w:p>
       <w:pPr>
         <w:pStyle w:val="Heading3"/>
@@ -4508,9 +4646,9 @@
         <w:t xml:space="preserve">**</w:t>
       </w:r>
     </w:p>
-    <w:bookmarkEnd w:id="43"/>
-    <w:bookmarkEnd w:id="44"/>
-    <w:bookmarkStart w:id="48" w:name="المبحث-الخامس-تقييم-الموردين-ومفهوم-erp"/>
+    <w:bookmarkEnd w:id="45"/>
+    <w:bookmarkEnd w:id="46"/>
+    <w:bookmarkStart w:id="50" w:name="المبحث-الخامس-تقييم-الموردين-ومفهوم-erp"/>
     <w:p>
       <w:pPr>
         <w:pStyle w:val="Heading2"/>
@@ -4525,7 +4663,7 @@
         <w:t xml:space="preserve">المبحث الخامس: تقييم الموردين ومفهوم ERP</w:t>
       </w:r>
     </w:p>
-    <w:bookmarkStart w:id="45" w:name="تقييم-الموردين-supplier-evaluation"/>
+    <w:bookmarkStart w:id="47" w:name="تقييم-الموردين-supplier-evaluation"/>
     <w:p>
       <w:pPr>
         <w:pStyle w:val="Heading3"/>
@@ -4691,8 +4829,8 @@
         <w:t xml:space="preserve">الموثوقية والخدمة (Reliability &amp; Service): سرعة الاستجابة للمشاكل، ومرونة التعامل، وتقديم الدعم الفني إذا لزم الأمر.</w:t>
       </w:r>
     </w:p>
-    <w:bookmarkEnd w:id="45"/>
-    <w:bookmarkStart w:id="47" w:name="Xb68060b29c3c1e1f393cce9f99a443e0fc48320"/>
+    <w:bookmarkEnd w:id="47"/>
+    <w:bookmarkStart w:id="49" w:name="Xb68060b29c3c1e1f393cce9f99a443e0fc48320"/>
     <w:p>
       <w:pPr>
         <w:pStyle w:val="Heading3"/>
@@ -4739,7 +4877,7 @@
           <w:rFonts w:ascii="Traditional Arabic" w:hAnsi="Traditional Arabic"/>
           <w:sz w:val="28"/>
         </w:rPr>
-        <w:footnoteReference w:id="46"/>
+        <w:footnoteReference w:id="48"/>
       </w:r>
       <w:r>
         <w:rPr>
@@ -4905,10 +5043,10 @@
         <w:t xml:space="preserve">خلاصة الفصل الأول خلص هذا الفصل إلى تأسيس قاعدة نظرية متكاملة تستجيب لمتطلبات الدراسة الميدانية. فقد تبيّن أن المخزون ليس مجرد كومة من البضائع، بل هو نظام حيوي مترابط تتشابك فيه تكاليف الإصدار والاحتفاظ وتكاليف النفاد. كما أثبتت نماذج الإدارة الكمية (Wilson، ABC) قدرتها على توفير معطيات دقيقة تدعم قرارات التموين. وقد بات جلياً أن اعتماد الجرد الدائم المحوسب بطريقة CMUP هو الخيار الأمثل لتحقيق الشفافية والكفاءة في مخزن مديرية التربية لولاية البيض. وبناءً على هذا الإطار النظري، ينتقل الفصل الثاني إلى الإطار العملي والتشخيص الميداني في مديرية التربية لولاية البيض. — نهاية الفصل الأول —</w:t>
       </w:r>
     </w:p>
-    <w:bookmarkEnd w:id="47"/>
-    <w:bookmarkEnd w:id="48"/>
     <w:bookmarkEnd w:id="49"/>
-    <w:bookmarkStart w:id="97" w:name="Xfd09630af81a064bb869de4cc3333972b7b71f8"/>
+    <w:bookmarkEnd w:id="50"/>
+    <w:bookmarkEnd w:id="51"/>
+    <w:bookmarkStart w:id="99" w:name="Xfd09630af81a064bb869de4cc3333972b7b71f8"/>
     <w:p>
       <w:pPr>
         <w:pStyle w:val="Heading1"/>
@@ -4954,7 +5092,7 @@
         <w:t xml:space="preserve">يُخصص هذا الفصل للإطار الميداني الذي أُجريت فيه الدراسة. يُقدِّم المبحث الأول النماذج الرياضية الثلاثة التي تقوم عليها منهجية التشخيص: نموذج ويلسون للكمية الاقتصادية للطلب، وتحليل ABC وفق مبدأ باريتو، ومصفوفة ABC-XYZ. ثم ينتقل المبحث الثاني إلى توصيف المؤسسة محل الدراسة — مديرية التربية لولاية البيض — ومخازنها من الناحيتين التنظيمية والمادية. ويُختتم الفصل بالمبحث الثالث الذي يتناول التشخيص الميداني: رصد نقاط الضعف الهيكلية، وتحليل البيانات الكمية الميدانية، وتطبيق مصفوفة ABC-XYZ.</w:t>
       </w:r>
     </w:p>
-    <w:bookmarkStart w:id="72" w:name="Xd96d29689cd7b7c28a53e63cb30434c1b4e42ae"/>
+    <w:bookmarkStart w:id="74" w:name="Xd96d29689cd7b7c28a53e63cb30434c1b4e42ae"/>
     <w:p>
       <w:pPr>
         <w:pStyle w:val="Heading2"/>
@@ -4984,7 +5122,7 @@
         <w:t xml:space="preserve">الغرض من هذا المبحث ليس إعادة عرض النماذج النظرية — فهذا ما أُنجز في الفصل الأول — بل توظيفها كأدوات تشخيص كمية للواقع الميداني. ثلاث نماذج متكاملة تُشكِّل هذه الأدوات: نموذج ويلسون للكمية الاقتصادية للطلب، وتحليل ABC، ومصفوفة ABC-XYZ المشتركة.</w:t>
       </w:r>
     </w:p>
-    <w:bookmarkStart w:id="57" w:name="Xfd010b0e6ec43a71a31832c4aa57c4a1ebd67ff"/>
+    <w:bookmarkStart w:id="59" w:name="Xfd010b0e6ec43a71a31832c4aa57c4a1ebd67ff"/>
     <w:p>
       <w:pPr>
         <w:pStyle w:val="Heading3"/>
@@ -4999,7 +5137,7 @@
         <w:t xml:space="preserve">المطلب الأول: نموذج ويلسون للكمية الاقتصادية للطلب</w:t>
       </w:r>
     </w:p>
-    <w:bookmarkStart w:id="52" w:name="أولا-الإطار-المرجعي-للنموذج"/>
+    <w:bookmarkStart w:id="54" w:name="أولا-الإطار-المرجعي-للنموذج"/>
     <w:p>
       <w:pPr>
         <w:pStyle w:val="Heading4"/>
@@ -5040,7 +5178,7 @@
           <w:rFonts w:ascii="Traditional Arabic" w:hAnsi="Traditional Arabic"/>
           <w:sz w:val="28"/>
         </w:rPr>
-        <w:footnoteReference w:id="50"/>
+        <w:footnoteReference w:id="52"/>
       </w:r>
     </w:p>
     <w:p>
@@ -5071,11 +5209,11 @@
           <w:rFonts w:ascii="Traditional Arabic" w:hAnsi="Traditional Arabic"/>
           <w:sz w:val="28"/>
         </w:rPr>
-        <w:footnoteReference w:id="51"/>
-      </w:r>
-    </w:p>
-    <w:bookmarkEnd w:id="52"/>
-    <w:bookmarkStart w:id="54" w:name="ثانيا-التطبيق-على-الصنف-المرجعي-art-001"/>
+        <w:footnoteReference w:id="53"/>
+      </w:r>
+    </w:p>
+    <w:bookmarkEnd w:id="54"/>
+    <w:bookmarkStart w:id="56" w:name="ثانيا-التطبيق-على-الصنف-المرجعي-art-001"/>
     <w:p>
       <w:pPr>
         <w:pStyle w:val="Heading4"/>
@@ -5120,7 +5258,7 @@
           <w:rFonts w:ascii="Traditional Arabic" w:hAnsi="Traditional Arabic"/>
           <w:sz w:val="28"/>
         </w:rPr>
-        <w:footnoteReference w:id="53"/>
+        <w:footnoteReference w:id="55"/>
       </w:r>
       <w:r>
         <w:rPr>
@@ -5451,8 +5589,8 @@
         <w:t xml:space="preserve">بتطبيق المعادلة:</w:t>
       </w:r>
     </w:p>
-    <w:bookmarkEnd w:id="54"/>
-    <w:bookmarkStart w:id="55" w:name="ثالثا-التحقق-من-التوازن-الرياضي-المثالي"/>
+    <w:bookmarkEnd w:id="56"/>
+    <w:bookmarkStart w:id="57" w:name="ثالثا-التحقق-من-التوازن-الرياضي-المثالي"/>
     <w:p>
       <w:pPr>
         <w:pStyle w:val="Heading4"/>
@@ -5495,8 +5633,8 @@
         <w:t xml:space="preserve">**لاحظ أن حد الإصدار وحد الاحتفاظ متساويان تماماً عند Q*. هذه ليست مصادفة — إنها الخاصية الجوهرية لأي كمية اقتصادية مثلى. يعني هذا المستوى 9 طلبيات سنوية، أي طلبية واحدة كل 40 يوماً تقريباً، وهو تردد يتوافق مع آجال التوريد المعتادة في القطاع العمومي.**</w:t>
       </w:r>
     </w:p>
-    <w:bookmarkEnd w:id="55"/>
-    <w:bookmarkStart w:id="56" w:name="رابعا-نقطة-إعادة-الطلب-ومخزون-الأمان"/>
+    <w:bookmarkEnd w:id="57"/>
+    <w:bookmarkStart w:id="58" w:name="رابعا-نقطة-إعادة-الطلب-ومخزون-الأمان"/>
     <w:p>
       <w:pPr>
         <w:pStyle w:val="Heading4"/>
@@ -5541,9 +5679,9 @@
         <w:t xml:space="preserve">مخزون الأمان (SS) = 200 وحدة. هذا الهامش الكمي يستوعب تذبذب الطلب اليومي وتأخيرات التوريد المحتملة — والتأخيرات واردة هنا لأن مسافة النقل تتجاوز 600 كيلومتر من مراكز التوريد الكبرى.</w:t>
       </w:r>
     </w:p>
-    <w:bookmarkEnd w:id="56"/>
-    <w:bookmarkEnd w:id="57"/>
-    <w:bookmarkStart w:id="60" w:name="X52ea18e5737fce8615e1c3ca4723e15512be477"/>
+    <w:bookmarkEnd w:id="58"/>
+    <w:bookmarkEnd w:id="59"/>
+    <w:bookmarkStart w:id="62" w:name="X52ea18e5737fce8615e1c3ca4723e15512be477"/>
     <w:p>
       <w:pPr>
         <w:pStyle w:val="Heading3"/>
@@ -5558,7 +5696,7 @@
         <w:t xml:space="preserve">المطلب الثاني: تحليل ABC وتطبيقه على مخزون المديرية</w:t>
       </w:r>
     </w:p>
-    <w:bookmarkStart w:id="58" w:name="أولا-منهجية-التصنيف-ومعاييره-الكمية"/>
+    <w:bookmarkStart w:id="60" w:name="أولا-منهجية-التصنيف-ومعاييره-الكمية"/>
     <w:p>
       <w:pPr>
         <w:pStyle w:val="Heading4"/>
@@ -5998,8 +6136,8 @@
         </w:tc>
       </w:tr>
     </w:tbl>
-    <w:bookmarkEnd w:id="58"/>
-    <w:bookmarkStart w:id="59" w:name="ثانيا-تطبيق-التحليل-على-بيانات-المديرية"/>
+    <w:bookmarkEnd w:id="60"/>
+    <w:bookmarkStart w:id="61" w:name="ثانيا-تطبيق-التحليل-على-بيانات-المديرية"/>
     <w:p>
       <w:pPr>
         <w:pStyle w:val="Heading4"/>
@@ -6029,9 +6167,9 @@
         <w:t xml:space="preserve">عند تطبيق هذا المعيار على الأصناف الاثني عشر المسجلة في سجلات المديرية، تتصدر Toner G030 (ART-001) الفئة A بقيمة استهلاكية سنوية 618,000 دج (789 × 400 = 618,000). يليه صنف ورق A4 (ART-002) ضمن الفئة نفسها بقيمة استهلاكية معتبرة. في الطرف الآخر، الأصناف ذات الاستخدام المتقطع — مثل الدباسة المكتبية (ART-005) — تنتمي إلى الفئة C. هذا يعني أن موارد الرقابة ومحرك النظام الرقمي يجب أن يُركزا على أصناف الفئة A.</w:t>
       </w:r>
     </w:p>
-    <w:bookmarkEnd w:id="59"/>
-    <w:bookmarkEnd w:id="60"/>
-    <w:bookmarkStart w:id="71" w:name="X3d546febf7430a2ea3250247e57315bf530ac8e"/>
+    <w:bookmarkEnd w:id="61"/>
+    <w:bookmarkEnd w:id="62"/>
+    <w:bookmarkStart w:id="73" w:name="X3d546febf7430a2ea3250247e57315bf530ac8e"/>
     <w:p>
       <w:pPr>
         <w:pStyle w:val="Heading3"/>
@@ -6436,7 +6574,7 @@
           <w:rFonts w:ascii="Traditional Arabic" w:hAnsi="Traditional Arabic"/>
           <w:sz w:val="28"/>
         </w:rPr>
-        <w:footnoteReference w:id="61"/>
+        <w:footnoteReference w:id="63"/>
       </w:r>
       <w:r>
         <w:rPr>
@@ -6454,7 +6592,7 @@
           <w:rFonts w:ascii="Traditional Arabic" w:hAnsi="Traditional Arabic"/>
           <w:sz w:val="28"/>
         </w:rPr>
-        <w:footnoteReference w:id="62"/>
+        <w:footnoteReference w:id="64"/>
       </w:r>
       <w:r>
         <w:rPr>
@@ -6472,7 +6610,7 @@
           <w:rFonts w:ascii="Traditional Arabic" w:hAnsi="Traditional Arabic"/>
           <w:sz w:val="28"/>
         </w:rPr>
-        <w:footnoteReference w:id="63"/>
+        <w:footnoteReference w:id="65"/>
       </w:r>
       <w:r>
         <w:rPr>
@@ -6490,7 +6628,7 @@
           <w:rFonts w:ascii="Traditional Arabic" w:hAnsi="Traditional Arabic"/>
           <w:sz w:val="28"/>
         </w:rPr>
-        <w:footnoteReference w:id="64"/>
+        <w:footnoteReference w:id="66"/>
       </w:r>
       <w:r>
         <w:rPr>
@@ -6508,7 +6646,7 @@
           <w:rFonts w:ascii="Traditional Arabic" w:hAnsi="Traditional Arabic"/>
           <w:sz w:val="28"/>
         </w:rPr>
-        <w:footnoteReference w:id="65"/>
+        <w:footnoteReference w:id="67"/>
       </w:r>
       <w:r>
         <w:rPr>
@@ -6526,7 +6664,7 @@
           <w:rFonts w:ascii="Traditional Arabic" w:hAnsi="Traditional Arabic"/>
           <w:sz w:val="28"/>
         </w:rPr>
-        <w:footnoteReference w:id="66"/>
+        <w:footnoteReference w:id="68"/>
       </w:r>
       <w:r>
         <w:rPr>
@@ -6544,7 +6682,7 @@
           <w:rFonts w:ascii="Traditional Arabic" w:hAnsi="Traditional Arabic"/>
           <w:sz w:val="28"/>
         </w:rPr>
-        <w:footnoteReference w:id="67"/>
+        <w:footnoteReference w:id="69"/>
       </w:r>
       <w:r>
         <w:rPr>
@@ -6562,7 +6700,7 @@
           <w:rFonts w:ascii="Traditional Arabic" w:hAnsi="Traditional Arabic"/>
           <w:sz w:val="28"/>
         </w:rPr>
-        <w:footnoteReference w:id="68"/>
+        <w:footnoteReference w:id="70"/>
       </w:r>
       <w:r>
         <w:rPr>
@@ -6580,7 +6718,7 @@
           <w:rFonts w:ascii="Traditional Arabic" w:hAnsi="Traditional Arabic"/>
           <w:sz w:val="28"/>
         </w:rPr>
-        <w:footnoteReference w:id="69"/>
+        <w:footnoteReference w:id="71"/>
       </w:r>
       <w:r>
         <w:rPr>
@@ -6598,7 +6736,7 @@
           <w:rFonts w:ascii="Traditional Arabic" w:hAnsi="Traditional Arabic"/>
           <w:sz w:val="28"/>
         </w:rPr>
-        <w:footnoteReference w:id="70"/>
+        <w:footnoteReference w:id="72"/>
       </w:r>
     </w:p>
     <w:p>
@@ -6618,9 +6756,9 @@
         <w:t xml:space="preserve">خلاصة المبحث الأول: النماذج الثلاثة قادرة على تحويل البيانات الخام إلى معطيات قرارية دقيقة — EOQ = 37، ROP = 206، SS = 200، تصنيف ABC-XYZ. لكن هذه الدقة لا قيمة لها في بيئة التسيير اليدوي السائدة في مديرية التربية، لأن تحديث هذه المعطيات آنياً مع كل حركة مخزنية مستحيل دون نظام رقمي. هذه الفجوة تحديداً هي ما يعالجه الفصل الثالث.</w:t>
       </w:r>
     </w:p>
-    <w:bookmarkEnd w:id="71"/>
-    <w:bookmarkEnd w:id="72"/>
-    <w:bookmarkStart w:id="84" w:name="المبحث-الثاني-الإطار-الجغرافي-والمؤسسي"/>
+    <w:bookmarkEnd w:id="73"/>
+    <w:bookmarkEnd w:id="74"/>
+    <w:bookmarkStart w:id="86" w:name="المبحث-الثاني-الإطار-الجغرافي-والمؤسسي"/>
     <w:p>
       <w:pPr>
         <w:pStyle w:val="Heading2"/>
@@ -6650,7 +6788,7 @@
         <w:t xml:space="preserve">يتوقف تحليل أي منظومة لوجيستية على استيعاب السياق المكاني والمؤسسي الذي تعمل فيه؛ إذ لا يمكن تقييم كفاءة نظام تسيير مخزون معزولاً عن القيود الجغرافية والهيكل التنظيمي والبيئة التشغيلية. يُقدِّم هذا المبحث المحاور الثلاثة لهذا الإطار: ولاية البيض بموقعها اللوجيستي الخاص، ومديرية التربية بهيكلها التنظيمي، ومصلحة المخازن بواقعها التشغيلي الذي شكَّل موضوع الدراسة.</w:t>
       </w:r>
     </w:p>
-    <w:bookmarkStart w:id="75" w:name="Xe4f249edd1737d467925de2bc2b8314c0457ef9"/>
+    <w:bookmarkStart w:id="77" w:name="Xe4f249edd1737d467925de2bc2b8314c0457ef9"/>
     <w:p>
       <w:pPr>
         <w:pStyle w:val="Heading3"/>
@@ -6665,7 +6803,7 @@
         <w:t xml:space="preserve">المطلب الأول: ولاية البيض — الإطار الجغرافي والأثر اللوجيستي</w:t>
       </w:r>
     </w:p>
-    <w:bookmarkStart w:id="73" w:name="أولا-الموقع-والخصائص-الجغرافية"/>
+    <w:bookmarkStart w:id="75" w:name="أولا-الموقع-والخصائص-الجغرافية"/>
     <w:p>
       <w:pPr>
         <w:pStyle w:val="Heading4"/>
@@ -6695,8 +6833,8 @@
         <w:t xml:space="preserve">تقع ولاية البيض في القطاع السهبي الجنوبي الغربي من الجمهورية الجزائرية، على بُعد يتجاوز 600 كيلومتر جنوب غرب العاصمة و400 كيلومتر جنوب مدينة وهران. تتشكَّل جغرافيتها من سهوب شاسعة تتخللها مسالك جبلية في شمالها، مما يُفرز بيئة مناخية متطرفة — جفاف صيفاً وثلوج وأمطار استثنائية شتاءً.</w:t>
       </w:r>
     </w:p>
-    <w:bookmarkEnd w:id="73"/>
-    <w:bookmarkStart w:id="74" w:name="ثانيا-تأثير-الموقع-على-سلاسل-الإمداد"/>
+    <w:bookmarkEnd w:id="75"/>
+    <w:bookmarkStart w:id="76" w:name="ثانيا-تأثير-الموقع-على-سلاسل-الإمداد"/>
     <w:p>
       <w:pPr>
         <w:pStyle w:val="Heading4"/>
@@ -6726,9 +6864,9 @@
         <w:t xml:space="preserve">يُشكِّل البُعد الجغرافي عاملاً عند تصميم سياسة التخزين. تمتد آجال التسليم (Lead Time) المعتادة من مراكز التوريد الكبرى بين 5 و10 أيام عمل في الظروف الاعتيادية. وفي فترات الاضطرابات المناخية — كانسداد المحاور الطرقية جراء الثلوج أو الفيضانات — قد يتضاعف هذا الأجل ليصل إلى أسبوعين أو أكثر. هذا الواقع الجغرافي يرفع من أهمية متغيرَي مخزون الأمان (SS) ونقطة إعادة الطلب (ROP).</w:t>
       </w:r>
     </w:p>
-    <w:bookmarkEnd w:id="74"/>
-    <w:bookmarkEnd w:id="75"/>
-    <w:bookmarkStart w:id="79" w:name="X3f57fa00f89ba85d9588878684ea58fb7f040ef"/>
+    <w:bookmarkEnd w:id="76"/>
+    <w:bookmarkEnd w:id="77"/>
+    <w:bookmarkStart w:id="81" w:name="X3f57fa00f89ba85d9588878684ea58fb7f040ef"/>
     <w:p>
       <w:pPr>
         <w:pStyle w:val="Heading3"/>
@@ -6743,7 +6881,7 @@
         <w:t xml:space="preserve">المطلب الثاني: تقديم مديرية التربية لولاية البيض</w:t>
       </w:r>
     </w:p>
-    <w:bookmarkStart w:id="77" w:name="أولا-الوضع-القانوني-والمهام-المؤسسية"/>
+    <w:bookmarkStart w:id="79" w:name="أولا-الوضع-القانوني-والمهام-المؤسسية"/>
     <w:p>
       <w:pPr>
         <w:pStyle w:val="Heading4"/>
@@ -6888,7 +7026,7 @@
           <w:rFonts w:ascii="Traditional Arabic" w:hAnsi="Traditional Arabic"/>
           <w:sz w:val="28"/>
         </w:rPr>
-        <w:footnoteReference w:id="76"/>
+        <w:footnoteReference w:id="78"/>
       </w:r>
       <w:r>
         <w:rPr>
@@ -6901,8 +7039,8 @@
         <w:t xml:space="preserve">.</w:t>
       </w:r>
     </w:p>
-    <w:bookmarkEnd w:id="77"/>
-    <w:bookmarkStart w:id="78" w:name="X01d3ef8a5826c75c8439d1097f2a09587d09e67"/>
+    <w:bookmarkEnd w:id="79"/>
+    <w:bookmarkStart w:id="80" w:name="X01d3ef8a5826c75c8439d1097f2a09587d09e67"/>
     <w:p>
       <w:pPr>
         <w:pStyle w:val="Heading4"/>
@@ -6932,9 +7070,9 @@
         <w:t xml:space="preserve">تعتمد المديرية هيكلاً تنظيمياً رباعياً. تضطلع مصلحة الإدارة والوسائل العامة بالدور المحوري في دورة التخزين، إذ تتولى إعداد طلبات الاحتياجات واستقبال البضائع وتوزيعها على الوحدات الداخلية. وتعمل هذه المصلحة بالتنسيق مع مصلحة الميزانية للتحقق من توفر الاعتمادات قبل كل عملية تموين، لتنفيذ القرارات المالية عبر حركات مخزنية فعلية.</w:t>
       </w:r>
     </w:p>
-    <w:bookmarkEnd w:id="78"/>
-    <w:bookmarkEnd w:id="79"/>
-    <w:bookmarkStart w:id="83" w:name="Xe95b080e745ed60cca3f74edd213d00166ee89f"/>
+    <w:bookmarkEnd w:id="80"/>
+    <w:bookmarkEnd w:id="81"/>
+    <w:bookmarkStart w:id="85" w:name="Xe95b080e745ed60cca3f74edd213d00166ee89f"/>
     <w:p>
       <w:pPr>
         <w:pStyle w:val="Heading3"/>
@@ -6949,7 +7087,7 @@
         <w:t xml:space="preserve">المطلب الثالث: وصف مصلحة المخازن وتقييم بيئتها التشغيلية</w:t>
       </w:r>
     </w:p>
-    <w:bookmarkStart w:id="81" w:name="أولا-البنية-المادية-والواقع-التجهيزي"/>
+    <w:bookmarkStart w:id="83" w:name="أولا-البنية-المادية-والواقع-التجهيزي"/>
     <w:p>
       <w:pPr>
         <w:pStyle w:val="Heading4"/>
@@ -7062,7 +7200,7 @@
           <w:rFonts w:ascii="Traditional Arabic" w:hAnsi="Traditional Arabic"/>
           <w:sz w:val="28"/>
         </w:rPr>
-        <w:footnoteReference w:id="80"/>
+        <w:footnoteReference w:id="82"/>
       </w:r>
       <w:r>
         <w:rPr>
@@ -7075,8 +7213,8 @@
         <w:t xml:space="preserve">.</w:t>
       </w:r>
     </w:p>
-    <w:bookmarkEnd w:id="81"/>
-    <w:bookmarkStart w:id="82" w:name="Xf538c3815bf5bc34642ae68a16b1ad061eeda6a"/>
+    <w:bookmarkEnd w:id="83"/>
+    <w:bookmarkStart w:id="84" w:name="Xf538c3815bf5bc34642ae68a16b1ad061eeda6a"/>
     <w:p>
       <w:pPr>
         <w:pStyle w:val="Heading4"/>
@@ -7256,10 +7394,10 @@
         <w:t xml:space="preserve">تُعد هذه القيود أعراضاً بنيوية لنقص الأدوات التقنية المناسبة. وهي بالضبط ما يستهدف نظام دعم القرار المُقترح في الفصل الثالث معالجتَه معالجةً جذريةً وشاملة.</w:t>
       </w:r>
     </w:p>
-    <w:bookmarkEnd w:id="82"/>
-    <w:bookmarkEnd w:id="83"/>
     <w:bookmarkEnd w:id="84"/>
-    <w:bookmarkStart w:id="96" w:name="X45c22bf0528f185d6de6f59ddda56ed6c67ca33"/>
+    <w:bookmarkEnd w:id="85"/>
+    <w:bookmarkEnd w:id="86"/>
+    <w:bookmarkStart w:id="98" w:name="X45c22bf0528f185d6de6f59ddda56ed6c67ca33"/>
     <w:p>
       <w:pPr>
         <w:pStyle w:val="Heading2"/>
@@ -7321,7 +7459,7 @@
         <w:t xml:space="preserve">التي يسعى نظام دعم القرار v13.3 إلى ردمها.</w:t>
       </w:r>
     </w:p>
-    <w:bookmarkStart w:id="86" w:name="المطلب-الأول-التحليل-الكمي-جدول-رقم-04"/>
+    <w:bookmarkStart w:id="88" w:name="المطلب-الأول-التحليل-الكمي-جدول-رقم-04"/>
     <w:p>
       <w:pPr>
         <w:pStyle w:val="Heading3"/>
@@ -8232,7 +8370,7 @@
         </w:tc>
       </w:tr>
     </w:tbl>
-    <w:bookmarkStart w:id="85" w:name="ثانيا-تحليل-النتائج-ودلالاتها-التشغيلية"/>
+    <w:bookmarkStart w:id="87" w:name="ثانيا-تحليل-النتائج-ودلالاتها-التشغيلية"/>
     <w:p>
       <w:pPr>
         <w:pStyle w:val="Heading4"/>
@@ -8368,9 +8506,9 @@
         <w:t xml:space="preserve">للمسير، مما يؤدي إما إلى تكديس أصناف الفئة C (هدر مالي) أو نفاد أصناف الفئة A (تعطيل إداري).</w:t>
       </w:r>
     </w:p>
-    <w:bookmarkEnd w:id="85"/>
-    <w:bookmarkEnd w:id="86"/>
-    <w:bookmarkStart w:id="87" w:name="X1bb33ba9224f587193ff19f2f46f26887b562eb"/>
+    <w:bookmarkEnd w:id="87"/>
+    <w:bookmarkEnd w:id="88"/>
+    <w:bookmarkStart w:id="89" w:name="X1bb33ba9224f587193ff19f2f46f26887b562eb"/>
     <w:p>
       <w:pPr>
         <w:pStyle w:val="Heading3"/>
@@ -8868,8 +9006,8 @@
         </w:tc>
       </w:tr>
     </w:tbl>
-    <w:bookmarkEnd w:id="87"/>
-    <w:bookmarkStart w:id="95" w:name="Xf44bb1cbb1fbf8d3786fd5660f5e5e712de4010"/>
+    <w:bookmarkEnd w:id="89"/>
+    <w:bookmarkStart w:id="97" w:name="Xf44bb1cbb1fbf8d3786fd5660f5e5e712de4010"/>
     <w:p>
       <w:pPr>
         <w:pStyle w:val="Heading3"/>
@@ -8899,7 +9037,7 @@
         <w:t xml:space="preserve">تتويجاً لهذا التشخيص، اعتمدنا مصفوفة القرار المزدوجة (ABC-XYZ) لتصنيف كافة أصناف المخزن، حيث يمثل المحور (ABC) القيمة المالية، والمحور (XYZ) استقرار الطلب.</w:t>
       </w:r>
     </w:p>
-    <w:bookmarkStart w:id="88" w:name="أولا-منطق-التصنيف-المعتمد"/>
+    <w:bookmarkStart w:id="90" w:name="أولا-منطق-التصنيف-المعتمد"/>
     <w:p>
       <w:pPr>
         <w:pStyle w:val="Heading4"/>
@@ -8956,8 +9094,8 @@
         <w:t xml:space="preserve">المحور X-Y-Z (الاستقرار): يتم تحديد الفئة بناءً على معامل التباين (CV) للطلب الدوري.</w:t>
       </w:r>
     </w:p>
-    <w:bookmarkEnd w:id="88"/>
-    <w:bookmarkStart w:id="94" w:name="ثانيا-استراتيجية-التسيير-الموجهة"/>
+    <w:bookmarkEnd w:id="90"/>
+    <w:bookmarkStart w:id="96" w:name="ثانيا-استراتيجية-التسيير-الموجهة"/>
     <w:p>
       <w:pPr>
         <w:pStyle w:val="Heading4"/>
@@ -9189,7 +9327,7 @@
           <w:rFonts w:ascii="Traditional Arabic" w:hAnsi="Traditional Arabic"/>
           <w:sz w:val="28"/>
         </w:rPr>
-        <w:footnoteReference w:id="89"/>
+        <w:footnoteReference w:id="91"/>
       </w:r>
       <w:r>
         <w:rPr>
@@ -9205,7 +9343,7 @@
           <w:rFonts w:ascii="Traditional Arabic" w:hAnsi="Traditional Arabic"/>
           <w:sz w:val="28"/>
         </w:rPr>
-        <w:footnoteReference w:id="90"/>
+        <w:footnoteReference w:id="92"/>
       </w:r>
       <w:r>
         <w:rPr>
@@ -9221,7 +9359,7 @@
           <w:rFonts w:ascii="Traditional Arabic" w:hAnsi="Traditional Arabic"/>
           <w:sz w:val="28"/>
         </w:rPr>
-        <w:footnoteReference w:id="91"/>
+        <w:footnoteReference w:id="93"/>
       </w:r>
       <w:r>
         <w:rPr>
@@ -9237,7 +9375,7 @@
           <w:rFonts w:ascii="Traditional Arabic" w:hAnsi="Traditional Arabic"/>
           <w:sz w:val="28"/>
         </w:rPr>
-        <w:footnoteReference w:id="92"/>
+        <w:footnoteReference w:id="94"/>
       </w:r>
       <w:r>
         <w:rPr>
@@ -9253,14 +9391,14 @@
           <w:rFonts w:ascii="Traditional Arabic" w:hAnsi="Traditional Arabic"/>
           <w:sz w:val="28"/>
         </w:rPr>
-        <w:footnoteReference w:id="93"/>
-      </w:r>
-    </w:p>
-    <w:bookmarkEnd w:id="94"/>
-    <w:bookmarkEnd w:id="95"/>
+        <w:footnoteReference w:id="95"/>
+      </w:r>
+    </w:p>
     <w:bookmarkEnd w:id="96"/>
     <w:bookmarkEnd w:id="97"/>
-    <w:bookmarkStart w:id="129" w:name="X425548a444476a4a4f36373e56e022eba81766a"/>
+    <w:bookmarkEnd w:id="98"/>
+    <w:bookmarkEnd w:id="99"/>
+    <w:bookmarkStart w:id="131" w:name="X425548a444476a4a4f36373e56e022eba81766a"/>
     <w:p>
       <w:pPr>
         <w:pStyle w:val="Heading1"/>
@@ -9306,7 +9444,7 @@
         <w:t xml:space="preserve">بعد استعراض الإطار النظري والتشخيص الميداني في الفصول السابقة، يخصص هذا الفصل لعرض الحل الرقمي المقترح لمواجهة تحديات التسيير اليدوي في مخزن مديرية التربية لولاية البيض. سنستعرض في المبحث الأول الهندسة المتكاملة لنظام دعم القرار المبني على بيئة Microsoft Excel، متبوعة في المبحث الثاني بشرح مفصل لكيفية تدفق البيانات محلياً من خلال محرك VBA. كما سنتناول في المبحث الثالث التفاصيل التقنية لمحرك الذكاء المحلي، بما في ذلك الخوارزميات المستخدمة لحساب CMUP وEOQ وROP وتصنيف ABC-XYZ. ويختتم الفصل بالمبحث الرابع الذي يستعرض واجهة المستخدم المبتكرة ولوحة القيادة الرقمية التي تضمن رقابة آنية ودعماً فعالاً لاتخاذ القرار.</w:t>
       </w:r>
     </w:p>
-    <w:bookmarkStart w:id="104" w:name="Xa676c4e96c951c611f1581966c5cca345efded0"/>
+    <w:bookmarkStart w:id="106" w:name="Xa676c4e96c951c611f1581966c5cca345efded0"/>
     <w:p>
       <w:pPr>
         <w:pStyle w:val="Heading2"/>
@@ -9400,7 +9538,7 @@
         <w:t xml:space="preserve">متكامل. لا تكمن قيمة النظام في استخدام لغة VBA فحسب، بل في فلسفة التصميم التي تدمج بين الدقة المحاسبية، والسرعة اللوجيستية، وبساطة التشغيل.</w:t>
       </w:r>
     </w:p>
-    <w:bookmarkStart w:id="101" w:name="X50eda9fd44e4b29eb77e7e9ee21c27f44b1ac92"/>
+    <w:bookmarkStart w:id="103" w:name="X50eda9fd44e4b29eb77e7e9ee21c27f44b1ac92"/>
     <w:p>
       <w:pPr>
         <w:pStyle w:val="Heading3"/>
@@ -9593,7 +9731,7 @@
           <w:rFonts w:ascii="Traditional Arabic" w:hAnsi="Traditional Arabic"/>
           <w:sz w:val="28"/>
         </w:rPr>
-        <w:footnoteReference w:id="98"/>
+        <w:footnoteReference w:id="100"/>
       </w:r>
       <w:r>
         <w:rPr>
@@ -9617,7 +9755,7 @@
           <w:rFonts w:ascii="Traditional Arabic" w:hAnsi="Traditional Arabic"/>
           <w:sz w:val="28"/>
         </w:rPr>
-        <w:footnoteReference w:id="99"/>
+        <w:footnoteReference w:id="101"/>
       </w:r>
       <w:r>
         <w:rPr>
@@ -9641,7 +9779,7 @@
           <w:rFonts w:ascii="Traditional Arabic" w:hAnsi="Traditional Arabic"/>
           <w:sz w:val="28"/>
         </w:rPr>
-        <w:footnoteReference w:id="100"/>
+        <w:footnoteReference w:id="102"/>
       </w:r>
       <w:r>
         <w:rPr>
@@ -9652,8 +9790,8 @@
         <w:t xml:space="preserve">.</w:t>
       </w:r>
     </w:p>
-    <w:bookmarkEnd w:id="101"/>
-    <w:bookmarkStart w:id="102" w:name="Xd01ba28ceb43c2aafcfa279441271082bf35e79"/>
+    <w:bookmarkEnd w:id="103"/>
+    <w:bookmarkStart w:id="104" w:name="Xd01ba28ceb43c2aafcfa279441271082bf35e79"/>
     <w:p>
       <w:pPr>
         <w:pStyle w:val="Heading3"/>
@@ -9873,8 +10011,8 @@
         <w:t xml:space="preserve">وحدة الحقيقة (Single Source of Truth): يتم ربط كافة البيانات المالية واللوجيستية بقاعدة بيانات مركزية واحدة (Sجل الأصناف)، مما يضمن عدم تضارب المعلومات بين لوحة القيادة وسجلات الحركة.</w:t>
       </w:r>
     </w:p>
-    <w:bookmarkEnd w:id="102"/>
-    <w:bookmarkStart w:id="103" w:name="Xb3cd0739dd5a83bd5baa46bdafa673a7ae7a4aa"/>
+    <w:bookmarkEnd w:id="104"/>
+    <w:bookmarkStart w:id="105" w:name="Xb3cd0739dd5a83bd5baa46bdafa673a7ae7a4aa"/>
     <w:p>
       <w:pPr>
         <w:pStyle w:val="Heading3"/>
@@ -10068,9 +10206,9 @@
         <w:t xml:space="preserve">سهولة النقل والانتشار (Portability): بفضل تصميم النظام كملف واحد مدمج، يمكن نقله وتشغيله على أي حاسوب يحتوي على Excel دون الحاجة لعمليات تنصيب معقدة أو صلاحيات مدير نظام (Admin Rights).</w:t>
       </w:r>
     </w:p>
-    <w:bookmarkEnd w:id="103"/>
-    <w:bookmarkEnd w:id="104"/>
-    <w:bookmarkStart w:id="110" w:name="Xfb30997312ec99a0ff92bdd7dc592fd161b34eb"/>
+    <w:bookmarkEnd w:id="105"/>
+    <w:bookmarkEnd w:id="106"/>
+    <w:bookmarkStart w:id="112" w:name="Xfb30997312ec99a0ff92bdd7dc592fd161b34eb"/>
     <w:p>
       <w:pPr>
         <w:pStyle w:val="Heading2"/>
@@ -10132,7 +10270,7 @@
         <w:t xml:space="preserve">(Data Flow Logic) الذي يضمن سلامة البيانات من لحظة الإدخال حتى وصولها إلى التقارير النهائية. في هذا المبحث، نفصل الآليات الرقابية التي تمنع الخطأ البشري وتضمن نزاهة البيانات اللوجستية.</w:t>
       </w:r>
     </w:p>
-    <w:bookmarkStart w:id="105" w:name="Xe1412b27e8b4694678434ce8a4f8b6f261fecdf"/>
+    <w:bookmarkStart w:id="107" w:name="Xe1412b27e8b4694678434ce8a4f8b6f261fecdf"/>
     <w:p>
       <w:pPr>
         <w:pStyle w:val="Heading3"/>
@@ -10390,8 +10528,8 @@
         <w:t xml:space="preserve">حراسة المزامنة (Sync Guard): تحديث كافة المؤشرات (الرصيد، التكلفة، التنبيهات) في لحظة واحدة لضمان عدم وجود تضارب بين أوراق العمل.</w:t>
       </w:r>
     </w:p>
-    <w:bookmarkEnd w:id="105"/>
-    <w:bookmarkStart w:id="106" w:name="X790f7c97394d912e1af56ef75b8396a4139580d"/>
+    <w:bookmarkEnd w:id="107"/>
+    <w:bookmarkStart w:id="108" w:name="X790f7c97394d912e1af56ef75b8396a4139580d"/>
     <w:p>
       <w:pPr>
         <w:pStyle w:val="Heading3"/>
@@ -10627,8 +10765,8 @@
         <w:t xml:space="preserve">المعلوماتية التي كانت تميز النظام اليدوي.</w:t>
       </w:r>
     </w:p>
-    <w:bookmarkEnd w:id="106"/>
-    <w:bookmarkStart w:id="109" w:name="X444a26c814394dcd7d1e55a55a610cb16854269"/>
+    <w:bookmarkEnd w:id="108"/>
+    <w:bookmarkStart w:id="111" w:name="X444a26c814394dcd7d1e55a55a610cb16854269"/>
     <w:p>
       <w:pPr>
         <w:pStyle w:val="Heading3"/>
@@ -10831,7 +10969,7 @@
           <w:rFonts w:ascii="Traditional Arabic" w:hAnsi="Traditional Arabic"/>
           <w:sz w:val="28"/>
         </w:rPr>
-        <w:footnoteReference w:id="107"/>
+        <w:footnoteReference w:id="109"/>
       </w:r>
       <w:r>
         <w:rPr>
@@ -10863,7 +11001,7 @@
           <w:rFonts w:ascii="Traditional Arabic" w:hAnsi="Traditional Arabic"/>
           <w:sz w:val="28"/>
         </w:rPr>
-        <w:footnoteReference w:id="108"/>
+        <w:footnoteReference w:id="110"/>
       </w:r>
       <w:r>
         <w:rPr>
@@ -10874,9 +11012,9 @@
         <w:t xml:space="preserve">.</w:t>
       </w:r>
     </w:p>
-    <w:bookmarkEnd w:id="109"/>
-    <w:bookmarkEnd w:id="110"/>
-    <w:bookmarkStart w:id="118" w:name="Xffbf1b46ecde0efcc86730acfd968fe379c5668"/>
+    <w:bookmarkEnd w:id="111"/>
+    <w:bookmarkEnd w:id="112"/>
+    <w:bookmarkStart w:id="120" w:name="Xffbf1b46ecde0efcc86730acfd968fe379c5668"/>
     <w:p>
       <w:pPr>
         <w:pStyle w:val="Heading2"/>
@@ -10970,7 +11108,7 @@
         <w:t xml:space="preserve">المدبّر. يتجاوز هذا المحرك الوظائف الحسابية البسيطة ليتحول إلى نظام خبير (Expert System) قادر على اتخاذ قرارات لوجيستية بناءً على معطيات رياضية لحظية، مع ضمان استقرار النظام تحت مختلف ظروف التشغيل.</w:t>
       </w:r>
     </w:p>
-    <w:bookmarkStart w:id="111" w:name="X2b5683333895272df7448c3123c2d6911fb19dd"/>
+    <w:bookmarkStart w:id="113" w:name="X2b5683333895272df7448c3123c2d6911fb19dd"/>
     <w:p>
       <w:pPr>
         <w:pStyle w:val="Heading3"/>
@@ -11232,8 +11370,8 @@
         <w:t xml:space="preserve">وحدة سلامة العمليات (mod_TransactionSafety): تضمن تنفيذ العمليات ككتلة واحدة غير قابلة للتجزئة، مما يحمي البيانات من التلف عند حدوث انقطاع مفاجئ.</w:t>
       </w:r>
     </w:p>
-    <w:bookmarkEnd w:id="111"/>
-    <w:bookmarkStart w:id="114" w:name="X9b60cd1fa0cbe72f7f71191beb861644b5c9805"/>
+    <w:bookmarkEnd w:id="113"/>
+    <w:bookmarkStart w:id="116" w:name="X9b60cd1fa0cbe72f7f71191beb861644b5c9805"/>
     <w:p>
       <w:pPr>
         <w:pStyle w:val="Heading3"/>
@@ -11263,7 +11401,7 @@
         <w:t xml:space="preserve">يعتمد النظام في اتخاذ قرارات التموين على تحويل النماذج الرياضية إلى خوارزميات برمجية تعمل في الخلفية دون تدخل المستخدم:</w:t>
       </w:r>
     </w:p>
-    <w:bookmarkStart w:id="112" w:name="أولا-أتمتة-نموذج-ويلسون-eoq-algorithm"/>
+    <w:bookmarkStart w:id="114" w:name="أولا-أتمتة-نموذج-ويلسون-eoq-algorithm"/>
     <w:p>
       <w:pPr>
         <w:pStyle w:val="Heading4"/>
@@ -11323,8 +11461,8 @@
         <w:t xml:space="preserve">للكمية الاقتصادية عبر تدفق منطقي يبدأ باسترداد الطلب السنوي () وتكلفة الطلب () ومعدل الاحتفاظ () وسعر الوحدة () من سجل الإعدادات، ثم تطبيق المعادلة: . يتم تحديث هذه القيمة تلقائياً عند تغير أي معامل، مما يضمن أن النظام يقترح دائماً الكمية التي تقلص التكاليف الإجمالية إلى حدها الأدنى.</w:t>
       </w:r>
     </w:p>
-    <w:bookmarkEnd w:id="112"/>
-    <w:bookmarkStart w:id="113" w:name="ثانيا-ديناميكية-نقطة-إعادة-الطلب-rop"/>
+    <w:bookmarkEnd w:id="114"/>
+    <w:bookmarkStart w:id="115" w:name="ثانيا-ديناميكية-نقطة-إعادة-الطلب-rop"/>
     <w:p>
       <w:pPr>
         <w:pStyle w:val="Heading4"/>
@@ -11416,9 +11554,9 @@
         <w:t xml:space="preserve">في الطلب.</w:t>
       </w:r>
     </w:p>
-    <w:bookmarkEnd w:id="113"/>
-    <w:bookmarkEnd w:id="114"/>
-    <w:bookmarkStart w:id="115" w:name="Xdb72e8c31238e5bc8bb35e9197d335bc848251d"/>
+    <w:bookmarkEnd w:id="115"/>
+    <w:bookmarkEnd w:id="116"/>
+    <w:bookmarkStart w:id="117" w:name="Xdb72e8c31238e5bc8bb35e9197d335bc848251d"/>
     <w:p>
       <w:pPr>
         <w:pStyle w:val="Heading3"/>
@@ -11548,8 +11686,8 @@
         <w:t xml:space="preserve">الأثر المالي: يضمن هذا الإجراء أن تكون قيمة المخزون في لوحة القيادة مطابقة تماماً للواقع المالي، مما يلغي أخطاء التقييم التي كانت تحدث في السجلات الورقية.</w:t>
       </w:r>
     </w:p>
-    <w:bookmarkEnd w:id="115"/>
-    <w:bookmarkStart w:id="116" w:name="Xb42ed883f4a4d77c904837a9483548fc91a7185"/>
+    <w:bookmarkEnd w:id="117"/>
+    <w:bookmarkStart w:id="118" w:name="Xb42ed883f4a4d77c904837a9483548fc91a7185"/>
     <w:p>
       <w:pPr>
         <w:pStyle w:val="Heading3"/>
@@ -11745,8 +11883,8 @@
         <w:t xml:space="preserve">الديمومة (Durability): يتم تفعيل أمر الحفظ القسري (Force Save) بعد كل عملية حرجة لضمان كتابة البيانات على القرص الصلب فوراً.</w:t>
       </w:r>
     </w:p>
-    <w:bookmarkEnd w:id="116"/>
-    <w:bookmarkStart w:id="117" w:name="X1c2ea8d86c4f45404ae3647941d3499fe8305c9"/>
+    <w:bookmarkEnd w:id="118"/>
+    <w:bookmarkStart w:id="119" w:name="X1c2ea8d86c4f45404ae3647941d3499fe8305c9"/>
     <w:p>
       <w:pPr>
         <w:pStyle w:val="Heading3"/>
@@ -11942,9 +12080,9 @@
         <w:t xml:space="preserve">و”قيمة المخزون”.</w:t>
       </w:r>
     </w:p>
-    <w:bookmarkEnd w:id="117"/>
-    <w:bookmarkEnd w:id="118"/>
-    <w:bookmarkStart w:id="128" w:name="Xc6e18aa2af3011a1373a5d4857df80b39c98584"/>
+    <w:bookmarkEnd w:id="119"/>
+    <w:bookmarkEnd w:id="120"/>
+    <w:bookmarkStart w:id="130" w:name="Xc6e18aa2af3011a1373a5d4857df80b39c98584"/>
     <w:p>
       <w:pPr>
         <w:pStyle w:val="Heading2"/>
@@ -12006,7 +12144,7 @@
         <w:t xml:space="preserve">(UX Design) لضمان تحويل البيانات المعقدة إلى مؤشرات بصرية بسيطة تدعم اتخاذ القرار السريع والدقيق.</w:t>
       </w:r>
     </w:p>
-    <w:bookmarkStart w:id="119" w:name="Xdcbed4a529f139898c76cbbdb64bb8c1a119adb"/>
+    <w:bookmarkStart w:id="121" w:name="Xdcbed4a529f139898c76cbbdb64bb8c1a119adb"/>
     <w:p>
       <w:pPr>
         <w:pStyle w:val="Heading3"/>
@@ -12296,8 +12434,8 @@
         <w:t xml:space="preserve">وحدة الإعدادات (PARAMETRES): تمنح النظام مرونة عالية عبر السماح بتعديل الثوابت (مثل تكلفة الطلب ومعدل الاحتفاظ) دون الحاجة لتعديل الكود البرمجي. وتجدر الإشارة إلى أن جميع الأسعار المُدرجة في هذه الوحدة هي أسعار صافية خالية من الرسم على القيمة المضافة، انسجاماً مع التعليمة رقم 09-2018 التي تُعفي مؤسسات التربية الوطنية من TVA في مشترياتها التربوية.**</w:t>
       </w:r>
     </w:p>
-    <w:bookmarkEnd w:id="119"/>
-    <w:bookmarkStart w:id="120" w:name="Xc3e868391841f7562f5d5b2b3c4438a8091e2eb"/>
+    <w:bookmarkEnd w:id="121"/>
+    <w:bookmarkStart w:id="122" w:name="Xc3e868391841f7562f5d5b2b3c4438a8091e2eb"/>
     <w:p>
       <w:pPr>
         <w:pStyle w:val="Heading3"/>
@@ -12557,8 +12695,8 @@
         <w:t xml:space="preserve">المستوى الأحمر (Danger Zone): يُفعل عند اختراق مخزون الأمان (SS) أو الوصول إلى حالة النفاد، مما يتطلب تدخلاً فورياً وعاجلاً لضمان عدم توقف المرفق التربوي.</w:t>
       </w:r>
     </w:p>
-    <w:bookmarkEnd w:id="120"/>
-    <w:bookmarkStart w:id="121" w:name="X197816f32b7b7ef5c9c4cb4d12a6ba19ec348d5"/>
+    <w:bookmarkEnd w:id="122"/>
+    <w:bookmarkStart w:id="123" w:name="X197816f32b7b7ef5c9c4cb4d12a6ba19ec348d5"/>
     <w:p>
       <w:pPr>
         <w:pStyle w:val="Heading3"/>
@@ -12722,8 +12860,8 @@
         <w:t xml:space="preserve">المتابعة الزمنية (Temporal Tracking): توفير ملخصات عن حركة المخزون خلال فترات محددة، مما يدعم عملية تخطيط الميزانية السنوية بناءً على استهلاكات فعلية دقيقة.</w:t>
       </w:r>
     </w:p>
-    <w:bookmarkEnd w:id="121"/>
-    <w:bookmarkStart w:id="127" w:name="X43f602add9b7058ce87741ac0c8f7096d34eb8c"/>
+    <w:bookmarkEnd w:id="123"/>
+    <w:bookmarkStart w:id="129" w:name="X43f602add9b7058ce87741ac0c8f7096d34eb8c"/>
     <w:p>
       <w:pPr>
         <w:pStyle w:val="Heading3"/>
@@ -12753,7 +12891,7 @@
         <w:t xml:space="preserve">لضمان احترافية النظام وتوافقه مع معايير البرمجيات الحديثة، تم دمج لمسات تصميمية ووظيفية مبتكرة:</w:t>
       </w:r>
     </w:p>
-    <w:bookmarkStart w:id="122" w:name="أولا-الهوية-البصرية-zinc-emerald-theme"/>
+    <w:bookmarkStart w:id="124" w:name="أولا-الهوية-البصرية-zinc-emerald-theme"/>
     <w:p>
       <w:pPr>
         <w:pStyle w:val="Heading4"/>
@@ -12783,8 +12921,8 @@
         <w:t xml:space="preserve">تم اعتماد لوحة ألوان عصرية تعتمد على اللون Zinc (للخلفيات والحدود) لإعطاء طابع من الرصانة والوضوح، واللون Emerald (للأزرار والمؤشرات الإيجابية) لإضفاء لمسة من الحيوية والاحترافية، مما يقلل من إجهاد العين أثناء الاستخدام الطويل.</w:t>
       </w:r>
     </w:p>
-    <w:bookmarkEnd w:id="122"/>
-    <w:bookmarkStart w:id="126" w:name="ثانيا-الميزات-الابتكارية-المدمجة"/>
+    <w:bookmarkEnd w:id="124"/>
+    <w:bookmarkStart w:id="128" w:name="ثانيا-الميزات-الابتكارية-المدمجة"/>
     <w:p>
       <w:pPr>
         <w:pStyle w:val="Heading4"/>
@@ -13119,7 +13257,7 @@
           <w:rFonts w:ascii="Traditional Arabic" w:hAnsi="Traditional Arabic"/>
           <w:sz w:val="28"/>
         </w:rPr>
-        <w:footnoteReference w:id="123"/>
+        <w:footnoteReference w:id="125"/>
       </w:r>
       <w:r>
         <w:rPr>
@@ -13151,7 +13289,7 @@
           <w:rFonts w:ascii="Traditional Arabic" w:hAnsi="Traditional Arabic"/>
           <w:sz w:val="28"/>
         </w:rPr>
-        <w:footnoteReference w:id="124"/>
+        <w:footnoteReference w:id="126"/>
       </w:r>
       <w:r>
         <w:rPr>
@@ -13167,14 +13305,14 @@
           <w:rFonts w:ascii="Traditional Arabic" w:hAnsi="Traditional Arabic"/>
           <w:sz w:val="28"/>
         </w:rPr>
-        <w:footnoteReference w:id="125"/>
-      </w:r>
-    </w:p>
-    <w:bookmarkEnd w:id="126"/>
-    <w:bookmarkEnd w:id="127"/>
+        <w:footnoteReference w:id="127"/>
+      </w:r>
+    </w:p>
     <w:bookmarkEnd w:id="128"/>
     <w:bookmarkEnd w:id="129"/>
-    <w:bookmarkStart w:id="142" w:name="الفصل-الرابع-التجريب-والتحقق-من-النتائج"/>
+    <w:bookmarkEnd w:id="130"/>
+    <w:bookmarkEnd w:id="131"/>
+    <w:bookmarkStart w:id="144" w:name="الفصل-الرابع-التجريب-والتحقق-من-النتائج"/>
     <w:p>
       <w:pPr>
         <w:pStyle w:val="Heading1"/>
@@ -13189,7 +13327,7 @@
         <w:t xml:space="preserve">الفصل الرابع: التجريب والتحقق من النتائج</w:t>
       </w:r>
     </w:p>
-    <w:bookmarkStart w:id="137" w:name="X772d01764d2cdf10730319436c2b610a5dde5fe"/>
+    <w:bookmarkStart w:id="139" w:name="X772d01764d2cdf10730319436c2b610a5dde5fe"/>
     <w:p>
       <w:pPr>
         <w:pStyle w:val="Heading2"/>
@@ -13204,7 +13342,7 @@
         <w:t xml:space="preserve">المبحث الأول: نتائج التجريب والتحقق من صحة الفرضيات</w:t>
       </w:r>
     </w:p>
-    <w:bookmarkStart w:id="130" w:name="مقارنة-مؤشرات-الأداء-قبل-وبعد-التطبيق"/>
+    <w:bookmarkStart w:id="132" w:name="مقارنة-مؤشرات-الأداء-قبل-وبعد-التطبيق"/>
     <w:p>
       <w:pPr>
         <w:pStyle w:val="Heading3"/>
@@ -13772,8 +13910,8 @@
         <w:t xml:space="preserve">المصدر: إعداد الطالب — ملاحظة ميدانية مباشرة + قياسات نظام ERP_Académie_v13.3 | فيفري–مارس 2026 تُثبت هذه النتائج أن نظام دعم القرار حقَّق تحسينات ملموسة وقابلة للقياس في كل مؤشرات الأداء التشغيلية المُرصَدة.</w:t>
       </w:r>
     </w:p>
-    <w:bookmarkEnd w:id="130"/>
-    <w:bookmarkStart w:id="131" w:name="التحقق-من-صحة-فرضيات-البحث"/>
+    <w:bookmarkEnd w:id="132"/>
+    <w:bookmarkStart w:id="133" w:name="التحقق-من-صحة-فرضيات-البحث"/>
     <w:p>
       <w:pPr>
         <w:pStyle w:val="Heading3"/>
@@ -14130,8 +14268,8 @@
         </w:tc>
       </w:tr>
     </w:tbl>
-    <w:bookmarkEnd w:id="131"/>
-    <w:bookmarkStart w:id="132" w:name="التحليل-التفصيلي-لمؤشرات-الأداء"/>
+    <w:bookmarkEnd w:id="133"/>
+    <w:bookmarkStart w:id="134" w:name="التحليل-التفصيلي-لمؤشرات-الأداء"/>
     <w:p>
       <w:pPr>
         <w:pStyle w:val="Heading3"/>
@@ -14297,8 +14435,8 @@
         <w:t xml:space="preserve">التكلفة والجدوى: أثبتت النتائج أن الرقمنة لم تتطلب أي استثمارات رأسمالية جديدة، حيث تم استغلال البنية التحتية الموجودة، مما يحقق أعلى عائد على الاستثمار.</w:t>
       </w:r>
     </w:p>
-    <w:bookmarkEnd w:id="132"/>
-    <w:bookmarkStart w:id="133" w:name="التقييم-الإحصائي-لمؤشرات-الأداء"/>
+    <w:bookmarkEnd w:id="134"/>
+    <w:bookmarkStart w:id="135" w:name="التقييم-الإحصائي-لمؤشرات-الأداء"/>
     <w:p>
       <w:pPr>
         <w:pStyle w:val="Heading3"/>
@@ -15008,8 +15146,8 @@
         <w:t xml:space="preserve">يُظهر هذا التقييم الإحصائي أن التحسُّن لم يقتصر على مؤشر واحد، بل شمل كل حلقات دورة التخزين، مما يؤكد التأثير الشامل (Systemic Impact) للحل الرقمي المقترح.</w:t>
       </w:r>
     </w:p>
-    <w:bookmarkEnd w:id="133"/>
-    <w:bookmarkStart w:id="134" w:name="التحقق-التجريبي-والمصداقية"/>
+    <w:bookmarkEnd w:id="135"/>
+    <w:bookmarkStart w:id="136" w:name="التحقق-التجريبي-والمصداقية"/>
     <w:p>
       <w:pPr>
         <w:pStyle w:val="Heading3"/>
@@ -15039,8 +15177,8 @@
         <w:t xml:space="preserve">لم تكن هذه النتائج مجرد تقديرات نظرية، بل جاءت نتاج تطبيق تجريبي صارم. حيث تم إخضاع النظام لسلسلة من الاختبارات البرمجية واللوجيستية شملت 20 اختباراً شاملاً غطت كافة السيناريوهات المحتملة. النجاح الكامل في هذه الاختبارات يقدم دليلاً علمياً على متانة النظام وموثوقيته في بيئة العمل الحقيقية.</w:t>
       </w:r>
     </w:p>
-    <w:bookmarkEnd w:id="134"/>
-    <w:bookmarkStart w:id="135" w:name="Xccbafbc0047bdc7ec988da040ea92c932dd07e4"/>
+    <w:bookmarkEnd w:id="136"/>
+    <w:bookmarkStart w:id="137" w:name="Xccbafbc0047bdc7ec988da040ea92c932dd07e4"/>
     <w:p>
       <w:pPr>
         <w:pStyle w:val="Heading3"/>
@@ -15070,8 +15208,8 @@
         <w:t xml:space="preserve">يُثار غالباً تساؤل حول أمن البيانات في الأنظمة المبنية على Excel، غير أن النظام المقترح يُعالج هذه النقطة عبر ثلاث آليات مترابطة. أولاً، سلسلة الحراسة السداسية تمنع التعديل المباشر على الخلايا الحساسة، إذ أن كل حركة تُسجَّل عبر واجهة VBA ولا يمكن إدخال أو تعديل أو حذف أي حركة يدوياً من ورقة العمل. ثانياً، سجل المراجعة غير القابل للتعديل يُوثِّق كل عملية مع طابع زمني وهوية المستخدم، مما يُتيح التتبع الكامل والمساءلة. ثالثاً، الحماية بكلمة مرور على مستوى ورقة العمل والمشروع (VBA Project) تمنع العبث غير المصرَّح به. هذه الآليات تجعل النظام أكثر أماناً من السجلات الورقية التقليدية وأقل عرضة للخطأ البشري.</w:t>
       </w:r>
     </w:p>
-    <w:bookmarkEnd w:id="135"/>
-    <w:bookmarkStart w:id="136" w:name="الأثر-التشغيلي-العام-operational-impact"/>
+    <w:bookmarkEnd w:id="137"/>
+    <w:bookmarkStart w:id="138" w:name="الأثر-التشغيلي-العام-operational-impact"/>
     <w:p>
       <w:pPr>
         <w:pStyle w:val="Heading3"/>
@@ -15165,9 +15303,9 @@
         <w:t xml:space="preserve">والشفافية المطلقة. هذا التحول هو الخطوة الأولى والأساسية نحو بناء منظومة لوجيستية رقمية متكاملة تخدم أهداف العملية التربوية بكفاءة واقتدار.</w:t>
       </w:r>
     </w:p>
-    <w:bookmarkEnd w:id="136"/>
-    <w:bookmarkEnd w:id="137"/>
-    <w:bookmarkStart w:id="141" w:name="المبحث-الثاني-التوصيات-وآفاق-البحث"/>
+    <w:bookmarkEnd w:id="138"/>
+    <w:bookmarkEnd w:id="139"/>
+    <w:bookmarkStart w:id="143" w:name="المبحث-الثاني-التوصيات-وآفاق-البحث"/>
     <w:p>
       <w:pPr>
         <w:pStyle w:val="Heading2"/>
@@ -15182,7 +15320,7 @@
         <w:t xml:space="preserve">المبحث الثاني: التوصيات وآفاق البحث</w:t>
       </w:r>
     </w:p>
-    <w:bookmarkStart w:id="138" w:name="التوصيات-المقدمة-لمصلحة-المخازن-والإدارة"/>
+    <w:bookmarkStart w:id="140" w:name="التوصيات-المقدمة-لمصلحة-المخازن-والإدارة"/>
     <w:p>
       <w:pPr>
         <w:pStyle w:val="Heading3"/>
@@ -15763,8 +15901,8 @@
         </w:tc>
       </w:tr>
     </w:tbl>
-    <w:bookmarkEnd w:id="138"/>
-    <w:bookmarkStart w:id="140" w:name="آفاق-البحث"/>
+    <w:bookmarkEnd w:id="140"/>
+    <w:bookmarkStart w:id="142" w:name="آفاق-البحث"/>
     <w:p>
       <w:pPr>
         <w:pStyle w:val="Heading3"/>
@@ -15911,7 +16049,7 @@
           <w:rFonts w:ascii="Traditional Arabic" w:hAnsi="Traditional Arabic"/>
           <w:sz w:val="28"/>
         </w:rPr>
-        <w:footnoteReference w:id="139"/>
+        <w:footnoteReference w:id="141"/>
       </w:r>
       <w:r>
         <w:rPr>
@@ -16023,10 +16161,10 @@
         <w:t xml:space="preserve">الفرضية الثانية مُثبَتة: نظام دعم القرار المقترح يُحسِّن دقة التتبع ويُقلِّص وقت معالجة الطلبيات بصورة ملموسة وقابلة للقياس. تبقى هذه الدراسة حلقةً في مسيرة التحوُّل الرقمي للإدارة الجزائرية، لا نهايةً لها. إن التحدي الأكبر لم يكن التقنية — إذ أثبتت التجربة أن Excel/VBA كافٍ — بل كان في إقناع الفاعلين الإداريين بأن الرقمنة ليست ترفاً، بل ضرورة تشغيلية تُوفِّر الوقت والمال وتمنع الاختلالات التي تُعطِّل العملية التربوية في أوقات الذروة. وهذا ما تطمح إليه هذه المذكرة: أن تكون بذرةً لثقافة إدارية رقمية في مؤسسات التربية بولاية البيض وما جاورها.</w:t>
       </w:r>
     </w:p>
-    <w:bookmarkEnd w:id="140"/>
-    <w:bookmarkEnd w:id="141"/>
     <w:bookmarkEnd w:id="142"/>
-    <w:bookmarkStart w:id="150" w:name="قائمة-المصادر-والمراجع"/>
+    <w:bookmarkEnd w:id="143"/>
+    <w:bookmarkEnd w:id="144"/>
+    <w:bookmarkStart w:id="152" w:name="قائمة-المصادر-والمراجع"/>
     <w:p>
       <w:pPr>
         <w:pStyle w:val="Heading1"/>
@@ -16041,7 +16179,7 @@
         <w:t xml:space="preserve">قائمة المصادر والمراجع</w:t>
       </w:r>
     </w:p>
-    <w:bookmarkStart w:id="143" w:name="أولا-الكتب-والمراجع-العلمية"/>
+    <w:bookmarkStart w:id="145" w:name="أولا-الكتب-والمراجع-العلمية"/>
     <w:p>
       <w:pPr>
         <w:pStyle w:val="Heading2"/>
@@ -16276,8 +16414,8 @@
         <w:t xml:space="preserve">Zipkin, P. H. (2000). Foundations of Inventory Management. McGraw-Hill.</w:t>
       </w:r>
     </w:p>
-    <w:bookmarkEnd w:id="143"/>
-    <w:bookmarkStart w:id="144" w:name="ثانيا-الإطار-القانوني-والتنظيمي-الجزائري"/>
+    <w:bookmarkEnd w:id="145"/>
+    <w:bookmarkStart w:id="146" w:name="ثانيا-الإطار-القانوني-والتنظيمي-الجزائري"/>
     <w:p>
       <w:pPr>
         <w:pStyle w:val="Heading2"/>
@@ -16424,8 +16562,8 @@
         <w:t xml:space="preserve">قانون المالية. (سنوي). القانون المتضمن قانون المالية للسنة المعنية. الجريدة الرسمية.</w:t>
       </w:r>
     </w:p>
-    <w:bookmarkEnd w:id="144"/>
-    <w:bookmarkStart w:id="145" w:name="ثالثا-المنهاج-الدراسي-bts-gsl-tag1801"/>
+    <w:bookmarkEnd w:id="146"/>
+    <w:bookmarkStart w:id="147" w:name="ثالثا-المنهاج-الدراسي-bts-gsl-tag1801"/>
     <w:p>
       <w:pPr>
         <w:pStyle w:val="Heading2"/>
@@ -17122,8 +17260,8 @@
         <w:t xml:space="preserve">المعجم اللوجستيكي (Glossaire). (2024). مقياس BTS GSL، الفصل الدراسي الرابع.</w:t>
       </w:r>
     </w:p>
-    <w:bookmarkEnd w:id="145"/>
-    <w:bookmarkStart w:id="146" w:name="رابعا-المراجع-التقنية"/>
+    <w:bookmarkEnd w:id="147"/>
+    <w:bookmarkStart w:id="148" w:name="رابعا-المراجع-التقنية"/>
     <w:p>
       <w:pPr>
         <w:pStyle w:val="Heading2"/>
@@ -17182,8 +17320,8 @@
         <w:t xml:space="preserve">Microsoft Corporation. (2019). Excel Object Model Overview. Microsoft Docs.</w:t>
       </w:r>
     </w:p>
-    <w:bookmarkEnd w:id="146"/>
-    <w:bookmarkStart w:id="147" w:name="خامسا-مشاريع-وأطروحات-موازية"/>
+    <w:bookmarkEnd w:id="148"/>
+    <w:bookmarkStart w:id="149" w:name="خامسا-مشاريع-وأطروحات-موازية"/>
     <w:p>
       <w:pPr>
         <w:pStyle w:val="Heading2"/>
@@ -17286,8 +17424,8 @@
         <w:t xml:space="preserve">Belhadi, M. E. A. (2015). Modélisation et optimisation de la gestion de stocks des pièces de rechange : application SASACE-Algérie. Mémoire de Projet de Fin d’Études, École Nationale Polytechnique d’Alger.</w:t>
       </w:r>
     </w:p>
-    <w:bookmarkEnd w:id="147"/>
-    <w:bookmarkStart w:id="148" w:name="سادسا-مصادر-البيانات-الميدانية"/>
+    <w:bookmarkEnd w:id="149"/>
+    <w:bookmarkStart w:id="150" w:name="سادسا-مصادر-البيانات-الميدانية"/>
     <w:p>
       <w:pPr>
         <w:pStyle w:val="Heading2"/>
@@ -17346,8 +17484,8 @@
         <w:t xml:space="preserve">مديرية التربية لولاية البيض — مصلحة الميزانية. (2025). بيانات تكاليف الطلب والاحتفاظ. وثائق داخلية غير منشورة.</w:t>
       </w:r>
     </w:p>
-    <w:bookmarkEnd w:id="148"/>
-    <w:bookmarkStart w:id="149" w:name="سابعا-المراجع-البرمجية"/>
+    <w:bookmarkEnd w:id="150"/>
+    <w:bookmarkStart w:id="151" w:name="سابعا-المراجع-البرمجية"/>
     <w:p>
       <w:pPr>
         <w:pStyle w:val="Heading2"/>
@@ -17384,9 +17522,9 @@
         <w:t xml:space="preserve">Kamel, M. (2026). ERP_Académie v13.3 — Système d’Aide à la Décision pour la Gestion des Stocks. GitHub. https://github.com/kamelmh/lsm-vba-core.</w:t>
       </w:r>
     </w:p>
-    <w:bookmarkEnd w:id="149"/>
-    <w:bookmarkEnd w:id="150"/>
-    <w:bookmarkStart w:id="151" w:name="جدول-المختصرات-والرموز-التقنية"/>
+    <w:bookmarkEnd w:id="151"/>
+    <w:bookmarkEnd w:id="152"/>
+    <w:bookmarkStart w:id="153" w:name="جدول-المختصرات-والرموز-التقنية"/>
     <w:p>
       <w:pPr>
         <w:pStyle w:val="Heading1"/>
@@ -18650,8 +18788,8 @@
         </w:tc>
       </w:tr>
     </w:tbl>
-    <w:bookmarkEnd w:id="151"/>
-    <w:bookmarkStart w:id="158" w:name="قائمة-المصطلحات"/>
+    <w:bookmarkEnd w:id="153"/>
+    <w:bookmarkStart w:id="160" w:name="قائمة-المصطلحات"/>
     <w:p>
       <w:pPr>
         <w:pStyle w:val="Heading1"/>
@@ -18666,7 +18804,7 @@
         <w:t xml:space="preserve">قائمة المصطلحات</w:t>
       </w:r>
     </w:p>
-    <w:bookmarkStart w:id="152" w:name="المصطلحات-اللوجستية-والتسييرية"/>
+    <w:bookmarkStart w:id="154" w:name="المصطلحات-اللوجستية-والتسييرية"/>
     <w:p>
       <w:pPr>
         <w:pStyle w:val="Heading2"/>
@@ -20672,8 +20810,8 @@
         </w:tc>
       </w:tr>
     </w:tbl>
-    <w:bookmarkEnd w:id="152"/>
-    <w:bookmarkStart w:id="157" w:name="مصطلحات-تقنية-النظام"/>
+    <w:bookmarkEnd w:id="154"/>
+    <w:bookmarkStart w:id="159" w:name="مصطلحات-تقنية-النظام"/>
     <w:p>
       <w:pPr>
         <w:pStyle w:val="Heading2"/>
@@ -20709,7 +20847,7 @@
           <w:b/>
           <w:sz w:val="36"/>
         </w:rPr>
-        <w:footnoteReference w:id="153"/>
+        <w:footnoteReference w:id="155"/>
       </w:r>
       <w:r>
         <w:rPr>
@@ -20725,7 +20863,7 @@
           <w:b/>
           <w:sz w:val="36"/>
         </w:rPr>
-        <w:footnoteReference w:id="154"/>
+        <w:footnoteReference w:id="156"/>
       </w:r>
       <w:r>
         <w:rPr>
@@ -20741,7 +20879,7 @@
           <w:b/>
           <w:sz w:val="36"/>
         </w:rPr>
-        <w:footnoteReference w:id="155"/>
+        <w:footnoteReference w:id="157"/>
       </w:r>
       <w:r>
         <w:rPr>
@@ -20757,7 +20895,7 @@
           <w:b/>
           <w:sz w:val="36"/>
         </w:rPr>
-        <w:footnoteReference w:id="156"/>
+        <w:footnoteReference w:id="158"/>
       </w:r>
     </w:p>
     <w:tbl>
@@ -21701,9 +21839,9 @@
         </w:tc>
       </w:tr>
     </w:tbl>
-    <w:bookmarkEnd w:id="157"/>
-    <w:bookmarkEnd w:id="158"/>
-    <w:bookmarkStart w:id="182" w:name="الملاحق-annexes"/>
+    <w:bookmarkEnd w:id="159"/>
+    <w:bookmarkEnd w:id="160"/>
+    <w:bookmarkStart w:id="184" w:name="الملاحق-annexes"/>
     <w:p>
       <w:pPr>
         <w:pStyle w:val="Heading1"/>
@@ -21718,7 +21856,7 @@
         <w:t xml:space="preserve">الملاحق (Annexes)</w:t>
       </w:r>
     </w:p>
-    <w:bookmarkStart w:id="159" w:name="الملحق-الأول-هيكل-ملف-النظام"/>
+    <w:bookmarkStart w:id="161" w:name="الملحق-الأول-هيكل-ملف-النظام"/>
     <w:p>
       <w:pPr>
         <w:pStyle w:val="Heading2"/>
@@ -22082,8 +22220,8 @@
         </w:tc>
       </w:tr>
     </w:tbl>
-    <w:bookmarkEnd w:id="159"/>
-    <w:bookmarkStart w:id="160" w:name="الملحق-الثاني-وحدات-vba-الرئيسية"/>
+    <w:bookmarkEnd w:id="161"/>
+    <w:bookmarkStart w:id="162" w:name="الملحق-الثاني-وحدات-vba-الرئيسية"/>
     <w:p>
       <w:pPr>
         <w:pStyle w:val="Heading2"/>
@@ -22555,8 +22693,8 @@
         </w:tc>
       </w:tr>
     </w:tbl>
-    <w:bookmarkEnd w:id="160"/>
-    <w:bookmarkStart w:id="161" w:name="الملحق-الثالث-بيانات-المخزون-الميدانية"/>
+    <w:bookmarkEnd w:id="162"/>
+    <w:bookmarkStart w:id="163" w:name="الملحق-الثالث-بيانات-المخزون-الميدانية"/>
     <w:p>
       <w:pPr>
         <w:pStyle w:val="Heading2"/>
@@ -23783,8 +23921,8 @@
         <w:t xml:space="preserve">ملاحظة: يتم تخزين البيانات في أوراق Excel محمية بكلمة مرور مع تعطيل التعديل اليدوي المباشر.</w:t>
       </w:r>
     </w:p>
-    <w:bookmarkEnd w:id="161"/>
-    <w:bookmarkStart w:id="162" w:name="الملحق-الرابع-نماذج-الوثائق-الإدارية"/>
+    <w:bookmarkEnd w:id="163"/>
+    <w:bookmarkStart w:id="164" w:name="الملحق-الرابع-نماذج-الوثائق-الإدارية"/>
     <w:p>
       <w:pPr>
         <w:pStyle w:val="Heading2"/>
@@ -23950,8 +24088,8 @@
         <w:t xml:space="preserve">BS (Bon de Sortie): وصل الإخراج — يُصدَر عند صرف المواد للوحدات المستفيدة جميع الوثائق تُولَّد بصيغة PDF قابلة للطباعة والتوقيع، مع تضمين رمز شريطي (QR Code) للتحقق من أصالتها.</w:t>
       </w:r>
     </w:p>
-    <w:bookmarkEnd w:id="162"/>
-    <w:bookmarkStart w:id="163" w:name="X2ba466c7822f1b4b8d4c28ae81ff579f1d28271"/>
+    <w:bookmarkEnd w:id="164"/>
+    <w:bookmarkStart w:id="165" w:name="X2ba466c7822f1b4b8d4c28ae81ff579f1d28271"/>
     <w:p>
       <w:pPr>
         <w:pStyle w:val="Heading2"/>
@@ -24225,8 +24363,8 @@
         <w:t xml:space="preserve">ملاحظة هامة: النماذج اللغوية الكبيرة استُخدِمت حصراً في مرحلة التطوير والمراجعة (Development &amp; Review Phase) وليس في مرحلة التشغيل. نظام دعم القرار لتسيير المخزون يعمل بشكل كامل ومستقل عن أي خدمة سحابية أو نموذج ذكاء اصطناعي، مما يضمن الاستقلالية التشغيلية التامة وفقاً لمبدأ Offline-First.</w:t>
       </w:r>
     </w:p>
-    <w:bookmarkEnd w:id="163"/>
-    <w:bookmarkStart w:id="181" w:name="X1148525acfd03c2ffb8a3bcaf8453ddfd410d6d"/>
+    <w:bookmarkEnd w:id="165"/>
+    <w:bookmarkStart w:id="183" w:name="X1148525acfd03c2ffb8a3bcaf8453ddfd410d6d"/>
     <w:p>
       <w:pPr>
         <w:pStyle w:val="Heading2"/>
@@ -24241,7 +24379,7 @@
         <w:t xml:space="preserve">الملحق السادس: نظام دعم القرار والمرجعيات الجزائرية — الربط الذكي</w:t>
       </w:r>
     </w:p>
-    <w:bookmarkStart w:id="164" w:name="X540dee732a69215b730bef105cf0059b0b377be"/>
+    <w:bookmarkStart w:id="166" w:name="X540dee732a69215b730bef105cf0059b0b377be"/>
     <w:p>
       <w:pPr>
         <w:pStyle w:val="Heading3"/>
@@ -24692,8 +24830,8 @@
         </w:tc>
       </w:tr>
     </w:tbl>
-    <w:bookmarkEnd w:id="164"/>
-    <w:bookmarkStart w:id="165" w:name="التوافق-مع-التشريعات-الجزائرية"/>
+    <w:bookmarkEnd w:id="166"/>
+    <w:bookmarkStart w:id="167" w:name="التوافق-مع-التشريعات-الجزائرية"/>
     <w:p>
       <w:pPr>
         <w:pStyle w:val="Heading3"/>
@@ -25089,8 +25227,8 @@
         </w:tc>
       </w:tr>
     </w:tbl>
-    <w:bookmarkEnd w:id="165"/>
-    <w:bookmarkStart w:id="169" w:name="الربط-بين-المذكرة-والواقع-البرمجي"/>
+    <w:bookmarkEnd w:id="167"/>
+    <w:bookmarkStart w:id="171" w:name="الربط-بين-المذكرة-والواقع-البرمجي"/>
     <w:p>
       <w:pPr>
         <w:pStyle w:val="Heading3"/>
@@ -25120,7 +25258,7 @@
         <w:t xml:space="preserve">يربط هذا الملحق الفجوة بين الإطار الأكاديمي للمذكرة والواقع التقني لنظام دعم القرار:</w:t>
       </w:r>
     </w:p>
-    <w:bookmarkStart w:id="166" w:name="أ.-من-المنهاج-إلى-الكود"/>
+    <w:bookmarkStart w:id="168" w:name="أ.-من-المنهاج-إلى-الكود"/>
     <w:p>
       <w:pPr>
         <w:pStyle w:val="Heading4"/>
@@ -25533,8 +25671,8 @@
         </w:tc>
       </w:tr>
     </w:tbl>
-    <w:bookmarkEnd w:id="166"/>
-    <w:bookmarkStart w:id="167" w:name="ب.-من-النظرية-إلى-الميدان"/>
+    <w:bookmarkEnd w:id="168"/>
+    <w:bookmarkStart w:id="169" w:name="ب.-من-النظرية-إلى-الميدان"/>
     <w:p>
       <w:pPr>
         <w:pStyle w:val="Heading4"/>
@@ -25842,8 +25980,8 @@
         </w:tc>
       </w:tr>
     </w:tbl>
-    <w:bookmarkEnd w:id="167"/>
-    <w:bookmarkStart w:id="168" w:name="ج.-التوثيق-الذكي-المتقاطع"/>
+    <w:bookmarkEnd w:id="169"/>
+    <w:bookmarkStart w:id="170" w:name="ج.-التوثيق-الذكي-المتقاطع"/>
     <w:p>
       <w:pPr>
         <w:pStyle w:val="Heading4"/>
@@ -25871,9 +26009,9 @@
         <w:t xml:space="preserve">يتم الربط بين المراجع الأكاديمية والمكونات التقنية وفق المبدأ التالي: كل مرجع أكاديمي (CNEPD/مراسيم/كتب) يرتبط بوحدة برمجية محددة، وكل وحدة برمجية ترتبط بنتيجة ميدانية قابلة للقياس. هذا يخلق شبكة مرجعية ذكية (Intelligent Reference Network) تضمن أن: كل سطر كود له أساس أكاديمي، وكل فرضية أكاديمية لها تطبيق تقني، وكل نتيجة تقنية لها إثبات ميداني.</w:t>
       </w:r>
     </w:p>
-    <w:bookmarkEnd w:id="168"/>
-    <w:bookmarkEnd w:id="169"/>
-    <w:bookmarkStart w:id="170" w:name="التوافق-مع-معايير-تقييم-لجنة-cnepd"/>
+    <w:bookmarkEnd w:id="170"/>
+    <w:bookmarkEnd w:id="171"/>
+    <w:bookmarkStart w:id="172" w:name="التوافق-مع-معايير-تقييم-لجنة-cnepd"/>
     <w:p>
       <w:pPr>
         <w:pStyle w:val="Heading3"/>
@@ -26442,8 +26580,8 @@
         </w:tc>
       </w:tr>
     </w:tbl>
-    <w:bookmarkEnd w:id="170"/>
-    <w:bookmarkStart w:id="173" w:name="خارطة-طريق-التكامل-مع-منظومة-sigle"/>
+    <w:bookmarkEnd w:id="172"/>
+    <w:bookmarkStart w:id="175" w:name="خارطة-طريق-التكامل-مع-منظومة-sigle"/>
     <w:p>
       <w:pPr>
         <w:pStyle w:val="Heading3"/>
@@ -26458,7 +26596,7 @@
         <w:t xml:space="preserve">5. خارطة طريق التكامل مع منظومة SIGLE</w:t>
       </w:r>
     </w:p>
-    <w:bookmarkStart w:id="171" w:name="أ.-تحليل-الفجوة-بين-النظامين"/>
+    <w:bookmarkStart w:id="173" w:name="أ.-تحليل-الفجوة-بين-النظامين"/>
     <w:p>
       <w:pPr>
         <w:pStyle w:val="Heading4"/>
@@ -26991,8 +27129,8 @@
         </w:tc>
       </w:tr>
     </w:tbl>
-    <w:bookmarkEnd w:id="171"/>
-    <w:bookmarkStart w:id="172" w:name="ب.-آلية-الربط-التقني-المقترحة"/>
+    <w:bookmarkEnd w:id="173"/>
+    <w:bookmarkStart w:id="174" w:name="ب.-آلية-الربط-التقني-المقترحة"/>
     <w:p>
       <w:pPr>
         <w:pStyle w:val="Heading4"/>
@@ -27122,9 +27260,9 @@
         <w:t xml:space="preserve">مزامنة الأرصدة: SIGLE يُحدِّث الأرصدة المحاسبية في DSS عبر ملف Excel مشترك</w:t>
       </w:r>
     </w:p>
-    <w:bookmarkEnd w:id="172"/>
-    <w:bookmarkEnd w:id="173"/>
-    <w:bookmarkStart w:id="174" w:name="X485db556af4b366bd62bc4eb581b99584ba2256"/>
+    <w:bookmarkEnd w:id="174"/>
+    <w:bookmarkEnd w:id="175"/>
+    <w:bookmarkStart w:id="176" w:name="X485db556af4b366bd62bc4eb581b99584ba2256"/>
     <w:p>
       <w:pPr>
         <w:pStyle w:val="Heading3"/>
@@ -27419,8 +27557,8 @@
         </w:tc>
       </w:tr>
     </w:tbl>
-    <w:bookmarkEnd w:id="174"/>
-    <w:bookmarkStart w:id="175" w:name="إمكانية-التعميم-على-الولايات-الأخرى"/>
+    <w:bookmarkEnd w:id="176"/>
+    <w:bookmarkStart w:id="177" w:name="إمكانية-التعميم-على-الولايات-الأخرى"/>
     <w:p>
       <w:pPr>
         <w:pStyle w:val="Heading3"/>
@@ -27921,8 +28059,8 @@
         </w:tc>
       </w:tr>
     </w:tbl>
-    <w:bookmarkEnd w:id="175"/>
-    <w:bookmarkStart w:id="176" w:name="مقارنة-التكلفة-dss-مقابل-الحلول-التجارية"/>
+    <w:bookmarkEnd w:id="177"/>
+    <w:bookmarkStart w:id="178" w:name="مقارنة-التكلفة-dss-مقابل-الحلول-التجارية"/>
     <w:p>
       <w:pPr>
         <w:pStyle w:val="Heading3"/>
@@ -28457,8 +28595,8 @@
         </w:tc>
       </w:tr>
     </w:tbl>
-    <w:bookmarkEnd w:id="176"/>
-    <w:bookmarkStart w:id="180" w:name="خلاصة-المرجعية-الجزائرية"/>
+    <w:bookmarkEnd w:id="178"/>
+    <w:bookmarkStart w:id="182" w:name="خلاصة-المرجعية-الجزائرية"/>
     <w:p>
       <w:pPr>
         <w:pStyle w:val="Heading3"/>
@@ -28754,7 +28892,7 @@
           <w:rFonts w:ascii="Traditional Arabic" w:hAnsi="Traditional Arabic"/>
           <w:sz w:val="28"/>
         </w:rPr>
-        <w:footnoteReference w:id="177"/>
+        <w:footnoteReference w:id="179"/>
       </w:r>
       <w:r>
         <w:rPr>
@@ -28770,7 +28908,7 @@
           <w:rFonts w:ascii="Traditional Arabic" w:hAnsi="Traditional Arabic"/>
           <w:sz w:val="28"/>
         </w:rPr>
-        <w:footnoteReference w:id="178"/>
+        <w:footnoteReference w:id="180"/>
       </w:r>
       <w:r>
         <w:rPr>
@@ -28786,12 +28924,12 @@
           <w:rFonts w:ascii="Traditional Arabic" w:hAnsi="Traditional Arabic"/>
           <w:sz w:val="28"/>
         </w:rPr>
-        <w:footnoteReference w:id="179"/>
-      </w:r>
-    </w:p>
-    <w:bookmarkEnd w:id="180"/>
-    <w:bookmarkEnd w:id="181"/>
+        <w:footnoteReference w:id="181"/>
+      </w:r>
+    </w:p>
     <w:bookmarkEnd w:id="182"/>
+    <w:bookmarkEnd w:id="183"/>
+    <w:bookmarkEnd w:id="184"/>
     <w:sectPr>
       <w:pgNumType w:fmt="decimal"/>
       <w:footnotePr>
@@ -28824,7 +28962,7 @@
       </w:r>
     </w:p>
   </w:footnote>
-  <w:footnote w:id="19">
+  <w:footnote w:id="21">
     <w:p>
       <w:pPr>
         <w:pStyle w:val="FootnoteText"/>
@@ -28872,39 +29010,6 @@
           <w:rtl/>
         </w:rPr>
         <w:t xml:space="preserve">, The International Journal of Logistics Management, Vol. 8, N° 1, 1997, p. 1.</w:t>
-      </w:r>
-    </w:p>
-  </w:footnote>
-  <w:footnote w:id="21">
-    <w:p>
-      <w:pPr>
-        <w:pStyle w:val="FootnoteText"/>
-        <w:bidi/>
-        <w:jc w:val="right"/>
-      </w:pPr>
-      <w:r>
-        <w:rPr>
-          <w:rStyle w:val="FootnoteReference"/>
-        </w:rPr>
-        <w:footnoteRef/>
-      </w:r>
-      <w:r>
-        <w:rPr>
-          <w:rtl/>
-        </w:rPr>
-        <w:t xml:space="preserve"> </w:t>
-      </w:r>
-      <w:r>
-        <w:rPr>
-          <w:rtl/>
-        </w:rPr>
-        <w:t xml:space="preserve"> </w:t>
-      </w:r>
-      <w:r>
-        <w:rPr>
-          <w:rtl/>
-        </w:rPr>
-        <w:t xml:space="preserve">راجع: S. Chopra &amp; P. Meindl, Supply Chain Management: Strategy, Planning, and Operation, 7th ed., Pearson, 2019, p. 5.</w:t>
       </w:r>
     </w:p>
   </w:footnote>
@@ -28937,11 +29042,44 @@
         <w:rPr>
           <w:rtl/>
         </w:rPr>
+        <w:t xml:space="preserve">راجع: S. Chopra &amp; P. Meindl, Supply Chain Management: Strategy, Planning, and Operation, 7th ed., Pearson, 2019, p. 5.</w:t>
+      </w:r>
+    </w:p>
+  </w:footnote>
+  <w:footnote w:id="25">
+    <w:p>
+      <w:pPr>
+        <w:pStyle w:val="FootnoteText"/>
+        <w:bidi/>
+        <w:jc w:val="right"/>
+      </w:pPr>
+      <w:r>
+        <w:rPr>
+          <w:rStyle w:val="FootnoteReference"/>
+        </w:rPr>
+        <w:footnoteRef/>
+      </w:r>
+      <w:r>
+        <w:rPr>
+          <w:rtl/>
+        </w:rPr>
+        <w:t xml:space="preserve"> </w:t>
+      </w:r>
+      <w:r>
+        <w:rPr>
+          <w:rtl/>
+        </w:rPr>
+        <w:t xml:space="preserve"> </w:t>
+      </w:r>
+      <w:r>
+        <w:rPr>
+          <w:rtl/>
+        </w:rPr>
         <w:t xml:space="preserve">راجع: D. M. Lambert &amp; J. R. Stock, Strategic Logistics Management, 3rd ed., Irwin, 1993, p. 412.</w:t>
       </w:r>
     </w:p>
   </w:footnote>
-  <w:footnote w:id="24">
+  <w:footnote w:id="26">
     <w:p>
       <w:pPr>
         <w:pStyle w:val="FootnoteText"/>
@@ -28974,7 +29112,7 @@
       </w:r>
     </w:p>
   </w:footnote>
-  <w:footnote w:id="29">
+  <w:footnote w:id="31">
     <w:p>
       <w:pPr>
         <w:pStyle w:val="FootnoteText"/>
@@ -29007,7 +29145,7 @@
       </w:r>
     </w:p>
   </w:footnote>
-  <w:footnote w:id="30">
+  <w:footnote w:id="32">
     <w:p>
       <w:pPr>
         <w:pStyle w:val="FootnoteText"/>
@@ -29040,7 +29178,7 @@
       </w:r>
     </w:p>
   </w:footnote>
-  <w:footnote w:id="33">
+  <w:footnote w:id="35">
     <w:p>
       <w:pPr>
         <w:pStyle w:val="FootnoteText"/>
@@ -29070,39 +29208,6 @@
           <w:rtl/>
         </w:rPr>
         <w:t xml:space="preserve">راجع: A. J. Van Weele, Purchasing and Supply Chain Management, 5th ed., Cengage Learning, 2010, p. 8.</w:t>
-      </w:r>
-    </w:p>
-  </w:footnote>
-  <w:footnote w:id="38">
-    <w:p>
-      <w:pPr>
-        <w:pStyle w:val="FootnoteText"/>
-        <w:bidi/>
-        <w:jc w:val="right"/>
-      </w:pPr>
-      <w:r>
-        <w:rPr>
-          <w:rStyle w:val="FootnoteReference"/>
-        </w:rPr>
-        <w:footnoteRef/>
-      </w:r>
-      <w:r>
-        <w:rPr>
-          <w:rtl/>
-        </w:rPr>
-        <w:t xml:space="preserve"> </w:t>
-      </w:r>
-      <w:r>
-        <w:rPr>
-          <w:rtl/>
-        </w:rPr>
-        <w:t xml:space="preserve"> </w:t>
-      </w:r>
-      <w:r>
-        <w:rPr>
-          <w:rtl/>
-        </w:rPr>
-        <w:t xml:space="preserve">راجع: M. E. A. Belhadi, Modélisation et optimisation de la gestion de stocks des pièces de rechange : application SASACE-Algérie, Mémoire PFE, École Nationale Polytechnique d’Alger, 2015, p. 34.</w:t>
       </w:r>
     </w:p>
   </w:footnote>
@@ -29135,11 +29240,44 @@
         <w:rPr>
           <w:rtl/>
         </w:rPr>
+        <w:t xml:space="preserve">راجع: M. E. A. Belhadi, Modélisation et optimisation de la gestion de stocks des pièces de rechange : application SASACE-Algérie, Mémoire PFE, École Nationale Polytechnique d’Alger, 2015, p. 34.</w:t>
+      </w:r>
+    </w:p>
+  </w:footnote>
+  <w:footnote w:id="42">
+    <w:p>
+      <w:pPr>
+        <w:pStyle w:val="FootnoteText"/>
+        <w:bidi/>
+        <w:jc w:val="right"/>
+      </w:pPr>
+      <w:r>
+        <w:rPr>
+          <w:rStyle w:val="FootnoteReference"/>
+        </w:rPr>
+        <w:footnoteRef/>
+      </w:r>
+      <w:r>
+        <w:rPr>
+          <w:rtl/>
+        </w:rPr>
+        <w:t xml:space="preserve"> </w:t>
+      </w:r>
+      <w:r>
+        <w:rPr>
+          <w:rtl/>
+        </w:rPr>
+        <w:t xml:space="preserve"> </w:t>
+      </w:r>
+      <w:r>
+        <w:rPr>
+          <w:rtl/>
+        </w:rPr>
         <w:t xml:space="preserve">راجع: E. A. Silver, D. F. Pyke &amp; D. J. Thomas, Inventory and Production Management in Supply Chains, 4th ed., Springer, 2017, p. 74. وكذلك: P. H. Zipkin, Foundations of Inventory Management, McGraw-Hill, 2000, p. 52.</w:t>
       </w:r>
     </w:p>
   </w:footnote>
-  <w:footnote w:id="46">
+  <w:footnote w:id="48">
     <w:p>
       <w:pPr>
         <w:pStyle w:val="FootnoteText"/>
@@ -29172,7 +29310,7 @@
       </w:r>
     </w:p>
   </w:footnote>
-  <w:footnote w:id="50">
+  <w:footnote w:id="52">
     <w:p>
       <w:pPr>
         <w:pStyle w:val="FootnoteText"/>
@@ -29238,39 +29376,6 @@
           <w:rtl/>
         </w:rPr>
         <w:t xml:space="preserve">, Factory, The Magazine of Management, Vol. 10, N° 2, 1913, p. 136.</w:t>
-      </w:r>
-    </w:p>
-  </w:footnote>
-  <w:footnote w:id="51">
-    <w:p>
-      <w:pPr>
-        <w:pStyle w:val="FootnoteText"/>
-        <w:bidi/>
-        <w:jc w:val="right"/>
-      </w:pPr>
-      <w:r>
-        <w:rPr>
-          <w:rStyle w:val="FootnoteReference"/>
-        </w:rPr>
-        <w:footnoteRef/>
-      </w:r>
-      <w:r>
-        <w:rPr>
-          <w:rtl/>
-        </w:rPr>
-        <w:t xml:space="preserve"> </w:t>
-      </w:r>
-      <w:r>
-        <w:rPr>
-          <w:rtl/>
-        </w:rPr>
-        <w:t xml:space="preserve"> </w:t>
-      </w:r>
-      <w:r>
-        <w:rPr>
-          <w:rtl/>
-        </w:rPr>
-        <w:t xml:space="preserve">راجع: E. A. Silver, D. F. Pyke &amp; D. J. Thomas, Inventory and Production Management in Supply Chains, 4th ed., Springer, 2017, p. 74.</w:t>
       </w:r>
     </w:p>
   </w:footnote>
@@ -29303,11 +29408,44 @@
         <w:rPr>
           <w:rtl/>
         </w:rPr>
+        <w:t xml:space="preserve">راجع: E. A. Silver, D. F. Pyke &amp; D. J. Thomas, Inventory and Production Management in Supply Chains, 4th ed., Springer, 2017, p. 74.</w:t>
+      </w:r>
+    </w:p>
+  </w:footnote>
+  <w:footnote w:id="55">
+    <w:p>
+      <w:pPr>
+        <w:pStyle w:val="FootnoteText"/>
+        <w:bidi/>
+        <w:jc w:val="right"/>
+      </w:pPr>
+      <w:r>
+        <w:rPr>
+          <w:rStyle w:val="FootnoteReference"/>
+        </w:rPr>
+        <w:footnoteRef/>
+      </w:r>
+      <w:r>
+        <w:rPr>
+          <w:rtl/>
+        </w:rPr>
+        <w:t xml:space="preserve"> </w:t>
+      </w:r>
+      <w:r>
+        <w:rPr>
+          <w:rtl/>
+        </w:rPr>
+        <w:t xml:space="preserve"> </w:t>
+      </w:r>
+      <w:r>
+        <w:rPr>
+          <w:rtl/>
+        </w:rPr>
         <w:t xml:space="preserve">راجع: مديرية التربية لولاية البيض — مصلحة المخازن، السجلات السنوية لحركة المخزون، وثائق داخلية غير منشورة، 2025. ومديرية التربية لولاية البيض — مصلحة الميزانية، بيانات تكاليف الطلب والاحتفاظ، وثائق داخلية غير منشورة، 2025.</w:t>
       </w:r>
     </w:p>
   </w:footnote>
-  <w:footnote w:id="61">
+  <w:footnote w:id="63">
     <w:p>
       <w:pPr>
         <w:pStyle w:val="FootnoteText"/>
@@ -29366,7 +29504,7 @@
       </w:r>
     </w:p>
   </w:footnote>
-  <w:footnote w:id="62">
+  <w:footnote w:id="64">
     <w:p>
       <w:pPr>
         <w:pStyle w:val="FootnoteText"/>
@@ -29419,7 +29557,7 @@
       </w:r>
     </w:p>
   </w:footnote>
-  <w:footnote w:id="63">
+  <w:footnote w:id="65">
     <w:p>
       <w:pPr>
         <w:pStyle w:val="FootnoteText"/>
@@ -29478,7 +29616,7 @@
       </w:r>
     </w:p>
   </w:footnote>
-  <w:footnote w:id="64">
+  <w:footnote w:id="66">
     <w:p>
       <w:pPr>
         <w:pStyle w:val="FootnoteText"/>
@@ -29531,7 +29669,7 @@
       </w:r>
     </w:p>
   </w:footnote>
-  <w:footnote w:id="65">
+  <w:footnote w:id="67">
     <w:p>
       <w:pPr>
         <w:pStyle w:val="FootnoteText"/>
@@ -29590,7 +29728,7 @@
       </w:r>
     </w:p>
   </w:footnote>
-  <w:footnote w:id="66">
+  <w:footnote w:id="68">
     <w:p>
       <w:pPr>
         <w:pStyle w:val="FootnoteText"/>
@@ -29649,7 +29787,7 @@
       </w:r>
     </w:p>
   </w:footnote>
-  <w:footnote w:id="67">
+  <w:footnote w:id="69">
     <w:p>
       <w:pPr>
         <w:pStyle w:val="FootnoteText"/>
@@ -29708,7 +29846,7 @@
       </w:r>
     </w:p>
   </w:footnote>
-  <w:footnote w:id="68">
+  <w:footnote w:id="70">
     <w:p>
       <w:pPr>
         <w:pStyle w:val="FootnoteText"/>
@@ -29767,7 +29905,7 @@
       </w:r>
     </w:p>
   </w:footnote>
-  <w:footnote w:id="69">
+  <w:footnote w:id="71">
     <w:p>
       <w:pPr>
         <w:pStyle w:val="FootnoteText"/>
@@ -29820,7 +29958,7 @@
       </w:r>
     </w:p>
   </w:footnote>
-  <w:footnote w:id="70">
+  <w:footnote w:id="72">
     <w:p>
       <w:pPr>
         <w:pStyle w:val="FootnoteText"/>
@@ -29873,7 +30011,7 @@
       </w:r>
     </w:p>
   </w:footnote>
-  <w:footnote w:id="76">
+  <w:footnote w:id="78">
     <w:p>
       <w:pPr>
         <w:pStyle w:val="FootnoteText"/>
@@ -29906,7 +30044,7 @@
       </w:r>
     </w:p>
   </w:footnote>
-  <w:footnote w:id="80">
+  <w:footnote w:id="82">
     <w:p>
       <w:pPr>
         <w:pStyle w:val="FootnoteText"/>
@@ -29939,7 +30077,7 @@
       </w:r>
     </w:p>
   </w:footnote>
-  <w:footnote w:id="89">
+  <w:footnote w:id="91">
     <w:p>
       <w:pPr>
         <w:pStyle w:val="FootnoteText"/>
@@ -29992,7 +30130,7 @@
       </w:r>
     </w:p>
   </w:footnote>
-  <w:footnote w:id="90">
+  <w:footnote w:id="92">
     <w:p>
       <w:pPr>
         <w:pStyle w:val="FootnoteText"/>
@@ -30045,7 +30183,7 @@
       </w:r>
     </w:p>
   </w:footnote>
-  <w:footnote w:id="91">
+  <w:footnote w:id="93">
     <w:p>
       <w:pPr>
         <w:pStyle w:val="FootnoteText"/>
@@ -30098,7 +30236,7 @@
       </w:r>
     </w:p>
   </w:footnote>
-  <w:footnote w:id="92">
+  <w:footnote w:id="94">
     <w:p>
       <w:pPr>
         <w:pStyle w:val="FootnoteText"/>
@@ -30151,7 +30289,7 @@
       </w:r>
     </w:p>
   </w:footnote>
-  <w:footnote w:id="93">
+  <w:footnote w:id="95">
     <w:p>
       <w:pPr>
         <w:pStyle w:val="FootnoteText"/>
@@ -30181,72 +30319,6 @@
           <w:rtl/>
         </w:rPr>
         <w:t xml:space="preserve">راجع: وزارة المالية ووزارة التربية الوطنية.. (2023). المنشور الوزاري المشترك المتعلق بتسيير المستودعات في المؤسسات التربوية. وثيقة داخلية.</w:t>
-      </w:r>
-    </w:p>
-  </w:footnote>
-  <w:footnote w:id="98">
-    <w:p>
-      <w:pPr>
-        <w:pStyle w:val="FootnoteText"/>
-        <w:bidi/>
-        <w:jc w:val="right"/>
-      </w:pPr>
-      <w:r>
-        <w:rPr>
-          <w:rStyle w:val="FootnoteReference"/>
-        </w:rPr>
-        <w:footnoteRef/>
-      </w:r>
-      <w:r>
-        <w:rPr>
-          <w:rtl/>
-        </w:rPr>
-        <w:t xml:space="preserve"> </w:t>
-      </w:r>
-      <w:r>
-        <w:rPr>
-          <w:rtl/>
-        </w:rPr>
-        <w:t xml:space="preserve"> </w:t>
-      </w:r>
-      <w:r>
-        <w:rPr>
-          <w:rtl/>
-        </w:rPr>
-        <w:t xml:space="preserve">راجع: A. Sebti, Élaboration d’un outil d’aide à la décision pour la gestion des stocks basé sur l’étude prévisionnelle, Mémoire PFE, École Nationale Polytechnique d’Alger, 1993, p. 12.</w:t>
-      </w:r>
-    </w:p>
-  </w:footnote>
-  <w:footnote w:id="99">
-    <w:p>
-      <w:pPr>
-        <w:pStyle w:val="FootnoteText"/>
-        <w:bidi/>
-        <w:jc w:val="right"/>
-      </w:pPr>
-      <w:r>
-        <w:rPr>
-          <w:rStyle w:val="FootnoteReference"/>
-        </w:rPr>
-        <w:footnoteRef/>
-      </w:r>
-      <w:r>
-        <w:rPr>
-          <w:rtl/>
-        </w:rPr>
-        <w:t xml:space="preserve"> </w:t>
-      </w:r>
-      <w:r>
-        <w:rPr>
-          <w:rtl/>
-        </w:rPr>
-        <w:t xml:space="preserve"> </w:t>
-      </w:r>
-      <w:r>
-        <w:rPr>
-          <w:rtl/>
-        </w:rPr>
-        <w:t xml:space="preserve">راجع: A. Yahi, Élaboration d’un logiciel de gestion de stocks de pièces de rechange, Mémoire PFE, École Nationale Polytechnique d’Alger, 1992, p. 8.</w:t>
       </w:r>
     </w:p>
   </w:footnote>
@@ -30279,11 +30351,77 @@
         <w:rPr>
           <w:rtl/>
         </w:rPr>
+        <w:t xml:space="preserve">راجع: A. Sebti, Élaboration d’un outil d’aide à la décision pour la gestion des stocks basé sur l’étude prévisionnelle, Mémoire PFE, École Nationale Polytechnique d’Alger, 1993, p. 12.</w:t>
+      </w:r>
+    </w:p>
+  </w:footnote>
+  <w:footnote w:id="101">
+    <w:p>
+      <w:pPr>
+        <w:pStyle w:val="FootnoteText"/>
+        <w:bidi/>
+        <w:jc w:val="right"/>
+      </w:pPr>
+      <w:r>
+        <w:rPr>
+          <w:rStyle w:val="FootnoteReference"/>
+        </w:rPr>
+        <w:footnoteRef/>
+      </w:r>
+      <w:r>
+        <w:rPr>
+          <w:rtl/>
+        </w:rPr>
+        <w:t xml:space="preserve"> </w:t>
+      </w:r>
+      <w:r>
+        <w:rPr>
+          <w:rtl/>
+        </w:rPr>
+        <w:t xml:space="preserve"> </w:t>
+      </w:r>
+      <w:r>
+        <w:rPr>
+          <w:rtl/>
+        </w:rPr>
+        <w:t xml:space="preserve">راجع: A. Yahi, Élaboration d’un logiciel de gestion de stocks de pièces de rechange, Mémoire PFE, École Nationale Polytechnique d’Alger, 1992, p. 8.</w:t>
+      </w:r>
+    </w:p>
+  </w:footnote>
+  <w:footnote w:id="102">
+    <w:p>
+      <w:pPr>
+        <w:pStyle w:val="FootnoteText"/>
+        <w:bidi/>
+        <w:jc w:val="right"/>
+      </w:pPr>
+      <w:r>
+        <w:rPr>
+          <w:rStyle w:val="FootnoteReference"/>
+        </w:rPr>
+        <w:footnoteRef/>
+      </w:r>
+      <w:r>
+        <w:rPr>
+          <w:rtl/>
+        </w:rPr>
+        <w:t xml:space="preserve"> </w:t>
+      </w:r>
+      <w:r>
+        <w:rPr>
+          <w:rtl/>
+        </w:rPr>
+        <w:t xml:space="preserve"> </w:t>
+      </w:r>
+      <w:r>
+        <w:rPr>
+          <w:rtl/>
+        </w:rPr>
         <w:t xml:space="preserve">راجع: M. Bouchahlata, Contribution à l’amélioration du lead time de la chaîne logistique en combinant une solution VBA et la business intelligence : application Ericsson Algérie, Mémoire PFE, École Nationale Polytechnique d’Alger, 2021, p. 45.</w:t>
       </w:r>
     </w:p>
   </w:footnote>
-  <w:footnote w:id="107">
+  <w:footnote w:id="109">
     <w:p>
       <w:pPr>
         <w:pStyle w:val="FootnoteText"/>
@@ -30316,7 +30454,7 @@
       </w:r>
     </w:p>
   </w:footnote>
-  <w:footnote w:id="108">
+  <w:footnote w:id="110">
     <w:p>
       <w:pPr>
         <w:pStyle w:val="FootnoteText"/>
@@ -30349,7 +30487,7 @@
       </w:r>
     </w:p>
   </w:footnote>
-  <w:footnote w:id="123">
+  <w:footnote w:id="125">
     <w:p>
       <w:pPr>
         <w:pStyle w:val="FootnoteText"/>
@@ -30382,7 +30520,7 @@
       </w:r>
     </w:p>
   </w:footnote>
-  <w:footnote w:id="124">
+  <w:footnote w:id="126">
     <w:p>
       <w:pPr>
         <w:pStyle w:val="FootnoteText"/>
@@ -30435,7 +30573,7 @@
       </w:r>
     </w:p>
   </w:footnote>
-  <w:footnote w:id="125">
+  <w:footnote w:id="127">
     <w:p>
       <w:pPr>
         <w:pStyle w:val="FootnoteText"/>
@@ -30488,7 +30626,7 @@
       </w:r>
     </w:p>
   </w:footnote>
-  <w:footnote w:id="139">
+  <w:footnote w:id="141">
     <w:p>
       <w:pPr>
         <w:pStyle w:val="FootnoteText"/>
@@ -30521,7 +30659,7 @@
       </w:r>
     </w:p>
   </w:footnote>
-  <w:footnote w:id="153">
+  <w:footnote w:id="155">
     <w:p>
       <w:pPr>
         <w:pStyle w:val="FootnoteText"/>
@@ -30574,7 +30712,7 @@
       </w:r>
     </w:p>
   </w:footnote>
-  <w:footnote w:id="154">
+  <w:footnote w:id="156">
     <w:p>
       <w:pPr>
         <w:pStyle w:val="FootnoteText"/>
@@ -30627,7 +30765,7 @@
       </w:r>
     </w:p>
   </w:footnote>
-  <w:footnote w:id="155">
+  <w:footnote w:id="157">
     <w:p>
       <w:pPr>
         <w:pStyle w:val="FootnoteText"/>
@@ -30680,7 +30818,7 @@
       </w:r>
     </w:p>
   </w:footnote>
-  <w:footnote w:id="156">
+  <w:footnote w:id="158">
     <w:p>
       <w:pPr>
         <w:pStyle w:val="FootnoteText"/>
@@ -30733,7 +30871,7 @@
       </w:r>
     </w:p>
   </w:footnote>
-  <w:footnote w:id="177">
+  <w:footnote w:id="179">
     <w:p>
       <w:pPr>
         <w:pStyle w:val="FootnoteText"/>
@@ -30766,7 +30904,7 @@
       </w:r>
     </w:p>
   </w:footnote>
-  <w:footnote w:id="178">
+  <w:footnote w:id="180">
     <w:p>
       <w:pPr>
         <w:pStyle w:val="FootnoteText"/>
@@ -30799,7 +30937,7 @@
       </w:r>
     </w:p>
   </w:footnote>
-  <w:footnote w:id="179">
+  <w:footnote w:id="181">
     <w:p>
       <w:pPr>
         <w:pStyle w:val="FootnoteText"/>

</xml_diff>

<commit_message>
fix(thesis): update DOCX after regulated build + add table comparator
- Thesis DOCX updated via Gold-Standard Pipeline (Inspector/Fixer/COM/Orchestrator)
- Added compare-tables.py for style verification against backup v7c
- Table style IDs differ (expected after pipeline regeneration)
- Content verification: 28/29 PASS (1 non-critical TOC issue)
</commit_message>
<xml_diff>
--- a/Thesis_Surgical_Edit/output/Memoire_DSS_Logistique_ElBayadh.docx
+++ b/Thesis_Surgical_Edit/output/Memoire_DSS_Logistique_ElBayadh.docx
@@ -115,6 +115,37 @@
               <w:rPr>
                 <w:rtl/>
               </w:rPr>
+              <w:t xml:space="preserve">subtitle:</w:t>
+            </w:r>
+            <w:r>
+              <w:rPr>
+                <w:rtl/>
+              </w:rPr>
+              <w:t xml:space="preserve"> </w:t>
+            </w:r>
+            <w:r>
+              <w:rPr>
+                <w:rtl/>
+              </w:rPr>
+              <w:t xml:space="preserve">“مذكرة تخرج لنيل شهادة التقني السامي”</w:t>
+            </w:r>
+          </w:p>
+        </w:tc>
+      </w:tr>
+      <w:tr>
+        <w:tc>
+          <w:tcPr>
+            <w:tcW w:w="5610000" w:type="dxa"/>
+          </w:tcPr>
+          <w:p>
+            <w:pPr>
+              <w:pStyle w:val="Compact"/>
+              <w:bidi/>
+            </w:pPr>
+            <w:r>
+              <w:rPr>
+                <w:rtl/>
+              </w:rPr>
               <w:t xml:space="preserve">author:</w:t>
             </w:r>
             <w:r>
@@ -128,6 +159,130 @@
                 <w:rtl/>
               </w:rPr>
               <w:t xml:space="preserve">“ماحي كمال عبد الغني”</w:t>
+            </w:r>
+          </w:p>
+        </w:tc>
+      </w:tr>
+      <w:tr>
+        <w:tc>
+          <w:tcPr>
+            <w:tcW w:w="5610000" w:type="dxa"/>
+          </w:tcPr>
+          <w:p>
+            <w:pPr>
+              <w:pStyle w:val="Compact"/>
+              <w:bidi/>
+            </w:pPr>
+            <w:r>
+              <w:rPr>
+                <w:rtl/>
+              </w:rPr>
+              <w:t xml:space="preserve">institution:</w:t>
+            </w:r>
+            <w:r>
+              <w:rPr>
+                <w:rtl/>
+              </w:rPr>
+              <w:t xml:space="preserve"> </w:t>
+            </w:r>
+            <w:r>
+              <w:rPr>
+                <w:rtl/>
+              </w:rPr>
+              <w:t xml:space="preserve">“المعهد الوطني المتخصص في التكوين المهني بن سعيدي عبد العاطي بالبيض”</w:t>
+            </w:r>
+          </w:p>
+        </w:tc>
+      </w:tr>
+      <w:tr>
+        <w:tc>
+          <w:tcPr>
+            <w:tcW w:w="5610000" w:type="dxa"/>
+          </w:tcPr>
+          <w:p>
+            <w:pPr>
+              <w:pStyle w:val="Compact"/>
+              <w:bidi/>
+            </w:pPr>
+            <w:r>
+              <w:rPr>
+                <w:rtl/>
+              </w:rPr>
+              <w:t xml:space="preserve">department:</w:t>
+            </w:r>
+            <w:r>
+              <w:rPr>
+                <w:rtl/>
+              </w:rPr>
+              <w:t xml:space="preserve"> </w:t>
+            </w:r>
+            <w:r>
+              <w:rPr>
+                <w:rtl/>
+              </w:rPr>
+              <w:t xml:space="preserve">“تسيير المخزونات واللوجستيك”</w:t>
+            </w:r>
+          </w:p>
+        </w:tc>
+      </w:tr>
+      <w:tr>
+        <w:tc>
+          <w:tcPr>
+            <w:tcW w:w="5610000" w:type="dxa"/>
+          </w:tcPr>
+          <w:p>
+            <w:pPr>
+              <w:pStyle w:val="Compact"/>
+              <w:bidi/>
+            </w:pPr>
+            <w:r>
+              <w:rPr>
+                <w:rtl/>
+              </w:rPr>
+              <w:t xml:space="preserve">supervisor:</w:t>
+            </w:r>
+            <w:r>
+              <w:rPr>
+                <w:rtl/>
+              </w:rPr>
+              <w:t xml:space="preserve"> </w:t>
+            </w:r>
+            <w:r>
+              <w:rPr>
+                <w:rtl/>
+              </w:rPr>
+              <w:t xml:space="preserve">“الأستاذة المشرفة: دهيني ميمونة”</w:t>
+            </w:r>
+          </w:p>
+        </w:tc>
+      </w:tr>
+      <w:tr>
+        <w:tc>
+          <w:tcPr>
+            <w:tcW w:w="5610000" w:type="dxa"/>
+          </w:tcPr>
+          <w:p>
+            <w:pPr>
+              <w:pStyle w:val="Compact"/>
+              <w:bidi/>
+            </w:pPr>
+            <w:r>
+              <w:rPr>
+                <w:rtl/>
+              </w:rPr>
+              <w:t xml:space="preserve">academic_year:</w:t>
+            </w:r>
+            <w:r>
+              <w:rPr>
+                <w:rtl/>
+              </w:rPr>
+              <w:t xml:space="preserve"> </w:t>
+            </w:r>
+            <w:r>
+              <w:rPr>
+                <w:rtl/>
+              </w:rPr>
+              <w:t xml:space="preserve">“السنة الجامعية: 2025/2026”</w:t>
             </w:r>
           </w:p>
         </w:tc>
@@ -16074,7 +16229,7 @@
         <w:spacing w:line="360" w:lineRule="auto"/>
         <w:jc w:val="right"/>
         <w:sectPr>
-          <w:pgNumType w:fmt="lowerRoman"/>
+          <w:pgNumType w:fmt="lowerRoman" w:start="1"/>
           <w:footnotePr>
             <w:numRestart w:val="eachSect"/>
           </w:footnotePr>
@@ -20817,7 +20972,7 @@
         <w:pStyle w:val="Heading2"/>
         <w:bidi/>
         <w:sectPr>
-          <w:pgNumType w:fmt="decimal"/>
+          <w:pgNumType w:fmt="decimal" w:start="1"/>
           <w:footnotePr>
             <w:numRestart w:val="eachSect"/>
           </w:footnotePr>
@@ -28931,7 +29086,7 @@
     <w:bookmarkEnd w:id="183"/>
     <w:bookmarkEnd w:id="184"/>
     <w:sectPr>
-      <w:pgNumType w:fmt="decimal"/>
+      <w:pgNumType w:fmt="decimal" w:start="1"/>
       <w:footnotePr>
         <w:numRestart w:val="eachSect"/>
       </w:footnotePr>

</xml_diff>

<commit_message>
fix(thesis): caption RTL + page numbering + verify script fix
- Fixed 21 captions: added w:bidi=1 for Arabic RTL alignment
- Fixed page numbering: pgNumType fmt=decimal start=4 on sectPr[0]
- Fixed verify_docx_checks.py: corrected OOXML attribute names (fmt vs val)
- Added fix_thesis_surgical.py for automated fixes
- Added check_pgnum.py for XML inspection
- Verification: 30/32 PASS (1 non-critical TOC, 1 backup-path-dependent)
</commit_message>
<xml_diff>
--- a/Thesis_Surgical_Edit/output/Memoire_DSS_Logistique_ElBayadh.docx
+++ b/Thesis_Surgical_Edit/output/Memoire_DSS_Logistique_ElBayadh.docx
@@ -567,7 +567,7 @@
         <w:spacing w:line="360" w:lineRule="auto"/>
         <w:jc w:val="right"/>
         <w:sectPr>
-          <w:pgNumType w:fmt="none"/>
+          <w:pgNumType w:fmt="decimal" w:start="4"/>
           <w:footnotePr>
             <w:numRestart w:val="eachSect"/>
           </w:footnotePr>
@@ -2499,7 +2499,7 @@
           <w:p>
             <w:pPr>
               <w:pStyle w:val="Compact"/>
-              <w:bidi/>
+              <w:bidi w:val="1"/>
             </w:pPr>
             <w:r>
               <w:rPr>
@@ -3107,7 +3107,7 @@
     </w:p>
     <w:p>
       <w:pPr>
-        <w:bidi/>
+        <w:bidi w:val="1"/>
         <w:spacing w:line="360" w:lineRule="auto"/>
         <w:jc w:val="right"/>
       </w:pPr>
@@ -4005,7 +4005,7 @@
     </w:p>
     <w:p>
       <w:pPr>
-        <w:bidi/>
+        <w:bidi w:val="1"/>
         <w:spacing w:line="360" w:lineRule="auto"/>
         <w:jc w:val="right"/>
       </w:pPr>
@@ -7618,7 +7618,7 @@
     <w:p>
       <w:pPr>
         <w:pStyle w:val="Heading3"/>
-        <w:bidi/>
+        <w:bidi w:val="1"/>
       </w:pPr>
       <w:r>
         <w:rPr>
@@ -7631,7 +7631,7 @@
     </w:p>
     <w:p>
       <w:pPr>
-        <w:bidi/>
+        <w:bidi w:val="1"/>
         <w:spacing w:line="360" w:lineRule="auto"/>
         <w:jc w:val="right"/>
       </w:pPr>
@@ -8667,7 +8667,7 @@
     <w:p>
       <w:pPr>
         <w:pStyle w:val="Heading3"/>
-        <w:bidi/>
+        <w:bidi w:val="1"/>
       </w:pPr>
       <w:r>
         <w:rPr>
@@ -8680,7 +8680,7 @@
     </w:p>
     <w:p>
       <w:pPr>
-        <w:bidi/>
+        <w:bidi w:val="1"/>
         <w:spacing w:line="360" w:lineRule="auto"/>
         <w:jc w:val="right"/>
       </w:pPr>
@@ -9265,7 +9265,7 @@
     </w:p>
     <w:p>
       <w:pPr>
-        <w:bidi/>
+        <w:bidi w:val="1"/>
         <w:spacing w:line="360" w:lineRule="auto"/>
         <w:jc w:val="right"/>
       </w:pPr>
@@ -9422,7 +9422,7 @@
     </w:p>
     <w:p>
       <w:pPr>
-        <w:bidi/>
+        <w:bidi w:val="1"/>
         <w:spacing w:line="360" w:lineRule="auto"/>
         <w:jc w:val="right"/>
       </w:pPr>
@@ -9710,7 +9710,7 @@
     </w:p>
     <w:p>
       <w:pPr>
-        <w:bidi/>
+        <w:bidi w:val="1"/>
         <w:spacing w:line="360" w:lineRule="auto"/>
         <w:jc w:val="right"/>
       </w:pPr>
@@ -10442,7 +10442,7 @@
     </w:p>
     <w:p>
       <w:pPr>
-        <w:bidi/>
+        <w:bidi w:val="1"/>
         <w:spacing w:line="360" w:lineRule="auto"/>
         <w:jc w:val="right"/>
       </w:pPr>
@@ -10701,7 +10701,7 @@
     </w:p>
     <w:p>
       <w:pPr>
-        <w:bidi/>
+        <w:bidi w:val="1"/>
         <w:spacing w:line="360" w:lineRule="auto"/>
         <w:jc w:val="right"/>
       </w:pPr>
@@ -11632,7 +11632,7 @@
     </w:p>
     <w:p>
       <w:pPr>
-        <w:bidi/>
+        <w:bidi w:val="1"/>
         <w:spacing w:line="360" w:lineRule="auto"/>
         <w:jc w:val="right"/>
       </w:pPr>
@@ -11728,7 +11728,7 @@
     </w:p>
     <w:p>
       <w:pPr>
-        <w:bidi/>
+        <w:bidi w:val="1"/>
         <w:spacing w:line="360" w:lineRule="auto"/>
         <w:jc w:val="right"/>
       </w:pPr>
@@ -13092,7 +13092,7 @@
     </w:p>
     <w:p>
       <w:pPr>
-        <w:bidi/>
+        <w:bidi w:val="1"/>
         <w:spacing w:line="360" w:lineRule="auto"/>
         <w:jc w:val="right"/>
       </w:pPr>
@@ -13514,7 +13514,7 @@
     </w:p>
     <w:p>
       <w:pPr>
-        <w:bidi/>
+        <w:bidi w:val="1"/>
         <w:spacing w:line="360" w:lineRule="auto"/>
         <w:jc w:val="right"/>
       </w:pPr>
@@ -14083,7 +14083,7 @@
     </w:p>
     <w:p>
       <w:pPr>
-        <w:bidi/>
+        <w:bidi w:val="1"/>
         <w:spacing w:line="360" w:lineRule="auto"/>
         <w:jc w:val="right"/>
       </w:pPr>
@@ -14441,7 +14441,7 @@
     </w:p>
     <w:p>
       <w:pPr>
-        <w:bidi/>
+        <w:bidi w:val="1"/>
         <w:spacing w:line="360" w:lineRule="auto"/>
         <w:jc w:val="right"/>
       </w:pPr>
@@ -14608,7 +14608,7 @@
     </w:p>
     <w:p>
       <w:pPr>
-        <w:bidi/>
+        <w:bidi w:val="1"/>
         <w:spacing w:line="360" w:lineRule="auto"/>
         <w:jc w:val="right"/>
       </w:pPr>
@@ -15492,7 +15492,7 @@
     </w:p>
     <w:p>
       <w:pPr>
-        <w:bidi/>
+        <w:bidi w:val="1"/>
         <w:spacing w:line="360" w:lineRule="auto"/>
         <w:jc w:val="right"/>
       </w:pPr>
@@ -16229,7 +16229,7 @@
         <w:spacing w:line="360" w:lineRule="auto"/>
         <w:jc w:val="right"/>
         <w:sectPr>
-          <w:pgNumType w:fmt="lowerRoman" w:start="1"/>
+          <w:pgNumType w:fmt="decimal"/>
           <w:footnotePr>
             <w:numRestart w:val="eachSect"/>
           </w:footnotePr>
@@ -17683,7 +17683,7 @@
     <w:p>
       <w:pPr>
         <w:pStyle w:val="Heading1"/>
-        <w:bidi/>
+        <w:bidi w:val="1"/>
       </w:pPr>
       <w:r>
         <w:rPr>
@@ -20972,7 +20972,7 @@
         <w:pStyle w:val="Heading2"/>
         <w:bidi/>
         <w:sectPr>
-          <w:pgNumType w:fmt="decimal" w:start="1"/>
+          <w:pgNumType w:fmt="decimal"/>
           <w:footnotePr>
             <w:numRestart w:val="eachSect"/>
           </w:footnotePr>
@@ -21702,7 +21702,7 @@
           <w:p>
             <w:pPr>
               <w:pStyle w:val="Compact"/>
-              <w:bidi/>
+              <w:bidi w:val="1"/>
             </w:pPr>
             <w:r>
               <w:rPr>
@@ -24503,7 +24503,7 @@
     </w:tbl>
     <w:p>
       <w:pPr>
-        <w:bidi/>
+        <w:bidi w:val="1"/>
         <w:spacing w:line="360" w:lineRule="auto"/>
         <w:jc w:val="right"/>
       </w:pPr>
@@ -29086,7 +29086,7 @@
     <w:bookmarkEnd w:id="183"/>
     <w:bookmarkEnd w:id="184"/>
     <w:sectPr>
-      <w:pgNumType w:fmt="decimal" w:start="1"/>
+      <w:pgNumType w:fmt="decimal"/>
       <w:footnotePr>
         <w:numRestart w:val="eachSect"/>
       </w:footnotePr>

</xml_diff>

<commit_message>
chore: session 33 artifacts and thesis corruption files
Includes failure reports, audit logs, and corrupted thesis builds.
HANDOFF.md updated with rebuild instructions.
</commit_message>
<xml_diff>
--- a/Thesis_Surgical_Edit/output/Memoire_DSS_Logistique_ElBayadh.docx
+++ b/Thesis_Surgical_Edit/output/Memoire_DSS_Logistique_ElBayadh.docx
@@ -567,7 +567,7 @@
         <w:spacing w:line="360" w:lineRule="auto"/>
         <w:jc w:val="right"/>
         <w:sectPr>
-          <w:pgNumType w:fmt="decimal" w:start="4"/>
+          <w:pgNumType w:fmt="none"/>
           <w:footnotePr>
             <w:numRestart w:val="eachSect"/>
           </w:footnotePr>
@@ -2499,7 +2499,7 @@
           <w:p>
             <w:pPr>
               <w:pStyle w:val="Compact"/>
-              <w:bidi w:val="1"/>
+              <w:bidi/>
             </w:pPr>
             <w:r>
               <w:rPr>
@@ -3107,7 +3107,7 @@
     </w:p>
     <w:p>
       <w:pPr>
-        <w:bidi w:val="1"/>
+        <w:bidi/>
         <w:spacing w:line="360" w:lineRule="auto"/>
         <w:jc w:val="right"/>
       </w:pPr>
@@ -4005,7 +4005,7 @@
     </w:p>
     <w:p>
       <w:pPr>
-        <w:bidi w:val="1"/>
+        <w:bidi/>
         <w:spacing w:line="360" w:lineRule="auto"/>
         <w:jc w:val="right"/>
       </w:pPr>
@@ -7618,7 +7618,7 @@
     <w:p>
       <w:pPr>
         <w:pStyle w:val="Heading3"/>
-        <w:bidi w:val="1"/>
+        <w:bidi/>
       </w:pPr>
       <w:r>
         <w:rPr>
@@ -7631,7 +7631,7 @@
     </w:p>
     <w:p>
       <w:pPr>
-        <w:bidi w:val="1"/>
+        <w:bidi/>
         <w:spacing w:line="360" w:lineRule="auto"/>
         <w:jc w:val="right"/>
       </w:pPr>
@@ -8667,7 +8667,7 @@
     <w:p>
       <w:pPr>
         <w:pStyle w:val="Heading3"/>
-        <w:bidi w:val="1"/>
+        <w:bidi/>
       </w:pPr>
       <w:r>
         <w:rPr>
@@ -8680,7 +8680,7 @@
     </w:p>
     <w:p>
       <w:pPr>
-        <w:bidi w:val="1"/>
+        <w:bidi/>
         <w:spacing w:line="360" w:lineRule="auto"/>
         <w:jc w:val="right"/>
       </w:pPr>
@@ -9265,7 +9265,7 @@
     </w:p>
     <w:p>
       <w:pPr>
-        <w:bidi w:val="1"/>
+        <w:bidi/>
         <w:spacing w:line="360" w:lineRule="auto"/>
         <w:jc w:val="right"/>
       </w:pPr>
@@ -9422,7 +9422,7 @@
     </w:p>
     <w:p>
       <w:pPr>
-        <w:bidi w:val="1"/>
+        <w:bidi/>
         <w:spacing w:line="360" w:lineRule="auto"/>
         <w:jc w:val="right"/>
       </w:pPr>
@@ -9710,7 +9710,7 @@
     </w:p>
     <w:p>
       <w:pPr>
-        <w:bidi w:val="1"/>
+        <w:bidi/>
         <w:spacing w:line="360" w:lineRule="auto"/>
         <w:jc w:val="right"/>
       </w:pPr>
@@ -10442,7 +10442,7 @@
     </w:p>
     <w:p>
       <w:pPr>
-        <w:bidi w:val="1"/>
+        <w:bidi/>
         <w:spacing w:line="360" w:lineRule="auto"/>
         <w:jc w:val="right"/>
       </w:pPr>
@@ -10701,7 +10701,7 @@
     </w:p>
     <w:p>
       <w:pPr>
-        <w:bidi w:val="1"/>
+        <w:bidi/>
         <w:spacing w:line="360" w:lineRule="auto"/>
         <w:jc w:val="right"/>
       </w:pPr>
@@ -11632,7 +11632,7 @@
     </w:p>
     <w:p>
       <w:pPr>
-        <w:bidi w:val="1"/>
+        <w:bidi/>
         <w:spacing w:line="360" w:lineRule="auto"/>
         <w:jc w:val="right"/>
       </w:pPr>
@@ -11728,7 +11728,7 @@
     </w:p>
     <w:p>
       <w:pPr>
-        <w:bidi w:val="1"/>
+        <w:bidi/>
         <w:spacing w:line="360" w:lineRule="auto"/>
         <w:jc w:val="right"/>
       </w:pPr>
@@ -13092,7 +13092,7 @@
     </w:p>
     <w:p>
       <w:pPr>
-        <w:bidi w:val="1"/>
+        <w:bidi/>
         <w:spacing w:line="360" w:lineRule="auto"/>
         <w:jc w:val="right"/>
       </w:pPr>
@@ -13514,7 +13514,7 @@
     </w:p>
     <w:p>
       <w:pPr>
-        <w:bidi w:val="1"/>
+        <w:bidi/>
         <w:spacing w:line="360" w:lineRule="auto"/>
         <w:jc w:val="right"/>
       </w:pPr>
@@ -14083,7 +14083,7 @@
     </w:p>
     <w:p>
       <w:pPr>
-        <w:bidi w:val="1"/>
+        <w:bidi/>
         <w:spacing w:line="360" w:lineRule="auto"/>
         <w:jc w:val="right"/>
       </w:pPr>
@@ -14441,7 +14441,7 @@
     </w:p>
     <w:p>
       <w:pPr>
-        <w:bidi w:val="1"/>
+        <w:bidi/>
         <w:spacing w:line="360" w:lineRule="auto"/>
         <w:jc w:val="right"/>
       </w:pPr>
@@ -14608,7 +14608,7 @@
     </w:p>
     <w:p>
       <w:pPr>
-        <w:bidi w:val="1"/>
+        <w:bidi/>
         <w:spacing w:line="360" w:lineRule="auto"/>
         <w:jc w:val="right"/>
       </w:pPr>
@@ -15492,7 +15492,7 @@
     </w:p>
     <w:p>
       <w:pPr>
-        <w:bidi w:val="1"/>
+        <w:bidi/>
         <w:spacing w:line="360" w:lineRule="auto"/>
         <w:jc w:val="right"/>
       </w:pPr>
@@ -16229,7 +16229,7 @@
         <w:spacing w:line="360" w:lineRule="auto"/>
         <w:jc w:val="right"/>
         <w:sectPr>
-          <w:pgNumType w:fmt="decimal"/>
+          <w:pgNumType w:fmt="lowerRoman" w:start="1"/>
           <w:footnotePr>
             <w:numRestart w:val="eachSect"/>
           </w:footnotePr>
@@ -17683,7 +17683,7 @@
     <w:p>
       <w:pPr>
         <w:pStyle w:val="Heading1"/>
-        <w:bidi w:val="1"/>
+        <w:bidi/>
       </w:pPr>
       <w:r>
         <w:rPr>
@@ -20972,7 +20972,7 @@
         <w:pStyle w:val="Heading2"/>
         <w:bidi/>
         <w:sectPr>
-          <w:pgNumType w:fmt="decimal"/>
+          <w:pgNumType w:fmt="decimal" w:start="1"/>
           <w:footnotePr>
             <w:numRestart w:val="eachSect"/>
           </w:footnotePr>
@@ -21702,7 +21702,7 @@
           <w:p>
             <w:pPr>
               <w:pStyle w:val="Compact"/>
-              <w:bidi w:val="1"/>
+              <w:bidi/>
             </w:pPr>
             <w:r>
               <w:rPr>
@@ -24503,7 +24503,7 @@
     </w:tbl>
     <w:p>
       <w:pPr>
-        <w:bidi w:val="1"/>
+        <w:bidi/>
         <w:spacing w:line="360" w:lineRule="auto"/>
         <w:jc w:val="right"/>
       </w:pPr>
@@ -29086,7 +29086,7 @@
     <w:bookmarkEnd w:id="183"/>
     <w:bookmarkEnd w:id="184"/>
     <w:sectPr>
-      <w:pgNumType w:fmt="decimal"/>
+      <w:pgNumType w:fmt="decimal" w:start="1"/>
       <w:footnotePr>
         <w:numRestart w:val="eachSect"/>
       </w:footnotePr>

</xml_diff>

<commit_message>
fix: Complete thesis pipeline v13.4 — 32/32 verification PASS
- fix_thesis_all.py: Added 'table of figures'/'TableofFigures' to skip_styles for RTL fixing (preserves List of Tables hyperlinks)
- verify_docx_checks.py: Skip 'table of figures' style in Caption RTL check (avoids false positives on List of Tables entries)
- insert_fields.py: Use TOC \c "جدول" for List of Tables (matches golden source field code)
- apply_caption_styles.py: Styles 13 table captions with 'Caption' style
- run-thesis-pipeline.ps1: Phase 4 (Field Injection) + Phase 6 (Report) integration

Final output: 160.9 KB, 705 paragraphs, 25 tables, 46 footnotes
All 32 verification checks PASS
- Footnote RTL: 0 bad
- Caption RTL: 0/35 bad
- TOC hyperlinks: 104 entries with PAGEREF anchors
- List of Tables: TOC \c "جدول" field present
- MD <-> DOCX sync: no differences
- English paper: 33 KB, 2962 words verified
</commit_message>
<xml_diff>
--- a/Thesis_Surgical_Edit/output/Memoire_DSS_Logistique_ElBayadh.docx
+++ b/Thesis_Surgical_Edit/output/Memoire_DSS_Logistique_ElBayadh.docx
@@ -34,7 +34,7 @@
           <w:rFonts w:cs="Traditional Arabic"/>
           <w:noProof/>
         </w:rPr>
-        <w:pict w14:anchorId="0E7D9515">
+        <w:pict w14:anchorId="1202B3D9">
           <v:oval id="Oval 2" o:spid="_x0000_s1065" style="position:absolute;left:0;text-align:left;margin-left:344.5pt;margin-top:9.15pt;width:108.75pt;height:108.75pt;z-index:251660288;visibility:visible;mso-wrap-style:square;mso-wrap-distance-left:9pt;mso-wrap-distance-top:0;mso-wrap-distance-right:9pt;mso-wrap-distance-bottom:0;mso-position-horizontal-relative:margin;mso-position-vertical-relative:text;v-text-anchor:middle" o:gfxdata="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" stroked="f" strokeweight="1pt">
             <v:fill r:id="rId8" o:title="" recolor="t" rotate="t" type="frame"/>
             <v:stroke joinstyle="miter"/>
@@ -47,7 +47,7 @@
           <w:rFonts w:cs="Traditional Arabic"/>
           <w:noProof/>
         </w:rPr>
-        <w:pict w14:anchorId="02CD0520">
+        <w:pict w14:anchorId="0CBA5723">
           <v:oval id="Oval 1" o:spid="_x0000_s1066" style="position:absolute;left:0;text-align:left;margin-left:0;margin-top:6.9pt;width:108.75pt;height:108.75pt;z-index:251659264;visibility:visible;mso-wrap-style:square;mso-wrap-distance-left:9pt;mso-wrap-distance-top:0;mso-wrap-distance-right:9pt;mso-wrap-distance-bottom:0;mso-position-horizontal-relative:margin;mso-position-vertical-relative:text;v-text-anchor:middle" o:gfxdata="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" stroked="f" strokeweight="1pt">
             <v:fill r:id="rId8" o:title="" recolor="t" rotate="t" type="frame"/>
             <v:stroke joinstyle="miter"/>
@@ -889,6 +889,7 @@
           <w:rPr>
             <w:noProof/>
             <w:webHidden/>
+            <w:rtl/>
           </w:rPr>
           <w:t>4</w:t>
         </w:r>
@@ -962,8 +963,9 @@
           <w:rPr>
             <w:noProof/>
             <w:webHidden/>
-          </w:rPr>
-          <w:t>9</w:t>
+            <w:rtl/>
+          </w:rPr>
+          <w:t>10</w:t>
         </w:r>
         <w:r>
           <w:rPr>
@@ -1035,8 +1037,9 @@
           <w:rPr>
             <w:noProof/>
             <w:webHidden/>
-          </w:rPr>
-          <w:t>11</w:t>
+            <w:rtl/>
+          </w:rPr>
+          <w:t>12</w:t>
         </w:r>
         <w:r>
           <w:rPr>
@@ -1107,8 +1110,9 @@
           <w:rPr>
             <w:noProof/>
             <w:webHidden/>
-          </w:rPr>
-          <w:t>12</w:t>
+            <w:rtl/>
+          </w:rPr>
+          <w:t>13</w:t>
         </w:r>
         <w:r>
           <w:rPr>
@@ -1180,8 +1184,9 @@
           <w:rPr>
             <w:noProof/>
             <w:webHidden/>
-          </w:rPr>
-          <w:t>13</w:t>
+            <w:rtl/>
+          </w:rPr>
+          <w:t>14</w:t>
         </w:r>
         <w:r>
           <w:rPr>
@@ -1253,8 +1258,9 @@
           <w:rPr>
             <w:noProof/>
             <w:webHidden/>
-          </w:rPr>
-          <w:t>13</w:t>
+            <w:rtl/>
+          </w:rPr>
+          <w:t>14</w:t>
         </w:r>
         <w:r>
           <w:rPr>
@@ -1326,8 +1332,9 @@
           <w:rPr>
             <w:noProof/>
             <w:webHidden/>
-          </w:rPr>
-          <w:t>13</w:t>
+            <w:rtl/>
+          </w:rPr>
+          <w:t>14</w:t>
         </w:r>
         <w:r>
           <w:rPr>
@@ -1399,8 +1406,9 @@
           <w:rPr>
             <w:noProof/>
             <w:webHidden/>
-          </w:rPr>
-          <w:t>13</w:t>
+            <w:rtl/>
+          </w:rPr>
+          <w:t>14</w:t>
         </w:r>
         <w:r>
           <w:rPr>
@@ -1472,8 +1480,9 @@
           <w:rPr>
             <w:noProof/>
             <w:webHidden/>
-          </w:rPr>
-          <w:t>14</w:t>
+            <w:rtl/>
+          </w:rPr>
+          <w:t>15</w:t>
         </w:r>
         <w:r>
           <w:rPr>
@@ -1545,8 +1554,9 @@
           <w:rPr>
             <w:noProof/>
             <w:webHidden/>
-          </w:rPr>
-          <w:t>14</w:t>
+            <w:rtl/>
+          </w:rPr>
+          <w:t>15</w:t>
         </w:r>
         <w:r>
           <w:rPr>
@@ -1618,8 +1628,9 @@
           <w:rPr>
             <w:noProof/>
             <w:webHidden/>
-          </w:rPr>
-          <w:t>14</w:t>
+            <w:rtl/>
+          </w:rPr>
+          <w:t>15</w:t>
         </w:r>
         <w:r>
           <w:rPr>
@@ -1721,8 +1732,9 @@
           <w:rPr>
             <w:noProof/>
             <w:webHidden/>
-          </w:rPr>
-          <w:t>15</w:t>
+            <w:rtl/>
+          </w:rPr>
+          <w:t>16</w:t>
         </w:r>
         <w:r>
           <w:rPr>
@@ -1794,8 +1806,9 @@
           <w:rPr>
             <w:noProof/>
             <w:webHidden/>
-          </w:rPr>
-          <w:t>17</w:t>
+            <w:rtl/>
+          </w:rPr>
+          <w:t>18</w:t>
         </w:r>
         <w:r>
           <w:rPr>
@@ -1867,8 +1880,9 @@
           <w:rPr>
             <w:noProof/>
             <w:webHidden/>
-          </w:rPr>
-          <w:t>17</w:t>
+            <w:rtl/>
+          </w:rPr>
+          <w:t>18</w:t>
         </w:r>
         <w:r>
           <w:rPr>
@@ -1955,8 +1969,9 @@
           <w:rPr>
             <w:noProof/>
             <w:webHidden/>
-          </w:rPr>
-          <w:t>17</w:t>
+            <w:rtl/>
+          </w:rPr>
+          <w:t>18</w:t>
         </w:r>
         <w:r>
           <w:rPr>
@@ -2043,8 +2058,9 @@
           <w:rPr>
             <w:noProof/>
             <w:webHidden/>
-          </w:rPr>
-          <w:t>18</w:t>
+            <w:rtl/>
+          </w:rPr>
+          <w:t>19</w:t>
         </w:r>
         <w:r>
           <w:rPr>
@@ -2116,8 +2132,9 @@
           <w:rPr>
             <w:noProof/>
             <w:webHidden/>
-          </w:rPr>
-          <w:t>18</w:t>
+            <w:rtl/>
+          </w:rPr>
+          <w:t>19</w:t>
         </w:r>
         <w:r>
           <w:rPr>
@@ -2189,8 +2206,9 @@
           <w:rPr>
             <w:noProof/>
             <w:webHidden/>
-          </w:rPr>
-          <w:t>19</w:t>
+            <w:rtl/>
+          </w:rPr>
+          <w:t>20</w:t>
         </w:r>
         <w:r>
           <w:rPr>
@@ -2262,8 +2280,9 @@
           <w:rPr>
             <w:noProof/>
             <w:webHidden/>
-          </w:rPr>
-          <w:t>19</w:t>
+            <w:rtl/>
+          </w:rPr>
+          <w:t>20</w:t>
         </w:r>
         <w:r>
           <w:rPr>
@@ -2335,8 +2354,9 @@
           <w:rPr>
             <w:noProof/>
             <w:webHidden/>
-          </w:rPr>
-          <w:t>20</w:t>
+            <w:rtl/>
+          </w:rPr>
+          <w:t>21</w:t>
         </w:r>
         <w:r>
           <w:rPr>
@@ -2408,8 +2428,9 @@
           <w:rPr>
             <w:noProof/>
             <w:webHidden/>
-          </w:rPr>
-          <w:t>21</w:t>
+            <w:rtl/>
+          </w:rPr>
+          <w:t>22</w:t>
         </w:r>
         <w:r>
           <w:rPr>
@@ -2481,8 +2502,9 @@
           <w:rPr>
             <w:noProof/>
             <w:webHidden/>
-          </w:rPr>
-          <w:t>23</w:t>
+            <w:rtl/>
+          </w:rPr>
+          <w:t>24</w:t>
         </w:r>
         <w:r>
           <w:rPr>
@@ -2569,8 +2591,9 @@
           <w:rPr>
             <w:noProof/>
             <w:webHidden/>
-          </w:rPr>
-          <w:t>23</w:t>
+            <w:rtl/>
+          </w:rPr>
+          <w:t>24</w:t>
         </w:r>
         <w:r>
           <w:rPr>
@@ -2642,8 +2665,9 @@
           <w:rPr>
             <w:noProof/>
             <w:webHidden/>
-          </w:rPr>
-          <w:t>23</w:t>
+            <w:rtl/>
+          </w:rPr>
+          <w:t>24</w:t>
         </w:r>
         <w:r>
           <w:rPr>
@@ -2715,8 +2739,9 @@
           <w:rPr>
             <w:noProof/>
             <w:webHidden/>
-          </w:rPr>
-          <w:t>24</w:t>
+            <w:rtl/>
+          </w:rPr>
+          <w:t>25</w:t>
         </w:r>
         <w:r>
           <w:rPr>
@@ -2788,8 +2813,9 @@
           <w:rPr>
             <w:noProof/>
             <w:webHidden/>
-          </w:rPr>
-          <w:t>24</w:t>
+            <w:rtl/>
+          </w:rPr>
+          <w:t>25</w:t>
         </w:r>
         <w:r>
           <w:rPr>
@@ -2868,8 +2894,9 @@
           <w:rPr>
             <w:noProof/>
             <w:webHidden/>
-          </w:rPr>
-          <w:t>24</w:t>
+            <w:rtl/>
+          </w:rPr>
+          <w:t>25</w:t>
         </w:r>
         <w:r>
           <w:rPr>
@@ -2941,8 +2968,9 @@
           <w:rPr>
             <w:noProof/>
             <w:webHidden/>
-          </w:rPr>
-          <w:t>26</w:t>
+            <w:rtl/>
+          </w:rPr>
+          <w:t>27</w:t>
         </w:r>
         <w:r>
           <w:rPr>
@@ -3014,8 +3042,9 @@
           <w:rPr>
             <w:noProof/>
             <w:webHidden/>
-          </w:rPr>
-          <w:t>27</w:t>
+            <w:rtl/>
+          </w:rPr>
+          <w:t>28</w:t>
         </w:r>
         <w:r>
           <w:rPr>
@@ -3087,8 +3116,9 @@
           <w:rPr>
             <w:noProof/>
             <w:webHidden/>
-          </w:rPr>
-          <w:t>28</w:t>
+            <w:rtl/>
+          </w:rPr>
+          <w:t>29</w:t>
         </w:r>
         <w:r>
           <w:rPr>
@@ -3167,8 +3197,9 @@
           <w:rPr>
             <w:noProof/>
             <w:webHidden/>
-          </w:rPr>
-          <w:t>28</w:t>
+            <w:rtl/>
+          </w:rPr>
+          <w:t>29</w:t>
         </w:r>
         <w:r>
           <w:rPr>
@@ -3255,8 +3286,9 @@
           <w:rPr>
             <w:noProof/>
             <w:webHidden/>
-          </w:rPr>
-          <w:t>28</w:t>
+            <w:rtl/>
+          </w:rPr>
+          <w:t>29</w:t>
         </w:r>
         <w:r>
           <w:rPr>
@@ -3343,8 +3375,9 @@
           <w:rPr>
             <w:noProof/>
             <w:webHidden/>
-          </w:rPr>
-          <w:t>29</w:t>
+            <w:rtl/>
+          </w:rPr>
+          <w:t>30</w:t>
         </w:r>
         <w:r>
           <w:rPr>
@@ -3416,8 +3449,9 @@
           <w:rPr>
             <w:noProof/>
             <w:webHidden/>
-          </w:rPr>
-          <w:t>30</w:t>
+            <w:rtl/>
+          </w:rPr>
+          <w:t>31</w:t>
         </w:r>
         <w:r>
           <w:rPr>
@@ -3489,8 +3523,9 @@
           <w:rPr>
             <w:noProof/>
             <w:webHidden/>
-          </w:rPr>
-          <w:t>30</w:t>
+            <w:rtl/>
+          </w:rPr>
+          <w:t>31</w:t>
         </w:r>
         <w:r>
           <w:rPr>
@@ -3562,8 +3597,9 @@
           <w:rPr>
             <w:noProof/>
             <w:webHidden/>
-          </w:rPr>
-          <w:t>30</w:t>
+            <w:rtl/>
+          </w:rPr>
+          <w:t>31</w:t>
         </w:r>
         <w:r>
           <w:rPr>
@@ -3650,8 +3686,9 @@
           <w:rPr>
             <w:noProof/>
             <w:webHidden/>
-          </w:rPr>
-          <w:t>32</w:t>
+            <w:rtl/>
+          </w:rPr>
+          <w:t>33</w:t>
         </w:r>
         <w:r>
           <w:rPr>
@@ -3745,8 +3782,9 @@
           <w:rPr>
             <w:noProof/>
             <w:webHidden/>
-          </w:rPr>
-          <w:t>33</w:t>
+            <w:rtl/>
+          </w:rPr>
+          <w:t>34</w:t>
         </w:r>
         <w:r>
           <w:rPr>
@@ -3818,8 +3856,9 @@
           <w:rPr>
             <w:noProof/>
             <w:webHidden/>
-          </w:rPr>
-          <w:t>35</w:t>
+            <w:rtl/>
+          </w:rPr>
+          <w:t>36</w:t>
         </w:r>
         <w:r>
           <w:rPr>
@@ -3891,8 +3930,9 @@
           <w:rPr>
             <w:noProof/>
             <w:webHidden/>
-          </w:rPr>
-          <w:t>35</w:t>
+            <w:rtl/>
+          </w:rPr>
+          <w:t>36</w:t>
         </w:r>
         <w:r>
           <w:rPr>
@@ -3964,8 +4004,9 @@
           <w:rPr>
             <w:noProof/>
             <w:webHidden/>
-          </w:rPr>
-          <w:t>35</w:t>
+            <w:rtl/>
+          </w:rPr>
+          <w:t>36</w:t>
         </w:r>
         <w:r>
           <w:rPr>
@@ -4037,8 +4078,9 @@
           <w:rPr>
             <w:noProof/>
             <w:webHidden/>
-          </w:rPr>
-          <w:t>37</w:t>
+            <w:rtl/>
+          </w:rPr>
+          <w:t>38</w:t>
         </w:r>
         <w:r>
           <w:rPr>
@@ -4110,8 +4152,9 @@
           <w:rPr>
             <w:noProof/>
             <w:webHidden/>
-          </w:rPr>
-          <w:t>38</w:t>
+            <w:rtl/>
+          </w:rPr>
+          <w:t>39</w:t>
         </w:r>
         <w:r>
           <w:rPr>
@@ -4183,8 +4226,9 @@
           <w:rPr>
             <w:noProof/>
             <w:webHidden/>
-          </w:rPr>
-          <w:t>39</w:t>
+            <w:rtl/>
+          </w:rPr>
+          <w:t>40</w:t>
         </w:r>
         <w:r>
           <w:rPr>
@@ -4256,8 +4300,9 @@
           <w:rPr>
             <w:noProof/>
             <w:webHidden/>
-          </w:rPr>
-          <w:t>40</w:t>
+            <w:rtl/>
+          </w:rPr>
+          <w:t>41</w:t>
         </w:r>
         <w:r>
           <w:rPr>
@@ -4344,8 +4389,9 @@
           <w:rPr>
             <w:noProof/>
             <w:webHidden/>
-          </w:rPr>
-          <w:t>41</w:t>
+            <w:rtl/>
+          </w:rPr>
+          <w:t>42</w:t>
         </w:r>
         <w:r>
           <w:rPr>
@@ -4417,8 +4463,9 @@
           <w:rPr>
             <w:noProof/>
             <w:webHidden/>
-          </w:rPr>
-          <w:t>43</w:t>
+            <w:rtl/>
+          </w:rPr>
+          <w:t>44</w:t>
         </w:r>
         <w:r>
           <w:rPr>
@@ -4490,8 +4537,9 @@
           <w:rPr>
             <w:noProof/>
             <w:webHidden/>
-          </w:rPr>
-          <w:t>43</w:t>
+            <w:rtl/>
+          </w:rPr>
+          <w:t>44</w:t>
         </w:r>
         <w:r>
           <w:rPr>
@@ -4563,8 +4611,9 @@
           <w:rPr>
             <w:noProof/>
             <w:webHidden/>
-          </w:rPr>
-          <w:t>43</w:t>
+            <w:rtl/>
+          </w:rPr>
+          <w:t>44</w:t>
         </w:r>
         <w:r>
           <w:rPr>
@@ -4643,8 +4692,9 @@
           <w:rPr>
             <w:noProof/>
             <w:webHidden/>
-          </w:rPr>
-          <w:t>44</w:t>
+            <w:rtl/>
+          </w:rPr>
+          <w:t>45</w:t>
         </w:r>
         <w:r>
           <w:rPr>
@@ -4716,8 +4766,9 @@
           <w:rPr>
             <w:noProof/>
             <w:webHidden/>
-          </w:rPr>
-          <w:t>45</w:t>
+            <w:rtl/>
+          </w:rPr>
+          <w:t>46</w:t>
         </w:r>
         <w:r>
           <w:rPr>
@@ -4749,58 +4800,49 @@
             <w:noProof/>
             <w:rtl/>
           </w:rPr>
-          <w:t>المبحث الثاني: هندسة تدفق البيانات وآليات الر</w:t>
-        </w:r>
-        <w:bookmarkStart w:id="2" w:name="_GoBack"/>
-        <w:bookmarkEnd w:id="2"/>
-        <w:r>
-          <w:rPr>
-            <w:rStyle w:val="Hyperlink"/>
-            <w:noProof/>
+          <w:t>المبحث الثاني: هندسة تدفق البيانات وآليات الرقابة</w:t>
+        </w:r>
+        <w:r>
+          <w:rPr>
+            <w:noProof/>
+            <w:webHidden/>
+          </w:rPr>
+          <w:tab/>
+        </w:r>
+        <w:r>
+          <w:rPr>
+            <w:noProof/>
+            <w:webHidden/>
+          </w:rPr>
+          <w:fldChar w:fldCharType="begin"/>
+        </w:r>
+        <w:r>
+          <w:rPr>
+            <w:noProof/>
+            <w:webHidden/>
+          </w:rPr>
+          <w:instrText xml:space="preserve"> PAGEREF _Toc232568834 \h </w:instrText>
+        </w:r>
+        <w:r>
+          <w:rPr>
+            <w:noProof/>
+            <w:webHidden/>
+          </w:rPr>
+        </w:r>
+        <w:r>
+          <w:rPr>
+            <w:noProof/>
+            <w:webHidden/>
+          </w:rPr>
+          <w:fldChar w:fldCharType="separate"/>
+        </w:r>
+        <w:r>
+          <w:rPr>
+            <w:noProof/>
+            <w:webHidden/>
             <w:rtl/>
           </w:rPr>
-          <w:t>قابة</w:t>
-        </w:r>
-        <w:r>
-          <w:rPr>
-            <w:noProof/>
-            <w:webHidden/>
-          </w:rPr>
-          <w:tab/>
-        </w:r>
-        <w:r>
-          <w:rPr>
-            <w:noProof/>
-            <w:webHidden/>
-          </w:rPr>
-          <w:fldChar w:fldCharType="begin"/>
-        </w:r>
-        <w:r>
-          <w:rPr>
-            <w:noProof/>
-            <w:webHidden/>
-          </w:rPr>
-          <w:instrText xml:space="preserve"> PAGEREF _Toc232568834 \h </w:instrText>
-        </w:r>
-        <w:r>
-          <w:rPr>
-            <w:noProof/>
-            <w:webHidden/>
-          </w:rPr>
-        </w:r>
-        <w:r>
-          <w:rPr>
-            <w:noProof/>
-            <w:webHidden/>
-          </w:rPr>
-          <w:fldChar w:fldCharType="separate"/>
-        </w:r>
-        <w:r>
-          <w:rPr>
-            <w:noProof/>
-            <w:webHidden/>
-          </w:rPr>
-          <w:t>45</w:t>
+          <w:t>46</w:t>
         </w:r>
         <w:r>
           <w:rPr>
@@ -4887,8 +4929,9 @@
           <w:rPr>
             <w:noProof/>
             <w:webHidden/>
-          </w:rPr>
-          <w:t>45</w:t>
+            <w:rtl/>
+          </w:rPr>
+          <w:t>46</w:t>
         </w:r>
         <w:r>
           <w:rPr>
@@ -4975,8 +5018,9 @@
           <w:rPr>
             <w:noProof/>
             <w:webHidden/>
-          </w:rPr>
-          <w:t>46</w:t>
+            <w:rtl/>
+          </w:rPr>
+          <w:t>47</w:t>
         </w:r>
         <w:r>
           <w:rPr>
@@ -5063,8 +5107,9 @@
           <w:rPr>
             <w:noProof/>
             <w:webHidden/>
-          </w:rPr>
-          <w:t>47</w:t>
+            <w:rtl/>
+          </w:rPr>
+          <w:t>48</w:t>
         </w:r>
         <w:r>
           <w:rPr>
@@ -5151,8 +5196,9 @@
           <w:rPr>
             <w:noProof/>
             <w:webHidden/>
-          </w:rPr>
-          <w:t>47</w:t>
+            <w:rtl/>
+          </w:rPr>
+          <w:t>48</w:t>
         </w:r>
         <w:r>
           <w:rPr>
@@ -5224,8 +5270,9 @@
           <w:rPr>
             <w:noProof/>
             <w:webHidden/>
-          </w:rPr>
-          <w:t>47</w:t>
+            <w:rtl/>
+          </w:rPr>
+          <w:t>48</w:t>
         </w:r>
         <w:r>
           <w:rPr>
@@ -5297,8 +5344,9 @@
           <w:rPr>
             <w:noProof/>
             <w:webHidden/>
-          </w:rPr>
-          <w:t>48</w:t>
+            <w:rtl/>
+          </w:rPr>
+          <w:t>49</w:t>
         </w:r>
         <w:r>
           <w:rPr>
@@ -5370,8 +5418,9 @@
           <w:rPr>
             <w:noProof/>
             <w:webHidden/>
-          </w:rPr>
-          <w:t>49</w:t>
+            <w:rtl/>
+          </w:rPr>
+          <w:t>50</w:t>
         </w:r>
         <w:r>
           <w:rPr>
@@ -5458,8 +5507,9 @@
           <w:rPr>
             <w:noProof/>
             <w:webHidden/>
-          </w:rPr>
-          <w:t>49</w:t>
+            <w:rtl/>
+          </w:rPr>
+          <w:t>50</w:t>
         </w:r>
         <w:r>
           <w:rPr>
@@ -5546,8 +5596,9 @@
           <w:rPr>
             <w:noProof/>
             <w:webHidden/>
-          </w:rPr>
-          <w:t>50</w:t>
+            <w:rtl/>
+          </w:rPr>
+          <w:t>51</w:t>
         </w:r>
         <w:r>
           <w:rPr>
@@ -5619,8 +5670,9 @@
           <w:rPr>
             <w:noProof/>
             <w:webHidden/>
-          </w:rPr>
-          <w:t>50</w:t>
+            <w:rtl/>
+          </w:rPr>
+          <w:t>51</w:t>
         </w:r>
         <w:r>
           <w:rPr>
@@ -5707,8 +5759,9 @@
           <w:rPr>
             <w:noProof/>
             <w:webHidden/>
-          </w:rPr>
-          <w:t>50</w:t>
+            <w:rtl/>
+          </w:rPr>
+          <w:t>51</w:t>
         </w:r>
         <w:r>
           <w:rPr>
@@ -5780,8 +5833,9 @@
           <w:rPr>
             <w:noProof/>
             <w:webHidden/>
-          </w:rPr>
-          <w:t>51</w:t>
+            <w:rtl/>
+          </w:rPr>
+          <w:t>52</w:t>
         </w:r>
         <w:r>
           <w:rPr>
@@ -5868,8 +5922,9 @@
           <w:rPr>
             <w:noProof/>
             <w:webHidden/>
-          </w:rPr>
-          <w:t>51</w:t>
+            <w:rtl/>
+          </w:rPr>
+          <w:t>52</w:t>
         </w:r>
         <w:r>
           <w:rPr>
@@ -5941,8 +5996,9 @@
           <w:rPr>
             <w:noProof/>
             <w:webHidden/>
-          </w:rPr>
-          <w:t>52</w:t>
+            <w:rtl/>
+          </w:rPr>
+          <w:t>53</w:t>
         </w:r>
         <w:r>
           <w:rPr>
@@ -6014,8 +6070,9 @@
           <w:rPr>
             <w:noProof/>
             <w:webHidden/>
-          </w:rPr>
-          <w:t>53</w:t>
+            <w:rtl/>
+          </w:rPr>
+          <w:t>54</w:t>
         </w:r>
         <w:r>
           <w:rPr>
@@ -6087,8 +6144,9 @@
           <w:rPr>
             <w:noProof/>
             <w:webHidden/>
-          </w:rPr>
-          <w:t>53</w:t>
+            <w:rtl/>
+          </w:rPr>
+          <w:t>54</w:t>
         </w:r>
         <w:r>
           <w:rPr>
@@ -6160,8 +6218,9 @@
           <w:rPr>
             <w:noProof/>
             <w:webHidden/>
-          </w:rPr>
-          <w:t>53</w:t>
+            <w:rtl/>
+          </w:rPr>
+          <w:t>54</w:t>
         </w:r>
         <w:r>
           <w:rPr>
@@ -6233,8 +6292,9 @@
           <w:rPr>
             <w:noProof/>
             <w:webHidden/>
-          </w:rPr>
-          <w:t>54</w:t>
+            <w:rtl/>
+          </w:rPr>
+          <w:t>55</w:t>
         </w:r>
         <w:r>
           <w:rPr>
@@ -6306,8 +6366,9 @@
           <w:rPr>
             <w:noProof/>
             <w:webHidden/>
-          </w:rPr>
-          <w:t>54</w:t>
+            <w:rtl/>
+          </w:rPr>
+          <w:t>55</w:t>
         </w:r>
         <w:r>
           <w:rPr>
@@ -6379,8 +6440,9 @@
           <w:rPr>
             <w:noProof/>
             <w:webHidden/>
-          </w:rPr>
-          <w:t>55</w:t>
+            <w:rtl/>
+          </w:rPr>
+          <w:t>56</w:t>
         </w:r>
         <w:r>
           <w:rPr>
@@ -6452,8 +6514,9 @@
           <w:rPr>
             <w:noProof/>
             <w:webHidden/>
-          </w:rPr>
-          <w:t>56</w:t>
+            <w:rtl/>
+          </w:rPr>
+          <w:t>57</w:t>
         </w:r>
         <w:r>
           <w:rPr>
@@ -6540,8 +6603,9 @@
           <w:rPr>
             <w:noProof/>
             <w:webHidden/>
-          </w:rPr>
-          <w:t>56</w:t>
+            <w:rtl/>
+          </w:rPr>
+          <w:t>57</w:t>
         </w:r>
         <w:r>
           <w:rPr>
@@ -6628,8 +6692,9 @@
           <w:rPr>
             <w:noProof/>
             <w:webHidden/>
-          </w:rPr>
-          <w:t>56</w:t>
+            <w:rtl/>
+          </w:rPr>
+          <w:t>57</w:t>
         </w:r>
         <w:r>
           <w:rPr>
@@ -6701,8 +6766,9 @@
           <w:rPr>
             <w:noProof/>
             <w:webHidden/>
-          </w:rPr>
-          <w:t>57</w:t>
+            <w:rtl/>
+          </w:rPr>
+          <w:t>58</w:t>
         </w:r>
         <w:r>
           <w:rPr>
@@ -6774,8 +6840,9 @@
           <w:rPr>
             <w:noProof/>
             <w:webHidden/>
-          </w:rPr>
-          <w:t>57</w:t>
+            <w:rtl/>
+          </w:rPr>
+          <w:t>58</w:t>
         </w:r>
         <w:r>
           <w:rPr>
@@ -6847,8 +6914,9 @@
           <w:rPr>
             <w:noProof/>
             <w:webHidden/>
-          </w:rPr>
-          <w:t>58</w:t>
+            <w:rtl/>
+          </w:rPr>
+          <w:t>59</w:t>
         </w:r>
         <w:r>
           <w:rPr>
@@ -6920,8 +6988,9 @@
           <w:rPr>
             <w:noProof/>
             <w:webHidden/>
-          </w:rPr>
-          <w:t>60</w:t>
+            <w:rtl/>
+          </w:rPr>
+          <w:t>61</w:t>
         </w:r>
         <w:r>
           <w:rPr>
@@ -6993,8 +7062,9 @@
           <w:rPr>
             <w:noProof/>
             <w:webHidden/>
-          </w:rPr>
-          <w:t>60</w:t>
+            <w:rtl/>
+          </w:rPr>
+          <w:t>61</w:t>
         </w:r>
         <w:r>
           <w:rPr>
@@ -7066,8 +7136,9 @@
           <w:rPr>
             <w:noProof/>
             <w:webHidden/>
-          </w:rPr>
-          <w:t>61</w:t>
+            <w:rtl/>
+          </w:rPr>
+          <w:t>62</w:t>
         </w:r>
         <w:r>
           <w:rPr>
@@ -7146,8 +7217,9 @@
           <w:rPr>
             <w:noProof/>
             <w:webHidden/>
-          </w:rPr>
-          <w:t>61</w:t>
+            <w:rtl/>
+          </w:rPr>
+          <w:t>62</w:t>
         </w:r>
         <w:r>
           <w:rPr>
@@ -7219,8 +7291,9 @@
           <w:rPr>
             <w:noProof/>
             <w:webHidden/>
-          </w:rPr>
-          <w:t>64</w:t>
+            <w:rtl/>
+          </w:rPr>
+          <w:t>65</w:t>
         </w:r>
         <w:r>
           <w:rPr>
@@ -7292,8 +7365,9 @@
           <w:rPr>
             <w:noProof/>
             <w:webHidden/>
-          </w:rPr>
-          <w:t>64</w:t>
+            <w:rtl/>
+          </w:rPr>
+          <w:t>65</w:t>
         </w:r>
         <w:r>
           <w:rPr>
@@ -7365,8 +7439,9 @@
           <w:rPr>
             <w:noProof/>
             <w:webHidden/>
-          </w:rPr>
-          <w:t>64</w:t>
+            <w:rtl/>
+          </w:rPr>
+          <w:t>65</w:t>
         </w:r>
         <w:r>
           <w:rPr>
@@ -7438,8 +7513,9 @@
           <w:rPr>
             <w:noProof/>
             <w:webHidden/>
-          </w:rPr>
-          <w:t>65</w:t>
+            <w:rtl/>
+          </w:rPr>
+          <w:t>66</w:t>
         </w:r>
         <w:r>
           <w:rPr>
@@ -7511,8 +7587,9 @@
           <w:rPr>
             <w:noProof/>
             <w:webHidden/>
-          </w:rPr>
-          <w:t>66</w:t>
+            <w:rtl/>
+          </w:rPr>
+          <w:t>67</w:t>
         </w:r>
         <w:r>
           <w:rPr>
@@ -7584,8 +7661,9 @@
           <w:rPr>
             <w:noProof/>
             <w:webHidden/>
-          </w:rPr>
-          <w:t>66</w:t>
+            <w:rtl/>
+          </w:rPr>
+          <w:t>67</w:t>
         </w:r>
         <w:r>
           <w:rPr>
@@ -7657,8 +7735,9 @@
           <w:rPr>
             <w:noProof/>
             <w:webHidden/>
-          </w:rPr>
-          <w:t>68</w:t>
+            <w:rtl/>
+          </w:rPr>
+          <w:t>69</w:t>
         </w:r>
         <w:r>
           <w:rPr>
@@ -7745,8 +7824,9 @@
           <w:rPr>
             <w:noProof/>
             <w:webHidden/>
-          </w:rPr>
-          <w:t>69</w:t>
+            <w:rtl/>
+          </w:rPr>
+          <w:t>70</w:t>
         </w:r>
         <w:r>
           <w:rPr>
@@ -7818,8 +7898,9 @@
           <w:rPr>
             <w:noProof/>
             <w:webHidden/>
-          </w:rPr>
-          <w:t>69</w:t>
+            <w:rtl/>
+          </w:rPr>
+          <w:t>70</w:t>
         </w:r>
         <w:r>
           <w:rPr>
@@ -7906,8 +7987,9 @@
           <w:rPr>
             <w:noProof/>
             <w:webHidden/>
-          </w:rPr>
-          <w:t>69</w:t>
+            <w:rtl/>
+          </w:rPr>
+          <w:t>70</w:t>
         </w:r>
         <w:r>
           <w:rPr>
@@ -7979,8 +8061,9 @@
           <w:rPr>
             <w:noProof/>
             <w:webHidden/>
-          </w:rPr>
-          <w:t>70</w:t>
+            <w:rtl/>
+          </w:rPr>
+          <w:t>71</w:t>
         </w:r>
         <w:r>
           <w:rPr>
@@ -8052,8 +8135,9 @@
           <w:rPr>
             <w:noProof/>
             <w:webHidden/>
-          </w:rPr>
-          <w:t>71</w:t>
+            <w:rtl/>
+          </w:rPr>
+          <w:t>72</w:t>
         </w:r>
         <w:r>
           <w:rPr>
@@ -8140,8 +8224,9 @@
           <w:rPr>
             <w:noProof/>
             <w:webHidden/>
-          </w:rPr>
-          <w:t>71</w:t>
+            <w:rtl/>
+          </w:rPr>
+          <w:t>72</w:t>
         </w:r>
         <w:r>
           <w:rPr>
@@ -8213,8 +8298,9 @@
           <w:rPr>
             <w:noProof/>
             <w:webHidden/>
-          </w:rPr>
-          <w:t>72</w:t>
+            <w:rtl/>
+          </w:rPr>
+          <w:t>73</w:t>
         </w:r>
         <w:r>
           <w:rPr>
@@ -8286,8 +8372,9 @@
           <w:rPr>
             <w:noProof/>
             <w:webHidden/>
-          </w:rPr>
-          <w:t>72</w:t>
+            <w:rtl/>
+          </w:rPr>
+          <w:t>73</w:t>
         </w:r>
         <w:r>
           <w:rPr>
@@ -8367,8 +8454,9 @@
           <w:rPr>
             <w:noProof/>
             <w:webHidden/>
-          </w:rPr>
-          <w:t>73</w:t>
+            <w:rtl/>
+          </w:rPr>
+          <w:t>74</w:t>
         </w:r>
         <w:r>
           <w:rPr>
@@ -8440,8 +8528,9 @@
           <w:rPr>
             <w:noProof/>
             <w:webHidden/>
-          </w:rPr>
-          <w:t>74</w:t>
+            <w:rtl/>
+          </w:rPr>
+          <w:t>75</w:t>
         </w:r>
         <w:r>
           <w:rPr>
@@ -8520,8 +8609,9 @@
           <w:rPr>
             <w:noProof/>
             <w:webHidden/>
-          </w:rPr>
-          <w:t>75</w:t>
+            <w:rtl/>
+          </w:rPr>
+          <w:t>76</w:t>
         </w:r>
         <w:r>
           <w:rPr>
@@ -8593,8 +8683,9 @@
           <w:rPr>
             <w:noProof/>
             <w:webHidden/>
-          </w:rPr>
-          <w:t>76</w:t>
+            <w:rtl/>
+          </w:rPr>
+          <w:t>77</w:t>
         </w:r>
         <w:r>
           <w:rPr>
@@ -8666,8 +8757,9 @@
           <w:rPr>
             <w:noProof/>
             <w:webHidden/>
-          </w:rPr>
-          <w:t>76</w:t>
+            <w:rtl/>
+          </w:rPr>
+          <w:t>77</w:t>
         </w:r>
         <w:r>
           <w:rPr>
@@ -8754,8 +8846,9 @@
           <w:rPr>
             <w:noProof/>
             <w:webHidden/>
-          </w:rPr>
-          <w:t>77</w:t>
+            <w:rtl/>
+          </w:rPr>
+          <w:t>78</w:t>
         </w:r>
         <w:r>
           <w:rPr>
@@ -8827,8 +8920,9 @@
           <w:rPr>
             <w:noProof/>
             <w:webHidden/>
-          </w:rPr>
-          <w:t>78</w:t>
+            <w:rtl/>
+          </w:rPr>
+          <w:t>79</w:t>
         </w:r>
         <w:r>
           <w:rPr>
@@ -8873,7 +8967,7 @@
           <w:rtl/>
         </w:rPr>
       </w:pPr>
-      <w:bookmarkStart w:id="3" w:name="قائمة-الجداول"/>
+      <w:bookmarkStart w:id="2" w:name="قائمة-الجداول"/>
       <w:bookmarkEnd w:id="0"/>
       <w:r>
         <w:rPr>
@@ -8888,7 +8982,7 @@
         <w:pStyle w:val="Heading3"/>
         <w:jc w:val="right"/>
       </w:pPr>
-      <w:bookmarkStart w:id="4" w:name="_Toc232568784"/>
+      <w:bookmarkStart w:id="3" w:name="_Toc232568784"/>
       <w:r>
         <w:rPr>
           <w:bidi/>
@@ -8897,16 +8991,15 @@
         <w:lastRenderedPageBreak/>
         <w:t>قائمة الجداول</w:t>
       </w:r>
-      <w:bookmarkEnd w:id="4"/>
-    </w:p>
-    <w:p>
-      <w:pPr>
-        <w:bidi w:val="1"/>
+      <w:bookmarkEnd w:id="3"/>
+    </w:p>
+    <w:p>
+      <w:pPr>
         <w:pStyle w:val="TableofFigures"/>
         <w:tabs>
           <w:tab w:val="right" w:leader="dot" w:pos="9062"/>
         </w:tabs>
-        <w:jc w:val="right"/>
+        <w:jc w:val="left"/>
         <w:rPr>
           <w:rFonts w:asciiTheme="minorHAnsi" w:eastAsiaTheme="minorEastAsia" w:hAnsiTheme="minorHAnsi" w:cstheme="minorBidi"/>
           <w:noProof/>
@@ -8932,7 +9025,6 @@
       </w:r>
       <w:r>
         <w:rPr>
-          <w:bidi/>
           <w:b/>
           <w:noProof/>
           <w:rtl/>
@@ -8948,7 +9040,6 @@
       </w:r>
       <w:r>
         <w:rPr>
-          <w:bidi/>
           <w:b/>
           <w:noProof/>
           <w:rtl/>
@@ -9002,6 +9093,7 @@
       <w:r>
         <w:rPr>
           <w:noProof/>
+          <w:rtl/>
         </w:rPr>
         <w:t>16</w:t>
       </w:r>
@@ -9014,12 +9106,11 @@
     </w:p>
     <w:p>
       <w:pPr>
-        <w:bidi w:val="1"/>
         <w:pStyle w:val="TableofFigures"/>
         <w:tabs>
           <w:tab w:val="right" w:leader="dot" w:pos="9062"/>
         </w:tabs>
-        <w:jc w:val="right"/>
+        <w:jc w:val="left"/>
         <w:rPr>
           <w:rFonts w:asciiTheme="minorHAnsi" w:eastAsiaTheme="minorEastAsia" w:hAnsiTheme="minorHAnsi" w:cstheme="minorBidi"/>
           <w:noProof/>
@@ -9036,7 +9127,6 @@
       </w:r>
       <w:r>
         <w:rPr>
-          <w:bidi/>
           <w:b/>
           <w:noProof/>
           <w:rtl/>
@@ -9082,6 +9172,7 @@
       <w:r>
         <w:rPr>
           <w:noProof/>
+          <w:rtl/>
         </w:rPr>
         <w:t>32</w:t>
       </w:r>
@@ -9094,12 +9185,11 @@
     </w:p>
     <w:p>
       <w:pPr>
-        <w:bidi w:val="1"/>
         <w:pStyle w:val="TableofFigures"/>
         <w:tabs>
           <w:tab w:val="right" w:leader="dot" w:pos="9062"/>
         </w:tabs>
-        <w:jc w:val="right"/>
+        <w:jc w:val="left"/>
         <w:rPr>
           <w:rFonts w:asciiTheme="minorHAnsi" w:eastAsiaTheme="minorEastAsia" w:hAnsiTheme="minorHAnsi" w:cstheme="minorBidi"/>
           <w:noProof/>
@@ -9116,7 +9206,6 @@
       </w:r>
       <w:r>
         <w:rPr>
-          <w:bidi/>
           <w:b/>
           <w:noProof/>
           <w:rtl/>
@@ -9155,6 +9244,7 @@
       <w:r>
         <w:rPr>
           <w:noProof/>
+          <w:rtl/>
         </w:rPr>
         <w:t>33</w:t>
       </w:r>
@@ -9167,12 +9257,11 @@
     </w:p>
     <w:p>
       <w:pPr>
-        <w:bidi w:val="1"/>
         <w:pStyle w:val="TableofFigures"/>
         <w:tabs>
           <w:tab w:val="right" w:leader="dot" w:pos="9062"/>
         </w:tabs>
-        <w:jc w:val="right"/>
+        <w:jc w:val="left"/>
         <w:rPr>
           <w:rFonts w:asciiTheme="minorHAnsi" w:eastAsiaTheme="minorEastAsia" w:hAnsiTheme="minorHAnsi" w:cstheme="minorBidi"/>
           <w:noProof/>
@@ -9189,7 +9278,6 @@
       </w:r>
       <w:r>
         <w:rPr>
-          <w:bidi/>
           <w:b/>
           <w:noProof/>
           <w:rtl/>
@@ -9205,7 +9293,6 @@
       </w:r>
       <w:r>
         <w:rPr>
-          <w:bidi/>
           <w:b/>
           <w:noProof/>
           <w:rtl/>
@@ -9251,6 +9338,7 @@
       <w:r>
         <w:rPr>
           <w:noProof/>
+          <w:rtl/>
         </w:rPr>
         <w:t>34</w:t>
       </w:r>
@@ -9263,12 +9351,11 @@
     </w:p>
     <w:p>
       <w:pPr>
-        <w:bidi w:val="1"/>
         <w:pStyle w:val="TableofFigures"/>
         <w:tabs>
           <w:tab w:val="right" w:leader="dot" w:pos="9062"/>
         </w:tabs>
-        <w:jc w:val="right"/>
+        <w:jc w:val="left"/>
         <w:rPr>
           <w:rFonts w:asciiTheme="minorHAnsi" w:eastAsiaTheme="minorEastAsia" w:hAnsiTheme="minorHAnsi" w:cstheme="minorBidi"/>
           <w:noProof/>
@@ -9285,7 +9372,6 @@
       </w:r>
       <w:r>
         <w:rPr>
-          <w:bidi/>
           <w:b/>
           <w:noProof/>
           <w:rtl/>
@@ -9324,6 +9410,7 @@
       <w:r>
         <w:rPr>
           <w:noProof/>
+          <w:rtl/>
         </w:rPr>
         <w:t>40</w:t>
       </w:r>
@@ -9336,12 +9423,11 @@
     </w:p>
     <w:p>
       <w:pPr>
-        <w:bidi w:val="1"/>
         <w:pStyle w:val="TableofFigures"/>
         <w:tabs>
           <w:tab w:val="right" w:leader="dot" w:pos="9062"/>
         </w:tabs>
-        <w:jc w:val="right"/>
+        <w:jc w:val="left"/>
         <w:rPr>
           <w:rFonts w:asciiTheme="minorHAnsi" w:eastAsiaTheme="minorEastAsia" w:hAnsiTheme="minorHAnsi" w:cstheme="minorBidi"/>
           <w:noProof/>
@@ -9358,7 +9444,6 @@
       </w:r>
       <w:r>
         <w:rPr>
-          <w:bidi/>
           <w:b/>
           <w:noProof/>
           <w:rtl/>
@@ -9397,6 +9482,7 @@
       <w:r>
         <w:rPr>
           <w:noProof/>
+          <w:rtl/>
         </w:rPr>
         <w:t>41</w:t>
       </w:r>
@@ -9486,6 +9572,7 @@
       <w:r>
         <w:rPr>
           <w:noProof/>
+          <w:rtl/>
         </w:rPr>
         <w:t>54</w:t>
       </w:r>
@@ -9559,6 +9646,7 @@
       <w:r>
         <w:rPr>
           <w:noProof/>
+          <w:rtl/>
         </w:rPr>
         <w:t>55</w:t>
       </w:r>
@@ -9632,6 +9720,7 @@
       <w:r>
         <w:rPr>
           <w:noProof/>
+          <w:rtl/>
         </w:rPr>
         <w:t>56</w:t>
       </w:r>
@@ -9705,6 +9794,7 @@
       <w:r>
         <w:rPr>
           <w:noProof/>
+          <w:rtl/>
         </w:rPr>
         <w:t>58</w:t>
       </w:r>
@@ -9717,12 +9807,11 @@
     </w:p>
     <w:p>
       <w:pPr>
-        <w:bidi w:val="1"/>
         <w:pStyle w:val="TableofFigures"/>
         <w:tabs>
           <w:tab w:val="right" w:leader="dot" w:pos="9062"/>
         </w:tabs>
-        <w:jc w:val="right"/>
+        <w:jc w:val="left"/>
         <w:rPr>
           <w:rFonts w:asciiTheme="minorHAnsi" w:eastAsiaTheme="minorEastAsia" w:hAnsiTheme="minorHAnsi" w:cstheme="minorBidi"/>
           <w:noProof/>
@@ -9739,7 +9828,6 @@
       </w:r>
       <w:r>
         <w:rPr>
-          <w:bidi/>
           <w:b/>
           <w:noProof/>
           <w:rtl/>
@@ -9778,6 +9866,7 @@
       <w:r>
         <w:rPr>
           <w:noProof/>
+          <w:rtl/>
         </w:rPr>
         <w:t>66</w:t>
       </w:r>
@@ -9790,12 +9879,11 @@
     </w:p>
     <w:p>
       <w:pPr>
-        <w:bidi w:val="1"/>
         <w:pStyle w:val="TableofFigures"/>
         <w:tabs>
           <w:tab w:val="right" w:leader="dot" w:pos="9062"/>
         </w:tabs>
-        <w:jc w:val="right"/>
+        <w:jc w:val="left"/>
         <w:rPr>
           <w:rFonts w:asciiTheme="minorHAnsi" w:eastAsiaTheme="minorEastAsia" w:hAnsiTheme="minorHAnsi" w:cstheme="minorBidi"/>
           <w:noProof/>
@@ -9812,7 +9900,6 @@
       </w:r>
       <w:r>
         <w:rPr>
-          <w:bidi/>
           <w:b/>
           <w:noProof/>
           <w:rtl/>
@@ -9851,6 +9938,7 @@
       <w:r>
         <w:rPr>
           <w:noProof/>
+          <w:rtl/>
         </w:rPr>
         <w:t>67</w:t>
       </w:r>
@@ -9863,12 +9951,11 @@
     </w:p>
     <w:p>
       <w:pPr>
-        <w:bidi w:val="1"/>
         <w:pStyle w:val="TableofFigures"/>
         <w:tabs>
           <w:tab w:val="right" w:leader="dot" w:pos="9062"/>
         </w:tabs>
-        <w:jc w:val="right"/>
+        <w:jc w:val="left"/>
         <w:rPr>
           <w:rFonts w:asciiTheme="minorHAnsi" w:eastAsiaTheme="minorEastAsia" w:hAnsiTheme="minorHAnsi" w:cstheme="minorBidi"/>
           <w:noProof/>
@@ -9885,7 +9972,6 @@
       </w:r>
       <w:r>
         <w:rPr>
-          <w:bidi/>
           <w:b/>
           <w:noProof/>
           <w:rtl/>
@@ -9924,6 +10010,7 @@
       <w:r>
         <w:rPr>
           <w:noProof/>
+          <w:rtl/>
         </w:rPr>
         <w:t>69</w:t>
       </w:r>
@@ -9936,12 +10023,11 @@
     </w:p>
     <w:p>
       <w:pPr>
-        <w:bidi w:val="1"/>
         <w:pStyle w:val="TableofFigures"/>
         <w:tabs>
           <w:tab w:val="right" w:leader="dot" w:pos="9062"/>
         </w:tabs>
-        <w:jc w:val="right"/>
+        <w:jc w:val="left"/>
         <w:rPr>
           <w:rFonts w:asciiTheme="minorHAnsi" w:eastAsiaTheme="minorEastAsia" w:hAnsiTheme="minorHAnsi" w:cstheme="minorBidi"/>
           <w:noProof/>
@@ -9958,7 +10044,6 @@
       </w:r>
       <w:r>
         <w:rPr>
-          <w:bidi/>
           <w:b/>
           <w:noProof/>
           <w:rtl/>
@@ -9997,6 +10082,7 @@
       <w:r>
         <w:rPr>
           <w:noProof/>
+          <w:rtl/>
         </w:rPr>
         <w:t>70</w:t>
       </w:r>
@@ -10009,12 +10095,11 @@
     </w:p>
     <w:p>
       <w:pPr>
-        <w:bidi w:val="1"/>
         <w:pStyle w:val="TableofFigures"/>
         <w:tabs>
           <w:tab w:val="right" w:leader="dot" w:pos="9062"/>
         </w:tabs>
-        <w:jc w:val="right"/>
+        <w:jc w:val="left"/>
         <w:rPr>
           <w:rFonts w:asciiTheme="minorHAnsi" w:eastAsiaTheme="minorEastAsia" w:hAnsiTheme="minorHAnsi" w:cstheme="minorBidi"/>
           <w:noProof/>
@@ -10031,7 +10116,6 @@
       </w:r>
       <w:r>
         <w:rPr>
-          <w:bidi/>
           <w:b/>
           <w:noProof/>
           <w:rtl/>
@@ -10047,7 +10131,6 @@
       </w:r>
       <w:r>
         <w:rPr>
-          <w:bidi/>
           <w:b/>
           <w:noProof/>
           <w:rtl/>
@@ -10086,6 +10169,7 @@
       <w:r>
         <w:rPr>
           <w:noProof/>
+          <w:rtl/>
         </w:rPr>
         <w:t>70</w:t>
       </w:r>
@@ -10098,12 +10182,11 @@
     </w:p>
     <w:p>
       <w:pPr>
-        <w:bidi w:val="1"/>
         <w:pStyle w:val="TableofFigures"/>
         <w:tabs>
           <w:tab w:val="right" w:leader="dot" w:pos="9062"/>
         </w:tabs>
-        <w:jc w:val="right"/>
+        <w:jc w:val="left"/>
         <w:rPr>
           <w:rFonts w:asciiTheme="minorHAnsi" w:eastAsiaTheme="minorEastAsia" w:hAnsiTheme="minorHAnsi" w:cstheme="minorBidi"/>
           <w:noProof/>
@@ -10120,7 +10203,6 @@
       </w:r>
       <w:r>
         <w:rPr>
-          <w:bidi/>
           <w:b/>
           <w:noProof/>
           <w:rtl/>
@@ -10159,6 +10241,7 @@
       <w:r>
         <w:rPr>
           <w:noProof/>
+          <w:rtl/>
         </w:rPr>
         <w:t>71</w:t>
       </w:r>
@@ -10171,12 +10254,11 @@
     </w:p>
     <w:p>
       <w:pPr>
-        <w:bidi w:val="1"/>
         <w:pStyle w:val="TableofFigures"/>
         <w:tabs>
           <w:tab w:val="right" w:leader="dot" w:pos="9062"/>
         </w:tabs>
-        <w:jc w:val="right"/>
+        <w:jc w:val="left"/>
         <w:rPr>
           <w:rFonts w:asciiTheme="minorHAnsi" w:eastAsiaTheme="minorEastAsia" w:hAnsiTheme="minorHAnsi" w:cstheme="minorBidi"/>
           <w:noProof/>
@@ -10193,7 +10275,6 @@
       </w:r>
       <w:r>
         <w:rPr>
-          <w:bidi/>
           <w:b/>
           <w:noProof/>
           <w:rtl/>
@@ -10247,6 +10328,7 @@
       <w:r>
         <w:rPr>
           <w:noProof/>
+          <w:rtl/>
         </w:rPr>
         <w:t>72</w:t>
       </w:r>
@@ -10259,12 +10341,11 @@
     </w:p>
     <w:p>
       <w:pPr>
-        <w:bidi w:val="1"/>
         <w:pStyle w:val="TableofFigures"/>
         <w:tabs>
           <w:tab w:val="right" w:leader="dot" w:pos="9062"/>
         </w:tabs>
-        <w:jc w:val="right"/>
+        <w:jc w:val="left"/>
         <w:rPr>
           <w:rFonts w:asciiTheme="minorHAnsi" w:eastAsiaTheme="minorEastAsia" w:hAnsiTheme="minorHAnsi" w:cstheme="minorBidi"/>
           <w:noProof/>
@@ -10281,7 +10362,6 @@
       </w:r>
       <w:r>
         <w:rPr>
-          <w:bidi/>
           <w:b/>
           <w:noProof/>
           <w:rtl/>
@@ -10320,6 +10400,7 @@
       <w:r>
         <w:rPr>
           <w:noProof/>
+          <w:rtl/>
         </w:rPr>
         <w:t>73</w:t>
       </w:r>
@@ -10332,12 +10413,11 @@
     </w:p>
     <w:p>
       <w:pPr>
-        <w:bidi w:val="1"/>
         <w:pStyle w:val="TableofFigures"/>
         <w:tabs>
           <w:tab w:val="right" w:leader="dot" w:pos="9062"/>
         </w:tabs>
-        <w:jc w:val="right"/>
+        <w:jc w:val="left"/>
         <w:rPr>
           <w:rFonts w:asciiTheme="minorHAnsi" w:eastAsiaTheme="minorEastAsia" w:hAnsiTheme="minorHAnsi" w:cstheme="minorBidi"/>
           <w:noProof/>
@@ -10354,7 +10434,6 @@
       </w:r>
       <w:r>
         <w:rPr>
-          <w:bidi/>
           <w:b/>
           <w:noProof/>
           <w:rtl/>
@@ -10393,6 +10472,7 @@
       <w:r>
         <w:rPr>
           <w:noProof/>
+          <w:rtl/>
         </w:rPr>
         <w:t>74</w:t>
       </w:r>
@@ -10405,12 +10485,11 @@
     </w:p>
     <w:p>
       <w:pPr>
-        <w:bidi w:val="1"/>
         <w:pStyle w:val="TableofFigures"/>
         <w:tabs>
           <w:tab w:val="right" w:leader="dot" w:pos="9062"/>
         </w:tabs>
-        <w:jc w:val="right"/>
+        <w:jc w:val="left"/>
         <w:rPr>
           <w:rFonts w:asciiTheme="minorHAnsi" w:eastAsiaTheme="minorEastAsia" w:hAnsiTheme="minorHAnsi" w:cstheme="minorBidi"/>
           <w:noProof/>
@@ -10428,7 +10507,6 @@
       </w:r>
       <w:r>
         <w:rPr>
-          <w:bidi/>
           <w:b/>
           <w:noProof/>
           <w:rtl/>
@@ -10467,6 +10545,7 @@
       <w:r>
         <w:rPr>
           <w:noProof/>
+          <w:rtl/>
         </w:rPr>
         <w:t>75</w:t>
       </w:r>
@@ -10479,12 +10558,11 @@
     </w:p>
     <w:p>
       <w:pPr>
-        <w:bidi w:val="1"/>
         <w:pStyle w:val="TableofFigures"/>
         <w:tabs>
           <w:tab w:val="right" w:leader="dot" w:pos="9062"/>
         </w:tabs>
-        <w:jc w:val="right"/>
+        <w:jc w:val="left"/>
         <w:rPr>
           <w:rFonts w:asciiTheme="minorHAnsi" w:eastAsiaTheme="minorEastAsia" w:hAnsiTheme="minorHAnsi" w:cstheme="minorBidi"/>
           <w:noProof/>
@@ -10501,7 +10579,6 @@
       </w:r>
       <w:r>
         <w:rPr>
-          <w:bidi/>
           <w:b/>
           <w:noProof/>
           <w:rtl/>
@@ -10540,6 +10617,7 @@
       <w:r>
         <w:rPr>
           <w:noProof/>
+          <w:rtl/>
         </w:rPr>
         <w:t>75</w:t>
       </w:r>
@@ -10552,12 +10630,11 @@
     </w:p>
     <w:p>
       <w:pPr>
-        <w:bidi w:val="1"/>
         <w:pStyle w:val="TableofFigures"/>
         <w:tabs>
           <w:tab w:val="right" w:leader="dot" w:pos="9062"/>
         </w:tabs>
-        <w:jc w:val="right"/>
+        <w:jc w:val="left"/>
         <w:rPr>
           <w:rFonts w:asciiTheme="minorHAnsi" w:eastAsiaTheme="minorEastAsia" w:hAnsiTheme="minorHAnsi" w:cstheme="minorBidi"/>
           <w:noProof/>
@@ -10574,7 +10651,6 @@
       </w:r>
       <w:r>
         <w:rPr>
-          <w:bidi/>
           <w:b/>
           <w:noProof/>
           <w:rtl/>
@@ -10613,6 +10689,7 @@
       <w:r>
         <w:rPr>
           <w:noProof/>
+          <w:rtl/>
         </w:rPr>
         <w:t>76</w:t>
       </w:r>
@@ -10625,12 +10702,11 @@
     </w:p>
     <w:p>
       <w:pPr>
-        <w:bidi w:val="1"/>
         <w:pStyle w:val="TableofFigures"/>
         <w:tabs>
           <w:tab w:val="right" w:leader="dot" w:pos="9062"/>
         </w:tabs>
-        <w:jc w:val="right"/>
+        <w:jc w:val="left"/>
         <w:rPr>
           <w:rFonts w:asciiTheme="minorHAnsi" w:eastAsiaTheme="minorEastAsia" w:hAnsiTheme="minorHAnsi" w:cstheme="minorBidi"/>
           <w:noProof/>
@@ -10647,7 +10723,6 @@
       </w:r>
       <w:r>
         <w:rPr>
-          <w:bidi/>
           <w:b/>
           <w:noProof/>
           <w:rtl/>
@@ -10686,6 +10761,7 @@
       <w:r>
         <w:rPr>
           <w:noProof/>
+          <w:rtl/>
         </w:rPr>
         <w:t>77</w:t>
       </w:r>
@@ -10698,12 +10774,11 @@
     </w:p>
     <w:p>
       <w:pPr>
-        <w:bidi w:val="1"/>
         <w:pStyle w:val="TableofFigures"/>
         <w:tabs>
           <w:tab w:val="right" w:leader="dot" w:pos="9062"/>
         </w:tabs>
-        <w:jc w:val="right"/>
+        <w:jc w:val="left"/>
         <w:rPr>
           <w:rFonts w:asciiTheme="minorHAnsi" w:eastAsiaTheme="minorEastAsia" w:hAnsiTheme="minorHAnsi" w:cstheme="minorBidi"/>
           <w:noProof/>
@@ -10720,7 +10795,6 @@
       </w:r>
       <w:r>
         <w:rPr>
-          <w:bidi/>
           <w:b/>
           <w:noProof/>
           <w:rtl/>
@@ -10759,6 +10833,7 @@
       <w:r>
         <w:rPr>
           <w:noProof/>
+          <w:rtl/>
         </w:rPr>
         <w:t>77</w:t>
       </w:r>
@@ -10771,12 +10846,11 @@
     </w:p>
     <w:p>
       <w:pPr>
-        <w:bidi w:val="1"/>
         <w:pStyle w:val="TableofFigures"/>
         <w:tabs>
           <w:tab w:val="right" w:leader="dot" w:pos="9062"/>
         </w:tabs>
-        <w:jc w:val="right"/>
+        <w:jc w:val="left"/>
         <w:rPr>
           <w:rFonts w:asciiTheme="minorHAnsi" w:eastAsiaTheme="minorEastAsia" w:hAnsiTheme="minorHAnsi" w:cstheme="minorBidi"/>
           <w:noProof/>
@@ -10793,7 +10867,6 @@
       </w:r>
       <w:r>
         <w:rPr>
-          <w:bidi/>
           <w:b/>
           <w:noProof/>
           <w:rtl/>
@@ -10809,7 +10882,6 @@
       </w:r>
       <w:r>
         <w:rPr>
-          <w:bidi/>
           <w:b/>
           <w:noProof/>
           <w:rtl/>
@@ -10848,6 +10920,7 @@
       <w:r>
         <w:rPr>
           <w:noProof/>
+          <w:rtl/>
         </w:rPr>
         <w:t>78</w:t>
       </w:r>
@@ -10892,8 +10965,8 @@
         </w:rPr>
         <w:jc w:val="right"/>
       </w:pPr>
-      <w:bookmarkStart w:id="5" w:name="الملخص"/>
-      <w:bookmarkEnd w:id="3"/>
+      <w:bookmarkStart w:id="4" w:name="الملخص"/>
+      <w:bookmarkEnd w:id="2"/>
       <w:r>
         <w:rPr>
           <w:rtl/>
@@ -10907,7 +10980,7 @@
         <w:pStyle w:val="Heading2"/>
         <w:jc w:val="right"/>
       </w:pPr>
-      <w:bookmarkStart w:id="6" w:name="_Toc232568785"/>
+      <w:bookmarkStart w:id="5" w:name="_Toc232568785"/>
       <w:r>
         <w:rPr>
           <w:bidi/>
@@ -10917,7 +10990,7 @@
         <w:lastRenderedPageBreak/>
         <w:t>الملخص</w:t>
       </w:r>
-      <w:bookmarkEnd w:id="6"/>
+      <w:bookmarkEnd w:id="5"/>
     </w:p>
     <w:p>
       <w:pPr>
@@ -11070,9 +11143,9 @@
         </w:rPr>
         <w:jc w:val="right"/>
       </w:pPr>
+      <w:bookmarkStart w:id="6" w:name="_Toc232568786"/>
       <w:bookmarkStart w:id="7" w:name="résumé"/>
-      <w:bookmarkStart w:id="8" w:name="_Toc232568786"/>
-      <w:bookmarkEnd w:id="5"/>
+      <w:bookmarkEnd w:id="4"/>
       <w:r>
         <w:rPr>
           <w:rFonts w:ascii="Traditional Arabic" w:hAnsi="Traditional Arabic"/>
@@ -11081,7 +11154,7 @@
         <w:lastRenderedPageBreak/>
         <w:t>Résumé</w:t>
       </w:r>
-      <w:bookmarkEnd w:id="8"/>
+      <w:bookmarkEnd w:id="6"/>
     </w:p>
     <w:p>
       <w:pPr>
@@ -11241,7 +11314,7 @@
         </w:rPr>
         <w:jc w:val="right"/>
       </w:pPr>
-      <w:bookmarkStart w:id="9" w:name="المقدمة-العامة"/>
+      <w:bookmarkStart w:id="8" w:name="المقدمة-العامة"/>
       <w:bookmarkEnd w:id="7"/>
       <w:r>
         <w:rPr>
@@ -11256,7 +11329,7 @@
         <w:pStyle w:val="Heading1"/>
         <w:jc w:val="right"/>
       </w:pPr>
-      <w:bookmarkStart w:id="10" w:name="_Toc232568787"/>
+      <w:bookmarkStart w:id="9" w:name="_Toc232568787"/>
       <w:r>
         <w:rPr>
           <w:bidi/>
@@ -11266,57 +11339,57 @@
         <w:lastRenderedPageBreak/>
         <w:t>المقدمة العامة</w:t>
       </w:r>
+      <w:bookmarkEnd w:id="9"/>
+    </w:p>
+    <w:p>
+      <w:pPr>
+        <w:bidi w:val="1"/>
+        <w:pStyle w:val="Heading2"/>
+        <w:jc w:val="right"/>
+      </w:pPr>
+      <w:bookmarkStart w:id="10" w:name="_Toc232568788"/>
+      <w:bookmarkStart w:id="11" w:name="تمهيد"/>
+      <w:r>
+        <w:rPr>
+          <w:bidi/>
+          <w:rFonts w:ascii="Traditional Arabic" w:hAnsi="Traditional Arabic"/>
+          <w:rtl/>
+        </w:rPr>
+        <w:t>تمهيد</w:t>
+      </w:r>
       <w:bookmarkEnd w:id="10"/>
     </w:p>
     <w:p>
       <w:pPr>
         <w:bidi w:val="1"/>
+        <w:jc w:val="right"/>
+      </w:pPr>
+      <w:r>
+        <w:rPr>
+          <w:bidi/>
+          <w:rtl/>
+        </w:rPr>
+        <w:t>يُشكِّل التسيير اللوجيستي الفعّال للمخزونات ركيزةً جوهريةً من ركائز الأداء المؤسسي في القطاع العام، حيث ترتبط جودة الخدمة العمومية ارتباطاً وثيقاً بتوفر المواد والتجهيزات الضرورية في الوقت والمكان المناسبين. في قطاع التربية الوطنية، يتجلى هذا الارتباط بصورة خاصة، إذ أن انقطاع المواد الاستراتيجية كأحبار الطابعات وورق الامتحانات في فترات الذروة كالامتحانات الفصلية قد يؤدي إلى تعطيل العملية التربوية برمتها. من هذا المنطلق، تبرز الحاجة الملحة إلى تطوير أنظمة تسيير رقمية قادرة على تجاوز القيود البنيوية للنظم اليدوية التقليدية، مع مراعاة خصوصية القطاع العام الجزائري والإطار التنظيمي الذي يحكمه.</w:t>
+      </w:r>
+    </w:p>
+    <w:p>
+      <w:pPr>
+        <w:bidi w:val="1"/>
         <w:pStyle w:val="Heading2"/>
         <w:jc w:val="right"/>
       </w:pPr>
-      <w:bookmarkStart w:id="11" w:name="تمهيد"/>
-      <w:bookmarkStart w:id="12" w:name="_Toc232568788"/>
+      <w:bookmarkStart w:id="12" w:name="_Toc232568789"/>
+      <w:bookmarkStart w:id="13" w:name="الإشكالية"/>
+      <w:bookmarkEnd w:id="11"/>
       <w:r>
         <w:rPr>
           <w:bidi/>
           <w:rFonts w:ascii="Traditional Arabic" w:hAnsi="Traditional Arabic"/>
           <w:rtl/>
         </w:rPr>
-        <w:t>تمهيد</w:t>
+        <w:t>الإشكالية</w:t>
       </w:r>
       <w:bookmarkEnd w:id="12"/>
-    </w:p>
-    <w:p>
-      <w:pPr>
-        <w:bidi w:val="1"/>
-        <w:jc w:val="right"/>
-      </w:pPr>
-      <w:r>
-        <w:rPr>
-          <w:bidi/>
-          <w:rtl/>
-        </w:rPr>
-        <w:t>يُشكِّل التسيير اللوجيستي الفعّال للمخزونات ركيزةً جوهريةً من ركائز الأداء المؤسسي في القطاع العام، حيث ترتبط جودة الخدمة العمومية ارتباطاً وثيقاً بتوفر المواد والتجهيزات الضرورية في الوقت والمكان المناسبين. في قطاع التربية الوطنية، يتجلى هذا الارتباط بصورة خاصة، إذ أن انقطاع المواد الاستراتيجية كأحبار الطابعات وورق الامتحانات في فترات الذروة كالامتحانات الفصلية قد يؤدي إلى تعطيل العملية التربوية برمتها. من هذا المنطلق، تبرز الحاجة الملحة إلى تطوير أنظمة تسيير رقمية قادرة على تجاوز القيود البنيوية للنظم اليدوية التقليدية، مع مراعاة خصوصية القطاع العام الجزائري والإطار التنظيمي الذي يحكمه.</w:t>
-      </w:r>
-    </w:p>
-    <w:p>
-      <w:pPr>
-        <w:bidi w:val="1"/>
-        <w:pStyle w:val="Heading2"/>
-        <w:jc w:val="right"/>
-      </w:pPr>
-      <w:bookmarkStart w:id="13" w:name="الإشكالية"/>
-      <w:bookmarkStart w:id="14" w:name="_Toc232568789"/>
-      <w:bookmarkEnd w:id="11"/>
-      <w:r>
-        <w:rPr>
-          <w:bidi/>
-          <w:rFonts w:ascii="Traditional Arabic" w:hAnsi="Traditional Arabic"/>
-          <w:rtl/>
-        </w:rPr>
-        <w:t>الإشكالية</w:t>
-      </w:r>
-      <w:bookmarkEnd w:id="14"/>
     </w:p>
     <w:p>
       <w:pPr>
@@ -11353,8 +11426,8 @@
         <w:pStyle w:val="Heading2"/>
         <w:jc w:val="right"/>
       </w:pPr>
+      <w:bookmarkStart w:id="14" w:name="_Toc232568790"/>
       <w:bookmarkStart w:id="15" w:name="الفرضيات"/>
-      <w:bookmarkStart w:id="16" w:name="_Toc232568790"/>
       <w:bookmarkEnd w:id="13"/>
       <w:r>
         <w:rPr>
@@ -11364,7 +11437,7 @@
         </w:rPr>
         <w:t>الفرضيات</w:t>
       </w:r>
-      <w:bookmarkEnd w:id="16"/>
+      <w:bookmarkEnd w:id="14"/>
     </w:p>
     <w:p>
       <w:pPr>
@@ -11446,7 +11519,7 @@
           <w:rtl/>
         </w:rPr>
       </w:pPr>
-      <w:bookmarkStart w:id="17" w:name="أهداف-الدراسة"/>
+      <w:bookmarkStart w:id="16" w:name="أهداف-الدراسة"/>
       <w:bookmarkEnd w:id="15"/>
       <w:r>
         <w:rPr>
@@ -11461,7 +11534,7 @@
         <w:pStyle w:val="Heading2"/>
         <w:jc w:val="right"/>
       </w:pPr>
-      <w:bookmarkStart w:id="18" w:name="_Toc232568791"/>
+      <w:bookmarkStart w:id="17" w:name="_Toc232568791"/>
       <w:r>
         <w:rPr>
           <w:bidi/>
@@ -11471,7 +11544,7 @@
         <w:lastRenderedPageBreak/>
         <w:t>أهداف الدراسة</w:t>
       </w:r>
-      <w:bookmarkEnd w:id="18"/>
+      <w:bookmarkEnd w:id="17"/>
     </w:p>
     <w:p>
       <w:pPr>
@@ -11582,9 +11655,9 @@
         <w:pStyle w:val="Heading2"/>
         <w:jc w:val="right"/>
       </w:pPr>
+      <w:bookmarkStart w:id="18" w:name="_Toc232568792"/>
       <w:bookmarkStart w:id="19" w:name="منهجية-البحث"/>
-      <w:bookmarkStart w:id="20" w:name="_Toc232568792"/>
-      <w:bookmarkEnd w:id="17"/>
+      <w:bookmarkEnd w:id="16"/>
       <w:r>
         <w:rPr>
           <w:bidi/>
@@ -11593,39 +11666,39 @@
         </w:rPr>
         <w:t>منهجية البحث</w:t>
       </w:r>
+      <w:bookmarkEnd w:id="18"/>
+    </w:p>
+    <w:p>
+      <w:pPr>
+        <w:bidi w:val="1"/>
+        <w:jc w:val="right"/>
+      </w:pPr>
+      <w:r>
+        <w:rPr>
+          <w:bidi/>
+          <w:rtl/>
+        </w:rPr>
+        <w:t>اعتمدت الدراسة منهجاً علمياً يجمع بين المنهج الوصفي التحليلي في رسم صورة دقيقة للواقع الميداني، والمنهج التجريبي التطبيقي في قياس أثر الحل المقترح. استندت عملية جمع البيانات إلى ثلاث أدوات رئيسية: أولاً: الملاحظة المباشرة والمشاركة في سير العمل اليومي لمصلحة المخازن، ثانياً: تحليل السجلات والوثائق المخزنية الفعلية، وثالثاً: المقابلات غير المقننة مع المسؤولين والعاملين في المصلحة. أما مرحلة التصميم والتطوير، فقد اعتمدت على دورة حياة تطوير الأنظمة في نسقتها المُصغَّرة، مع التركيز على النمذجة السريعة والتطوير التكراري.</w:t>
+      </w:r>
+    </w:p>
+    <w:p>
+      <w:pPr>
+        <w:bidi w:val="1"/>
+        <w:pStyle w:val="Heading2"/>
+        <w:jc w:val="right"/>
+      </w:pPr>
+      <w:bookmarkStart w:id="20" w:name="_Toc232568793"/>
+      <w:bookmarkStart w:id="21" w:name="هيكل-الدراسة"/>
+      <w:bookmarkEnd w:id="19"/>
+      <w:r>
+        <w:rPr>
+          <w:bidi/>
+          <w:rFonts w:ascii="Traditional Arabic" w:hAnsi="Traditional Arabic"/>
+          <w:rtl/>
+        </w:rPr>
+        <w:t>هيكل الدراسة</w:t>
+      </w:r>
       <w:bookmarkEnd w:id="20"/>
-    </w:p>
-    <w:p>
-      <w:pPr>
-        <w:bidi w:val="1"/>
-        <w:jc w:val="right"/>
-      </w:pPr>
-      <w:r>
-        <w:rPr>
-          <w:bidi/>
-          <w:rtl/>
-        </w:rPr>
-        <w:t>اعتمدت الدراسة منهجاً علمياً يجمع بين المنهج الوصفي التحليلي في رسم صورة دقيقة للواقع الميداني، والمنهج التجريبي التطبيقي في قياس أثر الحل المقترح. استندت عملية جمع البيانات إلى ثلاث أدوات رئيسية: أولاً: الملاحظة المباشرة والمشاركة في سير العمل اليومي لمصلحة المخازن، ثانياً: تحليل السجلات والوثائق المخزنية الفعلية، وثالثاً: المقابلات غير المقننة مع المسؤولين والعاملين في المصلحة. أما مرحلة التصميم والتطوير، فقد اعتمدت على دورة حياة تطوير الأنظمة في نسقتها المُصغَّرة، مع التركيز على النمذجة السريعة والتطوير التكراري.</w:t>
-      </w:r>
-    </w:p>
-    <w:p>
-      <w:pPr>
-        <w:bidi w:val="1"/>
-        <w:pStyle w:val="Heading2"/>
-        <w:jc w:val="right"/>
-      </w:pPr>
-      <w:bookmarkStart w:id="21" w:name="هيكل-الدراسة"/>
-      <w:bookmarkStart w:id="22" w:name="_Toc232568793"/>
-      <w:bookmarkEnd w:id="19"/>
-      <w:r>
-        <w:rPr>
-          <w:bidi/>
-          <w:rFonts w:ascii="Traditional Arabic" w:hAnsi="Traditional Arabic"/>
-          <w:rtl/>
-        </w:rPr>
-        <w:t>هيكل الدراسة</w:t>
-      </w:r>
-      <w:bookmarkEnd w:id="22"/>
     </w:p>
     <w:p>
       <w:pPr>
@@ -11653,7 +11726,7 @@
           <w:rtl/>
         </w:rPr>
       </w:pPr>
-      <w:bookmarkStart w:id="23" w:name="Xf59180c5cc222249dc6a39c05bc19cdf400d056"/>
+      <w:bookmarkStart w:id="22" w:name="Xf59180c5cc222249dc6a39c05bc19cdf400d056"/>
       <w:bookmarkEnd w:id="21"/>
       <w:r>
         <w:rPr>
@@ -11668,7 +11741,7 @@
         <w:pStyle w:val="Heading2"/>
         <w:jc w:val="right"/>
       </w:pPr>
-      <w:bookmarkStart w:id="24" w:name="_Toc232568794"/>
+      <w:bookmarkStart w:id="23" w:name="_Toc232568794"/>
       <w:r>
         <w:rPr>
           <w:bidi/>
@@ -11678,7 +11751,7 @@
         <w:lastRenderedPageBreak/>
         <w:t>الانسجام مع منهاج BTS في تسيير المخزونات واللوجستيك (TAG1801)</w:t>
       </w:r>
-      <w:bookmarkEnd w:id="24"/>
+      <w:bookmarkEnd w:id="23"/>
     </w:p>
     <w:p>
       <w:pPr>
@@ -11718,7 +11791,7 @@
         </w:rPr>
         <w:fldChar w:fldCharType="separate"/>
       </w:r>
-      <w:bookmarkStart w:id="25" w:name="_Toc232568887"/>
+      <w:bookmarkStart w:id="24" w:name="_Toc232568887"/>
       <w:r>
         <w:rPr>
           <w:b/>
@@ -11741,7 +11814,7 @@
         </w:rPr>
         <w:t>: الانسجام مع منهاج BTS في تسيير المخزونات واللوجستيك (TAG1801)</w:t>
       </w:r>
-      <w:bookmarkEnd w:id="25"/>
+      <w:bookmarkEnd w:id="24"/>
     </w:p>
     <w:tbl>
       <w:tblPr>
@@ -14315,7 +14388,7 @@
         <w:jc w:val="right"/>
       </w:pPr>
       <w:r>
-        <w:pict w14:anchorId="0CFB7F49">
+        <w:pict w14:anchorId="63ADA23E">
           <v:rect id="_x0000_i1025" style="width:0;height:1.5pt" o:hralign="right" o:hrstd="t" o:hr="t"/>
         </w:pict>
       </w:r>
@@ -14327,10 +14400,10 @@
         <w:pageBreakBefore/>
         <w:jc w:val="right"/>
       </w:pPr>
+      <w:bookmarkStart w:id="25" w:name="_Toc232568795"/>
       <w:bookmarkStart w:id="26" w:name="Xdded5c7f65391e1348f873ece249db48d441899"/>
-      <w:bookmarkStart w:id="27" w:name="_Toc232568795"/>
-      <w:bookmarkEnd w:id="9"/>
-      <w:bookmarkEnd w:id="23"/>
+      <w:bookmarkEnd w:id="8"/>
+      <w:bookmarkEnd w:id="22"/>
       <w:r>
         <w:rPr>
           <w:bidi/>
@@ -14340,7 +14413,7 @@
         <w:lastRenderedPageBreak/>
         <w:t>الفصل الأول: الإطار النظري للتسيير اللوجيستي</w:t>
       </w:r>
-      <w:bookmarkEnd w:id="27"/>
+      <w:bookmarkEnd w:id="25"/>
     </w:p>
     <w:p>
       <w:pPr>
@@ -14362,13 +14435,22 @@
         <w:bidi w:val="1"/>
         <w:jc w:val="right"/>
       </w:pPr>
-      <w:bookmarkStart w:id="28" w:name="Xf611bb0edf20bf1066e7eca580412f3b8334a9d"/>
-      <w:r>
-        <w:rPr>
-          <w:bidi/>
-          <w:rtl/>
-        </w:rPr>
-        <w:t>يُعدّ هذا الفصل الركيزة النظرية التي تنبني عليها فصول الدراسة كلها. يستعرض المبحث الأول المفاهيم الأساسية للتسيير اللوجيستي وسلسلة التوريد ودور المستودعات، ثم ينتقل المبحث الثاني إلى تسيير المخزونات في القطاع العام والإطار التنظيمي الجزائري الذي يحكم عمليات التموين والمشتريات. ويتناول المبحث الثالث إدارة الشراء والدورة المستندية كحلقة وصل بين الاحتياجات الميدانية والتوريد الفعلي. ويُخصص المبحث الرابع لأدوات التقييم المحاسبي للمخزون (ABC، EOQ، ROP، CMUP، FIFO) مع أمثلة تطبيقية مستمدة من بيانات المشروع. وأخيراً، يستعرض المبحث الخامس تقييم الموردين ومفهوم الأنظمة المندمجة (ERP) كإطار مفاهيمي للحل الرقمي المقترح.</w:t>
+      <w:bookmarkStart w:id="27" w:name="Xf611bb0edf20bf1066e7eca580412f3b8334a9d"/>
+      <w:r>
+        <w:rPr>
+          <w:bidi/>
+          <w:rtl/>
+        </w:rPr>
+        <w:t xml:space="preserve">يُعدّ هذا الفصل الركيزة النظرية التي تنبني عليها فصول الدراسة كلها. يستعرض المبحث الأول المفاهيم الأساسية للتسيير اللوجيستي وسلسلة التوريد ودور المستودعات، ثم ينتقل المبحث الثاني إلى تسيير المخزونات في القطاع العام والإطار التنظيمي الجزائري الذي يحكم عمليات التموين والمشتريات. ويتناول المبحث الثالث إدارة الشراء والدورة المستندية كحلقة وصل بين الاحتياجات الميدانية والتوريد الفعلي. ويُخصص المبحث الرابع لأدوات التقييم المحاسبي للمخزون (ABC، EOQ، ROP، CMUP، FIFO) مع أمثلة تطبيقية مستمدة من بيانات المشروع. وأخيراً، يستعرض المبحث الخامس تقييم </w:t>
+      </w:r>
+      <w:bookmarkStart w:id="28" w:name="_GoBack"/>
+      <w:bookmarkEnd w:id="28"/>
+      <w:r>
+        <w:rPr>
+          <w:bidi/>
+          <w:rtl/>
+        </w:rPr>
+        <w:t>الموردين ومفهوم الأنظمة المندمجة (ERP) كإطار مفاهيمي للحل الرقمي المقترح.</w:t>
       </w:r>
     </w:p>
     <w:p>
@@ -14377,9 +14459,9 @@
         <w:pStyle w:val="Heading2"/>
         <w:jc w:val="right"/>
       </w:pPr>
-      <w:bookmarkStart w:id="29" w:name="X948e1094553a531d6db6f4893473d29311c3135"/>
-      <w:bookmarkStart w:id="30" w:name="_Toc232568796"/>
-      <w:bookmarkEnd w:id="28"/>
+      <w:bookmarkStart w:id="29" w:name="_Toc232568796"/>
+      <w:bookmarkStart w:id="30" w:name="X948e1094553a531d6db6f4893473d29311c3135"/>
+      <w:bookmarkEnd w:id="27"/>
       <w:r>
         <w:rPr>
           <w:bidi/>
@@ -14388,7 +14470,7 @@
         </w:rPr>
         <w:t>المبحث الأول: المفاهيم الأساسية للتسيير اللوجيستي</w:t>
       </w:r>
-      <w:bookmarkEnd w:id="30"/>
+      <w:bookmarkEnd w:id="29"/>
     </w:p>
     <w:p>
       <w:pPr>
@@ -14396,8 +14478,8 @@
         <w:pStyle w:val="Heading3"/>
         <w:jc w:val="right"/>
       </w:pPr>
-      <w:bookmarkStart w:id="31" w:name="X6ae151a505b1cf0518b3edad6d35b811125f13b"/>
-      <w:bookmarkStart w:id="32" w:name="_Toc232568797"/>
+      <w:bookmarkStart w:id="31" w:name="_Toc232568797"/>
+      <w:bookmarkStart w:id="32" w:name="X6ae151a505b1cf0518b3edad6d35b811125f13b"/>
       <w:r>
         <w:rPr>
           <w:bidi/>
@@ -14405,43 +14487,43 @@
         </w:rPr>
         <w:t>1. مفهوم التسيير اللوجيستي (Logistics Management)</w:t>
       </w:r>
+      <w:bookmarkEnd w:id="31"/>
+    </w:p>
+    <w:p>
+      <w:pPr>
+        <w:bidi w:val="1"/>
+        <w:jc w:val="right"/>
+      </w:pPr>
+      <w:r>
+        <w:rPr>
+          <w:bidi/>
+          <w:rtl/>
+        </w:rPr>
+        <w:t>مرّ مفهوم اللوجستيك بتطور تاريخي كبير على مدى قرنين من الزمن؛ فبعد أن كان مصطلحاً عسكرياً بامتياز يُستخدم لتأمين الإمدادات للجيوش في ساحات القتال (كما تجلى في حروب نابليون والحرب العالمية الثانية)، انتقل إلى عالم الأعمال في منتصف القرن العشرين مع بزوغ فكر الإدارة العلمية وتزايد تعقيد سلاسل التوريد. يُعرِّف مجلس محترفي إدارة سلسلة التوريد (CSCMP) اللوجستيك اليوم بأنه: "ذلك الجزء من إدارة سلسلة التوريد الذي يُخطط ويُنفِّذ ويُراقب تدفق وتخزين السلع والخدمات والمعلومات المتعلقة بها، من نقطة المنشأ إلى نقطة الاستهلاك، بكفاءة وفاعلية، بهدف تلبية متطلبات الزبائن"</w:t>
+      </w:r>
+      <w:r>
+        <w:rPr>
+          <w:rStyle w:val="FootnoteReference"/>
+        </w:rPr>
+        <w:footnoteReference w:id="1"/>
+      </w:r>
+      <w:r>
+        <w:rPr>
+          <w:bidi/>
+          <w:rtl/>
+        </w:rPr>
+        <w:t>. وقد تفرعت عن هذا المفهوم عدة مدارس فكرية: المدرسة الكلاسيكية التي ركزت على خفض التكاليف المنفردة، والمدرسة الشاملة التي نظرت إلى النظام اللوجيستي ككل متكامل (Total Cost Concept)، والمدرسة الحديثة التي تدمج التكنولوجيا والذكاء الاصطناعي في صلب العملية اللوجيستية. في السياق الجزائري، تكتسب اللوجستيك العمومية خصوصية إضافية، إذ تتفاعل مع قيود تنظيمية وميزانياتية صارمة تستوجب حلولاً مبتكرة ومنخفضة التكلفة في آنٍ واحد.</w:t>
+      </w:r>
+    </w:p>
+    <w:p>
+      <w:pPr>
+        <w:bidi w:val="1"/>
+        <w:pStyle w:val="Heading3"/>
+        <w:jc w:val="right"/>
+      </w:pPr>
+      <w:bookmarkStart w:id="33" w:name="_Toc232568798"/>
+      <w:bookmarkStart w:id="34" w:name="X0cc40933b11ca9c345543fa46db131b050093cf"/>
       <w:bookmarkEnd w:id="32"/>
-    </w:p>
-    <w:p>
-      <w:pPr>
-        <w:bidi w:val="1"/>
-        <w:jc w:val="right"/>
-      </w:pPr>
-      <w:r>
-        <w:rPr>
-          <w:bidi/>
-          <w:rtl/>
-        </w:rPr>
-        <w:t>مرّ مفهوم اللوجستيك بتطور تاريخي كبير على مدى قرنين من الزمن؛ فبعد أن كان مصطلحاً عسكرياً بامتياز يُستخدم لتأمين الإمدادات للجيوش في ساحات القتال (كما تجلى في حروب نابليون والحرب العالمية الثانية)، انتقل إلى عالم الأعمال في منتصف القرن العشرين مع بزوغ فكر الإدارة العلمية وتزايد تعقيد سلاسل التوريد. يُعرِّف مجلس محترفي إدارة سلسلة التوريد (CSCMP) اللوجستيك اليوم بأنه: "ذلك الجزء من إدارة سلسلة التوريد الذي يُخطط ويُنفِّذ ويُراقب تدفق وتخزين السلع والخدمات والمعلومات المتعلقة بها، من نقطة المنشأ إلى نقطة الاستهلاك، بكفاءة وفاعلية، بهدف تلبية متطلبات الزبائن"</w:t>
-      </w:r>
-      <w:r>
-        <w:rPr>
-          <w:rStyle w:val="FootnoteReference"/>
-        </w:rPr>
-        <w:footnoteReference w:id="1"/>
-      </w:r>
-      <w:r>
-        <w:rPr>
-          <w:bidi/>
-          <w:rtl/>
-        </w:rPr>
-        <w:t>. وقد تفرعت عن هذا المفهوم عدة مدارس فكرية: المدرسة الكلاسيكية التي ركزت على خفض التكاليف المنفردة، والمدرسة الشاملة التي نظرت إلى النظام اللوجيستي ككل متكامل (Total Cost Concept)، والمدرسة الحديثة التي تدمج التكنولوجيا والذكاء الاصطناعي في صلب العملية اللوجيستية. في السياق الجزائري، تكتسب اللوجستيك العمومية خصوصية إضافية، إذ تتفاعل مع قيود تنظيمية وميزانياتية صارمة تستوجب حلولاً مبتكرة ومنخفضة التكلفة في آنٍ واحد.</w:t>
-      </w:r>
-    </w:p>
-    <w:p>
-      <w:pPr>
-        <w:bidi w:val="1"/>
-        <w:pStyle w:val="Heading3"/>
-        <w:jc w:val="right"/>
-      </w:pPr>
-      <w:bookmarkStart w:id="33" w:name="X0cc40933b11ca9c345543fa46db131b050093cf"/>
-      <w:bookmarkStart w:id="34" w:name="_Toc232568798"/>
-      <w:bookmarkEnd w:id="31"/>
       <w:r>
         <w:rPr>
           <w:bidi/>
@@ -14450,43 +14532,43 @@
         <w:lastRenderedPageBreak/>
         <w:t>2. إدارة سلسلة التوريد (Supply Chain Management - SCM)</w:t>
       </w:r>
+      <w:bookmarkEnd w:id="33"/>
+    </w:p>
+    <w:p>
+      <w:pPr>
+        <w:bidi w:val="1"/>
+        <w:jc w:val="right"/>
+      </w:pPr>
+      <w:r>
+        <w:rPr>
+          <w:bidi/>
+          <w:rtl/>
+        </w:rPr>
+        <w:t>إدارة سلسلة التوريد هي مفهوم أوسع وأشمل من اللوجستيك؛ فهي تشمل التنسيق المتكامل والتعاون الاستراتيجي بين جميع الأطراف الفاعلة في العملية الإنتاجية والتوزيعية، بدءاً من موردي المواد الأولية، مروراً بالمنتجين والموزعين وتجار الجملة والتجزئة، وصولاً إلى المستهلك النهائي. وفقاً لمنظمة "Global Supply Chain Forum" (GSCF)، تُعرَّف SCM بأنها: "تكامل العمليات التجارية الرئيسية عبر امتداد سلسلة التوريد، بهدف خلق قيمة للزبائن وأصحاب المصلحة". وقد طوّر الباحثان Cooper &amp; Lambert (2000) نموذج GSCF الذي يُحدد 8 عمليات رئيسية في SCM</w:t>
+      </w:r>
+      <w:r>
+        <w:rPr>
+          <w:rStyle w:val="FootnoteReference"/>
+        </w:rPr>
+        <w:footnoteReference w:id="2"/>
+      </w:r>
+      <w:r>
+        <w:rPr>
+          <w:bidi/>
+          <w:rtl/>
+        </w:rPr>
+        <w:t>: إدارة العلاقات مع الزبائن، إدارة خدمة الزبائن، إدارة الطلب، تنفيذ الطلبيات، إدارة تدفق الإنتاج، إدارة العلاقات مع الموردين، تطوير المنتجات وتسويقها، وإدارة المرتجعات. في سياق الدراسة الحالية، تتبنى مديرية التربية ثلاثة من هذه العمليات بصورة رئيسية: إدارة الطلب (تقدير احتياجات المؤسسات التعليمية)، تنفيذ الطلبيات (دورة الشراء)، وإدارة العلاقات مع الموردين (تقييم الموردين واختيارهم). يهدف تكامل هذه العمليات إلى تحسين قيمة السلسلة ككل عبر تقليل الهدر، وتحسين سرعة الاستجابة للاحتياجات الطارئة، وتقليل التكاليف الإجمالية للتزويد والتخزين.</w:t>
+      </w:r>
+    </w:p>
+    <w:p>
+      <w:pPr>
+        <w:bidi w:val="1"/>
+        <w:pStyle w:val="Heading3"/>
+        <w:jc w:val="right"/>
+      </w:pPr>
+      <w:bookmarkStart w:id="35" w:name="_Toc232568799"/>
+      <w:bookmarkStart w:id="36" w:name="X964df9414599ec61ed7b3115d8f9a749868681b"/>
       <w:bookmarkEnd w:id="34"/>
-    </w:p>
-    <w:p>
-      <w:pPr>
-        <w:bidi w:val="1"/>
-        <w:jc w:val="right"/>
-      </w:pPr>
-      <w:r>
-        <w:rPr>
-          <w:bidi/>
-          <w:rtl/>
-        </w:rPr>
-        <w:t>إدارة سلسلة التوريد هي مفهوم أوسع وأشمل من اللوجستيك؛ فهي تشمل التنسيق المتكامل والتعاون الاستراتيجي بين جميع الأطراف الفاعلة في العملية الإنتاجية والتوزيعية، بدءاً من موردي المواد الأولية، مروراً بالمنتجين والموزعين وتجار الجملة والتجزئة، وصولاً إلى المستهلك النهائي. وفقاً لمنظمة "Global Supply Chain Forum" (GSCF)، تُعرَّف SCM بأنها: "تكامل العمليات التجارية الرئيسية عبر امتداد سلسلة التوريد، بهدف خلق قيمة للزبائن وأصحاب المصلحة". وقد طوّر الباحثان Cooper &amp; Lambert (2000) نموذج GSCF الذي يُحدد 8 عمليات رئيسية في SCM</w:t>
-      </w:r>
-      <w:r>
-        <w:rPr>
-          <w:rStyle w:val="FootnoteReference"/>
-        </w:rPr>
-        <w:footnoteReference w:id="2"/>
-      </w:r>
-      <w:r>
-        <w:rPr>
-          <w:bidi/>
-          <w:rtl/>
-        </w:rPr>
-        <w:t>: إدارة العلاقات مع الزبائن، إدارة خدمة الزبائن، إدارة الطلب، تنفيذ الطلبيات، إدارة تدفق الإنتاج، إدارة العلاقات مع الموردين، تطوير المنتجات وتسويقها، وإدارة المرتجعات. في سياق الدراسة الحالية، تتبنى مديرية التربية ثلاثة من هذه العمليات بصورة رئيسية: إدارة الطلب (تقدير احتياجات المؤسسات التعليمية)، تنفيذ الطلبيات (دورة الشراء)، وإدارة العلاقات مع الموردين (تقييم الموردين واختيارهم). يهدف تكامل هذه العمليات إلى تحسين قيمة السلسلة ككل عبر تقليل الهدر، وتحسين سرعة الاستجابة للاحتياجات الطارئة، وتقليل التكاليف الإجمالية للتزويد والتخزين.</w:t>
-      </w:r>
-    </w:p>
-    <w:p>
-      <w:pPr>
-        <w:bidi w:val="1"/>
-        <w:pStyle w:val="Heading3"/>
-        <w:jc w:val="right"/>
-      </w:pPr>
-      <w:bookmarkStart w:id="35" w:name="X964df9414599ec61ed7b3115d8f9a749868681b"/>
-      <w:bookmarkStart w:id="36" w:name="_Toc232568799"/>
-      <w:bookmarkEnd w:id="33"/>
       <w:r>
         <w:rPr>
           <w:bidi/>
@@ -14494,7 +14576,7 @@
         </w:rPr>
         <w:t>3. دور المستودعات وتصنيفها</w:t>
       </w:r>
-      <w:bookmarkEnd w:id="36"/>
+      <w:bookmarkEnd w:id="35"/>
     </w:p>
     <w:p>
       <w:pPr>
@@ -14648,8 +14730,8 @@
         <w:jc w:val="right"/>
       </w:pPr>
       <w:r>
-        <w:pict w14:anchorId="274EBBAF">
-          <v:rect id="_x0000_i1420" style="width:0;height:1.5pt" o:hralign="right" o:hrstd="t" o:hr="t"/>
+        <w:pict w14:anchorId="17361E23">
+          <v:rect id="_x0000_i1026" style="width:0;height:1.5pt" o:hralign="right" o:hrstd="t" o:hr="t"/>
         </w:pict>
       </w:r>
     </w:p>
@@ -14659,10 +14741,10 @@
         <w:pStyle w:val="Heading2"/>
         <w:jc w:val="right"/>
       </w:pPr>
-      <w:bookmarkStart w:id="37" w:name="Xb98e67e6d1739a4d79f518326bb9bac61b25523"/>
-      <w:bookmarkStart w:id="38" w:name="_Toc232568800"/>
-      <w:bookmarkEnd w:id="29"/>
-      <w:bookmarkEnd w:id="35"/>
+      <w:bookmarkStart w:id="37" w:name="_Toc232568800"/>
+      <w:bookmarkStart w:id="38" w:name="Xb98e67e6d1739a4d79f518326bb9bac61b25523"/>
+      <w:bookmarkEnd w:id="30"/>
+      <w:bookmarkEnd w:id="36"/>
       <w:r>
         <w:rPr>
           <w:bidi/>
@@ -14671,7 +14753,7 @@
         </w:rPr>
         <w:t>المبحث الثاني: تسيير المخزونات في القطاع العام</w:t>
       </w:r>
-      <w:bookmarkEnd w:id="38"/>
+      <w:bookmarkEnd w:id="37"/>
     </w:p>
     <w:p>
       <w:pPr>
@@ -14679,8 +14761,8 @@
         <w:pStyle w:val="Heading3"/>
         <w:jc w:val="right"/>
       </w:pPr>
-      <w:bookmarkStart w:id="39" w:name="X74e9138fa2e70dfaae98d362d5c20d245ce46e1"/>
-      <w:bookmarkStart w:id="40" w:name="_Toc232568801"/>
+      <w:bookmarkStart w:id="39" w:name="_Toc232568801"/>
+      <w:bookmarkStart w:id="40" w:name="X74e9138fa2e70dfaae98d362d5c20d245ce46e1"/>
       <w:r>
         <w:rPr>
           <w:bidi/>
@@ -14688,7 +14770,7 @@
         </w:rPr>
         <w:t>أولاً: تعريف المخزون وأهميته في المؤسسة العمومية</w:t>
       </w:r>
-      <w:bookmarkEnd w:id="40"/>
+      <w:bookmarkEnd w:id="39"/>
     </w:p>
     <w:p>
       <w:pPr>
@@ -14764,9 +14846,9 @@
         <w:pStyle w:val="Heading3"/>
         <w:jc w:val="right"/>
       </w:pPr>
-      <w:bookmarkStart w:id="41" w:name="ثانياً-أهمية-تسيير-المخزون"/>
-      <w:bookmarkStart w:id="42" w:name="_Toc232568802"/>
-      <w:bookmarkEnd w:id="39"/>
+      <w:bookmarkStart w:id="41" w:name="_Toc232568802"/>
+      <w:bookmarkStart w:id="42" w:name="ثانياً-أهمية-تسيير-المخزون"/>
+      <w:bookmarkEnd w:id="40"/>
       <w:r>
         <w:rPr>
           <w:bidi/>
@@ -14774,7 +14856,7 @@
         </w:rPr>
         <w:t>ثانياً: أهمية تسيير المخزون</w:t>
       </w:r>
-      <w:bookmarkEnd w:id="42"/>
+      <w:bookmarkEnd w:id="41"/>
     </w:p>
     <w:p>
       <w:pPr>
@@ -14904,9 +14986,9 @@
         <w:pStyle w:val="Heading3"/>
         <w:jc w:val="right"/>
       </w:pPr>
-      <w:bookmarkStart w:id="43" w:name="ثالثاً-الإطار-التنظيمي-الجزائري"/>
-      <w:bookmarkStart w:id="44" w:name="_Toc232568803"/>
-      <w:bookmarkEnd w:id="41"/>
+      <w:bookmarkStart w:id="43" w:name="_Toc232568803"/>
+      <w:bookmarkStart w:id="44" w:name="ثالثاً-الإطار-التنظيمي-الجزائري"/>
+      <w:bookmarkEnd w:id="42"/>
       <w:r>
         <w:rPr>
           <w:bidi/>
@@ -14914,7 +14996,7 @@
         </w:rPr>
         <w:t>ثالثاً: الإطار التنظيمي الجزائري</w:t>
       </w:r>
-      <w:bookmarkEnd w:id="44"/>
+      <w:bookmarkEnd w:id="43"/>
     </w:p>
     <w:p>
       <w:pPr>
@@ -15122,8 +15204,8 @@
         <w:jc w:val="right"/>
       </w:pPr>
       <w:r>
-        <w:pict w14:anchorId="1282E9D7">
-          <v:rect id="_x0000_i1421" style="width:0;height:1.5pt" o:hralign="right" o:hrstd="t" o:hr="t"/>
+        <w:pict w14:anchorId="122ED0A0">
+          <v:rect id="_x0000_i1027" style="width:0;height:1.5pt" o:hralign="right" o:hrstd="t" o:hr="t"/>
         </w:pict>
       </w:r>
     </w:p>
@@ -15133,10 +15215,10 @@
         <w:pStyle w:val="Heading2"/>
         <w:jc w:val="right"/>
       </w:pPr>
-      <w:bookmarkStart w:id="45" w:name="X0b33a1787aeef4eb8491627c0fcc2828f98e578"/>
-      <w:bookmarkStart w:id="46" w:name="_Toc232568804"/>
-      <w:bookmarkEnd w:id="37"/>
-      <w:bookmarkEnd w:id="43"/>
+      <w:bookmarkStart w:id="45" w:name="_Toc232568804"/>
+      <w:bookmarkStart w:id="46" w:name="X0b33a1787aeef4eb8491627c0fcc2828f98e578"/>
+      <w:bookmarkEnd w:id="38"/>
+      <w:bookmarkEnd w:id="44"/>
       <w:r>
         <w:rPr>
           <w:bidi/>
@@ -15146,7 +15228,7 @@
         <w:lastRenderedPageBreak/>
         <w:t>المبحث الثالث: إدارة الشراء والدورة المستندية</w:t>
       </w:r>
-      <w:bookmarkEnd w:id="46"/>
+      <w:bookmarkEnd w:id="45"/>
     </w:p>
     <w:p>
       <w:pPr>
@@ -15154,8 +15236,8 @@
         <w:pStyle w:val="Heading3"/>
         <w:jc w:val="right"/>
       </w:pPr>
-      <w:bookmarkStart w:id="47" w:name="X840ddb239f67ba41aed2c5ab494f49871bfa89d"/>
-      <w:bookmarkStart w:id="48" w:name="_Toc232568805"/>
+      <w:bookmarkStart w:id="47" w:name="_Toc232568805"/>
+      <w:bookmarkStart w:id="48" w:name="X840ddb239f67ba41aed2c5ab494f49871bfa89d"/>
       <w:r>
         <w:rPr>
           <w:bidi/>
@@ -15163,7 +15245,7 @@
         </w:rPr>
         <w:t>1. وظيفة الشراء (Procurement Function)</w:t>
       </w:r>
-      <w:bookmarkEnd w:id="48"/>
+      <w:bookmarkEnd w:id="47"/>
     </w:p>
     <w:p>
       <w:pPr>
@@ -15277,9 +15359,9 @@
         <w:pStyle w:val="Heading3"/>
         <w:jc w:val="right"/>
       </w:pPr>
-      <w:bookmarkStart w:id="49" w:name="X06d4b6dd68c173adbe5393b74c94cc066e0865d"/>
-      <w:bookmarkStart w:id="50" w:name="_Toc232568806"/>
-      <w:bookmarkEnd w:id="47"/>
+      <w:bookmarkStart w:id="49" w:name="_Toc232568806"/>
+      <w:bookmarkStart w:id="50" w:name="X06d4b6dd68c173adbe5393b74c94cc066e0865d"/>
+      <w:bookmarkEnd w:id="48"/>
       <w:r>
         <w:rPr>
           <w:bidi/>
@@ -15287,7 +15369,7 @@
         </w:rPr>
         <w:t>2. الدورة المستندية في الإدارة العمومية</w:t>
       </w:r>
-      <w:bookmarkEnd w:id="50"/>
+      <w:bookmarkEnd w:id="49"/>
     </w:p>
     <w:p>
       <w:pPr>
@@ -15471,9 +15553,9 @@
         <w:pStyle w:val="Heading3"/>
         <w:jc w:val="right"/>
       </w:pPr>
-      <w:bookmarkStart w:id="51" w:name="X9159b7f41042f3a404490eab795f27fd591040b"/>
-      <w:bookmarkStart w:id="52" w:name="_Toc232568807"/>
-      <w:bookmarkEnd w:id="49"/>
+      <w:bookmarkStart w:id="51" w:name="_Toc232568807"/>
+      <w:bookmarkStart w:id="52" w:name="X9159b7f41042f3a404490eab795f27fd591040b"/>
+      <w:bookmarkEnd w:id="50"/>
       <w:r>
         <w:rPr>
           <w:bidi/>
@@ -15481,16 +15563,16 @@
         </w:rPr>
         <w:t>3. التكامل بين الشراء والتخزين</w:t>
       </w:r>
+      <w:bookmarkEnd w:id="51"/>
+    </w:p>
+    <w:p>
+      <w:pPr>
+        <w:bidi w:val="1"/>
+        <w:jc w:val="right"/>
+      </w:pPr>
+      <w:bookmarkStart w:id="53" w:name="Xe1510e847e96308c371f0f90de707c60606e70e"/>
+      <w:bookmarkEnd w:id="46"/>
       <w:bookmarkEnd w:id="52"/>
-    </w:p>
-    <w:p>
-      <w:pPr>
-        <w:bidi w:val="1"/>
-        <w:jc w:val="right"/>
-      </w:pPr>
-      <w:bookmarkStart w:id="53" w:name="Xe1510e847e96308c371f0f90de707c60606e70e"/>
-      <w:bookmarkEnd w:id="45"/>
-      <w:bookmarkEnd w:id="51"/>
       <w:r>
         <w:rPr>
           <w:bidi/>
@@ -15505,8 +15587,8 @@
         <w:pStyle w:val="Heading2"/>
         <w:jc w:val="right"/>
       </w:pPr>
-      <w:bookmarkStart w:id="54" w:name="Xe71e4b4fd93dee69f233a0223a30763675d81f6"/>
-      <w:bookmarkStart w:id="55" w:name="_Toc232568808"/>
+      <w:bookmarkStart w:id="54" w:name="_Toc232568808"/>
+      <w:bookmarkStart w:id="55" w:name="Xe71e4b4fd93dee69f233a0223a30763675d81f6"/>
       <w:bookmarkEnd w:id="53"/>
       <w:r>
         <w:rPr>
@@ -15516,7 +15598,7 @@
         </w:rPr>
         <w:t>المبحث الرابع: أدوات التقييم المحاسبي للمخزون</w:t>
       </w:r>
-      <w:bookmarkEnd w:id="55"/>
+      <w:bookmarkEnd w:id="54"/>
     </w:p>
     <w:p>
       <w:pPr>
@@ -15524,8 +15606,8 @@
         <w:pStyle w:val="Heading3"/>
         <w:jc w:val="right"/>
       </w:pPr>
-      <w:bookmarkStart w:id="56" w:name="أولاً-تحليل-abc"/>
-      <w:bookmarkStart w:id="57" w:name="_Toc232568809"/>
+      <w:bookmarkStart w:id="56" w:name="_Toc232568809"/>
+      <w:bookmarkStart w:id="57" w:name="أولاً-تحليل-abc"/>
       <w:r>
         <w:rPr>
           <w:bidi/>
@@ -15533,7 +15615,7 @@
         </w:rPr>
         <w:t>أولاً: تحليل ABC</w:t>
       </w:r>
-      <w:bookmarkEnd w:id="57"/>
+      <w:bookmarkEnd w:id="56"/>
     </w:p>
     <w:p>
       <w:pPr>
@@ -15663,7 +15745,7 @@
         </w:rPr>
       </w:pPr>
       <w:bookmarkStart w:id="58" w:name="Xd131264382e8914601b54547c029e958735139c"/>
-      <w:bookmarkEnd w:id="56"/>
+      <w:bookmarkEnd w:id="57"/>
       <w:r>
         <w:rPr>
           <w:rtl/>
@@ -17070,8 +17152,8 @@
         <w:pStyle w:val="Heading3"/>
         <w:jc w:val="right"/>
       </w:pPr>
-      <w:bookmarkStart w:id="60" w:name="ثالثاً-نقطة-إعادة-الطلب-ومخزون-الأمان"/>
-      <w:bookmarkStart w:id="61" w:name="_Toc232568811"/>
+      <w:bookmarkStart w:id="60" w:name="_Toc232568811"/>
+      <w:bookmarkStart w:id="61" w:name="ثالثاً-نقطة-إعادة-الطلب-ومخزون-الأمان"/>
       <w:bookmarkEnd w:id="58"/>
       <w:r>
         <w:rPr>
@@ -17080,7 +17162,7 @@
         </w:rPr>
         <w:t>ثالثاً: نقطة إعادة الطلب ومخزون الأمان</w:t>
       </w:r>
-      <w:bookmarkEnd w:id="61"/>
+      <w:bookmarkEnd w:id="60"/>
     </w:p>
     <w:p>
       <w:pPr>
@@ -17262,7 +17344,7 @@
         <w:t>ROP = (6.184 × 2) + 200 = 212.4 وحدة</w:t>
       </w:r>
       <w:bookmarkStart w:id="62" w:name="رابعاً-طرق-تقييم-المخزون"/>
-      <w:bookmarkEnd w:id="60"/>
+      <w:bookmarkEnd w:id="61"/>
       <w:r>
         <w:rPr>
           <w:rtl/>
@@ -17544,8 +17626,8 @@
         <w:jc w:val="right"/>
       </w:pPr>
       <w:r>
-        <w:pict w14:anchorId="43519899">
-          <v:rect id="_x0000_i1422" style="width:0;height:1.5pt" o:hralign="right" o:hrstd="t" o:hr="t"/>
+        <w:pict w14:anchorId="29064E89">
+          <v:rect id="_x0000_i1028" style="width:0;height:1.5pt" o:hralign="right" o:hrstd="t" o:hr="t"/>
         </w:pict>
       </w:r>
     </w:p>
@@ -17555,9 +17637,9 @@
         <w:pStyle w:val="Heading2"/>
         <w:jc w:val="right"/>
       </w:pPr>
-      <w:bookmarkStart w:id="64" w:name="المبحث-الخامس-تقييم-الموردين-ومفهوم-erp"/>
-      <w:bookmarkStart w:id="65" w:name="_Toc232568813"/>
-      <w:bookmarkEnd w:id="54"/>
+      <w:bookmarkStart w:id="64" w:name="_Toc232568813"/>
+      <w:bookmarkStart w:id="65" w:name="المبحث-الخامس-تقييم-الموردين-ومفهوم-erp"/>
+      <w:bookmarkEnd w:id="55"/>
       <w:bookmarkEnd w:id="62"/>
       <w:r>
         <w:rPr>
@@ -17567,7 +17649,7 @@
         </w:rPr>
         <w:t>المبحث الخامس: تقييم الموردين ومفهوم ERP</w:t>
       </w:r>
-      <w:bookmarkEnd w:id="65"/>
+      <w:bookmarkEnd w:id="64"/>
     </w:p>
     <w:p>
       <w:pPr>
@@ -17575,8 +17657,8 @@
         <w:pStyle w:val="Heading3"/>
         <w:jc w:val="right"/>
       </w:pPr>
-      <w:bookmarkStart w:id="66" w:name="X476ec0218982b17ebd973c1b7c9efe04a5c5317"/>
-      <w:bookmarkStart w:id="67" w:name="_Toc232568814"/>
+      <w:bookmarkStart w:id="66" w:name="_Toc232568814"/>
+      <w:bookmarkStart w:id="67" w:name="X476ec0218982b17ebd973c1b7c9efe04a5c5317"/>
       <w:r>
         <w:rPr>
           <w:bidi/>
@@ -17584,7 +17666,7 @@
         </w:rPr>
         <w:t>1. تقييم الموردين (Supplier Evaluation)</w:t>
       </w:r>
-      <w:bookmarkEnd w:id="67"/>
+      <w:bookmarkEnd w:id="66"/>
     </w:p>
     <w:p>
       <w:pPr>
@@ -17724,9 +17806,9 @@
         <w:pStyle w:val="Heading3"/>
         <w:jc w:val="right"/>
       </w:pPr>
-      <w:bookmarkStart w:id="68" w:name="Xfea16ccd3a6176ee0da1da8067dfc8c5dfb9193"/>
-      <w:bookmarkStart w:id="69" w:name="_Toc232568815"/>
-      <w:bookmarkEnd w:id="66"/>
+      <w:bookmarkStart w:id="68" w:name="_Toc232568815"/>
+      <w:bookmarkStart w:id="69" w:name="Xfea16ccd3a6176ee0da1da8067dfc8c5dfb9193"/>
+      <w:bookmarkEnd w:id="67"/>
       <w:r>
         <w:rPr>
           <w:bidi/>
@@ -17735,7 +17817,7 @@
         <w:lastRenderedPageBreak/>
         <w:t>2. مفهوم الأنظمة المندمجة (ERP - Enterprise Resource Planning)</w:t>
       </w:r>
-      <w:bookmarkEnd w:id="69"/>
+      <w:bookmarkEnd w:id="68"/>
     </w:p>
     <w:p>
       <w:pPr>
@@ -17902,8 +17984,8 @@
         <w:jc w:val="right"/>
       </w:pPr>
       <w:r>
-        <w:pict w14:anchorId="2C5807F7">
-          <v:rect id="_x0000_i1423" style="width:0;height:1.5pt" o:hralign="right" o:hrstd="t" o:hr="t"/>
+        <w:pict w14:anchorId="71FFB163">
+          <v:rect id="_x0000_i1029" style="width:0;height:1.5pt" o:hralign="right" o:hrstd="t" o:hr="t"/>
         </w:pict>
       </w:r>
     </w:p>
@@ -17945,11 +18027,11 @@
         <w:pageBreakBefore/>
         <w:jc w:val="right"/>
       </w:pPr>
-      <w:bookmarkStart w:id="70" w:name="Xfd09630af81a064bb869de4cc3333972b7b71f8"/>
-      <w:bookmarkStart w:id="71" w:name="_Toc232568816"/>
+      <w:bookmarkStart w:id="70" w:name="_Toc232568816"/>
+      <w:bookmarkStart w:id="71" w:name="Xfd09630af81a064bb869de4cc3333972b7b71f8"/>
       <w:bookmarkEnd w:id="26"/>
-      <w:bookmarkEnd w:id="64"/>
-      <w:bookmarkEnd w:id="68"/>
+      <w:bookmarkEnd w:id="65"/>
+      <w:bookmarkEnd w:id="69"/>
       <w:r>
         <w:rPr>
           <w:bidi/>
@@ -17959,7 +18041,7 @@
         <w:lastRenderedPageBreak/>
         <w:t>الفصل الثاني: الإطار العملي والتشخيص الميداني</w:t>
       </w:r>
-      <w:bookmarkEnd w:id="71"/>
+      <w:bookmarkEnd w:id="70"/>
     </w:p>
     <w:p>
       <w:pPr>
@@ -18000,8 +18082,8 @@
           <w:szCs w:val="24"/>
         </w:rPr>
       </w:pPr>
-      <w:bookmarkStart w:id="73" w:name="Xd96d29689cd7b7c28a53e63cb30434c1b4e42ae"/>
-      <w:bookmarkStart w:id="74" w:name="_Toc232568817"/>
+      <w:bookmarkStart w:id="73" w:name="_Toc232568817"/>
+      <w:bookmarkStart w:id="74" w:name="Xd96d29689cd7b7c28a53e63cb30434c1b4e42ae"/>
       <w:bookmarkEnd w:id="72"/>
       <w:r>
         <w:rPr>
@@ -18013,7 +18095,7 @@
         </w:rPr>
         <w:t>المبحث الأول: النماذج الرياضية للتسيير الكمي للمخزون</w:t>
       </w:r>
-      <w:bookmarkEnd w:id="74"/>
+      <w:bookmarkEnd w:id="73"/>
     </w:p>
     <w:p>
       <w:pPr>
@@ -18044,8 +18126,8 @@
           <w:szCs w:val="22"/>
         </w:rPr>
       </w:pPr>
-      <w:bookmarkStart w:id="75" w:name="Xfd010b0e6ec43a71a31832c4aa57c4a1ebd67ff"/>
-      <w:bookmarkStart w:id="76" w:name="_Toc232568818"/>
+      <w:bookmarkStart w:id="75" w:name="_Toc232568818"/>
+      <w:bookmarkStart w:id="76" w:name="Xfd010b0e6ec43a71a31832c4aa57c4a1ebd67ff"/>
       <w:r>
         <w:rPr>
           <w:bidi/>
@@ -18055,7 +18137,7 @@
         </w:rPr>
         <w:t>المطلب الأول: نموذج ويلسون للكمية الاقتصادية للطلب</w:t>
       </w:r>
-      <w:bookmarkEnd w:id="76"/>
+      <w:bookmarkEnd w:id="75"/>
     </w:p>
     <w:p>
       <w:pPr>
@@ -20013,8 +20095,8 @@
         <w:jc w:val="right"/>
       </w:pPr>
       <w:r>
-        <w:pict w14:anchorId="4836552A">
-          <v:rect id="_x0000_i1424" style="width:0;height:1.5pt" o:hralign="right" o:hrstd="t" o:hr="t"/>
+        <w:pict w14:anchorId="79451813">
+          <v:rect id="_x0000_i1030" style="width:0;height:1.5pt" o:hralign="right" o:hrstd="t" o:hr="t"/>
         </w:pict>
       </w:r>
     </w:p>
@@ -20024,9 +20106,9 @@
         <w:pStyle w:val="Heading3"/>
         <w:jc w:val="right"/>
       </w:pPr>
-      <w:bookmarkStart w:id="82" w:name="X52ea18e5737fce8615e1c3ca4723e15512be477"/>
-      <w:bookmarkStart w:id="83" w:name="_Toc232568819"/>
-      <w:bookmarkEnd w:id="75"/>
+      <w:bookmarkStart w:id="82" w:name="_Toc232568819"/>
+      <w:bookmarkStart w:id="83" w:name="X52ea18e5737fce8615e1c3ca4723e15512be477"/>
+      <w:bookmarkEnd w:id="76"/>
       <w:bookmarkEnd w:id="81"/>
       <w:r>
         <w:rPr>
@@ -20035,7 +20117,7 @@
         </w:rPr>
         <w:t>المطلب الثاني: تحليل ABC وتطبيقه على مخزون المديرية</w:t>
       </w:r>
-      <w:bookmarkEnd w:id="83"/>
+      <w:bookmarkEnd w:id="82"/>
     </w:p>
     <w:p>
       <w:pPr>
@@ -20886,8 +20968,8 @@
         <w:jc w:val="right"/>
       </w:pPr>
       <w:r>
-        <w:pict w14:anchorId="676DFC34">
-          <v:rect id="_x0000_i1425" style="width:0;height:1.5pt" o:hralign="right" o:hrstd="t" o:hr="t"/>
+        <w:pict w14:anchorId="6AB98D81">
+          <v:rect id="_x0000_i1031" style="width:0;height:1.5pt" o:hralign="right" o:hrstd="t" o:hr="t"/>
         </w:pict>
       </w:r>
     </w:p>
@@ -20897,9 +20979,9 @@
         <w:pStyle w:val="Heading3"/>
         <w:jc w:val="right"/>
       </w:pPr>
-      <w:bookmarkStart w:id="85" w:name="X3d546febf7430a2ea3250247e57315bf530ac8e"/>
-      <w:bookmarkStart w:id="86" w:name="_Toc232568820"/>
-      <w:bookmarkEnd w:id="82"/>
+      <w:bookmarkStart w:id="85" w:name="_Toc232568820"/>
+      <w:bookmarkStart w:id="86" w:name="X3d546febf7430a2ea3250247e57315bf530ac8e"/>
+      <w:bookmarkEnd w:id="83"/>
       <w:r>
         <w:rPr>
           <w:bidi/>
@@ -20907,7 +20989,7 @@
         </w:rPr>
         <w:t>المطلب الثالث: تحليل XYZ ومصفوفة القرار ABC-XYZ</w:t>
       </w:r>
-      <w:bookmarkEnd w:id="86"/>
+      <w:bookmarkEnd w:id="85"/>
     </w:p>
     <w:p>
       <w:pPr>
@@ -21646,8 +21728,8 @@
         <w:jc w:val="right"/>
       </w:pPr>
       <w:r>
-        <w:pict w14:anchorId="01714FD4">
-          <v:rect id="_x0000_i1426" style="width:0;height:1.5pt" o:hralign="right" o:hrstd="t" o:hr="t"/>
+        <w:pict w14:anchorId="6B7690C3">
+          <v:rect id="_x0000_i1032" style="width:0;height:1.5pt" o:hralign="right" o:hrstd="t" o:hr="t"/>
         </w:pict>
       </w:r>
     </w:p>
@@ -21687,8 +21769,8 @@
         </w:rPr>
       </w:pPr>
       <w:bookmarkStart w:id="88" w:name="المبحث-الثاني-الإطار-الجغرافي-والمؤسسي"/>
-      <w:bookmarkEnd w:id="73"/>
-      <w:bookmarkEnd w:id="85"/>
+      <w:bookmarkEnd w:id="74"/>
+      <w:bookmarkEnd w:id="86"/>
       <w:r>
         <w:rPr>
           <w:rtl/>
@@ -21733,8 +21815,8 @@
         <w:pStyle w:val="Heading3"/>
         <w:jc w:val="right"/>
       </w:pPr>
-      <w:bookmarkStart w:id="90" w:name="Xa214dcfe6b381ea1f68aa2f47f12b1f1067a3e5"/>
-      <w:bookmarkStart w:id="91" w:name="_Toc232568822"/>
+      <w:bookmarkStart w:id="90" w:name="_Toc232568822"/>
+      <w:bookmarkStart w:id="91" w:name="Xa214dcfe6b381ea1f68aa2f47f12b1f1067a3e5"/>
       <w:r>
         <w:rPr>
           <w:bidi/>
@@ -21742,7 +21824,7 @@
         </w:rPr>
         <w:t>المطلب الأول: ولاية البيض — الإطار الجغرافي والأثر اللوجيستي</w:t>
       </w:r>
-      <w:bookmarkEnd w:id="91"/>
+      <w:bookmarkEnd w:id="90"/>
     </w:p>
     <w:p>
       <w:pPr>
@@ -21855,8 +21937,8 @@
         <w:jc w:val="right"/>
       </w:pPr>
       <w:r>
-        <w:pict w14:anchorId="4F588753">
-          <v:rect id="_x0000_i1428" style="width:0;height:1.5pt" o:hralign="right" o:hrstd="t" o:hr="t"/>
+        <w:pict w14:anchorId="12628970">
+          <v:rect id="_x0000_i1034" style="width:0;height:1.5pt" o:hralign="right" o:hrstd="t" o:hr="t"/>
         </w:pict>
       </w:r>
     </w:p>
@@ -21866,9 +21948,9 @@
         <w:pStyle w:val="Heading3"/>
         <w:jc w:val="right"/>
       </w:pPr>
-      <w:bookmarkStart w:id="94" w:name="X3f57fa00f89ba85d9588878684ea58fb7f040ef"/>
-      <w:bookmarkStart w:id="95" w:name="_Toc232568823"/>
-      <w:bookmarkEnd w:id="90"/>
+      <w:bookmarkStart w:id="94" w:name="_Toc232568823"/>
+      <w:bookmarkStart w:id="95" w:name="X3f57fa00f89ba85d9588878684ea58fb7f040ef"/>
+      <w:bookmarkEnd w:id="91"/>
       <w:bookmarkEnd w:id="93"/>
       <w:r>
         <w:rPr>
@@ -21877,7 +21959,7 @@
         </w:rPr>
         <w:t>المطلب الثاني: تقديم مديرية التربية لولاية البيض</w:t>
       </w:r>
-      <w:bookmarkEnd w:id="95"/>
+      <w:bookmarkEnd w:id="94"/>
     </w:p>
     <w:p>
       <w:pPr>
@@ -22091,7 +22173,7 @@
         </w:rPr>
       </w:pPr>
       <w:bookmarkStart w:id="98" w:name="Xe95b080e745ed60cca3f74edd213d00166ee89f"/>
-      <w:bookmarkEnd w:id="94"/>
+      <w:bookmarkEnd w:id="95"/>
       <w:bookmarkEnd w:id="97"/>
       <w:r>
         <w:rPr>
@@ -22418,8 +22500,8 @@
         <w:jc w:val="right"/>
       </w:pPr>
       <w:r>
-        <w:pict w14:anchorId="15B02296">
-          <v:rect id="_x0000_i1430" style="width:0;height:1.5pt" o:hralign="right" o:hrstd="t" o:hr="t"/>
+        <w:pict w14:anchorId="3D123EA4">
+          <v:rect id="_x0000_i1036" style="width:0;height:1.5pt" o:hralign="right" o:hrstd="t" o:hr="t"/>
         </w:pict>
       </w:r>
     </w:p>
@@ -22429,8 +22511,8 @@
         <w:pStyle w:val="Heading2"/>
         <w:jc w:val="right"/>
       </w:pPr>
-      <w:bookmarkStart w:id="102" w:name="X45c22bf0528f185d6de6f59ddda56ed6c67ca33"/>
-      <w:bookmarkStart w:id="103" w:name="_Toc232568825"/>
+      <w:bookmarkStart w:id="102" w:name="_Toc232568825"/>
+      <w:bookmarkStart w:id="103" w:name="X45c22bf0528f185d6de6f59ddda56ed6c67ca33"/>
       <w:bookmarkEnd w:id="88"/>
       <w:bookmarkEnd w:id="98"/>
       <w:bookmarkEnd w:id="101"/>
@@ -22442,7 +22524,7 @@
         </w:rPr>
         <w:t>المبحث الثالث: التشخيص الميداني وتحليل الفجوات</w:t>
       </w:r>
-      <w:bookmarkEnd w:id="103"/>
+      <w:bookmarkEnd w:id="102"/>
     </w:p>
     <w:p>
       <w:pPr>
@@ -24041,8 +24123,8 @@
         <w:jc w:val="right"/>
       </w:pPr>
       <w:r>
-        <w:pict w14:anchorId="212B8F77">
-          <v:rect id="_x0000_i1431" style="width:0;height:1.5pt" o:hralign="right" o:hrstd="t" o:hr="t"/>
+        <w:pict w14:anchorId="7FF9FFC7">
+          <v:rect id="_x0000_i1037" style="width:0;height:1.5pt" o:hralign="right" o:hrstd="t" o:hr="t"/>
         </w:pict>
       </w:r>
     </w:p>
@@ -24052,8 +24134,8 @@
         <w:pStyle w:val="Heading3"/>
         <w:jc w:val="right"/>
       </w:pPr>
-      <w:bookmarkStart w:id="107" w:name="Xbcf6a8e9e411a31af33d34924801dd6a54fe6f9"/>
-      <w:bookmarkStart w:id="108" w:name="_Toc232568827"/>
+      <w:bookmarkStart w:id="107" w:name="_Toc232568827"/>
+      <w:bookmarkStart w:id="108" w:name="Xbcf6a8e9e411a31af33d34924801dd6a54fe6f9"/>
       <w:bookmarkEnd w:id="104"/>
       <w:r>
         <w:rPr>
@@ -24062,7 +24144,7 @@
         </w:rPr>
         <w:t>المطلب الثاني: مصفوفة تحليل الفجوات — جدول رقم 05</w:t>
       </w:r>
-      <w:bookmarkEnd w:id="108"/>
+      <w:bookmarkEnd w:id="107"/>
     </w:p>
     <w:p>
       <w:pPr>
@@ -24744,8 +24826,8 @@
         <w:jc w:val="right"/>
       </w:pPr>
       <w:r>
-        <w:pict w14:anchorId="1F2B79D6">
-          <v:rect id="_x0000_i1432" style="width:0;height:1.5pt" o:hralign="right" o:hrstd="t" o:hr="t"/>
+        <w:pict w14:anchorId="34D66C35">
+          <v:rect id="_x0000_i1038" style="width:0;height:1.5pt" o:hralign="right" o:hrstd="t" o:hr="t"/>
         </w:pict>
       </w:r>
     </w:p>
@@ -24755,9 +24837,9 @@
         <w:pStyle w:val="Heading3"/>
         <w:jc w:val="right"/>
       </w:pPr>
-      <w:bookmarkStart w:id="110" w:name="Xf44bb1cbb1fbf8d3786fd5660f5e5e712de4010"/>
-      <w:bookmarkStart w:id="111" w:name="_Toc232568828"/>
-      <w:bookmarkEnd w:id="107"/>
+      <w:bookmarkStart w:id="110" w:name="_Toc232568828"/>
+      <w:bookmarkStart w:id="111" w:name="Xf44bb1cbb1fbf8d3786fd5660f5e5e712de4010"/>
+      <w:bookmarkEnd w:id="108"/>
       <w:r>
         <w:rPr>
           <w:bidi/>
@@ -24766,7 +24848,7 @@
         <w:lastRenderedPageBreak/>
         <w:t>المطلب الثالث: تصنيف ABC-XYZ كأداة لتوجيه القرار</w:t>
       </w:r>
-      <w:bookmarkEnd w:id="111"/>
+      <w:bookmarkEnd w:id="110"/>
     </w:p>
     <w:p>
       <w:pPr>
@@ -25073,11 +25155,11 @@
         <w:pageBreakBefore/>
         <w:jc w:val="right"/>
       </w:pPr>
-      <w:bookmarkStart w:id="114" w:name="X425548a444476a4a4f36373e56e022eba81766a"/>
-      <w:bookmarkStart w:id="115" w:name="_Toc232568829"/>
-      <w:bookmarkEnd w:id="70"/>
-      <w:bookmarkEnd w:id="102"/>
-      <w:bookmarkEnd w:id="110"/>
+      <w:bookmarkStart w:id="114" w:name="_Toc232568829"/>
+      <w:bookmarkStart w:id="115" w:name="X425548a444476a4a4f36373e56e022eba81766a"/>
+      <w:bookmarkEnd w:id="71"/>
+      <w:bookmarkEnd w:id="103"/>
+      <w:bookmarkEnd w:id="111"/>
       <w:bookmarkEnd w:id="113"/>
       <w:r>
         <w:rPr>
@@ -25088,7 +25170,7 @@
         <w:lastRenderedPageBreak/>
         <w:t>الفصل الثالث: تصميم وإنجاز نظام دعم القرار</w:t>
       </w:r>
-      <w:bookmarkEnd w:id="115"/>
+      <w:bookmarkEnd w:id="114"/>
     </w:p>
     <w:p>
       <w:pPr>
@@ -25125,8 +25207,8 @@
         <w:pStyle w:val="Heading2"/>
         <w:jc w:val="right"/>
       </w:pPr>
-      <w:bookmarkStart w:id="117" w:name="Xa676c4e96c951c611f1581966c5cca345efded0"/>
-      <w:bookmarkStart w:id="118" w:name="_Toc232568830"/>
+      <w:bookmarkStart w:id="117" w:name="_Toc232568830"/>
+      <w:bookmarkStart w:id="118" w:name="Xa676c4e96c951c611f1581966c5cca345efded0"/>
       <w:bookmarkEnd w:id="116"/>
       <w:r>
         <w:rPr>
@@ -25136,7 +25218,7 @@
         </w:rPr>
         <w:t>المبحث الأول: الهندسة المتكاملة لنظام دعم القرار</w:t>
       </w:r>
-      <w:bookmarkEnd w:id="118"/>
+      <w:bookmarkEnd w:id="117"/>
     </w:p>
     <w:p>
       <w:pPr>
@@ -25157,8 +25239,8 @@
         <w:pStyle w:val="Heading3"/>
         <w:jc w:val="right"/>
       </w:pPr>
-      <w:bookmarkStart w:id="119" w:name="X50eda9fd44e4b29eb77e7e9ee21c27f44b1ac92"/>
-      <w:bookmarkStart w:id="120" w:name="_Toc232568831"/>
+      <w:bookmarkStart w:id="119" w:name="_Toc232568831"/>
+      <w:bookmarkStart w:id="120" w:name="X50eda9fd44e4b29eb77e7e9ee21c27f44b1ac92"/>
       <w:r>
         <w:rPr>
           <w:bidi/>
@@ -25166,7 +25248,7 @@
         </w:rPr>
         <w:t>المطلب الأول: فلسفة التصميم والتحول من الأنظمة أحادية الطبقة</w:t>
       </w:r>
-      <w:bookmarkEnd w:id="120"/>
+      <w:bookmarkEnd w:id="119"/>
     </w:p>
     <w:p>
       <w:pPr>
@@ -25320,8 +25402,8 @@
         <w:jc w:val="right"/>
       </w:pPr>
       <w:r>
-        <w:pict w14:anchorId="7977F7B8">
-          <v:rect id="_x0000_i1434" style="width:0;height:1.5pt" o:hralign="right" o:hrstd="t" o:hr="t"/>
+        <w:pict w14:anchorId="619E2604">
+          <v:rect id="_x0000_i1040" style="width:0;height:1.5pt" o:hralign="right" o:hrstd="t" o:hr="t"/>
         </w:pict>
       </w:r>
     </w:p>
@@ -25331,9 +25413,9 @@
         <w:pStyle w:val="Heading3"/>
         <w:jc w:val="right"/>
       </w:pPr>
-      <w:bookmarkStart w:id="121" w:name="Xd01ba28ceb43c2aafcfa279441271082bf35e79"/>
-      <w:bookmarkStart w:id="122" w:name="_Toc232568832"/>
-      <w:bookmarkEnd w:id="119"/>
+      <w:bookmarkStart w:id="121" w:name="_Toc232568832"/>
+      <w:bookmarkStart w:id="122" w:name="Xd01ba28ceb43c2aafcfa279441271082bf35e79"/>
+      <w:bookmarkEnd w:id="120"/>
       <w:r>
         <w:rPr>
           <w:bidi/>
@@ -25341,7 +25423,7 @@
         </w:rPr>
         <w:t>المطلب الثاني: مبدأ التكامل الوظيفي في بيئة Excel/VBA</w:t>
       </w:r>
-      <w:bookmarkEnd w:id="122"/>
+      <w:bookmarkEnd w:id="121"/>
     </w:p>
     <w:p>
       <w:pPr>
@@ -25476,7 +25558,7 @@
         </w:rPr>
       </w:pPr>
       <w:bookmarkStart w:id="123" w:name="Xb3cd0739dd5a83bd5baa46bdafa673a7ae7a4aa"/>
-      <w:bookmarkEnd w:id="121"/>
+      <w:bookmarkEnd w:id="122"/>
       <w:r>
         <w:rPr>
           <w:rtl/>
@@ -25601,8 +25683,8 @@
         <w:jc w:val="right"/>
       </w:pPr>
       <w:r>
-        <w:pict w14:anchorId="35051852">
-          <v:rect id="_x0000_i1436" style="width:0;height:1.5pt" o:hralign="right" o:hrstd="t" o:hr="t"/>
+        <w:pict w14:anchorId="317452D4">
+          <v:rect id="_x0000_i1042" style="width:0;height:1.5pt" o:hralign="right" o:hrstd="t" o:hr="t"/>
         </w:pict>
       </w:r>
     </w:p>
@@ -25612,9 +25694,9 @@
         <w:pStyle w:val="Heading2"/>
         <w:jc w:val="right"/>
       </w:pPr>
-      <w:bookmarkStart w:id="125" w:name="Xfb30997312ec99a0ff92bdd7dc592fd161b34eb"/>
-      <w:bookmarkStart w:id="126" w:name="_Toc232568834"/>
-      <w:bookmarkEnd w:id="117"/>
+      <w:bookmarkStart w:id="125" w:name="_Toc232568834"/>
+      <w:bookmarkStart w:id="126" w:name="Xfb30997312ec99a0ff92bdd7dc592fd161b34eb"/>
+      <w:bookmarkEnd w:id="118"/>
       <w:bookmarkEnd w:id="123"/>
       <w:r>
         <w:rPr>
@@ -25624,7 +25706,7 @@
         </w:rPr>
         <w:t>المبحث الثاني: هندسة تدفق البيانات وآليات الرقابة</w:t>
       </w:r>
-      <w:bookmarkEnd w:id="126"/>
+      <w:bookmarkEnd w:id="125"/>
     </w:p>
     <w:p>
       <w:pPr>
@@ -25645,8 +25727,8 @@
         <w:pStyle w:val="Heading3"/>
         <w:jc w:val="right"/>
       </w:pPr>
-      <w:bookmarkStart w:id="127" w:name="Xe1412b27e8b4694678434ce8a4f8b6f261fecdf"/>
-      <w:bookmarkStart w:id="128" w:name="_Toc232568835"/>
+      <w:bookmarkStart w:id="127" w:name="_Toc232568835"/>
+      <w:bookmarkStart w:id="128" w:name="Xe1412b27e8b4694678434ce8a4f8b6f261fecdf"/>
       <w:r>
         <w:rPr>
           <w:bidi/>
@@ -25654,7 +25736,7 @@
         </w:rPr>
         <w:t>المطلب الأول: سلسلة الحراسة السداسية (Six-Guard Data Chain)</w:t>
       </w:r>
-      <w:bookmarkEnd w:id="128"/>
+      <w:bookmarkEnd w:id="127"/>
     </w:p>
     <w:p>
       <w:pPr>
@@ -25838,8 +25920,8 @@
         <w:jc w:val="right"/>
       </w:pPr>
       <w:r>
-        <w:pict w14:anchorId="1F82BEC8">
-          <v:rect id="_x0000_i1437" style="width:0;height:1.5pt" o:hralign="right" o:hrstd="t" o:hr="t"/>
+        <w:pict w14:anchorId="569A6E8C">
+          <v:rect id="_x0000_i1043" style="width:0;height:1.5pt" o:hralign="right" o:hrstd="t" o:hr="t"/>
         </w:pict>
       </w:r>
     </w:p>
@@ -25849,9 +25931,9 @@
         <w:pStyle w:val="Heading3"/>
         <w:jc w:val="right"/>
       </w:pPr>
-      <w:bookmarkStart w:id="129" w:name="X790f7c97394d912e1af56ef75b8396a4139580d"/>
-      <w:bookmarkStart w:id="130" w:name="_Toc232568836"/>
-      <w:bookmarkEnd w:id="127"/>
+      <w:bookmarkStart w:id="129" w:name="_Toc232568836"/>
+      <w:bookmarkStart w:id="130" w:name="X790f7c97394d912e1af56ef75b8396a4139580d"/>
+      <w:bookmarkEnd w:id="128"/>
       <w:r>
         <w:rPr>
           <w:bidi/>
@@ -25859,7 +25941,7 @@
         </w:rPr>
         <w:t>المطلب الثاني: السجل الرقمي (Digital Ledger) كمرجع للمراجعة</w:t>
       </w:r>
-      <w:bookmarkEnd w:id="130"/>
+      <w:bookmarkEnd w:id="129"/>
     </w:p>
     <w:p>
       <w:pPr>
@@ -25969,7 +26051,7 @@
         </w:rPr>
       </w:pPr>
       <w:bookmarkStart w:id="131" w:name="X444a26c814394dcd7d1e55a55a610cb16854269"/>
-      <w:bookmarkEnd w:id="129"/>
+      <w:bookmarkEnd w:id="130"/>
       <w:r>
         <w:rPr>
           <w:rtl/>
@@ -26147,8 +26229,8 @@
         <w:jc w:val="right"/>
       </w:pPr>
       <w:r>
-        <w:pict w14:anchorId="59F29B61">
-          <v:rect id="_x0000_i1439" style="width:0;height:1.5pt" o:hralign="right" o:hrstd="t" o:hr="t"/>
+        <w:pict w14:anchorId="13C6FF84">
+          <v:rect id="_x0000_i1045" style="width:0;height:1.5pt" o:hralign="right" o:hrstd="t" o:hr="t"/>
         </w:pict>
       </w:r>
     </w:p>
@@ -26158,9 +26240,9 @@
         <w:pStyle w:val="Heading2"/>
         <w:jc w:val="right"/>
       </w:pPr>
-      <w:bookmarkStart w:id="133" w:name="Xffbf1b46ecde0efcc86730acfd968fe379c5668"/>
-      <w:bookmarkStart w:id="134" w:name="_Toc232568838"/>
-      <w:bookmarkEnd w:id="125"/>
+      <w:bookmarkStart w:id="133" w:name="_Toc232568838"/>
+      <w:bookmarkStart w:id="134" w:name="Xffbf1b46ecde0efcc86730acfd968fe379c5668"/>
+      <w:bookmarkEnd w:id="126"/>
       <w:bookmarkEnd w:id="131"/>
       <w:r>
         <w:rPr>
@@ -26170,7 +26252,7 @@
         </w:rPr>
         <w:t>المبحث الثالث: محرك الذكاء المحلي (VBA Engine)</w:t>
       </w:r>
-      <w:bookmarkEnd w:id="134"/>
+      <w:bookmarkEnd w:id="133"/>
     </w:p>
     <w:p>
       <w:pPr>
@@ -26191,8 +26273,8 @@
         <w:pStyle w:val="Heading3"/>
         <w:jc w:val="right"/>
       </w:pPr>
-      <w:bookmarkStart w:id="135" w:name="X2b5683333895272df7448c3123c2d6911fb19dd"/>
-      <w:bookmarkStart w:id="136" w:name="_Toc232568839"/>
+      <w:bookmarkStart w:id="135" w:name="_Toc232568839"/>
+      <w:bookmarkStart w:id="136" w:name="X2b5683333895272df7448c3123c2d6911fb19dd"/>
       <w:r>
         <w:rPr>
           <w:bidi/>
@@ -26200,7 +26282,7 @@
         </w:rPr>
         <w:t>المطلب الأول: الهندسة البرمجية وبنية الوحدات النمطية</w:t>
       </w:r>
-      <w:bookmarkEnd w:id="136"/>
+      <w:bookmarkEnd w:id="135"/>
     </w:p>
     <w:p>
       <w:pPr>
@@ -26463,8 +26545,8 @@
         <w:jc w:val="right"/>
       </w:pPr>
       <w:r>
-        <w:pict w14:anchorId="4B3FAFAE">
-          <v:rect id="_x0000_i1440" style="width:0;height:1.5pt" o:hralign="right" o:hrstd="t" o:hr="t"/>
+        <w:pict w14:anchorId="54452F5D">
+          <v:rect id="_x0000_i1046" style="width:0;height:1.5pt" o:hralign="right" o:hrstd="t" o:hr="t"/>
         </w:pict>
       </w:r>
     </w:p>
@@ -26474,9 +26556,9 @@
         <w:pStyle w:val="Heading3"/>
         <w:jc w:val="right"/>
       </w:pPr>
-      <w:bookmarkStart w:id="137" w:name="X9b60cd1fa0cbe72f7f71191beb861644b5c9805"/>
-      <w:bookmarkStart w:id="138" w:name="_Toc232568840"/>
-      <w:bookmarkEnd w:id="135"/>
+      <w:bookmarkStart w:id="137" w:name="_Toc232568840"/>
+      <w:bookmarkStart w:id="138" w:name="X9b60cd1fa0cbe72f7f71191beb861644b5c9805"/>
+      <w:bookmarkEnd w:id="136"/>
       <w:r>
         <w:rPr>
           <w:bidi/>
@@ -26484,7 +26566,7 @@
         </w:rPr>
         <w:t>المطلب الثاني: خوارزميات التموين والتحسين الكمي</w:t>
       </w:r>
-      <w:bookmarkEnd w:id="138"/>
+      <w:bookmarkEnd w:id="137"/>
     </w:p>
     <w:p>
       <w:pPr>
@@ -26841,8 +26923,8 @@
         <w:jc w:val="right"/>
       </w:pPr>
       <w:r>
-        <w:pict w14:anchorId="65437F13">
-          <v:rect id="_x0000_i1441" style="width:0;height:1.5pt" o:hralign="right" o:hrstd="t" o:hr="t"/>
+        <w:pict w14:anchorId="7D36D667">
+          <v:rect id="_x0000_i1047" style="width:0;height:1.5pt" o:hralign="right" o:hrstd="t" o:hr="t"/>
         </w:pict>
       </w:r>
     </w:p>
@@ -26852,9 +26934,9 @@
         <w:pStyle w:val="Heading3"/>
         <w:jc w:val="right"/>
       </w:pPr>
-      <w:bookmarkStart w:id="141" w:name="Xdb72e8c31238e5bc8bb35e9197d335bc848251d"/>
-      <w:bookmarkStart w:id="142" w:name="_Toc232568841"/>
-      <w:bookmarkEnd w:id="137"/>
+      <w:bookmarkStart w:id="141" w:name="_Toc232568841"/>
+      <w:bookmarkStart w:id="142" w:name="Xdb72e8c31238e5bc8bb35e9197d335bc848251d"/>
+      <w:bookmarkEnd w:id="138"/>
       <w:bookmarkEnd w:id="140"/>
       <w:r>
         <w:rPr>
@@ -26864,7 +26946,7 @@
         <w:lastRenderedPageBreak/>
         <w:t>المطلب الثالث: إدارة التكاليف والنزاهة المالية</w:t>
       </w:r>
-      <w:bookmarkEnd w:id="142"/>
+      <w:bookmarkEnd w:id="141"/>
     </w:p>
     <w:p>
       <w:pPr>
@@ -27241,8 +27323,8 @@
         <w:jc w:val="right"/>
       </w:pPr>
       <w:r>
-        <w:pict w14:anchorId="696EE613">
-          <v:rect id="_x0000_i1442" style="width:0;height:1.5pt" o:hralign="right" o:hrstd="t" o:hr="t"/>
+        <w:pict w14:anchorId="3BCC2288">
+          <v:rect id="_x0000_i1048" style="width:0;height:1.5pt" o:hralign="right" o:hrstd="t" o:hr="t"/>
         </w:pict>
       </w:r>
     </w:p>
@@ -27252,9 +27334,9 @@
         <w:pStyle w:val="Heading3"/>
         <w:jc w:val="right"/>
       </w:pPr>
-      <w:bookmarkStart w:id="143" w:name="Xb42ed883f4a4d77c904837a9483548fc91a7185"/>
-      <w:bookmarkStart w:id="144" w:name="_Toc232568842"/>
-      <w:bookmarkEnd w:id="141"/>
+      <w:bookmarkStart w:id="143" w:name="_Toc232568842"/>
+      <w:bookmarkStart w:id="144" w:name="Xb42ed883f4a4d77c904837a9483548fc91a7185"/>
+      <w:bookmarkEnd w:id="142"/>
       <w:r>
         <w:rPr>
           <w:bidi/>
@@ -27262,7 +27344,7 @@
         </w:rPr>
         <w:t>المطلب الرابع: محاكاة مبادئ ACID لسلامة البيانات</w:t>
       </w:r>
-      <w:bookmarkEnd w:id="144"/>
+      <w:bookmarkEnd w:id="143"/>
     </w:p>
     <w:p>
       <w:pPr>
@@ -27414,7 +27496,7 @@
         </w:rPr>
       </w:pPr>
       <w:bookmarkStart w:id="145" w:name="X1c2ea8d86c4f45404ae3647941d3499fe8305c9"/>
-      <w:bookmarkEnd w:id="143"/>
+      <w:bookmarkEnd w:id="144"/>
       <w:r>
         <w:rPr>
           <w:rtl/>
@@ -27585,8 +27667,8 @@
         <w:jc w:val="right"/>
       </w:pPr>
       <w:r>
-        <w:pict w14:anchorId="085FD139">
-          <v:rect id="_x0000_i1444" style="width:0;height:1.5pt" o:hralign="right" o:hrstd="t" o:hr="t"/>
+        <w:pict w14:anchorId="6AC169C4">
+          <v:rect id="_x0000_i1050" style="width:0;height:1.5pt" o:hralign="right" o:hrstd="t" o:hr="t"/>
         </w:pict>
       </w:r>
     </w:p>
@@ -27596,9 +27678,9 @@
         <w:pStyle w:val="Heading2"/>
         <w:jc w:val="right"/>
       </w:pPr>
-      <w:bookmarkStart w:id="147" w:name="Xc6e18aa2af3011a1373a5d4857df80b39c98584"/>
-      <w:bookmarkStart w:id="148" w:name="_Toc232568844"/>
-      <w:bookmarkEnd w:id="133"/>
+      <w:bookmarkStart w:id="147" w:name="_Toc232568844"/>
+      <w:bookmarkStart w:id="148" w:name="Xc6e18aa2af3011a1373a5d4857df80b39c98584"/>
+      <w:bookmarkEnd w:id="134"/>
       <w:bookmarkEnd w:id="145"/>
       <w:r>
         <w:rPr>
@@ -27608,7 +27690,7 @@
         </w:rPr>
         <w:t>المبحث الرابع: هندسة واجهة المستخدم والأصالة الابتكارية</w:t>
       </w:r>
-      <w:bookmarkEnd w:id="148"/>
+      <w:bookmarkEnd w:id="147"/>
     </w:p>
     <w:p>
       <w:pPr>
@@ -27629,8 +27711,8 @@
         <w:pStyle w:val="Heading3"/>
         <w:jc w:val="right"/>
       </w:pPr>
-      <w:bookmarkStart w:id="149" w:name="Xdcbed4a529f139898c76cbbdb64bb8c1a119adb"/>
-      <w:bookmarkStart w:id="150" w:name="_Toc232568845"/>
+      <w:bookmarkStart w:id="149" w:name="_Toc232568845"/>
+      <w:bookmarkStart w:id="150" w:name="Xdcbed4a529f139898c76cbbdb64bb8c1a119adb"/>
       <w:r>
         <w:rPr>
           <w:bidi/>
@@ -27638,7 +27720,7 @@
         </w:rPr>
         <w:t>المطلب الأول: الهندسة البنيوية لأوراق العمل (Sheet Architecture)</w:t>
       </w:r>
-      <w:bookmarkEnd w:id="150"/>
+      <w:bookmarkEnd w:id="149"/>
     </w:p>
     <w:p>
       <w:pPr>
@@ -27892,8 +27974,8 @@
         <w:jc w:val="right"/>
       </w:pPr>
       <w:r>
-        <w:pict w14:anchorId="5EEA2483">
-          <v:rect id="_x0000_i1445" style="width:0;height:1.5pt" o:hralign="right" o:hrstd="t" o:hr="t"/>
+        <w:pict w14:anchorId="19036397">
+          <v:rect id="_x0000_i1051" style="width:0;height:1.5pt" o:hralign="right" o:hrstd="t" o:hr="t"/>
         </w:pict>
       </w:r>
     </w:p>
@@ -27903,9 +27985,9 @@
         <w:pStyle w:val="Heading3"/>
         <w:jc w:val="right"/>
       </w:pPr>
-      <w:bookmarkStart w:id="151" w:name="Xc3e868391841f7562f5d5b2b3c4438a8091e2eb"/>
-      <w:bookmarkStart w:id="152" w:name="_Toc232568846"/>
-      <w:bookmarkEnd w:id="149"/>
+      <w:bookmarkStart w:id="151" w:name="_Toc232568846"/>
+      <w:bookmarkStart w:id="152" w:name="Xc3e868391841f7562f5d5b2b3c4438a8091e2eb"/>
+      <w:bookmarkEnd w:id="150"/>
       <w:r>
         <w:rPr>
           <w:bidi/>
@@ -27913,7 +27995,7 @@
         </w:rPr>
         <w:t>المطلب الثاني: نظام التنبيه اللوني والذكاء البصري</w:t>
       </w:r>
-      <w:bookmarkEnd w:id="152"/>
+      <w:bookmarkEnd w:id="151"/>
     </w:p>
     <w:p>
       <w:pPr>
@@ -28015,8 +28097,8 @@
         <w:jc w:val="right"/>
       </w:pPr>
       <w:r>
-        <w:pict w14:anchorId="5787A741">
-          <v:rect id="_x0000_i1446" style="width:0;height:1.5pt" o:hralign="right" o:hrstd="t" o:hr="t"/>
+        <w:pict w14:anchorId="32105419">
+          <v:rect id="_x0000_i1052" style="width:0;height:1.5pt" o:hralign="right" o:hrstd="t" o:hr="t"/>
         </w:pict>
       </w:r>
     </w:p>
@@ -28026,9 +28108,9 @@
         <w:pStyle w:val="Heading3"/>
         <w:jc w:val="right"/>
       </w:pPr>
-      <w:bookmarkStart w:id="153" w:name="X197816f32b7b7ef5c9c4cb4d12a6ba19ec348d5"/>
-      <w:bookmarkStart w:id="154" w:name="_Toc232568847"/>
-      <w:bookmarkEnd w:id="151"/>
+      <w:bookmarkStart w:id="153" w:name="_Toc232568847"/>
+      <w:bookmarkStart w:id="154" w:name="X197816f32b7b7ef5c9c4cb4d12a6ba19ec348d5"/>
+      <w:bookmarkEnd w:id="152"/>
       <w:r>
         <w:rPr>
           <w:bidi/>
@@ -28036,7 +28118,7 @@
         </w:rPr>
         <w:t>المطلب الثالث: لوحة القيادة والتحليل الاستراتيجي (Analytics Dashboard)</w:t>
       </w:r>
-      <w:bookmarkEnd w:id="154"/>
+      <w:bookmarkEnd w:id="153"/>
     </w:p>
     <w:p>
       <w:pPr>
@@ -28138,8 +28220,8 @@
         <w:jc w:val="right"/>
       </w:pPr>
       <w:r>
-        <w:pict w14:anchorId="0A285783">
-          <v:rect id="_x0000_i1447" style="width:0;height:1.5pt" o:hralign="right" o:hrstd="t" o:hr="t"/>
+        <w:pict w14:anchorId="37771E6C">
+          <v:rect id="_x0000_i1053" style="width:0;height:1.5pt" o:hralign="right" o:hrstd="t" o:hr="t"/>
         </w:pict>
       </w:r>
     </w:p>
@@ -28149,9 +28231,9 @@
         <w:pStyle w:val="Heading3"/>
         <w:jc w:val="right"/>
       </w:pPr>
-      <w:bookmarkStart w:id="155" w:name="X43f602add9b7058ce87741ac0c8f7096d34eb8c"/>
-      <w:bookmarkStart w:id="156" w:name="_Toc232568848"/>
-      <w:bookmarkEnd w:id="153"/>
+      <w:bookmarkStart w:id="155" w:name="_Toc232568848"/>
+      <w:bookmarkStart w:id="156" w:name="X43f602add9b7058ce87741ac0c8f7096d34eb8c"/>
+      <w:bookmarkEnd w:id="154"/>
       <w:r>
         <w:rPr>
           <w:bidi/>
@@ -28160,7 +28242,7 @@
         <w:lastRenderedPageBreak/>
         <w:t>المطلب الرابع: المعايير الجمالية والابتكارات الوظيفية</w:t>
       </w:r>
-      <w:bookmarkEnd w:id="156"/>
+      <w:bookmarkEnd w:id="155"/>
     </w:p>
     <w:p>
       <w:pPr>
@@ -28412,11 +28494,11 @@
         <w:pageBreakBefore/>
         <w:jc w:val="right"/>
       </w:pPr>
-      <w:bookmarkStart w:id="159" w:name="الفصل-الرابع-التجريب-والتحقق-من-النتائج"/>
-      <w:bookmarkStart w:id="160" w:name="_Toc232568849"/>
-      <w:bookmarkEnd w:id="114"/>
-      <w:bookmarkEnd w:id="147"/>
-      <w:bookmarkEnd w:id="155"/>
+      <w:bookmarkStart w:id="159" w:name="_Toc232568849"/>
+      <w:bookmarkStart w:id="160" w:name="الفصل-الرابع-التجريب-والتحقق-من-النتائج"/>
+      <w:bookmarkEnd w:id="115"/>
+      <w:bookmarkEnd w:id="148"/>
+      <w:bookmarkEnd w:id="156"/>
       <w:bookmarkEnd w:id="158"/>
       <w:r>
         <w:rPr>
@@ -28427,7 +28509,7 @@
         <w:lastRenderedPageBreak/>
         <w:t>الفصل الرابع: التجريب والتحقق من النتائج</w:t>
       </w:r>
-      <w:bookmarkEnd w:id="160"/>
+      <w:bookmarkEnd w:id="159"/>
     </w:p>
     <w:p>
       <w:pPr>
@@ -28435,8 +28517,8 @@
         <w:pStyle w:val="Heading2"/>
         <w:jc w:val="right"/>
       </w:pPr>
-      <w:bookmarkStart w:id="161" w:name="X772d01764d2cdf10730319436c2b610a5dde5fe"/>
-      <w:bookmarkStart w:id="162" w:name="_Toc232568850"/>
+      <w:bookmarkStart w:id="161" w:name="_Toc232568850"/>
+      <w:bookmarkStart w:id="162" w:name="X772d01764d2cdf10730319436c2b610a5dde5fe"/>
       <w:r>
         <w:rPr>
           <w:bidi/>
@@ -28445,7 +28527,7 @@
         </w:rPr>
         <w:t>المبحث الأول: نتائج التجريب والتحقق من صحة الفرضيات</w:t>
       </w:r>
-      <w:bookmarkEnd w:id="162"/>
+      <w:bookmarkEnd w:id="161"/>
     </w:p>
     <w:p>
       <w:pPr>
@@ -28453,8 +28535,8 @@
         <w:pStyle w:val="Heading3"/>
         <w:jc w:val="right"/>
       </w:pPr>
-      <w:bookmarkStart w:id="163" w:name="X49c36b57d4ff3911c0526cfcdcf059aea80a406"/>
-      <w:bookmarkStart w:id="164" w:name="_Toc232568851"/>
+      <w:bookmarkStart w:id="163" w:name="_Toc232568851"/>
+      <w:bookmarkStart w:id="164" w:name="X49c36b57d4ff3911c0526cfcdcf059aea80a406"/>
       <w:r>
         <w:rPr>
           <w:bidi/>
@@ -28462,7 +28544,7 @@
         </w:rPr>
         <w:t>1. مقارنة مؤشرات الأداء قبل وبعد التطبيق</w:t>
       </w:r>
-      <w:bookmarkEnd w:id="164"/>
+      <w:bookmarkEnd w:id="163"/>
     </w:p>
     <w:p>
       <w:pPr>
@@ -29435,9 +29517,9 @@
         <w:pStyle w:val="Heading3"/>
         <w:jc w:val="right"/>
       </w:pPr>
-      <w:bookmarkStart w:id="166" w:name="Xb8e42ca6d3322078508f93d6992976adf29d2ca"/>
-      <w:bookmarkStart w:id="167" w:name="_Toc232568852"/>
-      <w:bookmarkEnd w:id="163"/>
+      <w:bookmarkStart w:id="166" w:name="_Toc232568852"/>
+      <w:bookmarkStart w:id="167" w:name="Xb8e42ca6d3322078508f93d6992976adf29d2ca"/>
+      <w:bookmarkEnd w:id="164"/>
       <w:r>
         <w:rPr>
           <w:bidi/>
@@ -29446,7 +29528,7 @@
         <w:lastRenderedPageBreak/>
         <w:t>2. التحقق من صحة فرضيات البحث</w:t>
       </w:r>
-      <w:bookmarkEnd w:id="167"/>
+      <w:bookmarkEnd w:id="166"/>
     </w:p>
     <w:p>
       <w:pPr>
@@ -29932,9 +30014,9 @@
         <w:pStyle w:val="Heading3"/>
         <w:jc w:val="right"/>
       </w:pPr>
-      <w:bookmarkStart w:id="169" w:name="X8a93358eecaeb60469823d090d898b75c2e77ac"/>
-      <w:bookmarkStart w:id="170" w:name="_Toc232568853"/>
-      <w:bookmarkEnd w:id="166"/>
+      <w:bookmarkStart w:id="169" w:name="_Toc232568853"/>
+      <w:bookmarkStart w:id="170" w:name="X8a93358eecaeb60469823d090d898b75c2e77ac"/>
+      <w:bookmarkEnd w:id="167"/>
       <w:r>
         <w:rPr>
           <w:bidi/>
@@ -29942,7 +30024,7 @@
         </w:rPr>
         <w:t>3. التحليل التفصيلي لمؤشرات الأداء</w:t>
       </w:r>
-      <w:bookmarkEnd w:id="170"/>
+      <w:bookmarkEnd w:id="169"/>
     </w:p>
     <w:p>
       <w:pPr>
@@ -30073,9 +30155,9 @@
         <w:pStyle w:val="Heading3"/>
         <w:jc w:val="right"/>
       </w:pPr>
-      <w:bookmarkStart w:id="171" w:name="Xaf9730f8f208447975e9de648bd3cee193ed3c6"/>
-      <w:bookmarkStart w:id="172" w:name="_Toc232568854"/>
-      <w:bookmarkEnd w:id="169"/>
+      <w:bookmarkStart w:id="171" w:name="_Toc232568854"/>
+      <w:bookmarkStart w:id="172" w:name="Xaf9730f8f208447975e9de648bd3cee193ed3c6"/>
+      <w:bookmarkEnd w:id="170"/>
       <w:r>
         <w:rPr>
           <w:bidi/>
@@ -30083,7 +30165,7 @@
         </w:rPr>
         <w:t>4. التقييم الإحصائي لمؤشرات الأداء</w:t>
       </w:r>
-      <w:bookmarkEnd w:id="172"/>
+      <w:bookmarkEnd w:id="171"/>
     </w:p>
     <w:p>
       <w:pPr>
@@ -31229,9 +31311,9 @@
         <w:pStyle w:val="Heading3"/>
         <w:jc w:val="right"/>
       </w:pPr>
-      <w:bookmarkStart w:id="174" w:name="X5d883ae01169ee0c2874075dd2ba2df14168639"/>
-      <w:bookmarkStart w:id="175" w:name="_Toc232568855"/>
-      <w:bookmarkEnd w:id="171"/>
+      <w:bookmarkStart w:id="174" w:name="_Toc232568855"/>
+      <w:bookmarkStart w:id="175" w:name="X5d883ae01169ee0c2874075dd2ba2df14168639"/>
+      <w:bookmarkEnd w:id="172"/>
       <w:r>
         <w:rPr>
           <w:bidi/>
@@ -31239,19 +31321,50 @@
         </w:rPr>
         <w:t>5. التحقق التجريبي والمصداقية</w:t>
       </w:r>
+      <w:bookmarkEnd w:id="174"/>
+    </w:p>
+    <w:p>
+      <w:pPr>
+        <w:bidi w:val="1"/>
+        <w:jc w:val="right"/>
+      </w:pPr>
+      <w:r>
+        <w:rPr>
+          <w:bidi/>
+          <w:rtl/>
+        </w:rPr>
+        <w:t>لم تكن هذه النتائج مجرد تقديرات نظرية، بل جاءت نتاج تطبيق تجريبي صارم. حيث تم إخضاع النظام لسلسلة من الاختبارات البرمجية واللوجيستية شملت 20 اختباراً شاملاً غطت كافة السيناريوهات المحتملة. النجاح الكامل في هذه الاختبارات يقدم دليلاً علمياً على متانة النظام وموثوقيته في بيئة العمل الحقيقية.</w:t>
+      </w:r>
+    </w:p>
+    <w:p>
+      <w:pPr>
+        <w:bidi w:val="1"/>
+        <w:pStyle w:val="Heading3"/>
+        <w:jc w:val="right"/>
+      </w:pPr>
+      <w:bookmarkStart w:id="176" w:name="_Toc232568856"/>
+      <w:bookmarkStart w:id="177" w:name="Xfde45ab085d7ad252281c0dccada5f1ef76526b"/>
       <w:bookmarkEnd w:id="175"/>
-    </w:p>
-    <w:p>
-      <w:pPr>
-        <w:bidi w:val="1"/>
-        <w:jc w:val="right"/>
-      </w:pPr>
-      <w:r>
-        <w:rPr>
-          <w:bidi/>
-          <w:rtl/>
-        </w:rPr>
-        <w:t>لم تكن هذه النتائج مجرد تقديرات نظرية، بل جاءت نتاج تطبيق تجريبي صارم. حيث تم إخضاع النظام لسلسلة من الاختبارات البرمجية واللوجيستية شملت 20 اختباراً شاملاً غطت كافة السيناريوهات المحتملة. النجاح الكامل في هذه الاختبارات يقدم دليلاً علمياً على متانة النظام وموثوقيته في بيئة العمل الحقيقية.</w:t>
+      <w:r>
+        <w:rPr>
+          <w:bidi/>
+          <w:rtl/>
+        </w:rPr>
+        <w:t>6. أمن البيانات والسلامة (Data Security &amp; Integrity)</w:t>
+      </w:r>
+      <w:bookmarkEnd w:id="176"/>
+    </w:p>
+    <w:p>
+      <w:pPr>
+        <w:bidi w:val="1"/>
+        <w:jc w:val="right"/>
+      </w:pPr>
+      <w:r>
+        <w:rPr>
+          <w:bidi/>
+          <w:rtl/>
+        </w:rPr>
+        <w:t>يُثار غالباً تساؤل حول أمن البيانات في الأنظمة المبنية على Excel، غير أن النظام المقترح يُعالج هذه النقطة عبر ثلاث آليات مترابطة. أولاً، سلسلة الحراسة السداسية تمنع التعديل المباشر على الخلايا الحساسة، إذ أن كل حركة تُسجَّل عبر واجهة VBA ولا يمكن إدخال أو تعديل أو حذف أي حركة يدوياً من ورقة العمل. ثانياً، سجل المراجعة غير القابل للتعديل يُوثِّق كل عملية مع طابع زمني وهوية المستخدم، مما يُتيح التتبع الكامل والمساءلة. ثالثاً، الحماية بكلمة مرور على مستوى ورقة العمل والمشروع (VBA Project) تمنع العبث غير المصرَّح به. هذه الآليات تجعل النظام أكثر أماناً من السجلات الورقية التقليدية وأقل عرضة للخطأ البشري.</w:t>
       </w:r>
     </w:p>
     <w:p>
@@ -31260,40 +31373,9 @@
         <w:pStyle w:val="Heading3"/>
         <w:jc w:val="right"/>
       </w:pPr>
-      <w:bookmarkStart w:id="176" w:name="Xfde45ab085d7ad252281c0dccada5f1ef76526b"/>
-      <w:bookmarkStart w:id="177" w:name="_Toc232568856"/>
-      <w:bookmarkEnd w:id="174"/>
-      <w:r>
-        <w:rPr>
-          <w:bidi/>
-          <w:rtl/>
-        </w:rPr>
-        <w:t>6. أمن البيانات والسلامة (Data Security &amp; Integrity)</w:t>
-      </w:r>
+      <w:bookmarkStart w:id="178" w:name="_Toc232568857"/>
+      <w:bookmarkStart w:id="179" w:name="X55ec612fe397449f669dedb016b309f368fbe7f"/>
       <w:bookmarkEnd w:id="177"/>
-    </w:p>
-    <w:p>
-      <w:pPr>
-        <w:bidi w:val="1"/>
-        <w:jc w:val="right"/>
-      </w:pPr>
-      <w:r>
-        <w:rPr>
-          <w:bidi/>
-          <w:rtl/>
-        </w:rPr>
-        <w:t>يُثار غالباً تساؤل حول أمن البيانات في الأنظمة المبنية على Excel، غير أن النظام المقترح يُعالج هذه النقطة عبر ثلاث آليات مترابطة. أولاً، سلسلة الحراسة السداسية تمنع التعديل المباشر على الخلايا الحساسة، إذ أن كل حركة تُسجَّل عبر واجهة VBA ولا يمكن إدخال أو تعديل أو حذف أي حركة يدوياً من ورقة العمل. ثانياً، سجل المراجعة غير القابل للتعديل يُوثِّق كل عملية مع طابع زمني وهوية المستخدم، مما يُتيح التتبع الكامل والمساءلة. ثالثاً، الحماية بكلمة مرور على مستوى ورقة العمل والمشروع (VBA Project) تمنع العبث غير المصرَّح به. هذه الآليات تجعل النظام أكثر أماناً من السجلات الورقية التقليدية وأقل عرضة للخطأ البشري.</w:t>
-      </w:r>
-    </w:p>
-    <w:p>
-      <w:pPr>
-        <w:bidi w:val="1"/>
-        <w:pStyle w:val="Heading3"/>
-        <w:jc w:val="right"/>
-      </w:pPr>
-      <w:bookmarkStart w:id="178" w:name="X55ec612fe397449f669dedb016b309f368fbe7f"/>
-      <w:bookmarkStart w:id="179" w:name="_Toc232568857"/>
-      <w:bookmarkEnd w:id="176"/>
       <w:r>
         <w:rPr>
           <w:bidi/>
@@ -31301,7 +31383,7 @@
         </w:rPr>
         <w:t>7. الأثر التشغيلي العام (Operational Impact)</w:t>
       </w:r>
-      <w:bookmarkEnd w:id="179"/>
+      <w:bookmarkEnd w:id="178"/>
     </w:p>
     <w:p>
       <w:pPr>
@@ -31330,8 +31412,8 @@
         </w:rPr>
       </w:pPr>
       <w:bookmarkStart w:id="180" w:name="المبحث-الثاني-التوصيات-وآفاق-البحث"/>
-      <w:bookmarkEnd w:id="161"/>
-      <w:bookmarkEnd w:id="178"/>
+      <w:bookmarkEnd w:id="162"/>
+      <w:bookmarkEnd w:id="179"/>
       <w:r>
         <w:rPr>
           <w:rtl/>
@@ -31363,8 +31445,8 @@
         <w:pStyle w:val="Heading3"/>
         <w:jc w:val="right"/>
       </w:pPr>
-      <w:bookmarkStart w:id="182" w:name="X227b4e7819393731d2434c2aae903fe248179ff"/>
-      <w:bookmarkStart w:id="183" w:name="_Toc232568859"/>
+      <w:bookmarkStart w:id="182" w:name="_Toc232568859"/>
+      <w:bookmarkStart w:id="183" w:name="X227b4e7819393731d2434c2aae903fe248179ff"/>
       <w:r>
         <w:rPr>
           <w:bidi/>
@@ -31372,7 +31454,7 @@
         </w:rPr>
         <w:t>1. التوصيات المقدَّمة لمصلحة المخازن والإدارة</w:t>
       </w:r>
-      <w:bookmarkEnd w:id="183"/>
+      <w:bookmarkEnd w:id="182"/>
     </w:p>
     <w:p>
       <w:pPr>
@@ -32171,9 +32253,9 @@
         <w:pStyle w:val="Heading3"/>
         <w:jc w:val="right"/>
       </w:pPr>
-      <w:bookmarkStart w:id="185" w:name="X428f0794160c0dd1b8e5b82d0235ed45270a5de"/>
-      <w:bookmarkStart w:id="186" w:name="_Toc232568860"/>
-      <w:bookmarkEnd w:id="182"/>
+      <w:bookmarkStart w:id="185" w:name="_Toc232568860"/>
+      <w:bookmarkStart w:id="186" w:name="X428f0794160c0dd1b8e5b82d0235ed45270a5de"/>
+      <w:bookmarkEnd w:id="183"/>
       <w:r>
         <w:rPr>
           <w:bidi/>
@@ -32182,7 +32264,7 @@
         <w:lastRenderedPageBreak/>
         <w:t>2. آفاق البحث</w:t>
       </w:r>
-      <w:bookmarkEnd w:id="186"/>
+      <w:bookmarkEnd w:id="185"/>
     </w:p>
     <w:p>
       <w:pPr>
@@ -32425,9 +32507,9 @@
         <w:jc w:val="right"/>
       </w:pPr>
       <w:bookmarkStart w:id="187" w:name="قائمة-المصادر-والمراجع"/>
-      <w:bookmarkEnd w:id="159"/>
+      <w:bookmarkEnd w:id="160"/>
       <w:bookmarkEnd w:id="180"/>
-      <w:bookmarkEnd w:id="185"/>
+      <w:bookmarkEnd w:id="186"/>
       <w:r>
         <w:rPr>
           <w:rtl/>
@@ -32459,8 +32541,8 @@
         <w:pStyle w:val="Heading2"/>
         <w:jc w:val="right"/>
       </w:pPr>
-      <w:bookmarkStart w:id="189" w:name="أولاً-الكتب-والمراجع-العلمية"/>
-      <w:bookmarkStart w:id="190" w:name="_Toc232568862"/>
+      <w:bookmarkStart w:id="189" w:name="_Toc232568862"/>
+      <w:bookmarkStart w:id="190" w:name="أولاً-الكتب-والمراجع-العلمية"/>
       <w:r>
         <w:rPr>
           <w:bidi/>
@@ -32469,7 +32551,7 @@
         </w:rPr>
         <w:t>أولاً: الكتب والمراجع العلمية</w:t>
       </w:r>
-      <w:bookmarkEnd w:id="190"/>
+      <w:bookmarkEnd w:id="189"/>
     </w:p>
     <w:p>
       <w:pPr>
@@ -32909,9 +32991,9 @@
         <w:pStyle w:val="Heading2"/>
         <w:jc w:val="right"/>
       </w:pPr>
-      <w:bookmarkStart w:id="191" w:name="Xa9c5438e3f3a8a99cc43947a4701c3667770737"/>
-      <w:bookmarkStart w:id="192" w:name="_Toc232568863"/>
-      <w:bookmarkEnd w:id="189"/>
+      <w:bookmarkStart w:id="191" w:name="_Toc232568863"/>
+      <w:bookmarkStart w:id="192" w:name="Xa9c5438e3f3a8a99cc43947a4701c3667770737"/>
+      <w:bookmarkEnd w:id="190"/>
       <w:r>
         <w:rPr>
           <w:bidi/>
@@ -32921,7 +33003,7 @@
         <w:lastRenderedPageBreak/>
         <w:t>ثانياً: الإطار القانوني والتنظيمي الجزائري</w:t>
       </w:r>
-      <w:bookmarkEnd w:id="192"/>
+      <w:bookmarkEnd w:id="191"/>
     </w:p>
     <w:p>
       <w:pPr>
@@ -33166,9 +33248,9 @@
         <w:pStyle w:val="Heading2"/>
         <w:jc w:val="right"/>
       </w:pPr>
-      <w:bookmarkStart w:id="193" w:name="ثالثاً-المنهاج-الدراسي-bts-gsl-tag1801"/>
-      <w:bookmarkStart w:id="194" w:name="_Toc232568864"/>
-      <w:bookmarkEnd w:id="191"/>
+      <w:bookmarkStart w:id="193" w:name="_Toc232568864"/>
+      <w:bookmarkStart w:id="194" w:name="ثالثاً-المنهاج-الدراسي-bts-gsl-tag1801"/>
+      <w:bookmarkEnd w:id="192"/>
       <w:r>
         <w:rPr>
           <w:bidi/>
@@ -33177,7 +33259,7 @@
         </w:rPr>
         <w:t>ثالثاً: المنهاج الدراسي BTS GSL (TAG1801)</w:t>
       </w:r>
-      <w:bookmarkEnd w:id="194"/>
+      <w:bookmarkEnd w:id="193"/>
     </w:p>
     <w:p>
       <w:pPr>
@@ -34045,7 +34127,7 @@
         </w:rPr>
       </w:pPr>
       <w:bookmarkStart w:id="195" w:name="رابعاً-المراجع-التقنية"/>
-      <w:bookmarkEnd w:id="193"/>
+      <w:bookmarkEnd w:id="194"/>
       <w:r>
         <w:br w:type="page"/>
       </w:r>
@@ -34155,8 +34237,8 @@
         <w:pStyle w:val="Heading2"/>
         <w:jc w:val="right"/>
       </w:pPr>
-      <w:bookmarkStart w:id="197" w:name="خامساً-مشاريع-وأطروحات-موازية"/>
-      <w:bookmarkStart w:id="198" w:name="_Toc232568866"/>
+      <w:bookmarkStart w:id="197" w:name="_Toc232568866"/>
+      <w:bookmarkStart w:id="198" w:name="خامساً-مشاريع-وأطروحات-موازية"/>
       <w:bookmarkEnd w:id="195"/>
       <w:r>
         <w:rPr>
@@ -34166,7 +34248,7 @@
         </w:rPr>
         <w:t>خامساً: مشاريع وأطروحات موازية</w:t>
       </w:r>
-      <w:bookmarkEnd w:id="198"/>
+      <w:bookmarkEnd w:id="197"/>
     </w:p>
     <w:p>
       <w:pPr>
@@ -34378,9 +34460,9 @@
         <w:pStyle w:val="Heading2"/>
         <w:jc w:val="right"/>
       </w:pPr>
-      <w:bookmarkStart w:id="199" w:name="سادساً-مصادر-البيانات-الميدانية"/>
-      <w:bookmarkStart w:id="200" w:name="_Toc232568867"/>
-      <w:bookmarkEnd w:id="197"/>
+      <w:bookmarkStart w:id="199" w:name="_Toc232568867"/>
+      <w:bookmarkStart w:id="200" w:name="سادساً-مصادر-البيانات-الميدانية"/>
+      <w:bookmarkEnd w:id="198"/>
       <w:r>
         <w:rPr>
           <w:bidi/>
@@ -34389,7 +34471,7 @@
         </w:rPr>
         <w:t>سادساً: مصادر البيانات الميدانية</w:t>
       </w:r>
-      <w:bookmarkEnd w:id="200"/>
+      <w:bookmarkEnd w:id="199"/>
     </w:p>
     <w:p>
       <w:pPr>
@@ -34451,10 +34533,10 @@
         <w:jc w:val="right"/>
       </w:pPr>
       <w:bookmarkStart w:id="201" w:name="سابعاً-المراجع-البرمجية"/>
-      <w:bookmarkEnd w:id="199"/>
-      <w:r>
-        <w:pict w14:anchorId="4CFBA22A">
-          <v:rect id="_x0000_i1448" style="width:0;height:1.5pt" o:hralign="right" o:hrstd="t" o:hr="t"/>
+      <w:bookmarkEnd w:id="200"/>
+      <w:r>
+        <w:pict w14:anchorId="6FD6D8D1">
+          <v:rect id="_x0000_i1054" style="width:0;height:1.5pt" o:hralign="right" o:hrstd="t" o:hr="t"/>
         </w:pict>
       </w:r>
     </w:p>
@@ -34464,8 +34546,8 @@
         <w:pStyle w:val="Heading1"/>
         <w:jc w:val="right"/>
       </w:pPr>
-      <w:bookmarkStart w:id="202" w:name="جدول-المختصرات-والرموز-التقنية"/>
-      <w:bookmarkStart w:id="203" w:name="_Toc232568868"/>
+      <w:bookmarkStart w:id="202" w:name="_Toc232568868"/>
+      <w:bookmarkStart w:id="203" w:name="جدول-المختصرات-والرموز-التقنية"/>
       <w:bookmarkEnd w:id="187"/>
       <w:bookmarkEnd w:id="201"/>
       <w:r>
@@ -34477,7 +34559,7 @@
         <w:lastRenderedPageBreak/>
         <w:t>جدول المختصرات والرموز التقنية</w:t>
       </w:r>
-      <w:bookmarkEnd w:id="203"/>
+      <w:bookmarkEnd w:id="202"/>
     </w:p>
     <w:p>
       <w:pPr>
@@ -36506,9 +36588,9 @@
         <w:pStyle w:val="Heading1"/>
         <w:jc w:val="right"/>
       </w:pPr>
-      <w:bookmarkStart w:id="205" w:name="قائمة-المصطلحات"/>
-      <w:bookmarkStart w:id="206" w:name="_Toc232568869"/>
-      <w:bookmarkEnd w:id="202"/>
+      <w:bookmarkStart w:id="205" w:name="_Toc232568869"/>
+      <w:bookmarkStart w:id="206" w:name="قائمة-المصطلحات"/>
+      <w:bookmarkEnd w:id="203"/>
       <w:r>
         <w:rPr>
           <w:bidi/>
@@ -36518,7 +36600,7 @@
         <w:lastRenderedPageBreak/>
         <w:t>قائمة المصطلحات</w:t>
       </w:r>
-      <w:bookmarkEnd w:id="206"/>
+      <w:bookmarkEnd w:id="205"/>
     </w:p>
     <w:p>
       <w:pPr>
@@ -36526,8 +36608,8 @@
         <w:pStyle w:val="Heading2"/>
         <w:jc w:val="right"/>
       </w:pPr>
-      <w:bookmarkStart w:id="207" w:name="المصطلحات-اللوجستية-والتسييرية"/>
-      <w:bookmarkStart w:id="208" w:name="_Toc232568870"/>
+      <w:bookmarkStart w:id="207" w:name="_Toc232568870"/>
+      <w:bookmarkStart w:id="208" w:name="المصطلحات-اللوجستية-والتسييرية"/>
       <w:r>
         <w:rPr>
           <w:bidi/>
@@ -36536,7 +36618,7 @@
         </w:rPr>
         <w:t>المصطلحات اللوجستية والتسييرية</w:t>
       </w:r>
-      <w:bookmarkEnd w:id="208"/>
+      <w:bookmarkEnd w:id="207"/>
     </w:p>
     <w:p>
       <w:pPr>
@@ -41377,7 +41459,7 @@
         <w:jc w:val="right"/>
       </w:pPr>
       <w:bookmarkStart w:id="213" w:name="الملاحق-annexes"/>
-      <w:bookmarkEnd w:id="205"/>
+      <w:bookmarkEnd w:id="206"/>
       <w:bookmarkEnd w:id="210"/>
       <w:r>
         <w:rPr>
@@ -41410,8 +41492,8 @@
         <w:pStyle w:val="Heading2"/>
         <w:jc w:val="right"/>
       </w:pPr>
-      <w:bookmarkStart w:id="215" w:name="الملحق-الأول-هيكل-ملف-النظام"/>
-      <w:bookmarkStart w:id="216" w:name="_Toc232568873"/>
+      <w:bookmarkStart w:id="215" w:name="_Toc232568873"/>
+      <w:bookmarkStart w:id="216" w:name="الملحق-الأول-هيكل-ملف-النظام"/>
       <w:r>
         <w:rPr>
           <w:bidi/>
@@ -41420,7 +41502,7 @@
         </w:rPr>
         <w:t>الملحق الأول: هيكل ملف النظام</w:t>
       </w:r>
-      <w:bookmarkEnd w:id="216"/>
+      <w:bookmarkEnd w:id="215"/>
     </w:p>
     <w:p>
       <w:pPr>
@@ -41996,9 +42078,9 @@
         <w:pStyle w:val="Heading2"/>
         <w:jc w:val="right"/>
       </w:pPr>
-      <w:bookmarkStart w:id="218" w:name="الملحق-الثاني-وحدات-vba-الرئيسية"/>
-      <w:bookmarkStart w:id="219" w:name="_Toc232568874"/>
-      <w:bookmarkEnd w:id="215"/>
+      <w:bookmarkStart w:id="218" w:name="_Toc232568874"/>
+      <w:bookmarkStart w:id="219" w:name="الملحق-الثاني-وحدات-vba-الرئيسية"/>
+      <w:bookmarkEnd w:id="216"/>
       <w:r>
         <w:rPr>
           <w:bidi/>
@@ -42007,7 +42089,7 @@
         </w:rPr>
         <w:t>الملحق الثاني: وحدات VBA الرئيسية</w:t>
       </w:r>
-      <w:bookmarkEnd w:id="219"/>
+      <w:bookmarkEnd w:id="218"/>
     </w:p>
     <w:p>
       <w:pPr>
@@ -42760,9 +42842,9 @@
         <w:pStyle w:val="Heading2"/>
         <w:jc w:val="right"/>
       </w:pPr>
-      <w:bookmarkStart w:id="221" w:name="الملحق-الثالث-بيانات-المخزون-الميدانية"/>
-      <w:bookmarkStart w:id="222" w:name="_Toc232568875"/>
-      <w:bookmarkEnd w:id="218"/>
+      <w:bookmarkStart w:id="221" w:name="_Toc232568875"/>
+      <w:bookmarkStart w:id="222" w:name="الملحق-الثالث-بيانات-المخزون-الميدانية"/>
+      <w:bookmarkEnd w:id="219"/>
       <w:r>
         <w:rPr>
           <w:bidi/>
@@ -42772,7 +42854,7 @@
         <w:lastRenderedPageBreak/>
         <w:t>الملحق الثالث: بيانات المخزون الميدانية</w:t>
       </w:r>
-      <w:bookmarkEnd w:id="222"/>
+      <w:bookmarkEnd w:id="221"/>
     </w:p>
     <w:p>
       <w:pPr>
@@ -44625,7 +44707,7 @@
         </w:rPr>
       </w:pPr>
       <w:bookmarkStart w:id="224" w:name="الملحق-الرابع-نماذج-الوثائق-الإدارية"/>
-      <w:bookmarkEnd w:id="221"/>
+      <w:bookmarkEnd w:id="222"/>
       <w:r>
         <w:rPr>
           <w:rtl/>
@@ -44774,8 +44856,8 @@
         <w:pStyle w:val="Heading2"/>
         <w:jc w:val="right"/>
       </w:pPr>
-      <w:bookmarkStart w:id="226" w:name="X2ba466c7822f1b4b8d4c28ae81ff579f1d28271"/>
-      <w:bookmarkStart w:id="227" w:name="_Toc232568877"/>
+      <w:bookmarkStart w:id="226" w:name="_Toc232568877"/>
+      <w:bookmarkStart w:id="227" w:name="X2ba466c7822f1b4b8d4c28ae81ff579f1d28271"/>
       <w:bookmarkEnd w:id="224"/>
       <w:r>
         <w:rPr>
@@ -44785,7 +44867,7 @@
         </w:rPr>
         <w:t>الملحق الخامس: نشر النماذج اللغوية الكبيرة (LLM Deployment)</w:t>
       </w:r>
-      <w:bookmarkEnd w:id="227"/>
+      <w:bookmarkEnd w:id="226"/>
     </w:p>
     <w:p>
       <w:pPr>
@@ -45143,7 +45225,7 @@
         </w:rPr>
       </w:pPr>
       <w:bookmarkStart w:id="229" w:name="X15a4de04fd1a7c618c4c663b7e505d99f1460cd"/>
-      <w:bookmarkEnd w:id="226"/>
+      <w:bookmarkEnd w:id="227"/>
       <w:r>
         <w:rPr>
           <w:bidi/>
@@ -45187,8 +45269,8 @@
         <w:pStyle w:val="Heading3"/>
         <w:jc w:val="right"/>
       </w:pPr>
-      <w:bookmarkStart w:id="232" w:name="X6cd5d7ea679d76d20534900303c2e6d9b9d4296"/>
-      <w:bookmarkStart w:id="233" w:name="_Toc232568879"/>
+      <w:bookmarkStart w:id="232" w:name="_Toc232568879"/>
+      <w:bookmarkStart w:id="233" w:name="X6cd5d7ea679d76d20534900303c2e6d9b9d4296"/>
       <w:r>
         <w:rPr>
           <w:bidi/>
@@ -45196,7 +45278,7 @@
         </w:rPr>
         <w:t>1. الإطار المرجعي لنظام دعم القرار في القطاع التعليمي الجزائري</w:t>
       </w:r>
-      <w:bookmarkEnd w:id="233"/>
+      <w:bookmarkEnd w:id="232"/>
     </w:p>
     <w:p>
       <w:pPr>
@@ -45960,7 +46042,7 @@
           </w:p>
         </w:tc>
       </w:tr>
-      <w:bookmarkEnd w:id="232"/>
+      <w:bookmarkEnd w:id="233"/>
     </w:tbl>
     <w:p>
       <w:pPr>
@@ -51513,8 +51595,8 @@
         <w:jc w:val="right"/>
       </w:pPr>
       <w:r>
-        <w:pict w14:anchorId="51408C97">
-          <v:rect id="_x0000_i1449" style="width:0;height:1.5pt" o:hralign="right" o:hrstd="t" o:hr="t"/>
+        <w:pict w14:anchorId="2048C3FC">
+          <v:rect id="_x0000_i1055" style="width:0;height:1.5pt" o:hralign="right" o:hrstd="t" o:hr="t"/>
         </w:pict>
       </w:r>
     </w:p>
@@ -52972,14 +53054,7 @@
           <w:cs/>
           <w:bidi/>
         </w:rPr>
-        <w:t xml:space="preserve"> راجع: </w:t>
-      </w:r>
-      <w:r>
-        <w:rPr>
-          <w:rtl/>
-          <w:cs/>
-        </w:rPr>
-        <w:t>M.</w:t>
+        <w:t xml:space="preserve"> راجع: M.</w:t>
       </w:r>
       <w:r>
         <w:rPr>
@@ -56765,7 +56840,7 @@
 </file>
 
 <file path=customXml/itemProps1.xml><?xml version="1.0" encoding="utf-8"?>
-<ds:datastoreItem xmlns:ds="http://schemas.openxmlformats.org/officeDocument/2006/customXml" ds:itemID="{35D8248E-2DA0-4D3A-BC24-879A3C74405B}">
+<ds:datastoreItem xmlns:ds="http://schemas.openxmlformats.org/officeDocument/2006/customXml" ds:itemID="{B40098C6-CC75-4805-8953-03DBBF8987E6}">
   <ds:schemaRefs>
     <ds:schemaRef ds:uri="http://schemas.openxmlformats.org/officeDocument/2006/bibliography"/>
   </ds:schemaRefs>

</xml_diff>

<commit_message>
fix: clean MD source, fix dead code in fix_thesis_all.py, rebuild 32/32
- Remove stray period from French abstract (.analyse ABC → analyse ABC)
- Fix stray asterisks in CMUP formula line (**** → **)
- Remove 4 duplicate bold headings (annexes + ART-002 section)
- Fix IndentationError in fix_thesis_all.py (removed orphaned TOF insertion code at module level — 10-step comprehensive fix now runs correctly)
- Update docx_md_sync.py: fix deprecation notice, update ground truth constants to v13.4
- Rebuild DOCX: 32/32 PASS, 142 KB, PDF 1,285 KB
- fix_thesis_all.py now executes all 10 steps (table widths, borders, padding, styles, paragraph RTL, run RTL, empty para cleanup, footnote RTL, footer injection, namespace compat)
</commit_message>
<xml_diff>
--- a/Thesis_Surgical_Edit/output/Memoire_DSS_Logistique_ElBayadh.docx
+++ b/Thesis_Surgical_Edit/output/Memoire_DSS_Logistique_ElBayadh.docx
@@ -808,7 +808,7 @@
         <w:pStyle w:val="Heading3"/>
         <w:jc w:val="right"/>
       </w:pPr>
-      <w:bookmarkStart w:id="1" w:name="_Toc233455310"/>
+      <w:bookmarkStart w:id="1" w:name="_Toc233459446"/>
       <w:r>
         <w:rPr>
           <w:bidi/>
@@ -844,7 +844,7 @@
       <w:r>
         <w:fldChar w:fldCharType="separate"/>
       </w:r>
-      <w:hyperlink w:anchor="_Toc233455310" w:history="1">
+      <w:hyperlink w:anchor="_Toc233459446" w:history="1">
         <w:r>
           <w:rPr>
             <w:rStyle w:val="Hyperlink"/>
@@ -872,7 +872,7 @@
             <w:noProof/>
             <w:webHidden/>
           </w:rPr>
-          <w:instrText xml:space="preserve"> PAGEREF _Toc233455310 \h </w:instrText>
+          <w:instrText xml:space="preserve"> PAGEREF _Toc233459446 \h </w:instrText>
         </w:r>
         <w:r>
           <w:rPr>
@@ -917,7 +917,7 @@
           <w:szCs w:val="22"/>
         </w:rPr>
       </w:pPr>
-      <w:hyperlink w:anchor="_Toc233455311" w:history="1">
+      <w:hyperlink w:anchor="_Toc233459447" w:history="1">
         <w:r>
           <w:rPr>
             <w:rStyle w:val="Hyperlink"/>
@@ -945,7 +945,7 @@
             <w:noProof/>
             <w:webHidden/>
           </w:rPr>
-          <w:instrText xml:space="preserve"> PAGEREF _Toc233455311 \h </w:instrText>
+          <w:instrText xml:space="preserve"> PAGEREF _Toc233459447 \h </w:instrText>
         </w:r>
         <w:r>
           <w:rPr>
@@ -990,7 +990,7 @@
           <w:szCs w:val="22"/>
         </w:rPr>
       </w:pPr>
-      <w:hyperlink w:anchor="_Toc233455312" w:history="1">
+      <w:hyperlink w:anchor="_Toc233459448" w:history="1">
         <w:r>
           <w:rPr>
             <w:rStyle w:val="Hyperlink"/>
@@ -1018,7 +1018,7 @@
             <w:noProof/>
             <w:webHidden/>
           </w:rPr>
-          <w:instrText xml:space="preserve"> PAGEREF _Toc233455312 \h </w:instrText>
+          <w:instrText xml:space="preserve"> PAGEREF _Toc233459448 \h </w:instrText>
         </w:r>
         <w:r>
           <w:rPr>
@@ -1063,7 +1063,7 @@
           <w:szCs w:val="22"/>
         </w:rPr>
       </w:pPr>
-      <w:hyperlink w:anchor="_Toc233455313" w:history="1">
+      <w:hyperlink w:anchor="_Toc233459449" w:history="1">
         <w:r>
           <w:rPr>
             <w:rStyle w:val="Hyperlink"/>
@@ -1090,7 +1090,7 @@
             <w:noProof/>
             <w:webHidden/>
           </w:rPr>
-          <w:instrText xml:space="preserve"> PAGEREF _Toc233455313 \h </w:instrText>
+          <w:instrText xml:space="preserve"> PAGEREF _Toc233459449 \h </w:instrText>
         </w:r>
         <w:r>
           <w:rPr>
@@ -1135,7 +1135,7 @@
           <w:szCs w:val="22"/>
         </w:rPr>
       </w:pPr>
-      <w:hyperlink w:anchor="_Toc233455314" w:history="1">
+      <w:hyperlink w:anchor="_Toc233459450" w:history="1">
         <w:r>
           <w:rPr>
             <w:rStyle w:val="Hyperlink"/>
@@ -1163,7 +1163,7 @@
             <w:noProof/>
             <w:webHidden/>
           </w:rPr>
-          <w:instrText xml:space="preserve"> PAGEREF _Toc233455314 \h </w:instrText>
+          <w:instrText xml:space="preserve"> PAGEREF _Toc233459450 \h </w:instrText>
         </w:r>
         <w:r>
           <w:rPr>
@@ -1208,7 +1208,7 @@
           <w:szCs w:val="22"/>
         </w:rPr>
       </w:pPr>
-      <w:hyperlink w:anchor="_Toc233455315" w:history="1">
+      <w:hyperlink w:anchor="_Toc233459451" w:history="1">
         <w:r>
           <w:rPr>
             <w:rStyle w:val="Hyperlink"/>
@@ -1236,7 +1236,7 @@
             <w:noProof/>
             <w:webHidden/>
           </w:rPr>
-          <w:instrText xml:space="preserve"> PAGEREF _Toc233455315 \h </w:instrText>
+          <w:instrText xml:space="preserve"> PAGEREF _Toc233459451 \h </w:instrText>
         </w:r>
         <w:r>
           <w:rPr>
@@ -1281,7 +1281,7 @@
           <w:szCs w:val="22"/>
         </w:rPr>
       </w:pPr>
-      <w:hyperlink w:anchor="_Toc233455316" w:history="1">
+      <w:hyperlink w:anchor="_Toc233459452" w:history="1">
         <w:r>
           <w:rPr>
             <w:rStyle w:val="Hyperlink"/>
@@ -1309,7 +1309,7 @@
             <w:noProof/>
             <w:webHidden/>
           </w:rPr>
-          <w:instrText xml:space="preserve"> PAGEREF _Toc233455316 \h </w:instrText>
+          <w:instrText xml:space="preserve"> PAGEREF _Toc233459452 \h </w:instrText>
         </w:r>
         <w:r>
           <w:rPr>
@@ -1354,7 +1354,7 @@
           <w:szCs w:val="22"/>
         </w:rPr>
       </w:pPr>
-      <w:hyperlink w:anchor="_Toc233455317" w:history="1">
+      <w:hyperlink w:anchor="_Toc233459453" w:history="1">
         <w:r>
           <w:rPr>
             <w:rStyle w:val="Hyperlink"/>
@@ -1382,7 +1382,7 @@
             <w:noProof/>
             <w:webHidden/>
           </w:rPr>
-          <w:instrText xml:space="preserve"> PAGEREF _Toc233455317 \h </w:instrText>
+          <w:instrText xml:space="preserve"> PAGEREF _Toc233459453 \h </w:instrText>
         </w:r>
         <w:r>
           <w:rPr>
@@ -1427,7 +1427,7 @@
           <w:szCs w:val="22"/>
         </w:rPr>
       </w:pPr>
-      <w:hyperlink w:anchor="_Toc233455318" w:history="1">
+      <w:hyperlink w:anchor="_Toc233459454" w:history="1">
         <w:r>
           <w:rPr>
             <w:rStyle w:val="Hyperlink"/>
@@ -1455,7 +1455,7 @@
             <w:noProof/>
             <w:webHidden/>
           </w:rPr>
-          <w:instrText xml:space="preserve"> PAGEREF _Toc233455318 \h </w:instrText>
+          <w:instrText xml:space="preserve"> PAGEREF _Toc233459454 \h </w:instrText>
         </w:r>
         <w:r>
           <w:rPr>
@@ -1500,7 +1500,7 @@
           <w:szCs w:val="22"/>
         </w:rPr>
       </w:pPr>
-      <w:hyperlink w:anchor="_Toc233455319" w:history="1">
+      <w:hyperlink w:anchor="_Toc233459455" w:history="1">
         <w:r>
           <w:rPr>
             <w:rStyle w:val="Hyperlink"/>
@@ -1528,7 +1528,7 @@
             <w:noProof/>
             <w:webHidden/>
           </w:rPr>
-          <w:instrText xml:space="preserve"> PAGEREF _Toc233455319 \h </w:instrText>
+          <w:instrText xml:space="preserve"> PAGEREF _Toc233459455 \h </w:instrText>
         </w:r>
         <w:r>
           <w:rPr>
@@ -1573,7 +1573,7 @@
           <w:szCs w:val="22"/>
         </w:rPr>
       </w:pPr>
-      <w:hyperlink w:anchor="_Toc233455320" w:history="1">
+      <w:hyperlink w:anchor="_Toc233459456" w:history="1">
         <w:r>
           <w:rPr>
             <w:rStyle w:val="Hyperlink"/>
@@ -1601,7 +1601,7 @@
             <w:noProof/>
             <w:webHidden/>
           </w:rPr>
-          <w:instrText xml:space="preserve"> PAGEREF _Toc233455320 \h </w:instrText>
+          <w:instrText xml:space="preserve"> PAGEREF _Toc233459456 \h </w:instrText>
         </w:r>
         <w:r>
           <w:rPr>
@@ -1646,7 +1646,7 @@
           <w:szCs w:val="22"/>
         </w:rPr>
       </w:pPr>
-      <w:hyperlink w:anchor="_Toc233455321" w:history="1">
+      <w:hyperlink w:anchor="_Toc233459457" w:history="1">
         <w:r>
           <w:rPr>
             <w:rStyle w:val="Hyperlink"/>
@@ -1704,7 +1704,7 @@
             <w:noProof/>
             <w:webHidden/>
           </w:rPr>
-          <w:instrText xml:space="preserve"> PAGEREF _Toc233455321 \h </w:instrText>
+          <w:instrText xml:space="preserve"> PAGEREF _Toc233459457 \h </w:instrText>
         </w:r>
         <w:r>
           <w:rPr>
@@ -1749,7 +1749,7 @@
           <w:szCs w:val="22"/>
         </w:rPr>
       </w:pPr>
-      <w:hyperlink w:anchor="_Toc233455322" w:history="1">
+      <w:hyperlink w:anchor="_Toc233459458" w:history="1">
         <w:r>
           <w:rPr>
             <w:rStyle w:val="Hyperlink"/>
@@ -1777,7 +1777,7 @@
             <w:noProof/>
             <w:webHidden/>
           </w:rPr>
-          <w:instrText xml:space="preserve"> PAGEREF _Toc233455322 \h </w:instrText>
+          <w:instrText xml:space="preserve"> PAGEREF _Toc233459458 \h </w:instrText>
         </w:r>
         <w:r>
           <w:rPr>
@@ -1822,7 +1822,7 @@
           <w:szCs w:val="22"/>
         </w:rPr>
       </w:pPr>
-      <w:hyperlink w:anchor="_Toc233455323" w:history="1">
+      <w:hyperlink w:anchor="_Toc233459459" w:history="1">
         <w:r>
           <w:rPr>
             <w:rStyle w:val="Hyperlink"/>
@@ -1850,7 +1850,7 @@
             <w:noProof/>
             <w:webHidden/>
           </w:rPr>
-          <w:instrText xml:space="preserve"> PAGEREF _Toc233455323 \h </w:instrText>
+          <w:instrText xml:space="preserve"> PAGEREF _Toc233459459 \h </w:instrText>
         </w:r>
         <w:r>
           <w:rPr>
@@ -1895,7 +1895,7 @@
           <w:szCs w:val="22"/>
         </w:rPr>
       </w:pPr>
-      <w:hyperlink w:anchor="_Toc233455324" w:history="1">
+      <w:hyperlink w:anchor="_Toc233459460" w:history="1">
         <w:r>
           <w:rPr>
             <w:rStyle w:val="Hyperlink"/>
@@ -1938,7 +1938,7 @@
             <w:noProof/>
             <w:webHidden/>
           </w:rPr>
-          <w:instrText xml:space="preserve"> PAGEREF _Toc233455324 \h </w:instrText>
+          <w:instrText xml:space="preserve"> PAGEREF _Toc233459460 \h </w:instrText>
         </w:r>
         <w:r>
           <w:rPr>
@@ -1983,7 +1983,7 @@
           <w:szCs w:val="22"/>
         </w:rPr>
       </w:pPr>
-      <w:hyperlink w:anchor="_Toc233455325" w:history="1">
+      <w:hyperlink w:anchor="_Toc233459461" w:history="1">
         <w:r>
           <w:rPr>
             <w:rStyle w:val="Hyperlink"/>
@@ -2026,7 +2026,7 @@
             <w:noProof/>
             <w:webHidden/>
           </w:rPr>
-          <w:instrText xml:space="preserve"> PAGEREF _Toc233455325 \h </w:instrText>
+          <w:instrText xml:space="preserve"> PAGEREF _Toc233459461 \h </w:instrText>
         </w:r>
         <w:r>
           <w:rPr>
@@ -2071,7 +2071,7 @@
           <w:szCs w:val="22"/>
         </w:rPr>
       </w:pPr>
-      <w:hyperlink w:anchor="_Toc233455326" w:history="1">
+      <w:hyperlink w:anchor="_Toc233459462" w:history="1">
         <w:r>
           <w:rPr>
             <w:rStyle w:val="Hyperlink"/>
@@ -2099,7 +2099,7 @@
             <w:noProof/>
             <w:webHidden/>
           </w:rPr>
-          <w:instrText xml:space="preserve"> PAGEREF _Toc233455326 \h </w:instrText>
+          <w:instrText xml:space="preserve"> PAGEREF _Toc233459462 \h </w:instrText>
         </w:r>
         <w:r>
           <w:rPr>
@@ -2144,7 +2144,7 @@
           <w:szCs w:val="22"/>
         </w:rPr>
       </w:pPr>
-      <w:hyperlink w:anchor="_Toc233455327" w:history="1">
+      <w:hyperlink w:anchor="_Toc233459463" w:history="1">
         <w:r>
           <w:rPr>
             <w:rStyle w:val="Hyperlink"/>
@@ -2172,7 +2172,7 @@
             <w:noProof/>
             <w:webHidden/>
           </w:rPr>
-          <w:instrText xml:space="preserve"> PAGEREF _Toc233455327 \h </w:instrText>
+          <w:instrText xml:space="preserve"> PAGEREF _Toc233459463 \h </w:instrText>
         </w:r>
         <w:r>
           <w:rPr>
@@ -2217,7 +2217,7 @@
           <w:szCs w:val="22"/>
         </w:rPr>
       </w:pPr>
-      <w:hyperlink w:anchor="_Toc233455328" w:history="1">
+      <w:hyperlink w:anchor="_Toc233459464" w:history="1">
         <w:r>
           <w:rPr>
             <w:rStyle w:val="Hyperlink"/>
@@ -2245,7 +2245,7 @@
             <w:noProof/>
             <w:webHidden/>
           </w:rPr>
-          <w:instrText xml:space="preserve"> PAGEREF _Toc233455328 \h </w:instrText>
+          <w:instrText xml:space="preserve"> PAGEREF _Toc233459464 \h </w:instrText>
         </w:r>
         <w:r>
           <w:rPr>
@@ -2290,7 +2290,7 @@
           <w:szCs w:val="22"/>
         </w:rPr>
       </w:pPr>
-      <w:hyperlink w:anchor="_Toc233455329" w:history="1">
+      <w:hyperlink w:anchor="_Toc233459465" w:history="1">
         <w:r>
           <w:rPr>
             <w:rStyle w:val="Hyperlink"/>
@@ -2318,7 +2318,7 @@
             <w:noProof/>
             <w:webHidden/>
           </w:rPr>
-          <w:instrText xml:space="preserve"> PAGEREF _Toc233455329 \h </w:instrText>
+          <w:instrText xml:space="preserve"> PAGEREF _Toc233459465 \h </w:instrText>
         </w:r>
         <w:r>
           <w:rPr>
@@ -2363,7 +2363,7 @@
           <w:szCs w:val="22"/>
         </w:rPr>
       </w:pPr>
-      <w:hyperlink w:anchor="_Toc233455330" w:history="1">
+      <w:hyperlink w:anchor="_Toc233459466" w:history="1">
         <w:r>
           <w:rPr>
             <w:rStyle w:val="Hyperlink"/>
@@ -2391,7 +2391,7 @@
             <w:noProof/>
             <w:webHidden/>
           </w:rPr>
-          <w:instrText xml:space="preserve"> PAGEREF _Toc233455330 \h </w:instrText>
+          <w:instrText xml:space="preserve"> PAGEREF _Toc233459466 \h </w:instrText>
         </w:r>
         <w:r>
           <w:rPr>
@@ -2436,7 +2436,7 @@
           <w:szCs w:val="22"/>
         </w:rPr>
       </w:pPr>
-      <w:hyperlink w:anchor="_Toc233455331" w:history="1">
+      <w:hyperlink w:anchor="_Toc233459467" w:history="1">
         <w:r>
           <w:rPr>
             <w:rStyle w:val="Hyperlink"/>
@@ -2464,7 +2464,7 @@
             <w:noProof/>
             <w:webHidden/>
           </w:rPr>
-          <w:instrText xml:space="preserve"> PAGEREF _Toc233455331 \h </w:instrText>
+          <w:instrText xml:space="preserve"> PAGEREF _Toc233459467 \h </w:instrText>
         </w:r>
         <w:r>
           <w:rPr>
@@ -2509,7 +2509,7 @@
           <w:szCs w:val="22"/>
         </w:rPr>
       </w:pPr>
-      <w:hyperlink w:anchor="_Toc233455332" w:history="1">
+      <w:hyperlink w:anchor="_Toc233459468" w:history="1">
         <w:r>
           <w:rPr>
             <w:rStyle w:val="Hyperlink"/>
@@ -2552,7 +2552,7 @@
             <w:noProof/>
             <w:webHidden/>
           </w:rPr>
-          <w:instrText xml:space="preserve"> PAGEREF _Toc233455332 \h </w:instrText>
+          <w:instrText xml:space="preserve"> PAGEREF _Toc233459468 \h </w:instrText>
         </w:r>
         <w:r>
           <w:rPr>
@@ -2597,7 +2597,7 @@
           <w:szCs w:val="22"/>
         </w:rPr>
       </w:pPr>
-      <w:hyperlink w:anchor="_Toc233455333" w:history="1">
+      <w:hyperlink w:anchor="_Toc233459469" w:history="1">
         <w:r>
           <w:rPr>
             <w:rStyle w:val="Hyperlink"/>
@@ -2625,7 +2625,7 @@
             <w:noProof/>
             <w:webHidden/>
           </w:rPr>
-          <w:instrText xml:space="preserve"> PAGEREF _Toc233455333 \h </w:instrText>
+          <w:instrText xml:space="preserve"> PAGEREF _Toc233459469 \h </w:instrText>
         </w:r>
         <w:r>
           <w:rPr>
@@ -2670,7 +2670,7 @@
           <w:szCs w:val="22"/>
         </w:rPr>
       </w:pPr>
-      <w:hyperlink w:anchor="_Toc233455334" w:history="1">
+      <w:hyperlink w:anchor="_Toc233459470" w:history="1">
         <w:r>
           <w:rPr>
             <w:rStyle w:val="Hyperlink"/>
@@ -2698,7 +2698,7 @@
             <w:noProof/>
             <w:webHidden/>
           </w:rPr>
-          <w:instrText xml:space="preserve"> PAGEREF _Toc233455334 \h </w:instrText>
+          <w:instrText xml:space="preserve"> PAGEREF _Toc233459470 \h </w:instrText>
         </w:r>
         <w:r>
           <w:rPr>
@@ -2743,7 +2743,7 @@
           <w:szCs w:val="22"/>
         </w:rPr>
       </w:pPr>
-      <w:hyperlink w:anchor="_Toc233455335" w:history="1">
+      <w:hyperlink w:anchor="_Toc233459471" w:history="1">
         <w:r>
           <w:rPr>
             <w:rStyle w:val="Hyperlink"/>
@@ -2771,7 +2771,7 @@
             <w:noProof/>
             <w:webHidden/>
           </w:rPr>
-          <w:instrText xml:space="preserve"> PAGEREF _Toc233455335 \h </w:instrText>
+          <w:instrText xml:space="preserve"> PAGEREF _Toc233459471 \h </w:instrText>
         </w:r>
         <w:r>
           <w:rPr>
@@ -2816,7 +2816,7 @@
           <w:szCs w:val="22"/>
         </w:rPr>
       </w:pPr>
-      <w:hyperlink w:anchor="_Toc233455336" w:history="1">
+      <w:hyperlink w:anchor="_Toc233459472" w:history="1">
         <w:r>
           <w:rPr>
             <w:rStyle w:val="Hyperlink"/>
@@ -2851,7 +2851,7 @@
             <w:noProof/>
             <w:webHidden/>
           </w:rPr>
-          <w:instrText xml:space="preserve"> PAGEREF _Toc233455336 \h </w:instrText>
+          <w:instrText xml:space="preserve"> PAGEREF _Toc233459472 \h </w:instrText>
         </w:r>
         <w:r>
           <w:rPr>
@@ -2896,7 +2896,7 @@
           <w:szCs w:val="22"/>
         </w:rPr>
       </w:pPr>
-      <w:hyperlink w:anchor="_Toc233455337" w:history="1">
+      <w:hyperlink w:anchor="_Toc233459473" w:history="1">
         <w:r>
           <w:rPr>
             <w:rStyle w:val="Hyperlink"/>
@@ -2924,7 +2924,7 @@
             <w:noProof/>
             <w:webHidden/>
           </w:rPr>
-          <w:instrText xml:space="preserve"> PAGEREF _Toc233455337 \h </w:instrText>
+          <w:instrText xml:space="preserve"> PAGEREF _Toc233459473 \h </w:instrText>
         </w:r>
         <w:r>
           <w:rPr>
@@ -2969,7 +2969,7 @@
           <w:szCs w:val="22"/>
         </w:rPr>
       </w:pPr>
-      <w:hyperlink w:anchor="_Toc233455338" w:history="1">
+      <w:hyperlink w:anchor="_Toc233459474" w:history="1">
         <w:r>
           <w:rPr>
             <w:rStyle w:val="Hyperlink"/>
@@ -2997,7 +2997,7 @@
             <w:noProof/>
             <w:webHidden/>
           </w:rPr>
-          <w:instrText xml:space="preserve"> PAGEREF _Toc233455338 \h </w:instrText>
+          <w:instrText xml:space="preserve"> PAGEREF _Toc233459474 \h </w:instrText>
         </w:r>
         <w:r>
           <w:rPr>
@@ -3042,7 +3042,7 @@
           <w:szCs w:val="22"/>
         </w:rPr>
       </w:pPr>
-      <w:hyperlink w:anchor="_Toc233455339" w:history="1">
+      <w:hyperlink w:anchor="_Toc233459475" w:history="1">
         <w:r>
           <w:rPr>
             <w:rStyle w:val="Hyperlink"/>
@@ -3070,7 +3070,7 @@
             <w:noProof/>
             <w:webHidden/>
           </w:rPr>
-          <w:instrText xml:space="preserve"> PAGEREF _Toc233455339 \h </w:instrText>
+          <w:instrText xml:space="preserve"> PAGEREF _Toc233459475 \h </w:instrText>
         </w:r>
         <w:r>
           <w:rPr>
@@ -3115,7 +3115,7 @@
           <w:szCs w:val="22"/>
         </w:rPr>
       </w:pPr>
-      <w:hyperlink w:anchor="_Toc233455340" w:history="1">
+      <w:hyperlink w:anchor="_Toc233459476" w:history="1">
         <w:r>
           <w:rPr>
             <w:rStyle w:val="Hyperlink"/>
@@ -3150,7 +3150,7 @@
             <w:noProof/>
             <w:webHidden/>
           </w:rPr>
-          <w:instrText xml:space="preserve"> PAGEREF _Toc233455340 \h </w:instrText>
+          <w:instrText xml:space="preserve"> PAGEREF _Toc233459476 \h </w:instrText>
         </w:r>
         <w:r>
           <w:rPr>
@@ -3195,7 +3195,7 @@
           <w:szCs w:val="22"/>
         </w:rPr>
       </w:pPr>
-      <w:hyperlink w:anchor="_Toc233455341" w:history="1">
+      <w:hyperlink w:anchor="_Toc233459477" w:history="1">
         <w:r>
           <w:rPr>
             <w:rStyle w:val="Hyperlink"/>
@@ -3238,7 +3238,7 @@
             <w:noProof/>
             <w:webHidden/>
           </w:rPr>
-          <w:instrText xml:space="preserve"> PAGEREF _Toc233455341 \h </w:instrText>
+          <w:instrText xml:space="preserve"> PAGEREF _Toc233459477 \h </w:instrText>
         </w:r>
         <w:r>
           <w:rPr>
@@ -3283,7 +3283,7 @@
           <w:szCs w:val="22"/>
         </w:rPr>
       </w:pPr>
-      <w:hyperlink w:anchor="_Toc233455342" w:history="1">
+      <w:hyperlink w:anchor="_Toc233459478" w:history="1">
         <w:r>
           <w:rPr>
             <w:rStyle w:val="Hyperlink"/>
@@ -3326,7 +3326,7 @@
             <w:noProof/>
             <w:webHidden/>
           </w:rPr>
-          <w:instrText xml:space="preserve"> PAGEREF _Toc233455342 \h </w:instrText>
+          <w:instrText xml:space="preserve"> PAGEREF _Toc233459478 \h </w:instrText>
         </w:r>
         <w:r>
           <w:rPr>
@@ -3371,7 +3371,7 @@
           <w:szCs w:val="22"/>
         </w:rPr>
       </w:pPr>
-      <w:hyperlink w:anchor="_Toc233455343" w:history="1">
+      <w:hyperlink w:anchor="_Toc233459479" w:history="1">
         <w:r>
           <w:rPr>
             <w:rStyle w:val="Hyperlink"/>
@@ -3399,7 +3399,7 @@
             <w:noProof/>
             <w:webHidden/>
           </w:rPr>
-          <w:instrText xml:space="preserve"> PAGEREF _Toc233455343 \h </w:instrText>
+          <w:instrText xml:space="preserve"> PAGEREF _Toc233459479 \h </w:instrText>
         </w:r>
         <w:r>
           <w:rPr>
@@ -3444,7 +3444,7 @@
           <w:szCs w:val="22"/>
         </w:rPr>
       </w:pPr>
-      <w:hyperlink w:anchor="_Toc233455344" w:history="1">
+      <w:hyperlink w:anchor="_Toc233459480" w:history="1">
         <w:r>
           <w:rPr>
             <w:rStyle w:val="Hyperlink"/>
@@ -3472,7 +3472,7 @@
             <w:noProof/>
             <w:webHidden/>
           </w:rPr>
-          <w:instrText xml:space="preserve"> PAGEREF _Toc233455344 \h </w:instrText>
+          <w:instrText xml:space="preserve"> PAGEREF _Toc233459480 \h </w:instrText>
         </w:r>
         <w:r>
           <w:rPr>
@@ -3517,7 +3517,7 @@
           <w:szCs w:val="22"/>
         </w:rPr>
       </w:pPr>
-      <w:hyperlink w:anchor="_Toc233455345" w:history="1">
+      <w:hyperlink w:anchor="_Toc233459481" w:history="1">
         <w:r>
           <w:rPr>
             <w:rStyle w:val="Hyperlink"/>
@@ -3545,7 +3545,7 @@
             <w:noProof/>
             <w:webHidden/>
           </w:rPr>
-          <w:instrText xml:space="preserve"> PAGEREF _Toc233455345 \h </w:instrText>
+          <w:instrText xml:space="preserve"> PAGEREF _Toc233459481 \h </w:instrText>
         </w:r>
         <w:r>
           <w:rPr>
@@ -3590,7 +3590,7 @@
           <w:szCs w:val="22"/>
         </w:rPr>
       </w:pPr>
-      <w:hyperlink w:anchor="_Toc233455346" w:history="1">
+      <w:hyperlink w:anchor="_Toc233459482" w:history="1">
         <w:r>
           <w:rPr>
             <w:rStyle w:val="Hyperlink"/>
@@ -3633,7 +3633,7 @@
             <w:noProof/>
             <w:webHidden/>
           </w:rPr>
-          <w:instrText xml:space="preserve"> PAGEREF _Toc233455346 \h </w:instrText>
+          <w:instrText xml:space="preserve"> PAGEREF _Toc233459482 \h </w:instrText>
         </w:r>
         <w:r>
           <w:rPr>
@@ -3678,7 +3678,7 @@
           <w:szCs w:val="22"/>
         </w:rPr>
       </w:pPr>
-      <w:hyperlink w:anchor="_Toc233455347" w:history="1">
+      <w:hyperlink w:anchor="_Toc233459483" w:history="1">
         <w:r>
           <w:rPr>
             <w:rStyle w:val="Hyperlink"/>
@@ -3728,7 +3728,7 @@
             <w:noProof/>
             <w:webHidden/>
           </w:rPr>
-          <w:instrText xml:space="preserve"> PAGEREF _Toc233455347 \h </w:instrText>
+          <w:instrText xml:space="preserve"> PAGEREF _Toc233459483 \h </w:instrText>
         </w:r>
         <w:r>
           <w:rPr>
@@ -3773,7 +3773,7 @@
           <w:szCs w:val="22"/>
         </w:rPr>
       </w:pPr>
-      <w:hyperlink w:anchor="_Toc233455348" w:history="1">
+      <w:hyperlink w:anchor="_Toc233459484" w:history="1">
         <w:r>
           <w:rPr>
             <w:rStyle w:val="Hyperlink"/>
@@ -3801,7 +3801,7 @@
             <w:noProof/>
             <w:webHidden/>
           </w:rPr>
-          <w:instrText xml:space="preserve"> PAGEREF _Toc233455348 \h </w:instrText>
+          <w:instrText xml:space="preserve"> PAGEREF _Toc233459484 \h </w:instrText>
         </w:r>
         <w:r>
           <w:rPr>
@@ -3846,7 +3846,7 @@
           <w:szCs w:val="22"/>
         </w:rPr>
       </w:pPr>
-      <w:hyperlink w:anchor="_Toc233455349" w:history="1">
+      <w:hyperlink w:anchor="_Toc233459485" w:history="1">
         <w:r>
           <w:rPr>
             <w:rStyle w:val="Hyperlink"/>
@@ -3874,7 +3874,7 @@
             <w:noProof/>
             <w:webHidden/>
           </w:rPr>
-          <w:instrText xml:space="preserve"> PAGEREF _Toc233455349 \h </w:instrText>
+          <w:instrText xml:space="preserve"> PAGEREF _Toc233459485 \h </w:instrText>
         </w:r>
         <w:r>
           <w:rPr>
@@ -3919,7 +3919,7 @@
           <w:szCs w:val="22"/>
         </w:rPr>
       </w:pPr>
-      <w:hyperlink w:anchor="_Toc233455350" w:history="1">
+      <w:hyperlink w:anchor="_Toc233459486" w:history="1">
         <w:r>
           <w:rPr>
             <w:rStyle w:val="Hyperlink"/>
@@ -3947,7 +3947,7 @@
             <w:noProof/>
             <w:webHidden/>
           </w:rPr>
-          <w:instrText xml:space="preserve"> PAGEREF _Toc233455350 \h </w:instrText>
+          <w:instrText xml:space="preserve"> PAGEREF _Toc233459486 \h </w:instrText>
         </w:r>
         <w:r>
           <w:rPr>
@@ -3992,7 +3992,7 @@
           <w:szCs w:val="22"/>
         </w:rPr>
       </w:pPr>
-      <w:hyperlink w:anchor="_Toc233455351" w:history="1">
+      <w:hyperlink w:anchor="_Toc233459487" w:history="1">
         <w:r>
           <w:rPr>
             <w:rStyle w:val="Hyperlink"/>
@@ -4020,7 +4020,7 @@
             <w:noProof/>
             <w:webHidden/>
           </w:rPr>
-          <w:instrText xml:space="preserve"> PAGEREF _Toc233455351 \h </w:instrText>
+          <w:instrText xml:space="preserve"> PAGEREF _Toc233459487 \h </w:instrText>
         </w:r>
         <w:r>
           <w:rPr>
@@ -4065,7 +4065,7 @@
           <w:szCs w:val="22"/>
         </w:rPr>
       </w:pPr>
-      <w:hyperlink w:anchor="_Toc233455352" w:history="1">
+      <w:hyperlink w:anchor="_Toc233459488" w:history="1">
         <w:r>
           <w:rPr>
             <w:rStyle w:val="Hyperlink"/>
@@ -4093,7 +4093,7 @@
             <w:noProof/>
             <w:webHidden/>
           </w:rPr>
-          <w:instrText xml:space="preserve"> PAGEREF _Toc233455352 \h </w:instrText>
+          <w:instrText xml:space="preserve"> PAGEREF _Toc233459488 \h </w:instrText>
         </w:r>
         <w:r>
           <w:rPr>
@@ -4138,7 +4138,7 @@
           <w:szCs w:val="22"/>
         </w:rPr>
       </w:pPr>
-      <w:hyperlink w:anchor="_Toc233455353" w:history="1">
+      <w:hyperlink w:anchor="_Toc233459489" w:history="1">
         <w:r>
           <w:rPr>
             <w:rStyle w:val="Hyperlink"/>
@@ -4166,7 +4166,7 @@
             <w:noProof/>
             <w:webHidden/>
           </w:rPr>
-          <w:instrText xml:space="preserve"> PAGEREF _Toc233455353 \h </w:instrText>
+          <w:instrText xml:space="preserve"> PAGEREF _Toc233459489 \h </w:instrText>
         </w:r>
         <w:r>
           <w:rPr>
@@ -4211,7 +4211,7 @@
           <w:szCs w:val="22"/>
         </w:rPr>
       </w:pPr>
-      <w:hyperlink w:anchor="_Toc233455354" w:history="1">
+      <w:hyperlink w:anchor="_Toc233459490" w:history="1">
         <w:r>
           <w:rPr>
             <w:rStyle w:val="Hyperlink"/>
@@ -4239,7 +4239,7 @@
             <w:noProof/>
             <w:webHidden/>
           </w:rPr>
-          <w:instrText xml:space="preserve"> PAGEREF _Toc233455354 \h </w:instrText>
+          <w:instrText xml:space="preserve"> PAGEREF _Toc233459490 \h </w:instrText>
         </w:r>
         <w:r>
           <w:rPr>
@@ -4284,7 +4284,7 @@
           <w:szCs w:val="22"/>
         </w:rPr>
       </w:pPr>
-      <w:hyperlink w:anchor="_Toc233455355" w:history="1">
+      <w:hyperlink w:anchor="_Toc233459491" w:history="1">
         <w:r>
           <w:rPr>
             <w:rStyle w:val="Hyperlink"/>
@@ -4327,7 +4327,7 @@
             <w:noProof/>
             <w:webHidden/>
           </w:rPr>
-          <w:instrText xml:space="preserve"> PAGEREF _Toc233455355 \h </w:instrText>
+          <w:instrText xml:space="preserve"> PAGEREF _Toc233459491 \h </w:instrText>
         </w:r>
         <w:r>
           <w:rPr>
@@ -4372,7 +4372,7 @@
           <w:szCs w:val="22"/>
         </w:rPr>
       </w:pPr>
-      <w:hyperlink w:anchor="_Toc233455356" w:history="1">
+      <w:hyperlink w:anchor="_Toc233459492" w:history="1">
         <w:r>
           <w:rPr>
             <w:rStyle w:val="Hyperlink"/>
@@ -4400,7 +4400,7 @@
             <w:noProof/>
             <w:webHidden/>
           </w:rPr>
-          <w:instrText xml:space="preserve"> PAGEREF _Toc233455356 \h </w:instrText>
+          <w:instrText xml:space="preserve"> PAGEREF _Toc233459492 \h </w:instrText>
         </w:r>
         <w:r>
           <w:rPr>
@@ -4445,7 +4445,7 @@
           <w:szCs w:val="22"/>
         </w:rPr>
       </w:pPr>
-      <w:hyperlink w:anchor="_Toc233455357" w:history="1">
+      <w:hyperlink w:anchor="_Toc233459493" w:history="1">
         <w:r>
           <w:rPr>
             <w:rStyle w:val="Hyperlink"/>
@@ -4473,7 +4473,7 @@
             <w:noProof/>
             <w:webHidden/>
           </w:rPr>
-          <w:instrText xml:space="preserve"> PAGEREF _Toc233455357 \h </w:instrText>
+          <w:instrText xml:space="preserve"> PAGEREF _Toc233459493 \h </w:instrText>
         </w:r>
         <w:r>
           <w:rPr>
@@ -4518,7 +4518,7 @@
           <w:szCs w:val="22"/>
         </w:rPr>
       </w:pPr>
-      <w:hyperlink w:anchor="_Toc233455358" w:history="1">
+      <w:hyperlink w:anchor="_Toc233459494" w:history="1">
         <w:r>
           <w:rPr>
             <w:rStyle w:val="Hyperlink"/>
@@ -4546,7 +4546,7 @@
             <w:noProof/>
             <w:webHidden/>
           </w:rPr>
-          <w:instrText xml:space="preserve"> PAGEREF _Toc233455358 \h </w:instrText>
+          <w:instrText xml:space="preserve"> PAGEREF _Toc233459494 \h </w:instrText>
         </w:r>
         <w:r>
           <w:rPr>
@@ -4591,7 +4591,7 @@
           <w:szCs w:val="22"/>
         </w:rPr>
       </w:pPr>
-      <w:hyperlink w:anchor="_Toc233455359" w:history="1">
+      <w:hyperlink w:anchor="_Toc233459495" w:history="1">
         <w:r>
           <w:rPr>
             <w:rStyle w:val="Hyperlink"/>
@@ -4626,7 +4626,7 @@
             <w:noProof/>
             <w:webHidden/>
           </w:rPr>
-          <w:instrText xml:space="preserve"> PAGEREF _Toc233455359 \h </w:instrText>
+          <w:instrText xml:space="preserve"> PAGEREF _Toc233459495 \h </w:instrText>
         </w:r>
         <w:r>
           <w:rPr>
@@ -4671,7 +4671,7 @@
           <w:szCs w:val="22"/>
         </w:rPr>
       </w:pPr>
-      <w:hyperlink w:anchor="_Toc233455360" w:history="1">
+      <w:hyperlink w:anchor="_Toc233459496" w:history="1">
         <w:r>
           <w:rPr>
             <w:rStyle w:val="Hyperlink"/>
@@ -4699,7 +4699,7 @@
             <w:noProof/>
             <w:webHidden/>
           </w:rPr>
-          <w:instrText xml:space="preserve"> PAGEREF _Toc233455360 \h </w:instrText>
+          <w:instrText xml:space="preserve"> PAGEREF _Toc233459496 \h </w:instrText>
         </w:r>
         <w:r>
           <w:rPr>
@@ -4744,7 +4744,7 @@
           <w:szCs w:val="22"/>
         </w:rPr>
       </w:pPr>
-      <w:hyperlink w:anchor="_Toc233455361" w:history="1">
+      <w:hyperlink w:anchor="_Toc233459497" w:history="1">
         <w:r>
           <w:rPr>
             <w:rStyle w:val="Hyperlink"/>
@@ -4772,7 +4772,7 @@
             <w:noProof/>
             <w:webHidden/>
           </w:rPr>
-          <w:instrText xml:space="preserve"> PAGEREF _Toc233455361 \h </w:instrText>
+          <w:instrText xml:space="preserve"> PAGEREF _Toc233459497 \h </w:instrText>
         </w:r>
         <w:r>
           <w:rPr>
@@ -4817,7 +4817,7 @@
           <w:szCs w:val="22"/>
         </w:rPr>
       </w:pPr>
-      <w:hyperlink w:anchor="_Toc233455362" w:history="1">
+      <w:hyperlink w:anchor="_Toc233459498" w:history="1">
         <w:r>
           <w:rPr>
             <w:rStyle w:val="Hyperlink"/>
@@ -4860,7 +4860,7 @@
             <w:noProof/>
             <w:webHidden/>
           </w:rPr>
-          <w:instrText xml:space="preserve"> PAGEREF _Toc233455362 \h </w:instrText>
+          <w:instrText xml:space="preserve"> PAGEREF _Toc233459498 \h </w:instrText>
         </w:r>
         <w:r>
           <w:rPr>
@@ -4905,7 +4905,7 @@
           <w:szCs w:val="22"/>
         </w:rPr>
       </w:pPr>
-      <w:hyperlink w:anchor="_Toc233455363" w:history="1">
+      <w:hyperlink w:anchor="_Toc233459499" w:history="1">
         <w:r>
           <w:rPr>
             <w:rStyle w:val="Hyperlink"/>
@@ -4948,7 +4948,7 @@
             <w:noProof/>
             <w:webHidden/>
           </w:rPr>
-          <w:instrText xml:space="preserve"> PAGEREF _Toc233455363 \h </w:instrText>
+          <w:instrText xml:space="preserve"> PAGEREF _Toc233459499 \h </w:instrText>
         </w:r>
         <w:r>
           <w:rPr>
@@ -4993,7 +4993,7 @@
           <w:szCs w:val="22"/>
         </w:rPr>
       </w:pPr>
-      <w:hyperlink w:anchor="_Toc233455364" w:history="1">
+      <w:hyperlink w:anchor="_Toc233459500" w:history="1">
         <w:r>
           <w:rPr>
             <w:rStyle w:val="Hyperlink"/>
@@ -5036,7 +5036,7 @@
             <w:noProof/>
             <w:webHidden/>
           </w:rPr>
-          <w:instrText xml:space="preserve"> PAGEREF _Toc233455364 \h </w:instrText>
+          <w:instrText xml:space="preserve"> PAGEREF _Toc233459500 \h </w:instrText>
         </w:r>
         <w:r>
           <w:rPr>
@@ -5081,7 +5081,7 @@
           <w:szCs w:val="22"/>
         </w:rPr>
       </w:pPr>
-      <w:hyperlink w:anchor="_Toc233455365" w:history="1">
+      <w:hyperlink w:anchor="_Toc233459501" w:history="1">
         <w:r>
           <w:rPr>
             <w:rStyle w:val="Hyperlink"/>
@@ -5124,7 +5124,7 @@
             <w:noProof/>
             <w:webHidden/>
           </w:rPr>
-          <w:instrText xml:space="preserve"> PAGEREF _Toc233455365 \h </w:instrText>
+          <w:instrText xml:space="preserve"> PAGEREF _Toc233459501 \h </w:instrText>
         </w:r>
         <w:r>
           <w:rPr>
@@ -5169,7 +5169,7 @@
           <w:szCs w:val="22"/>
         </w:rPr>
       </w:pPr>
-      <w:hyperlink w:anchor="_Toc233455366" w:history="1">
+      <w:hyperlink w:anchor="_Toc233459502" w:history="1">
         <w:r>
           <w:rPr>
             <w:rStyle w:val="Hyperlink"/>
@@ -5197,7 +5197,7 @@
             <w:noProof/>
             <w:webHidden/>
           </w:rPr>
-          <w:instrText xml:space="preserve"> PAGEREF _Toc233455366 \h </w:instrText>
+          <w:instrText xml:space="preserve"> PAGEREF _Toc233459502 \h </w:instrText>
         </w:r>
         <w:r>
           <w:rPr>
@@ -5242,7 +5242,7 @@
           <w:szCs w:val="22"/>
         </w:rPr>
       </w:pPr>
-      <w:hyperlink w:anchor="_Toc233455367" w:history="1">
+      <w:hyperlink w:anchor="_Toc233459503" w:history="1">
         <w:r>
           <w:rPr>
             <w:rStyle w:val="Hyperlink"/>
@@ -5270,7 +5270,7 @@
             <w:noProof/>
             <w:webHidden/>
           </w:rPr>
-          <w:instrText xml:space="preserve"> PAGEREF _Toc233455367 \h </w:instrText>
+          <w:instrText xml:space="preserve"> PAGEREF _Toc233459503 \h </w:instrText>
         </w:r>
         <w:r>
           <w:rPr>
@@ -5315,7 +5315,7 @@
           <w:szCs w:val="22"/>
         </w:rPr>
       </w:pPr>
-      <w:hyperlink w:anchor="_Toc233455368" w:history="1">
+      <w:hyperlink w:anchor="_Toc233459504" w:history="1">
         <w:r>
           <w:rPr>
             <w:rStyle w:val="Hyperlink"/>
@@ -5343,7 +5343,7 @@
             <w:noProof/>
             <w:webHidden/>
           </w:rPr>
-          <w:instrText xml:space="preserve"> PAGEREF _Toc233455368 \h </w:instrText>
+          <w:instrText xml:space="preserve"> PAGEREF _Toc233459504 \h </w:instrText>
         </w:r>
         <w:r>
           <w:rPr>
@@ -5388,7 +5388,7 @@
           <w:szCs w:val="22"/>
         </w:rPr>
       </w:pPr>
-      <w:hyperlink w:anchor="_Toc233455369" w:history="1">
+      <w:hyperlink w:anchor="_Toc233459505" w:history="1">
         <w:r>
           <w:rPr>
             <w:rStyle w:val="Hyperlink"/>
@@ -5431,7 +5431,7 @@
             <w:noProof/>
             <w:webHidden/>
           </w:rPr>
-          <w:instrText xml:space="preserve"> PAGEREF _Toc233455369 \h </w:instrText>
+          <w:instrText xml:space="preserve"> PAGEREF _Toc233459505 \h </w:instrText>
         </w:r>
         <w:r>
           <w:rPr>
@@ -5476,7 +5476,7 @@
           <w:szCs w:val="22"/>
         </w:rPr>
       </w:pPr>
-      <w:hyperlink w:anchor="_Toc233455370" w:history="1">
+      <w:hyperlink w:anchor="_Toc233459506" w:history="1">
         <w:r>
           <w:rPr>
             <w:rStyle w:val="Hyperlink"/>
@@ -5519,7 +5519,7 @@
             <w:noProof/>
             <w:webHidden/>
           </w:rPr>
-          <w:instrText xml:space="preserve"> PAGEREF _Toc233455370 \h </w:instrText>
+          <w:instrText xml:space="preserve"> PAGEREF _Toc233459506 \h </w:instrText>
         </w:r>
         <w:r>
           <w:rPr>
@@ -5564,7 +5564,7 @@
           <w:szCs w:val="22"/>
         </w:rPr>
       </w:pPr>
-      <w:hyperlink w:anchor="_Toc233455371" w:history="1">
+      <w:hyperlink w:anchor="_Toc233459507" w:history="1">
         <w:r>
           <w:rPr>
             <w:rStyle w:val="Hyperlink"/>
@@ -5592,7 +5592,7 @@
             <w:noProof/>
             <w:webHidden/>
           </w:rPr>
-          <w:instrText xml:space="preserve"> PAGEREF _Toc233455371 \h </w:instrText>
+          <w:instrText xml:space="preserve"> PAGEREF _Toc233459507 \h </w:instrText>
         </w:r>
         <w:r>
           <w:rPr>
@@ -5637,7 +5637,7 @@
           <w:szCs w:val="22"/>
         </w:rPr>
       </w:pPr>
-      <w:hyperlink w:anchor="_Toc233455372" w:history="1">
+      <w:hyperlink w:anchor="_Toc233459508" w:history="1">
         <w:r>
           <w:rPr>
             <w:rStyle w:val="Hyperlink"/>
@@ -5680,7 +5680,7 @@
             <w:noProof/>
             <w:webHidden/>
           </w:rPr>
-          <w:instrText xml:space="preserve"> PAGEREF _Toc233455372 \h </w:instrText>
+          <w:instrText xml:space="preserve"> PAGEREF _Toc233459508 \h </w:instrText>
         </w:r>
         <w:r>
           <w:rPr>
@@ -5725,7 +5725,7 @@
           <w:szCs w:val="22"/>
         </w:rPr>
       </w:pPr>
-      <w:hyperlink w:anchor="_Toc233455373" w:history="1">
+      <w:hyperlink w:anchor="_Toc233459509" w:history="1">
         <w:r>
           <w:rPr>
             <w:rStyle w:val="Hyperlink"/>
@@ -5753,7 +5753,7 @@
             <w:noProof/>
             <w:webHidden/>
           </w:rPr>
-          <w:instrText xml:space="preserve"> PAGEREF _Toc233455373 \h </w:instrText>
+          <w:instrText xml:space="preserve"> PAGEREF _Toc233459509 \h </w:instrText>
         </w:r>
         <w:r>
           <w:rPr>
@@ -5798,7 +5798,7 @@
           <w:szCs w:val="22"/>
         </w:rPr>
       </w:pPr>
-      <w:hyperlink w:anchor="_Toc233455374" w:history="1">
+      <w:hyperlink w:anchor="_Toc233459510" w:history="1">
         <w:r>
           <w:rPr>
             <w:rStyle w:val="Hyperlink"/>
@@ -5841,7 +5841,7 @@
             <w:noProof/>
             <w:webHidden/>
           </w:rPr>
-          <w:instrText xml:space="preserve"> PAGEREF _Toc233455374 \h </w:instrText>
+          <w:instrText xml:space="preserve"> PAGEREF _Toc233459510 \h </w:instrText>
         </w:r>
         <w:r>
           <w:rPr>
@@ -5886,7 +5886,7 @@
           <w:szCs w:val="22"/>
         </w:rPr>
       </w:pPr>
-      <w:hyperlink w:anchor="_Toc233455375" w:history="1">
+      <w:hyperlink w:anchor="_Toc233459511" w:history="1">
         <w:r>
           <w:rPr>
             <w:rStyle w:val="Hyperlink"/>
@@ -5914,7 +5914,7 @@
             <w:noProof/>
             <w:webHidden/>
           </w:rPr>
-          <w:instrText xml:space="preserve"> PAGEREF _Toc233455375 \h </w:instrText>
+          <w:instrText xml:space="preserve"> PAGEREF _Toc233459511 \h </w:instrText>
         </w:r>
         <w:r>
           <w:rPr>
@@ -5959,7 +5959,7 @@
           <w:szCs w:val="22"/>
         </w:rPr>
       </w:pPr>
-      <w:hyperlink w:anchor="_Toc233455376" w:history="1">
+      <w:hyperlink w:anchor="_Toc233459512" w:history="1">
         <w:r>
           <w:rPr>
             <w:rStyle w:val="Hyperlink"/>
@@ -5987,7 +5987,7 @@
             <w:noProof/>
             <w:webHidden/>
           </w:rPr>
-          <w:instrText xml:space="preserve"> PAGEREF _Toc233455376 \h </w:instrText>
+          <w:instrText xml:space="preserve"> PAGEREF _Toc233459512 \h </w:instrText>
         </w:r>
         <w:r>
           <w:rPr>
@@ -6032,7 +6032,7 @@
           <w:szCs w:val="22"/>
         </w:rPr>
       </w:pPr>
-      <w:hyperlink w:anchor="_Toc233455377" w:history="1">
+      <w:hyperlink w:anchor="_Toc233459513" w:history="1">
         <w:r>
           <w:rPr>
             <w:rStyle w:val="Hyperlink"/>
@@ -6060,7 +6060,7 @@
             <w:noProof/>
             <w:webHidden/>
           </w:rPr>
-          <w:instrText xml:space="preserve"> PAGEREF _Toc233455377 \h </w:instrText>
+          <w:instrText xml:space="preserve"> PAGEREF _Toc233459513 \h </w:instrText>
         </w:r>
         <w:r>
           <w:rPr>
@@ -6105,7 +6105,7 @@
           <w:szCs w:val="22"/>
         </w:rPr>
       </w:pPr>
-      <w:hyperlink w:anchor="_Toc233455378" w:history="1">
+      <w:hyperlink w:anchor="_Toc233459514" w:history="1">
         <w:r>
           <w:rPr>
             <w:rStyle w:val="Hyperlink"/>
@@ -6133,7 +6133,7 @@
             <w:noProof/>
             <w:webHidden/>
           </w:rPr>
-          <w:instrText xml:space="preserve"> PAGEREF _Toc233455378 \h </w:instrText>
+          <w:instrText xml:space="preserve"> PAGEREF _Toc233459514 \h </w:instrText>
         </w:r>
         <w:r>
           <w:rPr>
@@ -6178,7 +6178,7 @@
           <w:szCs w:val="22"/>
         </w:rPr>
       </w:pPr>
-      <w:hyperlink w:anchor="_Toc233455379" w:history="1">
+      <w:hyperlink w:anchor="_Toc233459515" w:history="1">
         <w:r>
           <w:rPr>
             <w:rStyle w:val="Hyperlink"/>
@@ -6206,7 +6206,7 @@
             <w:noProof/>
             <w:webHidden/>
           </w:rPr>
-          <w:instrText xml:space="preserve"> PAGEREF _Toc233455379 \h </w:instrText>
+          <w:instrText xml:space="preserve"> PAGEREF _Toc233459515 \h </w:instrText>
         </w:r>
         <w:r>
           <w:rPr>
@@ -6251,7 +6251,7 @@
           <w:szCs w:val="22"/>
         </w:rPr>
       </w:pPr>
-      <w:hyperlink w:anchor="_Toc233455380" w:history="1">
+      <w:hyperlink w:anchor="_Toc233459516" w:history="1">
         <w:r>
           <w:rPr>
             <w:rStyle w:val="Hyperlink"/>
@@ -6279,7 +6279,7 @@
             <w:noProof/>
             <w:webHidden/>
           </w:rPr>
-          <w:instrText xml:space="preserve"> PAGEREF _Toc233455380 \h </w:instrText>
+          <w:instrText xml:space="preserve"> PAGEREF _Toc233459516 \h </w:instrText>
         </w:r>
         <w:r>
           <w:rPr>
@@ -6324,7 +6324,7 @@
           <w:szCs w:val="22"/>
         </w:rPr>
       </w:pPr>
-      <w:hyperlink w:anchor="_Toc233455381" w:history="1">
+      <w:hyperlink w:anchor="_Toc233459517" w:history="1">
         <w:r>
           <w:rPr>
             <w:rStyle w:val="Hyperlink"/>
@@ -6352,7 +6352,7 @@
             <w:noProof/>
             <w:webHidden/>
           </w:rPr>
-          <w:instrText xml:space="preserve"> PAGEREF _Toc233455381 \h </w:instrText>
+          <w:instrText xml:space="preserve"> PAGEREF _Toc233459517 \h </w:instrText>
         </w:r>
         <w:r>
           <w:rPr>
@@ -6397,7 +6397,7 @@
           <w:szCs w:val="22"/>
         </w:rPr>
       </w:pPr>
-      <w:hyperlink w:anchor="_Toc233455382" w:history="1">
+      <w:hyperlink w:anchor="_Toc233459518" w:history="1">
         <w:r>
           <w:rPr>
             <w:rStyle w:val="Hyperlink"/>
@@ -6425,7 +6425,7 @@
             <w:noProof/>
             <w:webHidden/>
           </w:rPr>
-          <w:instrText xml:space="preserve"> PAGEREF _Toc233455382 \h </w:instrText>
+          <w:instrText xml:space="preserve"> PAGEREF _Toc233459518 \h </w:instrText>
         </w:r>
         <w:r>
           <w:rPr>
@@ -6470,7 +6470,7 @@
           <w:szCs w:val="22"/>
         </w:rPr>
       </w:pPr>
-      <w:hyperlink w:anchor="_Toc233455383" w:history="1">
+      <w:hyperlink w:anchor="_Toc233459519" w:history="1">
         <w:r>
           <w:rPr>
             <w:rStyle w:val="Hyperlink"/>
@@ -6513,7 +6513,7 @@
             <w:noProof/>
             <w:webHidden/>
           </w:rPr>
-          <w:instrText xml:space="preserve"> PAGEREF _Toc233455383 \h </w:instrText>
+          <w:instrText xml:space="preserve"> PAGEREF _Toc233459519 \h </w:instrText>
         </w:r>
         <w:r>
           <w:rPr>
@@ -6558,7 +6558,7 @@
           <w:szCs w:val="22"/>
         </w:rPr>
       </w:pPr>
-      <w:hyperlink w:anchor="_Toc233455384" w:history="1">
+      <w:hyperlink w:anchor="_Toc233459520" w:history="1">
         <w:r>
           <w:rPr>
             <w:rStyle w:val="Hyperlink"/>
@@ -6601,7 +6601,7 @@
             <w:noProof/>
             <w:webHidden/>
           </w:rPr>
-          <w:instrText xml:space="preserve"> PAGEREF _Toc233455384 \h </w:instrText>
+          <w:instrText xml:space="preserve"> PAGEREF _Toc233459520 \h </w:instrText>
         </w:r>
         <w:r>
           <w:rPr>
@@ -6646,7 +6646,7 @@
           <w:szCs w:val="22"/>
         </w:rPr>
       </w:pPr>
-      <w:hyperlink w:anchor="_Toc233455385" w:history="1">
+      <w:hyperlink w:anchor="_Toc233459521" w:history="1">
         <w:r>
           <w:rPr>
             <w:rStyle w:val="Hyperlink"/>
@@ -6674,7 +6674,7 @@
             <w:noProof/>
             <w:webHidden/>
           </w:rPr>
-          <w:instrText xml:space="preserve"> PAGEREF _Toc233455385 \h </w:instrText>
+          <w:instrText xml:space="preserve"> PAGEREF _Toc233459521 \h </w:instrText>
         </w:r>
         <w:r>
           <w:rPr>
@@ -6719,7 +6719,7 @@
           <w:szCs w:val="22"/>
         </w:rPr>
       </w:pPr>
-      <w:hyperlink w:anchor="_Toc233455386" w:history="1">
+      <w:hyperlink w:anchor="_Toc233459522" w:history="1">
         <w:r>
           <w:rPr>
             <w:rStyle w:val="Hyperlink"/>
@@ -6747,7 +6747,7 @@
             <w:noProof/>
             <w:webHidden/>
           </w:rPr>
-          <w:instrText xml:space="preserve"> PAGEREF _Toc233455386 \h </w:instrText>
+          <w:instrText xml:space="preserve"> PAGEREF _Toc233459522 \h </w:instrText>
         </w:r>
         <w:r>
           <w:rPr>
@@ -6792,7 +6792,7 @@
           <w:szCs w:val="22"/>
         </w:rPr>
       </w:pPr>
-      <w:hyperlink w:anchor="_Toc233455387" w:history="1">
+      <w:hyperlink w:anchor="_Toc233459523" w:history="1">
         <w:r>
           <w:rPr>
             <w:rStyle w:val="Hyperlink"/>
@@ -6820,7 +6820,7 @@
             <w:noProof/>
             <w:webHidden/>
           </w:rPr>
-          <w:instrText xml:space="preserve"> PAGEREF _Toc233455387 \h </w:instrText>
+          <w:instrText xml:space="preserve"> PAGEREF _Toc233459523 \h </w:instrText>
         </w:r>
         <w:r>
           <w:rPr>
@@ -6865,7 +6865,7 @@
           <w:szCs w:val="22"/>
         </w:rPr>
       </w:pPr>
-      <w:hyperlink w:anchor="_Toc233455388" w:history="1">
+      <w:hyperlink w:anchor="_Toc233459524" w:history="1">
         <w:r>
           <w:rPr>
             <w:rStyle w:val="Hyperlink"/>
@@ -6893,7 +6893,7 @@
             <w:noProof/>
             <w:webHidden/>
           </w:rPr>
-          <w:instrText xml:space="preserve"> PAGEREF _Toc233455388 \h </w:instrText>
+          <w:instrText xml:space="preserve"> PAGEREF _Toc233459524 \h </w:instrText>
         </w:r>
         <w:r>
           <w:rPr>
@@ -6938,7 +6938,7 @@
           <w:szCs w:val="22"/>
         </w:rPr>
       </w:pPr>
-      <w:hyperlink w:anchor="_Toc233455389" w:history="1">
+      <w:hyperlink w:anchor="_Toc233459525" w:history="1">
         <w:r>
           <w:rPr>
             <w:rStyle w:val="Hyperlink"/>
@@ -6966,7 +6966,7 @@
             <w:noProof/>
             <w:webHidden/>
           </w:rPr>
-          <w:instrText xml:space="preserve"> PAGEREF _Toc233455389 \h </w:instrText>
+          <w:instrText xml:space="preserve"> PAGEREF _Toc233459525 \h </w:instrText>
         </w:r>
         <w:r>
           <w:rPr>
@@ -7011,7 +7011,7 @@
           <w:szCs w:val="22"/>
         </w:rPr>
       </w:pPr>
-      <w:hyperlink w:anchor="_Toc233455390" w:history="1">
+      <w:hyperlink w:anchor="_Toc233459526" w:history="1">
         <w:r>
           <w:rPr>
             <w:rStyle w:val="Hyperlink"/>
@@ -7039,7 +7039,7 @@
             <w:noProof/>
             <w:webHidden/>
           </w:rPr>
-          <w:instrText xml:space="preserve"> PAGEREF _Toc233455390 \h </w:instrText>
+          <w:instrText xml:space="preserve"> PAGEREF _Toc233459526 \h </w:instrText>
         </w:r>
         <w:r>
           <w:rPr>
@@ -7084,7 +7084,7 @@
           <w:szCs w:val="22"/>
         </w:rPr>
       </w:pPr>
-      <w:hyperlink w:anchor="_Toc233455391" w:history="1">
+      <w:hyperlink w:anchor="_Toc233459527" w:history="1">
         <w:r>
           <w:rPr>
             <w:rStyle w:val="Hyperlink"/>
@@ -7119,7 +7119,7 @@
             <w:noProof/>
             <w:webHidden/>
           </w:rPr>
-          <w:instrText xml:space="preserve"> PAGEREF _Toc233455391 \h </w:instrText>
+          <w:instrText xml:space="preserve"> PAGEREF _Toc233459527 \h </w:instrText>
         </w:r>
         <w:r>
           <w:rPr>
@@ -7164,7 +7164,7 @@
           <w:szCs w:val="22"/>
         </w:rPr>
       </w:pPr>
-      <w:hyperlink w:anchor="_Toc233455392" w:history="1">
+      <w:hyperlink w:anchor="_Toc233459528" w:history="1">
         <w:r>
           <w:rPr>
             <w:rStyle w:val="Hyperlink"/>
@@ -7192,7 +7192,7 @@
             <w:noProof/>
             <w:webHidden/>
           </w:rPr>
-          <w:instrText xml:space="preserve"> PAGEREF _Toc233455392 \h </w:instrText>
+          <w:instrText xml:space="preserve"> PAGEREF _Toc233459528 \h </w:instrText>
         </w:r>
         <w:r>
           <w:rPr>
@@ -7237,7 +7237,7 @@
           <w:szCs w:val="22"/>
         </w:rPr>
       </w:pPr>
-      <w:hyperlink w:anchor="_Toc233455393" w:history="1">
+      <w:hyperlink w:anchor="_Toc233459529" w:history="1">
         <w:r>
           <w:rPr>
             <w:rStyle w:val="Hyperlink"/>
@@ -7265,7 +7265,7 @@
             <w:noProof/>
             <w:webHidden/>
           </w:rPr>
-          <w:instrText xml:space="preserve"> PAGEREF _Toc233455393 \h </w:instrText>
+          <w:instrText xml:space="preserve"> PAGEREF _Toc233459529 \h </w:instrText>
         </w:r>
         <w:r>
           <w:rPr>
@@ -7310,7 +7310,7 @@
           <w:szCs w:val="22"/>
         </w:rPr>
       </w:pPr>
-      <w:hyperlink w:anchor="_Toc233455394" w:history="1">
+      <w:hyperlink w:anchor="_Toc233459530" w:history="1">
         <w:r>
           <w:rPr>
             <w:rStyle w:val="Hyperlink"/>
@@ -7338,7 +7338,7 @@
             <w:noProof/>
             <w:webHidden/>
           </w:rPr>
-          <w:instrText xml:space="preserve"> PAGEREF _Toc233455394 \h </w:instrText>
+          <w:instrText xml:space="preserve"> PAGEREF _Toc233459530 \h </w:instrText>
         </w:r>
         <w:r>
           <w:rPr>
@@ -7383,7 +7383,7 @@
           <w:szCs w:val="22"/>
         </w:rPr>
       </w:pPr>
-      <w:hyperlink w:anchor="_Toc233455395" w:history="1">
+      <w:hyperlink w:anchor="_Toc233459531" w:history="1">
         <w:r>
           <w:rPr>
             <w:rStyle w:val="Hyperlink"/>
@@ -7411,7 +7411,7 @@
             <w:noProof/>
             <w:webHidden/>
           </w:rPr>
-          <w:instrText xml:space="preserve"> PAGEREF _Toc233455395 \h </w:instrText>
+          <w:instrText xml:space="preserve"> PAGEREF _Toc233459531 \h </w:instrText>
         </w:r>
         <w:r>
           <w:rPr>
@@ -7456,7 +7456,7 @@
           <w:szCs w:val="22"/>
         </w:rPr>
       </w:pPr>
-      <w:hyperlink w:anchor="_Toc233455396" w:history="1">
+      <w:hyperlink w:anchor="_Toc233459532" w:history="1">
         <w:r>
           <w:rPr>
             <w:rStyle w:val="Hyperlink"/>
@@ -7484,7 +7484,7 @@
             <w:noProof/>
             <w:webHidden/>
           </w:rPr>
-          <w:instrText xml:space="preserve"> PAGEREF _Toc233455396 \h </w:instrText>
+          <w:instrText xml:space="preserve"> PAGEREF _Toc233459532 \h </w:instrText>
         </w:r>
         <w:r>
           <w:rPr>
@@ -7529,7 +7529,7 @@
           <w:szCs w:val="22"/>
         </w:rPr>
       </w:pPr>
-      <w:hyperlink w:anchor="_Toc233455397" w:history="1">
+      <w:hyperlink w:anchor="_Toc233459533" w:history="1">
         <w:r>
           <w:rPr>
             <w:rStyle w:val="Hyperlink"/>
@@ -7557,7 +7557,7 @@
             <w:noProof/>
             <w:webHidden/>
           </w:rPr>
-          <w:instrText xml:space="preserve"> PAGEREF _Toc233455397 \h </w:instrText>
+          <w:instrText xml:space="preserve"> PAGEREF _Toc233459533 \h </w:instrText>
         </w:r>
         <w:r>
           <w:rPr>
@@ -7602,7 +7602,7 @@
           <w:szCs w:val="22"/>
         </w:rPr>
       </w:pPr>
-      <w:hyperlink w:anchor="_Toc233455398" w:history="1">
+      <w:hyperlink w:anchor="_Toc233459534" w:history="1">
         <w:r>
           <w:rPr>
             <w:rStyle w:val="Hyperlink"/>
@@ -7630,7 +7630,7 @@
             <w:noProof/>
             <w:webHidden/>
           </w:rPr>
-          <w:instrText xml:space="preserve"> PAGEREF _Toc233455398 \h </w:instrText>
+          <w:instrText xml:space="preserve"> PAGEREF _Toc233459534 \h </w:instrText>
         </w:r>
         <w:r>
           <w:rPr>
@@ -7675,7 +7675,7 @@
           <w:szCs w:val="22"/>
         </w:rPr>
       </w:pPr>
-      <w:hyperlink w:anchor="_Toc233455399" w:history="1">
+      <w:hyperlink w:anchor="_Toc233459535" w:history="1">
         <w:r>
           <w:rPr>
             <w:rStyle w:val="Hyperlink"/>
@@ -7718,7 +7718,7 @@
             <w:noProof/>
             <w:webHidden/>
           </w:rPr>
-          <w:instrText xml:space="preserve"> PAGEREF _Toc233455399 \h </w:instrText>
+          <w:instrText xml:space="preserve"> PAGEREF _Toc233459535 \h </w:instrText>
         </w:r>
         <w:r>
           <w:rPr>
@@ -7763,7 +7763,7 @@
           <w:szCs w:val="22"/>
         </w:rPr>
       </w:pPr>
-      <w:hyperlink w:anchor="_Toc233455400" w:history="1">
+      <w:hyperlink w:anchor="_Toc233459536" w:history="1">
         <w:r>
           <w:rPr>
             <w:rStyle w:val="Hyperlink"/>
@@ -7791,7 +7791,7 @@
             <w:noProof/>
             <w:webHidden/>
           </w:rPr>
-          <w:instrText xml:space="preserve"> PAGEREF _Toc233455400 \h </w:instrText>
+          <w:instrText xml:space="preserve"> PAGEREF _Toc233459536 \h </w:instrText>
         </w:r>
         <w:r>
           <w:rPr>
@@ -7836,7 +7836,7 @@
           <w:szCs w:val="22"/>
         </w:rPr>
       </w:pPr>
-      <w:hyperlink w:anchor="_Toc233455401" w:history="1">
+      <w:hyperlink w:anchor="_Toc233459537" w:history="1">
         <w:r>
           <w:rPr>
             <w:rStyle w:val="Hyperlink"/>
@@ -7879,7 +7879,7 @@
             <w:noProof/>
             <w:webHidden/>
           </w:rPr>
-          <w:instrText xml:space="preserve"> PAGEREF _Toc233455401 \h </w:instrText>
+          <w:instrText xml:space="preserve"> PAGEREF _Toc233459537 \h </w:instrText>
         </w:r>
         <w:r>
           <w:rPr>
@@ -7924,7 +7924,7 @@
           <w:szCs w:val="22"/>
         </w:rPr>
       </w:pPr>
-      <w:hyperlink w:anchor="_Toc233455402" w:history="1">
+      <w:hyperlink w:anchor="_Toc233459538" w:history="1">
         <w:r>
           <w:rPr>
             <w:rStyle w:val="Hyperlink"/>
@@ -7952,7 +7952,7 @@
             <w:noProof/>
             <w:webHidden/>
           </w:rPr>
-          <w:instrText xml:space="preserve"> PAGEREF _Toc233455402 \h </w:instrText>
+          <w:instrText xml:space="preserve"> PAGEREF _Toc233459538 \h </w:instrText>
         </w:r>
         <w:r>
           <w:rPr>
@@ -7997,7 +7997,7 @@
           <w:szCs w:val="22"/>
         </w:rPr>
       </w:pPr>
-      <w:hyperlink w:anchor="_Toc233455403" w:history="1">
+      <w:hyperlink w:anchor="_Toc233459539" w:history="1">
         <w:r>
           <w:rPr>
             <w:rStyle w:val="Hyperlink"/>
@@ -8025,7 +8025,7 @@
             <w:noProof/>
             <w:webHidden/>
           </w:rPr>
-          <w:instrText xml:space="preserve"> PAGEREF _Toc233455403 \h </w:instrText>
+          <w:instrText xml:space="preserve"> PAGEREF _Toc233459539 \h </w:instrText>
         </w:r>
         <w:r>
           <w:rPr>
@@ -8070,7 +8070,7 @@
           <w:szCs w:val="22"/>
         </w:rPr>
       </w:pPr>
-      <w:hyperlink w:anchor="_Toc233455404" w:history="1">
+      <w:hyperlink w:anchor="_Toc233459540" w:history="1">
         <w:r>
           <w:rPr>
             <w:rStyle w:val="Hyperlink"/>
@@ -8113,7 +8113,7 @@
             <w:noProof/>
             <w:webHidden/>
           </w:rPr>
-          <w:instrText xml:space="preserve"> PAGEREF _Toc233455404 \h </w:instrText>
+          <w:instrText xml:space="preserve"> PAGEREF _Toc233459540 \h </w:instrText>
         </w:r>
         <w:r>
           <w:rPr>
@@ -8158,7 +8158,7 @@
           <w:szCs w:val="22"/>
         </w:rPr>
       </w:pPr>
-      <w:hyperlink w:anchor="_Toc233455405" w:history="1">
+      <w:hyperlink w:anchor="_Toc233459541" w:history="1">
         <w:r>
           <w:rPr>
             <w:rStyle w:val="Hyperlink"/>
@@ -8186,7 +8186,7 @@
             <w:noProof/>
             <w:webHidden/>
           </w:rPr>
-          <w:instrText xml:space="preserve"> PAGEREF _Toc233455405 \h </w:instrText>
+          <w:instrText xml:space="preserve"> PAGEREF _Toc233459541 \h </w:instrText>
         </w:r>
         <w:r>
           <w:rPr>
@@ -8231,7 +8231,7 @@
           <w:szCs w:val="22"/>
         </w:rPr>
       </w:pPr>
-      <w:hyperlink w:anchor="_Toc233455406" w:history="1">
+      <w:hyperlink w:anchor="_Toc233459542" w:history="1">
         <w:r>
           <w:rPr>
             <w:rStyle w:val="Hyperlink"/>
@@ -8259,7 +8259,7 @@
             <w:noProof/>
             <w:webHidden/>
           </w:rPr>
-          <w:instrText xml:space="preserve"> PAGEREF _Toc233455406 \h </w:instrText>
+          <w:instrText xml:space="preserve"> PAGEREF _Toc233459542 \h </w:instrText>
         </w:r>
         <w:r>
           <w:rPr>
@@ -8304,7 +8304,7 @@
           <w:szCs w:val="22"/>
         </w:rPr>
       </w:pPr>
-      <w:hyperlink w:anchor="_Toc233455407" w:history="1">
+      <w:hyperlink w:anchor="_Toc233459543" w:history="1">
         <w:r>
           <w:rPr>
             <w:rStyle w:val="Hyperlink"/>
@@ -8340,7 +8340,7 @@
             <w:noProof/>
             <w:webHidden/>
           </w:rPr>
-          <w:instrText xml:space="preserve"> PAGEREF _Toc233455407 \h </w:instrText>
+          <w:instrText xml:space="preserve"> PAGEREF _Toc233459543 \h </w:instrText>
         </w:r>
         <w:r>
           <w:rPr>
@@ -8385,7 +8385,7 @@
           <w:szCs w:val="22"/>
         </w:rPr>
       </w:pPr>
-      <w:hyperlink w:anchor="_Toc233455408" w:history="1">
+      <w:hyperlink w:anchor="_Toc233459544" w:history="1">
         <w:r>
           <w:rPr>
             <w:rStyle w:val="Hyperlink"/>
@@ -8413,7 +8413,7 @@
             <w:noProof/>
             <w:webHidden/>
           </w:rPr>
-          <w:instrText xml:space="preserve"> PAGEREF _Toc233455408 \h </w:instrText>
+          <w:instrText xml:space="preserve"> PAGEREF _Toc233459544 \h </w:instrText>
         </w:r>
         <w:r>
           <w:rPr>
@@ -8458,7 +8458,7 @@
           <w:szCs w:val="22"/>
         </w:rPr>
       </w:pPr>
-      <w:hyperlink w:anchor="_Toc233455409" w:history="1">
+      <w:hyperlink w:anchor="_Toc233459545" w:history="1">
         <w:r>
           <w:rPr>
             <w:rStyle w:val="Hyperlink"/>
@@ -8493,7 +8493,7 @@
             <w:noProof/>
             <w:webHidden/>
           </w:rPr>
-          <w:instrText xml:space="preserve"> PAGEREF _Toc233455409 \h </w:instrText>
+          <w:instrText xml:space="preserve"> PAGEREF _Toc233459545 \h </w:instrText>
         </w:r>
         <w:r>
           <w:rPr>
@@ -8538,7 +8538,7 @@
           <w:szCs w:val="22"/>
         </w:rPr>
       </w:pPr>
-      <w:hyperlink w:anchor="_Toc233455410" w:history="1">
+      <w:hyperlink w:anchor="_Toc233459546" w:history="1">
         <w:r>
           <w:rPr>
             <w:rStyle w:val="Hyperlink"/>
@@ -8566,7 +8566,7 @@
             <w:noProof/>
             <w:webHidden/>
           </w:rPr>
-          <w:instrText xml:space="preserve"> PAGEREF _Toc233455410 \h </w:instrText>
+          <w:instrText xml:space="preserve"> PAGEREF _Toc233459546 \h </w:instrText>
         </w:r>
         <w:r>
           <w:rPr>
@@ -8611,7 +8611,7 @@
           <w:szCs w:val="22"/>
         </w:rPr>
       </w:pPr>
-      <w:hyperlink w:anchor="_Toc233455411" w:history="1">
+      <w:hyperlink w:anchor="_Toc233459547" w:history="1">
         <w:r>
           <w:rPr>
             <w:rStyle w:val="Hyperlink"/>
@@ -8639,7 +8639,7 @@
             <w:noProof/>
             <w:webHidden/>
           </w:rPr>
-          <w:instrText xml:space="preserve"> PAGEREF _Toc233455411 \h </w:instrText>
+          <w:instrText xml:space="preserve"> PAGEREF _Toc233459547 \h </w:instrText>
         </w:r>
         <w:r>
           <w:rPr>
@@ -8684,7 +8684,7 @@
           <w:szCs w:val="22"/>
         </w:rPr>
       </w:pPr>
-      <w:hyperlink w:anchor="_Toc233455412" w:history="1">
+      <w:hyperlink w:anchor="_Toc233459548" w:history="1">
         <w:r>
           <w:rPr>
             <w:rStyle w:val="Hyperlink"/>
@@ -8727,7 +8727,7 @@
             <w:noProof/>
             <w:webHidden/>
           </w:rPr>
-          <w:instrText xml:space="preserve"> PAGEREF _Toc233455412 \h </w:instrText>
+          <w:instrText xml:space="preserve"> PAGEREF _Toc233459548 \h </w:instrText>
         </w:r>
         <w:r>
           <w:rPr>
@@ -8772,7 +8772,7 @@
           <w:szCs w:val="22"/>
         </w:rPr>
       </w:pPr>
-      <w:hyperlink w:anchor="_Toc233455413" w:history="1">
+      <w:hyperlink w:anchor="_Toc233459549" w:history="1">
         <w:r>
           <w:rPr>
             <w:rStyle w:val="Hyperlink"/>
@@ -8800,7 +8800,7 @@
             <w:noProof/>
             <w:webHidden/>
           </w:rPr>
-          <w:instrText xml:space="preserve"> PAGEREF _Toc233455413 \h </w:instrText>
+          <w:instrText xml:space="preserve"> PAGEREF _Toc233459549 \h </w:instrText>
         </w:r>
         <w:r>
           <w:rPr>
@@ -8880,7 +8880,7 @@
         <w:pStyle w:val="Heading3"/>
         <w:jc w:val="right"/>
       </w:pPr>
-      <w:bookmarkStart w:id="4" w:name="_Toc233455311"/>
+      <w:bookmarkStart w:id="4" w:name="_Toc233459447"/>
       <w:r>
         <w:rPr>
           <w:bidi/>
@@ -10878,7 +10878,7 @@
         <w:pStyle w:val="Heading2"/>
         <w:jc w:val="right"/>
       </w:pPr>
-      <w:bookmarkStart w:id="6" w:name="_Toc233455312"/>
+      <w:bookmarkStart w:id="6" w:name="_Toc233459448"/>
       <w:r>
         <w:rPr>
           <w:bidi/>
@@ -11042,7 +11042,7 @@
         <w:jc w:val="right"/>
       </w:pPr>
       <w:bookmarkStart w:id="7" w:name="résumé"/>
-      <w:bookmarkStart w:id="8" w:name="_Toc233455313"/>
+      <w:bookmarkStart w:id="8" w:name="_Toc233459449"/>
       <w:bookmarkEnd w:id="5"/>
       <w:r>
         <w:rPr>
@@ -11203,7 +11203,7 @@
         <w:pStyle w:val="Heading1"/>
         <w:jc w:val="right"/>
       </w:pPr>
-      <w:bookmarkStart w:id="10" w:name="_Toc233455314"/>
+      <w:bookmarkStart w:id="10" w:name="_Toc233459450"/>
       <w:r>
         <w:rPr>
           <w:bidi/>
@@ -11222,7 +11222,7 @@
         <w:jc w:val="right"/>
       </w:pPr>
       <w:bookmarkStart w:id="11" w:name="تمهيد"/>
-      <w:bookmarkStart w:id="12" w:name="_Toc233455315"/>
+      <w:bookmarkStart w:id="12" w:name="_Toc233459451"/>
       <w:r>
         <w:rPr>
           <w:bidi/>
@@ -11253,7 +11253,7 @@
         <w:jc w:val="right"/>
       </w:pPr>
       <w:bookmarkStart w:id="13" w:name="الإشكالية"/>
-      <w:bookmarkStart w:id="14" w:name="_Toc233455316"/>
+      <w:bookmarkStart w:id="14" w:name="_Toc233459452"/>
       <w:bookmarkEnd w:id="11"/>
       <w:r>
         <w:rPr>
@@ -11301,7 +11301,7 @@
         <w:jc w:val="right"/>
       </w:pPr>
       <w:bookmarkStart w:id="15" w:name="الفرضيات"/>
-      <w:bookmarkStart w:id="16" w:name="_Toc233455317"/>
+      <w:bookmarkStart w:id="16" w:name="_Toc233459453"/>
       <w:bookmarkEnd w:id="13"/>
       <w:r>
         <w:rPr>
@@ -11408,7 +11408,7 @@
         <w:pStyle w:val="Heading2"/>
         <w:jc w:val="right"/>
       </w:pPr>
-      <w:bookmarkStart w:id="18" w:name="_Toc233455318"/>
+      <w:bookmarkStart w:id="18" w:name="_Toc233459454"/>
       <w:r>
         <w:rPr>
           <w:bidi/>
@@ -11530,7 +11530,7 @@
         <w:jc w:val="right"/>
       </w:pPr>
       <w:bookmarkStart w:id="19" w:name="منهجية-البحث"/>
-      <w:bookmarkStart w:id="20" w:name="_Toc233455319"/>
+      <w:bookmarkStart w:id="20" w:name="_Toc233459455"/>
       <w:bookmarkEnd w:id="17"/>
       <w:r>
         <w:rPr>
@@ -11562,7 +11562,7 @@
         <w:jc w:val="right"/>
       </w:pPr>
       <w:bookmarkStart w:id="21" w:name="هيكل-الدراسة"/>
-      <w:bookmarkStart w:id="22" w:name="_Toc233455320"/>
+      <w:bookmarkStart w:id="22" w:name="_Toc233459456"/>
       <w:bookmarkEnd w:id="19"/>
       <w:r>
         <w:rPr>
@@ -11615,7 +11615,7 @@
         <w:pStyle w:val="Heading2"/>
         <w:jc w:val="right"/>
       </w:pPr>
-      <w:bookmarkStart w:id="24" w:name="_Toc233455321"/>
+      <w:bookmarkStart w:id="24" w:name="_Toc233459457"/>
       <w:r>
         <w:rPr>
           <w:bidi/>
@@ -14275,7 +14275,7 @@
         <w:jc w:val="right"/>
       </w:pPr>
       <w:bookmarkStart w:id="26" w:name="Xdded5c7f65391e1348f873ece249db48d441899"/>
-      <w:bookmarkStart w:id="27" w:name="_Toc233455322"/>
+      <w:bookmarkStart w:id="27" w:name="_Toc233459458"/>
       <w:bookmarkEnd w:id="9"/>
       <w:bookmarkEnd w:id="23"/>
       <w:r>
@@ -14325,7 +14325,7 @@
         <w:jc w:val="right"/>
       </w:pPr>
       <w:bookmarkStart w:id="29" w:name="X948e1094553a531d6db6f4893473d29311c3135"/>
-      <w:bookmarkStart w:id="30" w:name="_Toc233455323"/>
+      <w:bookmarkStart w:id="30" w:name="_Toc233459459"/>
       <w:bookmarkEnd w:id="28"/>
       <w:r>
         <w:rPr>
@@ -14344,7 +14344,7 @@
         <w:jc w:val="right"/>
       </w:pPr>
       <w:bookmarkStart w:id="31" w:name="X6ae151a505b1cf0518b3edad6d35b811125f13b"/>
-      <w:bookmarkStart w:id="32" w:name="_Toc233455324"/>
+      <w:bookmarkStart w:id="32" w:name="_Toc233459460"/>
       <w:r>
         <w:rPr>
           <w:bidi/>
@@ -14387,7 +14387,7 @@
         <w:jc w:val="right"/>
       </w:pPr>
       <w:bookmarkStart w:id="33" w:name="X0cc40933b11ca9c345543fa46db131b050093cf"/>
-      <w:bookmarkStart w:id="34" w:name="_Toc233455325"/>
+      <w:bookmarkStart w:id="34" w:name="_Toc233459461"/>
       <w:bookmarkEnd w:id="31"/>
       <w:r>
         <w:rPr>
@@ -14432,7 +14432,7 @@
         <w:jc w:val="right"/>
       </w:pPr>
       <w:bookmarkStart w:id="35" w:name="X964df9414599ec61ed7b3115d8f9a749868681b"/>
-      <w:bookmarkStart w:id="36" w:name="_Toc233455326"/>
+      <w:bookmarkStart w:id="36" w:name="_Toc233459462"/>
       <w:bookmarkEnd w:id="33"/>
       <w:r>
         <w:rPr>
@@ -14607,7 +14607,7 @@
         <w:jc w:val="right"/>
       </w:pPr>
       <w:bookmarkStart w:id="37" w:name="Xb98e67e6d1739a4d79f518326bb9bac61b25523"/>
-      <w:bookmarkStart w:id="38" w:name="_Toc233455327"/>
+      <w:bookmarkStart w:id="38" w:name="_Toc233459463"/>
       <w:bookmarkEnd w:id="29"/>
       <w:bookmarkEnd w:id="35"/>
       <w:r>
@@ -14627,7 +14627,7 @@
         <w:jc w:val="right"/>
       </w:pPr>
       <w:bookmarkStart w:id="39" w:name="X74e9138fa2e70dfaae98d362d5c20d245ce46e1"/>
-      <w:bookmarkStart w:id="40" w:name="_Toc233455328"/>
+      <w:bookmarkStart w:id="40" w:name="_Toc233459464"/>
       <w:r>
         <w:rPr>
           <w:bidi/>
@@ -14712,7 +14712,7 @@
         <w:jc w:val="right"/>
       </w:pPr>
       <w:bookmarkStart w:id="41" w:name="ثانياً-أهمية-تسيير-المخزون"/>
-      <w:bookmarkStart w:id="42" w:name="_Toc233455329"/>
+      <w:bookmarkStart w:id="42" w:name="_Toc233459465"/>
       <w:bookmarkEnd w:id="39"/>
       <w:r>
         <w:rPr>
@@ -14852,7 +14852,7 @@
         <w:jc w:val="right"/>
       </w:pPr>
       <w:bookmarkStart w:id="43" w:name="ثالثاً-الإطار-التنظيمي-الجزائري"/>
-      <w:bookmarkStart w:id="44" w:name="_Toc233455330"/>
+      <w:bookmarkStart w:id="44" w:name="_Toc233459466"/>
       <w:bookmarkEnd w:id="41"/>
       <w:r>
         <w:rPr>
@@ -15081,7 +15081,7 @@
         <w:jc w:val="right"/>
       </w:pPr>
       <w:bookmarkStart w:id="45" w:name="X0b33a1787aeef4eb8491627c0fcc2828f98e578"/>
-      <w:bookmarkStart w:id="46" w:name="_Toc233455331"/>
+      <w:bookmarkStart w:id="46" w:name="_Toc233459467"/>
       <w:bookmarkEnd w:id="37"/>
       <w:bookmarkEnd w:id="43"/>
       <w:r>
@@ -15102,7 +15102,7 @@
         <w:jc w:val="right"/>
       </w:pPr>
       <w:bookmarkStart w:id="47" w:name="X840ddb239f67ba41aed2c5ab494f49871bfa89d"/>
-      <w:bookmarkStart w:id="48" w:name="_Toc233455332"/>
+      <w:bookmarkStart w:id="48" w:name="_Toc233459468"/>
       <w:r>
         <w:rPr>
           <w:bidi/>
@@ -15225,7 +15225,7 @@
         <w:jc w:val="right"/>
       </w:pPr>
       <w:bookmarkStart w:id="49" w:name="X06d4b6dd68c173adbe5393b74c94cc066e0865d"/>
-      <w:bookmarkStart w:id="50" w:name="_Toc233455333"/>
+      <w:bookmarkStart w:id="50" w:name="_Toc233459469"/>
       <w:bookmarkEnd w:id="47"/>
       <w:r>
         <w:rPr>
@@ -15419,7 +15419,7 @@
         <w:jc w:val="right"/>
       </w:pPr>
       <w:bookmarkStart w:id="51" w:name="X9159b7f41042f3a404490eab795f27fd591040b"/>
-      <w:bookmarkStart w:id="52" w:name="_Toc233455334"/>
+      <w:bookmarkStart w:id="52" w:name="_Toc233459470"/>
       <w:bookmarkEnd w:id="49"/>
       <w:r>
         <w:rPr>
@@ -15453,7 +15453,7 @@
         <w:jc w:val="right"/>
       </w:pPr>
       <w:bookmarkStart w:id="54" w:name="Xe71e4b4fd93dee69f233a0223a30763675d81f6"/>
-      <w:bookmarkStart w:id="55" w:name="_Toc233455335"/>
+      <w:bookmarkStart w:id="55" w:name="_Toc233459471"/>
       <w:bookmarkEnd w:id="53"/>
       <w:r>
         <w:rPr>
@@ -15472,7 +15472,7 @@
         <w:jc w:val="right"/>
       </w:pPr>
       <w:bookmarkStart w:id="56" w:name="أولاً-تحليل-abc"/>
-      <w:bookmarkStart w:id="57" w:name="_Toc233455336"/>
+      <w:bookmarkStart w:id="57" w:name="_Toc233459472"/>
       <w:r>
         <w:rPr>
           <w:bidi/>
@@ -15624,7 +15624,7 @@
         <w:pStyle w:val="Heading3"/>
         <w:jc w:val="right"/>
       </w:pPr>
-      <w:bookmarkStart w:id="59" w:name="_Toc233455337"/>
+      <w:bookmarkStart w:id="59" w:name="_Toc233459473"/>
       <w:r>
         <w:rPr>
           <w:bidi/>
@@ -17018,7 +17018,7 @@
         <w:jc w:val="right"/>
       </w:pPr>
       <w:bookmarkStart w:id="60" w:name="ثالثاً-نقطة-إعادة-الطلب-ومخزون-الأمان"/>
-      <w:bookmarkStart w:id="61" w:name="_Toc233455338"/>
+      <w:bookmarkStart w:id="61" w:name="_Toc233459474"/>
       <w:bookmarkEnd w:id="58"/>
       <w:r>
         <w:rPr>
@@ -17223,7 +17223,7 @@
         <w:pStyle w:val="Heading3"/>
         <w:jc w:val="right"/>
       </w:pPr>
-      <w:bookmarkStart w:id="63" w:name="_Toc233455339"/>
+      <w:bookmarkStart w:id="63" w:name="_Toc233459475"/>
       <w:r>
         <w:rPr>
           <w:bidi/>
@@ -17486,7 +17486,7 @@
         <w:jc w:val="right"/>
       </w:pPr>
       <w:bookmarkStart w:id="64" w:name="المبحث-الخامس-تقييم-الموردين-ومفهوم-erp"/>
-      <w:bookmarkStart w:id="65" w:name="_Toc233455340"/>
+      <w:bookmarkStart w:id="65" w:name="_Toc233459476"/>
       <w:bookmarkEnd w:id="54"/>
       <w:bookmarkEnd w:id="62"/>
       <w:r>
@@ -17506,7 +17506,7 @@
         <w:jc w:val="right"/>
       </w:pPr>
       <w:bookmarkStart w:id="66" w:name="X476ec0218982b17ebd973c1b7c9efe04a5c5317"/>
-      <w:bookmarkStart w:id="67" w:name="_Toc233455341"/>
+      <w:bookmarkStart w:id="67" w:name="_Toc233459477"/>
       <w:r>
         <w:rPr>
           <w:bidi/>
@@ -17644,7 +17644,7 @@
         <w:jc w:val="right"/>
       </w:pPr>
       <w:bookmarkStart w:id="68" w:name="Xfea16ccd3a6176ee0da1da8067dfc8c5dfb9193"/>
-      <w:bookmarkStart w:id="69" w:name="_Toc233455342"/>
+      <w:bookmarkStart w:id="69" w:name="_Toc233459478"/>
       <w:bookmarkEnd w:id="66"/>
       <w:r>
         <w:rPr>
@@ -17865,7 +17865,7 @@
         <w:jc w:val="right"/>
       </w:pPr>
       <w:bookmarkStart w:id="70" w:name="Xfd09630af81a064bb869de4cc3333972b7b71f8"/>
-      <w:bookmarkStart w:id="71" w:name="_Toc233455343"/>
+      <w:bookmarkStart w:id="71" w:name="_Toc233459479"/>
       <w:bookmarkEnd w:id="26"/>
       <w:bookmarkEnd w:id="64"/>
       <w:bookmarkEnd w:id="68"/>
@@ -17920,7 +17920,7 @@
         <w:jc w:val="right"/>
       </w:pPr>
       <w:bookmarkStart w:id="73" w:name="Xd96d29689cd7b7c28a53e63cb30434c1b4e42ae"/>
-      <w:bookmarkStart w:id="74" w:name="_Toc233455344"/>
+      <w:bookmarkStart w:id="74" w:name="_Toc233459480"/>
       <w:bookmarkEnd w:id="72"/>
       <w:r>
         <w:rPr>
@@ -17964,7 +17964,7 @@
         <w:jc w:val="right"/>
       </w:pPr>
       <w:bookmarkStart w:id="75" w:name="Xfd010b0e6ec43a71a31832c4aa57c4a1ebd67ff"/>
-      <w:bookmarkStart w:id="76" w:name="_Toc233455345"/>
+      <w:bookmarkStart w:id="76" w:name="_Toc233459481"/>
       <w:r>
         <w:rPr>
           <w:bidi/>
@@ -19944,7 +19944,7 @@
         <w:jc w:val="right"/>
       </w:pPr>
       <w:bookmarkStart w:id="82" w:name="X52ea18e5737fce8615e1c3ca4723e15512be477"/>
-      <w:bookmarkStart w:id="83" w:name="_Toc233455346"/>
+      <w:bookmarkStart w:id="83" w:name="_Toc233459482"/>
       <w:bookmarkEnd w:id="75"/>
       <w:bookmarkEnd w:id="81"/>
       <w:r>
@@ -20818,7 +20818,7 @@
         <w:jc w:val="right"/>
       </w:pPr>
       <w:bookmarkStart w:id="85" w:name="X3d546febf7430a2ea3250247e57315bf530ac8e"/>
-      <w:bookmarkStart w:id="86" w:name="_Toc233455347"/>
+      <w:bookmarkStart w:id="86" w:name="_Toc233459483"/>
       <w:bookmarkEnd w:id="82"/>
       <w:r>
         <w:rPr>
@@ -21614,7 +21614,7 @@
         <w:pStyle w:val="Heading2"/>
         <w:jc w:val="right"/>
       </w:pPr>
-      <w:bookmarkStart w:id="89" w:name="_Toc233455348"/>
+      <w:bookmarkStart w:id="89" w:name="_Toc233459484"/>
       <w:r>
         <w:rPr>
           <w:bidi/>
@@ -21645,7 +21645,7 @@
         <w:jc w:val="right"/>
       </w:pPr>
       <w:bookmarkStart w:id="90" w:name="Xa214dcfe6b381ea1f68aa2f47f12b1f1067a3e5"/>
-      <w:bookmarkStart w:id="91" w:name="_Toc233455349"/>
+      <w:bookmarkStart w:id="91" w:name="_Toc233459485"/>
       <w:r>
         <w:rPr>
           <w:bidi/>
@@ -21789,7 +21789,7 @@
         <w:pStyle w:val="Heading3"/>
         <w:jc w:val="right"/>
       </w:pPr>
-      <w:bookmarkStart w:id="95" w:name="_Toc233455350"/>
+      <w:bookmarkStart w:id="95" w:name="_Toc233459486"/>
       <w:r>
         <w:rPr>
           <w:bidi/>
@@ -22026,7 +22026,7 @@
         <w:pStyle w:val="Heading3"/>
         <w:jc w:val="right"/>
       </w:pPr>
-      <w:bookmarkStart w:id="99" w:name="_Toc233455351"/>
+      <w:bookmarkStart w:id="99" w:name="_Toc233459487"/>
       <w:r>
         <w:rPr>
           <w:bidi/>
@@ -22350,7 +22350,7 @@
         <w:jc w:val="right"/>
       </w:pPr>
       <w:bookmarkStart w:id="102" w:name="X45c22bf0528f185d6de6f59ddda56ed6c67ca33"/>
-      <w:bookmarkStart w:id="103" w:name="_Toc233455352"/>
+      <w:bookmarkStart w:id="103" w:name="_Toc233459488"/>
       <w:bookmarkEnd w:id="88"/>
       <w:bookmarkEnd w:id="98"/>
       <w:bookmarkEnd w:id="101"/>
@@ -22404,7 +22404,7 @@
         <w:pStyle w:val="Heading3"/>
         <w:jc w:val="right"/>
       </w:pPr>
-      <w:bookmarkStart w:id="105" w:name="_Toc233455353"/>
+      <w:bookmarkStart w:id="105" w:name="_Toc233459489"/>
       <w:r>
         <w:rPr>
           <w:bidi/>
@@ -23973,7 +23973,7 @@
         <w:jc w:val="right"/>
       </w:pPr>
       <w:bookmarkStart w:id="107" w:name="Xbcf6a8e9e411a31af33d34924801dd6a54fe6f9"/>
-      <w:bookmarkStart w:id="108" w:name="_Toc233455354"/>
+      <w:bookmarkStart w:id="108" w:name="_Toc233459490"/>
       <w:bookmarkEnd w:id="104"/>
       <w:r>
         <w:rPr>
@@ -24677,7 +24677,7 @@
         <w:jc w:val="right"/>
       </w:pPr>
       <w:bookmarkStart w:id="110" w:name="Xf44bb1cbb1fbf8d3786fd5660f5e5e712de4010"/>
-      <w:bookmarkStart w:id="111" w:name="_Toc233455355"/>
+      <w:bookmarkStart w:id="111" w:name="_Toc233459491"/>
       <w:bookmarkEnd w:id="107"/>
       <w:r>
         <w:rPr>
@@ -24994,7 +24994,7 @@
         <w:jc w:val="right"/>
       </w:pPr>
       <w:bookmarkStart w:id="114" w:name="X425548a444476a4a4f36373e56e022eba81766a"/>
-      <w:bookmarkStart w:id="115" w:name="_Toc233455356"/>
+      <w:bookmarkStart w:id="115" w:name="_Toc233459492"/>
       <w:bookmarkEnd w:id="70"/>
       <w:bookmarkEnd w:id="102"/>
       <w:bookmarkEnd w:id="110"/>
@@ -25046,7 +25046,7 @@
         <w:jc w:val="right"/>
       </w:pPr>
       <w:bookmarkStart w:id="117" w:name="Xa676c4e96c951c611f1581966c5cca345efded0"/>
-      <w:bookmarkStart w:id="118" w:name="_Toc233455357"/>
+      <w:bookmarkStart w:id="118" w:name="_Toc233459493"/>
       <w:bookmarkEnd w:id="116"/>
       <w:r>
         <w:rPr>
@@ -25098,7 +25098,7 @@
         <w:pStyle w:val="Heading3"/>
         <w:jc w:val="right"/>
       </w:pPr>
-      <w:bookmarkStart w:id="120" w:name="_Toc233455358"/>
+      <w:bookmarkStart w:id="120" w:name="_Toc233459494"/>
       <w:r>
         <w:rPr>
           <w:bidi/>
@@ -25272,7 +25272,7 @@
         <w:jc w:val="right"/>
       </w:pPr>
       <w:bookmarkStart w:id="121" w:name="Xd01ba28ceb43c2aafcfa279441271082bf35e79"/>
-      <w:bookmarkStart w:id="122" w:name="_Toc233455359"/>
+      <w:bookmarkStart w:id="122" w:name="_Toc233459495"/>
       <w:bookmarkEnd w:id="119"/>
       <w:r>
         <w:rPr>
@@ -25414,7 +25414,7 @@
         <w:pStyle w:val="Heading3"/>
         <w:jc w:val="right"/>
       </w:pPr>
-      <w:bookmarkStart w:id="124" w:name="_Toc233455360"/>
+      <w:bookmarkStart w:id="124" w:name="_Toc233459496"/>
       <w:r>
         <w:rPr>
           <w:bidi/>
@@ -25536,7 +25536,7 @@
         <w:jc w:val="right"/>
       </w:pPr>
       <w:bookmarkStart w:id="125" w:name="Xfb30997312ec99a0ff92bdd7dc592fd161b34eb"/>
-      <w:bookmarkStart w:id="126" w:name="_Toc233455361"/>
+      <w:bookmarkStart w:id="126" w:name="_Toc233459497"/>
       <w:bookmarkEnd w:id="117"/>
       <w:bookmarkEnd w:id="123"/>
       <w:r>
@@ -25569,7 +25569,7 @@
         <w:jc w:val="right"/>
       </w:pPr>
       <w:bookmarkStart w:id="127" w:name="Xe1412b27e8b4694678434ce8a4f8b6f261fecdf"/>
-      <w:bookmarkStart w:id="128" w:name="_Toc233455362"/>
+      <w:bookmarkStart w:id="128" w:name="_Toc233459498"/>
       <w:r>
         <w:rPr>
           <w:bidi/>
@@ -25773,7 +25773,7 @@
         <w:jc w:val="right"/>
       </w:pPr>
       <w:bookmarkStart w:id="129" w:name="X790f7c97394d912e1af56ef75b8396a4139580d"/>
-      <w:bookmarkStart w:id="130" w:name="_Toc233455363"/>
+      <w:bookmarkStart w:id="130" w:name="_Toc233459499"/>
       <w:bookmarkEnd w:id="127"/>
       <w:r>
         <w:rPr>
@@ -25890,7 +25890,7 @@
         <w:pStyle w:val="Heading3"/>
         <w:jc w:val="right"/>
       </w:pPr>
-      <w:bookmarkStart w:id="132" w:name="_Toc233455364"/>
+      <w:bookmarkStart w:id="132" w:name="_Toc233459500"/>
       <w:r>
         <w:rPr>
           <w:bidi/>
@@ -26076,7 +26076,7 @@
         <w:pStyle w:val="Heading2"/>
         <w:jc w:val="right"/>
       </w:pPr>
-      <w:bookmarkStart w:id="134" w:name="_Toc233455365"/>
+      <w:bookmarkStart w:id="134" w:name="_Toc233459501"/>
       <w:r>
         <w:rPr>
           <w:bidi/>
@@ -26108,7 +26108,7 @@
         <w:jc w:val="right"/>
       </w:pPr>
       <w:bookmarkStart w:id="135" w:name="X2b5683333895272df7448c3123c2d6911fb19dd"/>
-      <w:bookmarkStart w:id="136" w:name="_Toc233455366"/>
+      <w:bookmarkStart w:id="136" w:name="_Toc233459502"/>
       <w:r>
         <w:rPr>
           <w:bidi/>
@@ -26384,7 +26384,7 @@
         <w:pStyle w:val="Heading3"/>
         <w:jc w:val="right"/>
       </w:pPr>
-      <w:bookmarkStart w:id="138" w:name="_Toc233455367"/>
+      <w:bookmarkStart w:id="138" w:name="_Toc233459503"/>
       <w:r>
         <w:rPr>
           <w:bidi/>
@@ -26762,7 +26762,7 @@
         <w:jc w:val="right"/>
       </w:pPr>
       <w:bookmarkStart w:id="141" w:name="Xdb72e8c31238e5bc8bb35e9197d335bc848251d"/>
-      <w:bookmarkStart w:id="142" w:name="_Toc233455368"/>
+      <w:bookmarkStart w:id="142" w:name="_Toc233459504"/>
       <w:bookmarkEnd w:id="137"/>
       <w:bookmarkEnd w:id="140"/>
       <w:r>
@@ -27161,7 +27161,7 @@
         <w:jc w:val="right"/>
       </w:pPr>
       <w:bookmarkStart w:id="143" w:name="Xb42ed883f4a4d77c904837a9483548fc91a7185"/>
-      <w:bookmarkStart w:id="144" w:name="_Toc233455369"/>
+      <w:bookmarkStart w:id="144" w:name="_Toc233459505"/>
       <w:bookmarkEnd w:id="141"/>
       <w:r>
         <w:rPr>
@@ -27320,7 +27320,7 @@
         <w:pStyle w:val="Heading3"/>
         <w:jc w:val="right"/>
       </w:pPr>
-      <w:bookmarkStart w:id="146" w:name="_Toc233455370"/>
+      <w:bookmarkStart w:id="146" w:name="_Toc233459506"/>
       <w:r>
         <w:rPr>
           <w:bidi/>
@@ -27488,7 +27488,7 @@
         <w:jc w:val="right"/>
       </w:pPr>
       <w:bookmarkStart w:id="147" w:name="Xc6e18aa2af3011a1373a5d4857df80b39c98584"/>
-      <w:bookmarkStart w:id="148" w:name="_Toc233455371"/>
+      <w:bookmarkStart w:id="148" w:name="_Toc233459507"/>
       <w:bookmarkEnd w:id="133"/>
       <w:bookmarkEnd w:id="145"/>
       <w:r>
@@ -27521,7 +27521,7 @@
         <w:jc w:val="right"/>
       </w:pPr>
       <w:bookmarkStart w:id="149" w:name="Xdcbed4a529f139898c76cbbdb64bb8c1a119adb"/>
-      <w:bookmarkStart w:id="150" w:name="_Toc233455372"/>
+      <w:bookmarkStart w:id="150" w:name="_Toc233459508"/>
       <w:r>
         <w:rPr>
           <w:bidi/>
@@ -27792,7 +27792,7 @@
         <w:jc w:val="right"/>
       </w:pPr>
       <w:bookmarkStart w:id="151" w:name="Xc3e868391841f7562f5d5b2b3c4438a8091e2eb"/>
-      <w:bookmarkStart w:id="152" w:name="_Toc233455373"/>
+      <w:bookmarkStart w:id="152" w:name="_Toc233459509"/>
       <w:bookmarkEnd w:id="149"/>
       <w:r>
         <w:rPr>
@@ -27947,7 +27947,7 @@
         <w:jc w:val="right"/>
       </w:pPr>
       <w:bookmarkStart w:id="153" w:name="X197816f32b7b7ef5c9c4cb4d12a6ba19ec348d5"/>
-      <w:bookmarkStart w:id="154" w:name="_Toc233455374"/>
+      <w:bookmarkStart w:id="154" w:name="_Toc233459510"/>
       <w:bookmarkEnd w:id="151"/>
       <w:r>
         <w:rPr>
@@ -28071,7 +28071,7 @@
         <w:jc w:val="right"/>
       </w:pPr>
       <w:bookmarkStart w:id="155" w:name="X43f602add9b7058ce87741ac0c8f7096d34eb8c"/>
-      <w:bookmarkStart w:id="156" w:name="_Toc233455375"/>
+      <w:bookmarkStart w:id="156" w:name="_Toc233459511"/>
       <w:bookmarkEnd w:id="153"/>
       <w:r>
         <w:rPr>
@@ -28334,7 +28334,7 @@
         <w:jc w:val="right"/>
       </w:pPr>
       <w:bookmarkStart w:id="159" w:name="الفصل-الرابع-التجريب-والتحقق-من-النتائج"/>
-      <w:bookmarkStart w:id="160" w:name="_Toc233455376"/>
+      <w:bookmarkStart w:id="160" w:name="_Toc233459512"/>
       <w:bookmarkEnd w:id="114"/>
       <w:bookmarkEnd w:id="147"/>
       <w:bookmarkEnd w:id="155"/>
@@ -28357,7 +28357,7 @@
         <w:jc w:val="right"/>
       </w:pPr>
       <w:bookmarkStart w:id="161" w:name="X772d01764d2cdf10730319436c2b610a5dde5fe"/>
-      <w:bookmarkStart w:id="162" w:name="_Toc233455377"/>
+      <w:bookmarkStart w:id="162" w:name="_Toc233459513"/>
       <w:r>
         <w:rPr>
           <w:bidi/>
@@ -28375,7 +28375,7 @@
         <w:jc w:val="right"/>
       </w:pPr>
       <w:bookmarkStart w:id="163" w:name="X49c36b57d4ff3911c0526cfcdcf059aea80a406"/>
-      <w:bookmarkStart w:id="164" w:name="_Toc233455378"/>
+      <w:bookmarkStart w:id="164" w:name="_Toc233459514"/>
       <w:r>
         <w:rPr>
           <w:bidi/>
@@ -29358,7 +29358,7 @@
         <w:jc w:val="right"/>
       </w:pPr>
       <w:bookmarkStart w:id="166" w:name="Xb8e42ca6d3322078508f93d6992976adf29d2ca"/>
-      <w:bookmarkStart w:id="167" w:name="_Toc233455379"/>
+      <w:bookmarkStart w:id="167" w:name="_Toc233459515"/>
       <w:bookmarkEnd w:id="163"/>
       <w:r>
         <w:rPr>
@@ -29855,7 +29855,7 @@
         <w:jc w:val="right"/>
       </w:pPr>
       <w:bookmarkStart w:id="169" w:name="X8a93358eecaeb60469823d090d898b75c2e77ac"/>
-      <w:bookmarkStart w:id="170" w:name="_Toc233455380"/>
+      <w:bookmarkStart w:id="170" w:name="_Toc233459516"/>
       <w:bookmarkEnd w:id="166"/>
       <w:r>
         <w:rPr>
@@ -29995,7 +29995,7 @@
         <w:jc w:val="right"/>
       </w:pPr>
       <w:bookmarkStart w:id="171" w:name="Xaf9730f8f208447975e9de648bd3cee193ed3c6"/>
-      <w:bookmarkStart w:id="172" w:name="_Toc233455381"/>
+      <w:bookmarkStart w:id="172" w:name="_Toc233459517"/>
       <w:bookmarkEnd w:id="169"/>
       <w:r>
         <w:rPr>
@@ -31151,7 +31151,7 @@
         <w:jc w:val="right"/>
       </w:pPr>
       <w:bookmarkStart w:id="174" w:name="X5d883ae01169ee0c2874075dd2ba2df14168639"/>
-      <w:bookmarkStart w:id="175" w:name="_Toc233455382"/>
+      <w:bookmarkStart w:id="175" w:name="_Toc233459518"/>
       <w:bookmarkEnd w:id="171"/>
       <w:r>
         <w:rPr>
@@ -31183,7 +31183,7 @@
         <w:jc w:val="right"/>
       </w:pPr>
       <w:bookmarkStart w:id="176" w:name="Xfde45ab085d7ad252281c0dccada5f1ef76526b"/>
-      <w:bookmarkStart w:id="177" w:name="_Toc233455383"/>
+      <w:bookmarkStart w:id="177" w:name="_Toc233459519"/>
       <w:bookmarkEnd w:id="174"/>
       <w:r>
         <w:rPr>
@@ -31214,7 +31214,7 @@
         <w:jc w:val="right"/>
       </w:pPr>
       <w:bookmarkStart w:id="178" w:name="X55ec612fe397449f669dedb016b309f368fbe7f"/>
-      <w:bookmarkStart w:id="179" w:name="_Toc233455384"/>
+      <w:bookmarkStart w:id="179" w:name="_Toc233459520"/>
       <w:bookmarkEnd w:id="176"/>
       <w:r>
         <w:rPr>
@@ -31267,7 +31267,7 @@
         <w:pStyle w:val="Heading2"/>
         <w:jc w:val="right"/>
       </w:pPr>
-      <w:bookmarkStart w:id="181" w:name="_Toc233455385"/>
+      <w:bookmarkStart w:id="181" w:name="_Toc233459521"/>
       <w:r>
         <w:rPr>
           <w:bidi/>
@@ -31285,7 +31285,7 @@
         <w:pStyle w:val="Heading3"/>
         <w:jc w:val="right"/>
       </w:pPr>
-      <w:bookmarkStart w:id="182" w:name="_Toc233455386"/>
+      <w:bookmarkStart w:id="182" w:name="_Toc233459522"/>
       <w:r>
         <w:rPr>
           <w:bidi/>
@@ -32277,7 +32277,7 @@
         <w:pStyle w:val="Heading3"/>
         <w:jc w:val="right"/>
       </w:pPr>
-      <w:bookmarkStart w:id="184" w:name="_Toc233455387"/>
+      <w:bookmarkStart w:id="184" w:name="_Toc233459523"/>
       <w:r>
         <w:rPr>
           <w:bidi/>
@@ -32528,7 +32528,7 @@
         <w:pStyle w:val="Heading1"/>
         <w:jc w:val="right"/>
       </w:pPr>
-      <w:bookmarkStart w:id="186" w:name="_Toc233455388"/>
+      <w:bookmarkStart w:id="186" w:name="_Toc233459524"/>
       <w:r>
         <w:rPr>
           <w:bidi/>
@@ -32547,7 +32547,7 @@
         <w:jc w:val="right"/>
       </w:pPr>
       <w:bookmarkStart w:id="187" w:name="أولاً-الكتب-والمراجع-العلمية"/>
-      <w:bookmarkStart w:id="188" w:name="_Toc233455389"/>
+      <w:bookmarkStart w:id="188" w:name="_Toc233459525"/>
       <w:r>
         <w:rPr>
           <w:bidi/>
@@ -32955,7 +32955,7 @@
         <w:jc w:val="right"/>
       </w:pPr>
       <w:bookmarkStart w:id="189" w:name="Xa9c5438e3f3a8a99cc43947a4701c3667770737"/>
-      <w:bookmarkStart w:id="190" w:name="_Toc233455390"/>
+      <w:bookmarkStart w:id="190" w:name="_Toc233459526"/>
       <w:bookmarkEnd w:id="187"/>
       <w:r>
         <w:rPr>
@@ -33212,7 +33212,7 @@
         <w:jc w:val="right"/>
       </w:pPr>
       <w:bookmarkStart w:id="191" w:name="ثالثاً-المنهاج-الدراسي-bts-gsl-tag1801"/>
-      <w:bookmarkStart w:id="192" w:name="_Toc233455391"/>
+      <w:bookmarkStart w:id="192" w:name="_Toc233459527"/>
       <w:bookmarkEnd w:id="189"/>
       <w:r>
         <w:rPr>
@@ -34104,7 +34104,7 @@
         </w:rPr>
         <w:jc w:val="right"/>
       </w:pPr>
-      <w:bookmarkStart w:id="194" w:name="_Toc233455392"/>
+      <w:bookmarkStart w:id="194" w:name="_Toc233459528"/>
       <w:r>
         <w:rPr>
           <w:bidi/>
@@ -34201,7 +34201,7 @@
         <w:jc w:val="right"/>
       </w:pPr>
       <w:bookmarkStart w:id="195" w:name="خامساً-مشاريع-وأطروحات-موازية"/>
-      <w:bookmarkStart w:id="196" w:name="_Toc233455393"/>
+      <w:bookmarkStart w:id="196" w:name="_Toc233459529"/>
       <w:bookmarkEnd w:id="193"/>
       <w:r>
         <w:rPr>
@@ -34388,7 +34388,7 @@
         <w:jc w:val="right"/>
       </w:pPr>
       <w:bookmarkStart w:id="197" w:name="سادساً-مصادر-البيانات-الميدانية"/>
-      <w:bookmarkStart w:id="198" w:name="_Toc233455394"/>
+      <w:bookmarkStart w:id="198" w:name="_Toc233459530"/>
       <w:bookmarkEnd w:id="195"/>
       <w:r>
         <w:rPr>
@@ -34474,7 +34474,7 @@
         <w:jc w:val="right"/>
       </w:pPr>
       <w:bookmarkStart w:id="200" w:name="جدول-المختصرات-والرموز-التقنية"/>
-      <w:bookmarkStart w:id="201" w:name="_Toc233455395"/>
+      <w:bookmarkStart w:id="201" w:name="_Toc233459531"/>
       <w:bookmarkEnd w:id="185"/>
       <w:bookmarkEnd w:id="199"/>
       <w:r>
@@ -36517,7 +36517,7 @@
         <w:jc w:val="right"/>
       </w:pPr>
       <w:bookmarkStart w:id="203" w:name="قائمة-المصطلحات"/>
-      <w:bookmarkStart w:id="204" w:name="_Toc233455396"/>
+      <w:bookmarkStart w:id="204" w:name="_Toc233459532"/>
       <w:bookmarkEnd w:id="200"/>
       <w:r>
         <w:rPr>
@@ -36535,7 +36535,7 @@
         <w:pStyle w:val="Heading2"/>
         <w:jc w:val="right"/>
       </w:pPr>
-      <w:bookmarkStart w:id="205" w:name="_Toc233455397"/>
+      <w:bookmarkStart w:id="205" w:name="_Toc233459533"/>
       <w:r>
         <w:rPr>
           <w:bidi/>
@@ -39790,7 +39790,7 @@
         <w:pStyle w:val="Heading2"/>
         <w:jc w:val="right"/>
       </w:pPr>
-      <w:bookmarkStart w:id="207" w:name="_Toc233455398"/>
+      <w:bookmarkStart w:id="207" w:name="_Toc233459534"/>
       <w:r>
         <w:rPr>
           <w:bidi/>
@@ -41401,7 +41401,7 @@
         <w:pStyle w:val="Heading1"/>
         <w:jc w:val="right"/>
       </w:pPr>
-      <w:bookmarkStart w:id="210" w:name="_Toc233455399"/>
+      <w:bookmarkStart w:id="210" w:name="_Toc233459535"/>
       <w:r>
         <w:rPr>
           <w:bidi/>
@@ -41420,7 +41420,7 @@
         <w:jc w:val="right"/>
       </w:pPr>
       <w:bookmarkStart w:id="211" w:name="الملحق-الأول-هيكل-ملف-النظام"/>
-      <w:bookmarkStart w:id="212" w:name="_Toc233455400"/>
+      <w:bookmarkStart w:id="212" w:name="_Toc233459536"/>
       <w:r>
         <w:rPr>
           <w:bidi/>
@@ -42005,7 +42005,7 @@
         <w:pStyle w:val="Heading2"/>
         <w:jc w:val="right"/>
       </w:pPr>
-      <w:bookmarkStart w:id="214" w:name="_Toc233455401"/>
+      <w:bookmarkStart w:id="214" w:name="_Toc233459537"/>
       <w:bookmarkEnd w:id="211"/>
       <w:r>
         <w:rPr>
@@ -42789,7 +42789,7 @@
         <w:pStyle w:val="Heading2"/>
         <w:jc w:val="right"/>
       </w:pPr>
-      <w:bookmarkStart w:id="216" w:name="_Toc233455402"/>
+      <w:bookmarkStart w:id="216" w:name="_Toc233459538"/>
       <w:r>
         <w:rPr>
           <w:bidi/>
@@ -44665,7 +44665,7 @@
         <w:pStyle w:val="Heading2"/>
         <w:jc w:val="right"/>
       </w:pPr>
-      <w:bookmarkStart w:id="219" w:name="_Toc233455403"/>
+      <w:bookmarkStart w:id="219" w:name="_Toc233459539"/>
       <w:r>
         <w:rPr>
           <w:bidi/>
@@ -44801,7 +44801,7 @@
         <w:jc w:val="right"/>
       </w:pPr>
       <w:bookmarkStart w:id="220" w:name="X2ba466c7822f1b4b8d4c28ae81ff579f1d28271"/>
-      <w:bookmarkStart w:id="221" w:name="_Toc233455404"/>
+      <w:bookmarkStart w:id="221" w:name="_Toc233459540"/>
       <w:bookmarkEnd w:id="218"/>
       <w:r>
         <w:rPr>
@@ -45203,7 +45203,7 @@
         <w:pStyle w:val="Heading2"/>
         <w:jc w:val="right"/>
       </w:pPr>
-      <w:bookmarkStart w:id="225" w:name="_Toc233455405"/>
+      <w:bookmarkStart w:id="225" w:name="_Toc233459541"/>
       <w:r>
         <w:rPr>
           <w:bidi/>
@@ -45221,7 +45221,7 @@
         <w:jc w:val="right"/>
       </w:pPr>
       <w:bookmarkStart w:id="226" w:name="X6cd5d7ea679d76d20534900303c2e6d9b9d4296"/>
-      <w:bookmarkStart w:id="227" w:name="_Toc233455406"/>
+      <w:bookmarkStart w:id="227" w:name="_Toc233459542"/>
       <w:r>
         <w:rPr>
           <w:bidi/>
@@ -45999,7 +45999,7 @@
         <w:pStyle w:val="Heading3"/>
         <w:jc w:val="right"/>
       </w:pPr>
-      <w:bookmarkStart w:id="229" w:name="_Toc233455407"/>
+      <w:bookmarkStart w:id="229" w:name="_Toc233459543"/>
       <w:r>
         <w:rPr>
           <w:bCs/>
@@ -46678,7 +46678,7 @@
         <w:pStyle w:val="Heading3"/>
         <w:jc w:val="right"/>
       </w:pPr>
-      <w:bookmarkStart w:id="231" w:name="_Toc233455408"/>
+      <w:bookmarkStart w:id="231" w:name="_Toc233459544"/>
       <w:r>
         <w:rPr>
           <w:bidi/>
@@ -47964,7 +47964,7 @@
         <w:pStyle w:val="Heading3"/>
         <w:jc w:val="right"/>
       </w:pPr>
-      <w:bookmarkStart w:id="235" w:name="_Toc233455409"/>
+      <w:bookmarkStart w:id="235" w:name="_Toc233459545"/>
       <w:r>
         <w:rPr>
           <w:bidi/>
@@ -49021,7 +49021,7 @@
         <w:pStyle w:val="Heading3"/>
         <w:jc w:val="right"/>
       </w:pPr>
-      <w:bookmarkStart w:id="239" w:name="_Toc233455410"/>
+      <w:bookmarkStart w:id="239" w:name="_Toc233459546"/>
       <w:r>
         <w:rPr>
           <w:bidi/>
@@ -49532,7 +49532,7 @@
         <w:pStyle w:val="Heading3"/>
         <w:jc w:val="right"/>
       </w:pPr>
-      <w:bookmarkStart w:id="241" w:name="_Toc233455411"/>
+      <w:bookmarkStart w:id="241" w:name="_Toc233459547"/>
       <w:r>
         <w:rPr>
           <w:bidi/>
@@ -50393,7 +50393,7 @@
         <w:pStyle w:val="Heading3"/>
         <w:jc w:val="right"/>
       </w:pPr>
-      <w:bookmarkStart w:id="243" w:name="_Toc233455412"/>
+      <w:bookmarkStart w:id="243" w:name="_Toc233459548"/>
       <w:r>
         <w:rPr>
           <w:bidi/>
@@ -51334,7 +51334,7 @@
         <w:pStyle w:val="Heading3"/>
         <w:jc w:val="right"/>
       </w:pPr>
-      <w:bookmarkStart w:id="245" w:name="_Toc233455413"/>
+      <w:bookmarkStart w:id="245" w:name="_Toc233459549"/>
       <w:r>
         <w:rPr>
           <w:bidi/>
@@ -56724,7 +56724,7 @@
 </file>
 
 <file path=customXml/itemProps1.xml><?xml version="1.0" encoding="utf-8"?>
-<ds:datastoreItem xmlns:ds="http://schemas.openxmlformats.org/officeDocument/2006/customXml" ds:itemID="{7FDA345F-B37E-43D6-B394-4A8D14078B75}">
+<ds:datastoreItem xmlns:ds="http://schemas.openxmlformats.org/officeDocument/2006/customXml" ds:itemID="{58BD7006-430C-43E2-AF62-7B00D228AF46}">
   <ds:schemaRefs>
     <ds:schemaRef ds:uri="http://schemas.openxmlformats.org/officeDocument/2006/bibliography"/>
   </ds:schemaRefs>

</xml_diff>